<commit_message>
fix obtencion de correo de tabla workers
</commit_message>
<xml_diff>
--- a/Features/CostsModule/Features/AdjudicacionesFeature/Templates/plantilla_instalacion_con_placeholders.docx
+++ b/Features/CostsModule/Features/AdjudicacionesFeature/Templates/plantilla_instalacion_con_placeholders.docx
@@ -34011,6 +34011,29 @@
           <w:szCs w:val="18"/>
         </w:rPr>
         <w:t>PRESUPUESTO, INDICACIONES, OTROS</w:t>
+      </w:r>
+    </w:p>
+    <w:p>
+      <w:pPr>
+        <w:ind w:left="0" w:firstLine="0"/>
+        <w:jc w:val="center"/>
+        <w:rPr>
+          <w:rFonts w:ascii="Arial Narrow" w:eastAsia="Arial Narrow" w:hAnsi="Arial Narrow" w:cs="Arial Narrow"/>
+          <w:b/>
+          <w:color w:val="FFFFFF" w:themeColor="background1"/>
+          <w:sz w:val="18"/>
+          <w:szCs w:val="18"/>
+        </w:rPr>
+      </w:pPr>
+      <w:r>
+        <w:rPr>
+          <w:rFonts w:ascii="Arial Narrow" w:eastAsia="Arial Narrow" w:hAnsi="Arial Narrow" w:cs="Arial Narrow"/>
+          <w:b/>
+          <w:color w:val="FFFFFF" w:themeColor="background1"/>
+          <w:sz w:val="18"/>
+          <w:szCs w:val="18"/>
+        </w:rPr>
+        <w:t>&lt;&lt;INSERTAR_COTIZACION_AQUI&gt;&gt;</w:t>
       </w:r>
     </w:p>
     <w:p>
@@ -50621,7 +50644,6 @@
   <w:style w:type="character" w:default="1" w:styleId="Fuentedeprrafopredeter">
     <w:name w:val="Default Paragraph Font"/>
     <w:uiPriority w:val="1"/>
-    <w:semiHidden/>
     <w:unhideWhenUsed/>
   </w:style>
   <w:style w:type="table" w:default="1" w:styleId="Tablanormal">
@@ -51599,6 +51621,10 @@
 </file>
 
 <file path=customXml/item1.xml><?xml version="1.0" encoding="utf-8"?>
+<b:Sources xmlns:b="http://schemas.openxmlformats.org/officeDocument/2006/bibliography" xmlns="http://schemas.openxmlformats.org/officeDocument/2006/bibliography" SelectedStyle="\APASixthEditionOfficeOnline.xsl" StyleName="APA" Version="6"/>
+</file>
+
+<file path=customXml/item2.xml><?xml version="1.0" encoding="utf-8"?>
 <?mso-contentType ?>
 <FormTemplates xmlns="http://schemas.microsoft.com/sharepoint/v3/contenttype/forms">
   <Display>DocumentLibraryForm</Display>
@@ -51607,16 +51633,10 @@
 </FormTemplates>
 </file>
 
-<file path=customXml/item2.xml><?xml version="1.0" encoding="utf-8"?>
-<b:Sources xmlns:b="http://schemas.openxmlformats.org/officeDocument/2006/bibliography" xmlns="http://schemas.openxmlformats.org/officeDocument/2006/bibliography" SelectedStyle="\APASixthEditionOfficeOnline.xsl" StyleName="APA" Version="6"/>
-</file>
-
 <file path=customXml/item3.xml><?xml version="1.0" encoding="utf-8"?>
-<p:properties xmlns:p="http://schemas.microsoft.com/office/2006/metadata/properties" xmlns:xsi="http://www.w3.org/2001/XMLSchema-instance" xmlns:pc="http://schemas.microsoft.com/office/infopath/2007/PartnerControls">
-  <documentManagement>
-    <_activity xmlns="1c364c2e-a9e5-4d0d-8b0c-60f96943b919" xsi:nil="true"/>
-  </documentManagement>
-</p:properties>
+<go:gDocsCustomXmlDataStorage xmlns:go="http://customooxmlschemas.google.com/" xmlns:r="http://schemas.openxmlformats.org/officeDocument/2006/relationships" uri="GoogleDocsCustomDataVersion2">
+  <go:docsCustomData xmlns:go="http://customooxmlschemas.google.com/" roundtripDataSignature="AMtx7mi65SlRJfsAaB/f5FQ/QJjSa7JTRg==">CgMxLjAyCGguZ2pkZ3hzMgloLjMwajB6bGwyCWguMWZvYjl0ZTIJaC4zem55c2g3MgloLjJldDkycDAyCGgudHlqY3d0MgloLjNkeTZ2a20yCWguMXQzaDVzZjIJaC40ZDM0b2c4MgloLjJzOGV5bzEyCWguMTdkcDh2dTIJaC4zcmRjcmpuMgloLjI2aW4xcmcyCGgubG54Yno5MgloLjM1bmt1bjI4AHIhMVB3QlM0WUsxeVpEc0RYM1hkSnRydEtfT2RVVDZQNW5I</go:docsCustomData>
+</go:gDocsCustomXmlDataStorage>
 </file>
 
 <file path=customXml/item4.xml><?xml version="1.0" encoding="utf-8"?>
@@ -51873,12 +51893,22 @@
 </file>
 
 <file path=customXml/item5.xml><?xml version="1.0" encoding="utf-8"?>
-<go:gDocsCustomXmlDataStorage xmlns:go="http://customooxmlschemas.google.com/" xmlns:r="http://schemas.openxmlformats.org/officeDocument/2006/relationships" uri="GoogleDocsCustomDataVersion2">
-  <go:docsCustomData xmlns:go="http://customooxmlschemas.google.com/" roundtripDataSignature="AMtx7mi65SlRJfsAaB/f5FQ/QJjSa7JTRg==">CgMxLjAyCGguZ2pkZ3hzMgloLjMwajB6bGwyCWguMWZvYjl0ZTIJaC4zem55c2g3MgloLjJldDkycDAyCGgudHlqY3d0MgloLjNkeTZ2a20yCWguMXQzaDVzZjIJaC40ZDM0b2c4MgloLjJzOGV5bzEyCWguMTdkcDh2dTIJaC4zcmRjcmpuMgloLjI2aW4xcmcyCGgubG54Yno5MgloLjM1bmt1bjI4AHIhMVB3QlM0WUsxeVpEc0RYM1hkSnRydEtfT2RVVDZQNW5I</go:docsCustomData>
-</go:gDocsCustomXmlDataStorage>
+<p:properties xmlns:p="http://schemas.microsoft.com/office/2006/metadata/properties" xmlns:xsi="http://www.w3.org/2001/XMLSchema-instance" xmlns:pc="http://schemas.microsoft.com/office/infopath/2007/PartnerControls">
+  <documentManagement>
+    <_activity xmlns="1c364c2e-a9e5-4d0d-8b0c-60f96943b919" xsi:nil="true"/>
+  </documentManagement>
+</p:properties>
 </file>
 
 <file path=customXml/itemProps1.xml><?xml version="1.0" encoding="utf-8"?>
+<ds:datastoreItem xmlns:ds="http://schemas.openxmlformats.org/officeDocument/2006/customXml" ds:itemID="{02C867CF-6023-4BBE-9EB8-8D3F09F43338}">
+  <ds:schemaRefs>
+    <ds:schemaRef ds:uri="http://schemas.openxmlformats.org/officeDocument/2006/bibliography"/>
+  </ds:schemaRefs>
+</ds:datastoreItem>
+</file>
+
+<file path=customXml/itemProps2.xml><?xml version="1.0" encoding="utf-8"?>
 <ds:datastoreItem xmlns:ds="http://schemas.openxmlformats.org/officeDocument/2006/customXml" ds:itemID="{DD1BD535-DABA-4752-B724-9FD5D9237B7F}">
   <ds:schemaRefs>
     <ds:schemaRef ds:uri="http://schemas.microsoft.com/sharepoint/v3/contenttype/forms"/>
@@ -51886,20 +51916,11 @@
 </ds:datastoreItem>
 </file>
 
-<file path=customXml/itemProps2.xml><?xml version="1.0" encoding="utf-8"?>
-<ds:datastoreItem xmlns:ds="http://schemas.openxmlformats.org/officeDocument/2006/customXml" ds:itemID="{02C867CF-6023-4BBE-9EB8-8D3F09F43338}">
+<file path=customXml/itemProps3.xml><?xml version="1.0" encoding="utf-8"?>
+<ds:datastoreItem xmlns:ds="http://schemas.openxmlformats.org/officeDocument/2006/customXml" ds:itemID="{11111111-1234-1234-1234-123412341234}">
   <ds:schemaRefs>
-    <ds:schemaRef ds:uri="http://schemas.openxmlformats.org/officeDocument/2006/bibliography"/>
-  </ds:schemaRefs>
-</ds:datastoreItem>
-</file>
-
-<file path=customXml/itemProps3.xml><?xml version="1.0" encoding="utf-8"?>
-<ds:datastoreItem xmlns:ds="http://schemas.openxmlformats.org/officeDocument/2006/customXml" ds:itemID="{D829E601-C5D7-4EB3-859E-E162E4261A98}">
-  <ds:schemaRefs>
-    <ds:schemaRef ds:uri="http://schemas.microsoft.com/office/2006/metadata/properties"/>
-    <ds:schemaRef ds:uri="http://schemas.microsoft.com/office/infopath/2007/PartnerControls"/>
-    <ds:schemaRef ds:uri="1c364c2e-a9e5-4d0d-8b0c-60f96943b919"/>
+    <ds:schemaRef ds:uri="http://customooxmlschemas.google.com/"/>
+    <ds:schemaRef ds:uri="http://schemas.openxmlformats.org/officeDocument/2006/relationships"/>
   </ds:schemaRefs>
 </ds:datastoreItem>
 </file>
@@ -51924,10 +51945,11 @@
 </file>
 
 <file path=customXml/itemProps5.xml><?xml version="1.0" encoding="utf-8"?>
-<ds:datastoreItem xmlns:ds="http://schemas.openxmlformats.org/officeDocument/2006/customXml" ds:itemID="{11111111-1234-1234-1234-123412341234}">
+<ds:datastoreItem xmlns:ds="http://schemas.openxmlformats.org/officeDocument/2006/customXml" ds:itemID="{D829E601-C5D7-4EB3-859E-E162E4261A98}">
   <ds:schemaRefs>
-    <ds:schemaRef ds:uri="http://customooxmlschemas.google.com/"/>
-    <ds:schemaRef ds:uri="http://schemas.openxmlformats.org/officeDocument/2006/relationships"/>
+    <ds:schemaRef ds:uri="http://schemas.microsoft.com/office/2006/metadata/properties"/>
+    <ds:schemaRef ds:uri="http://schemas.microsoft.com/office/infopath/2007/PartnerControls"/>
+    <ds:schemaRef ds:uri="1c364c2e-a9e5-4d0d-8b0c-60f96943b919"/>
   </ds:schemaRefs>
 </ds:datastoreItem>
 </file>
</xml_diff>

<commit_message>
add cambios en adjudicaciones
</commit_message>
<xml_diff>
--- a/Features/CostsModule/Features/AdjudicacionesFeature/Templates/plantilla_instalacion_con_placeholders.docx
+++ b/Features/CostsModule/Features/AdjudicacionesFeature/Templates/plantilla_instalacion_con_placeholders.docx
@@ -356,7 +356,7 @@
           <w:szCs w:val="24"/>
         </w:rPr>
         <w:tab/>
-        <w:t xml:space="preserve">{{MONTO}} </w:t>
+        <w:t>{{MONTO</w:t>
       </w:r>
       <w:r>
         <w:rPr>
@@ -364,9 +364,17 @@
           <w:color w:val="000000"/>
           <w:sz w:val="24"/>
           <w:szCs w:val="24"/>
-          <w:lang w:val="es-ES"/>
-        </w:rPr>
-        <w:t>incluido IGV</w:t>
+        </w:rPr>
+        <w:t>_CON_IGV</w:t>
+      </w:r>
+      <w:r>
+        <w:rPr>
+          <w:rFonts w:ascii="Calibri" w:eastAsia="Calibri" w:hAnsi="Calibri" w:cs="Calibri"/>
+          <w:color w:val="000000"/>
+          <w:sz w:val="24"/>
+          <w:szCs w:val="24"/>
+        </w:rPr>
+        <w:t>}}</w:t>
       </w:r>
     </w:p>
     <w:p>
@@ -518,29 +526,7 @@
           <w:szCs w:val="24"/>
           <w:lang w:val="es-ES"/>
         </w:rPr>
-        <w:t xml:space="preserve">                       </w:t>
-      </w:r>
-      <w:proofErr w:type="gramStart"/>
-      <w:r>
-        <w:rPr>
-          <w:rFonts w:ascii="Calibri" w:eastAsia="Calibri" w:hAnsi="Calibri" w:cs="Calibri"/>
-          <w:color w:val="000000" w:themeColor="text1"/>
-          <w:sz w:val="24"/>
-          <w:szCs w:val="24"/>
-          <w:lang w:val="es-ES"/>
-        </w:rPr>
-        <w:t xml:space="preserve">   (</w:t>
-      </w:r>
-      <w:proofErr w:type="gramEnd"/>
-      <w:r>
-        <w:rPr>
-          <w:rFonts w:ascii="Calibri" w:eastAsia="Calibri" w:hAnsi="Calibri" w:cs="Calibri"/>
-          <w:color w:val="000000" w:themeColor="text1"/>
-          <w:sz w:val="24"/>
-          <w:szCs w:val="24"/>
-          <w:lang w:val="es-ES"/>
-        </w:rPr>
-        <w:t xml:space="preserve">0.1% diario) </w:t>
+        <w:t xml:space="preserve">                          (0.1% diario) </w:t>
       </w:r>
     </w:p>
     <w:p>
@@ -716,9 +702,7 @@
           <w:szCs w:val="24"/>
         </w:rPr>
         <w:tab/>
-        <w:t xml:space="preserve">PAGARÉ </w:t>
-      </w:r>
-      <w:proofErr w:type="spellStart"/>
+      </w:r>
       <w:r>
         <w:rPr>
           <w:rFonts w:ascii="Calibri" w:eastAsia="Calibri" w:hAnsi="Calibri" w:cs="Calibri"/>
@@ -726,37 +710,7 @@
           <w:sz w:val="24"/>
           <w:szCs w:val="24"/>
         </w:rPr>
-        <w:t>N°</w:t>
-      </w:r>
-      <w:proofErr w:type="spellEnd"/>
-      <w:r>
-        <w:rPr>
-          <w:rFonts w:ascii="Calibri" w:eastAsia="Calibri" w:hAnsi="Calibri" w:cs="Calibri"/>
-          <w:color w:val="000000"/>
-          <w:sz w:val="24"/>
-          <w:szCs w:val="24"/>
-        </w:rPr>
-        <w:t>{{NUM_PAGARE</w:t>
-      </w:r>
-      <w:proofErr w:type="gramStart"/>
-      <w:r>
-        <w:rPr>
-          <w:rFonts w:ascii="Calibri" w:eastAsia="Calibri" w:hAnsi="Calibri" w:cs="Calibri"/>
-          <w:color w:val="000000"/>
-          <w:sz w:val="24"/>
-          <w:szCs w:val="24"/>
-        </w:rPr>
-        <w:t>}}{</w:t>
-      </w:r>
-      <w:proofErr w:type="gramEnd"/>
-      <w:r>
-        <w:rPr>
-          <w:rFonts w:ascii="Calibri" w:eastAsia="Calibri" w:hAnsi="Calibri" w:cs="Calibri"/>
-          <w:color w:val="000000"/>
-          <w:sz w:val="24"/>
-          <w:szCs w:val="24"/>
-        </w:rPr>
-        <w:t>{PROYECTO_ABREVIATURA}}-{{AÑO_ACTUAL}} Y LETRA DE GARANTÍA</w:t>
+        <w:t>{{TIPO_DOCUMENTO_GARANTÍA}}</w:t>
       </w:r>
     </w:p>
     <w:p>
@@ -50644,6 +50598,7 @@
   <w:style w:type="character" w:default="1" w:styleId="Fuentedeprrafopredeter">
     <w:name w:val="Default Paragraph Font"/>
     <w:uiPriority w:val="1"/>
+    <w:semiHidden/>
     <w:unhideWhenUsed/>
   </w:style>
   <w:style w:type="table" w:default="1" w:styleId="Tablanormal">

</xml_diff>

<commit_message>
add ajustes a adjudicaciones
</commit_message>
<xml_diff>
--- a/Features/CostsModule/Features/AdjudicacionesFeature/Templates/plantilla_instalacion_con_placeholders.docx
+++ b/Features/CostsModule/Features/AdjudicacionesFeature/Templates/plantilla_instalacion_con_placeholders.docx
@@ -305,7 +305,6 @@
           <w:lang w:val="es-ES"/>
         </w:rPr>
       </w:pPr>
-      <w:proofErr w:type="gramStart"/>
       <w:r>
         <w:rPr>
           <w:rFonts w:ascii="Calibri" w:eastAsia="Calibri" w:hAnsi="Calibri" w:cs="Calibri"/>
@@ -314,18 +313,7 @@
           <w:szCs w:val="24"/>
           <w:lang w:val="es-ES"/>
         </w:rPr>
-        <w:t>Precio a pagar</w:t>
-      </w:r>
-      <w:proofErr w:type="gramEnd"/>
-      <w:r>
-        <w:rPr>
-          <w:rFonts w:ascii="Calibri" w:eastAsia="Calibri" w:hAnsi="Calibri" w:cs="Calibri"/>
-          <w:color w:val="000000"/>
-          <w:sz w:val="24"/>
-          <w:szCs w:val="24"/>
-          <w:lang w:val="es-ES"/>
-        </w:rPr>
-        <w:t xml:space="preserve"> por </w:t>
+        <w:t xml:space="preserve">Precio a pagar por </w:t>
       </w:r>
       <w:r>
         <w:rPr>
@@ -783,29 +771,7 @@
           <w:szCs w:val="24"/>
           <w:lang w:val="es-ES"/>
         </w:rPr>
-        <w:t xml:space="preserve">                      </w:t>
-      </w:r>
-      <w:proofErr w:type="gramStart"/>
-      <w:r>
-        <w:rPr>
-          <w:rFonts w:ascii="Calibri" w:eastAsia="Calibri" w:hAnsi="Calibri" w:cs="Calibri"/>
-          <w:color w:val="000000" w:themeColor="text1"/>
-          <w:sz w:val="24"/>
-          <w:szCs w:val="24"/>
-          <w:lang w:val="es-ES"/>
-        </w:rPr>
-        <w:t xml:space="preserve">   {</w:t>
-      </w:r>
-      <w:proofErr w:type="gramEnd"/>
-      <w:r>
-        <w:rPr>
-          <w:rFonts w:ascii="Calibri" w:eastAsia="Calibri" w:hAnsi="Calibri" w:cs="Calibri"/>
-          <w:color w:val="000000" w:themeColor="text1"/>
-          <w:sz w:val="24"/>
-          <w:szCs w:val="24"/>
-          <w:lang w:val="es-ES"/>
-        </w:rPr>
-        <w:t>{ADVANCE_AMOUNT}} Inc. IGV</w:t>
+        <w:t xml:space="preserve">                         {{ADVANCE_AMOUNT}} Inc. IGV</w:t>
       </w:r>
     </w:p>
     <w:p>
@@ -1031,7 +997,17 @@
           <w:szCs w:val="24"/>
           <w:lang w:val="es-ES"/>
         </w:rPr>
-        <w:t xml:space="preserve">             Semanal</w:t>
+        <w:t xml:space="preserve">             </w:t>
+      </w:r>
+      <w:r>
+        <w:rPr>
+          <w:rFonts w:ascii="Calibri" w:eastAsia="Calibri" w:hAnsi="Calibri" w:cs="Calibri"/>
+          <w:color w:val="000000"/>
+          <w:sz w:val="24"/>
+          <w:szCs w:val="24"/>
+          <w:lang w:val="es-ES"/>
+        </w:rPr>
+        <w:t>{{FORMA_DE_VALORIZACIÓN}}</w:t>
       </w:r>
     </w:p>
     <w:p>
@@ -33987,7 +33963,53 @@
           <w:sz w:val="18"/>
           <w:szCs w:val="18"/>
         </w:rPr>
+        <w:t>&lt;&lt;INSERTAR_ORDEN_DE_SERVICIO_AQUI&gt;&gt;</w:t>
+      </w:r>
+    </w:p>
+    <w:p>
+      <w:pPr>
+        <w:ind w:left="0" w:firstLine="0"/>
+        <w:jc w:val="center"/>
+        <w:rPr>
+          <w:rFonts w:ascii="Arial Narrow" w:eastAsia="Arial Narrow" w:hAnsi="Arial Narrow" w:cs="Arial Narrow"/>
+          <w:b/>
+          <w:color w:val="FFFFFF" w:themeColor="background1"/>
+          <w:sz w:val="18"/>
+          <w:szCs w:val="18"/>
+        </w:rPr>
+      </w:pPr>
+      <w:r>
+        <w:rPr>
+          <w:rFonts w:ascii="Arial Narrow" w:eastAsia="Arial Narrow" w:hAnsi="Arial Narrow" w:cs="Arial Narrow"/>
+          <w:b/>
+          <w:color w:val="FFFFFF" w:themeColor="background1"/>
+          <w:sz w:val="18"/>
+          <w:szCs w:val="18"/>
+        </w:rPr>
         <w:t>&lt;&lt;INSERTAR_COTIZACION_AQUI&gt;&gt;</w:t>
+      </w:r>
+    </w:p>
+    <w:p>
+      <w:pPr>
+        <w:ind w:left="0" w:firstLine="0"/>
+        <w:jc w:val="center"/>
+        <w:rPr>
+          <w:rFonts w:ascii="Arial Narrow" w:eastAsia="Arial Narrow" w:hAnsi="Arial Narrow" w:cs="Arial Narrow"/>
+          <w:b/>
+          <w:color w:val="FFFFFF" w:themeColor="background1"/>
+          <w:sz w:val="18"/>
+          <w:szCs w:val="18"/>
+        </w:rPr>
+      </w:pPr>
+      <w:r>
+        <w:rPr>
+          <w:rFonts w:ascii="Arial Narrow" w:eastAsia="Arial Narrow" w:hAnsi="Arial Narrow" w:cs="Arial Narrow"/>
+          <w:b/>
+          <w:color w:val="FFFFFF" w:themeColor="background1"/>
+          <w:sz w:val="18"/>
+          <w:szCs w:val="18"/>
+        </w:rPr>
+        <w:t>&lt;&lt;INSERTAR_FICHA_TÉCNICA_AQUI&gt;&gt;</w:t>
       </w:r>
     </w:p>
     <w:p>
@@ -34075,6 +34097,29 @@
           <w:szCs w:val="18"/>
         </w:rPr>
         <w:t>(por semanas y visado por el Residente de Obra)</w:t>
+      </w:r>
+    </w:p>
+    <w:p>
+      <w:pPr>
+        <w:ind w:left="0" w:firstLine="0"/>
+        <w:jc w:val="center"/>
+        <w:rPr>
+          <w:rFonts w:ascii="Arial Narrow" w:eastAsia="Arial Narrow" w:hAnsi="Arial Narrow" w:cs="Arial Narrow"/>
+          <w:b/>
+          <w:color w:val="FFFFFF" w:themeColor="background1"/>
+          <w:sz w:val="18"/>
+          <w:szCs w:val="18"/>
+        </w:rPr>
+      </w:pPr>
+      <w:r>
+        <w:rPr>
+          <w:rFonts w:ascii="Arial Narrow" w:eastAsia="Arial Narrow" w:hAnsi="Arial Narrow" w:cs="Arial Narrow"/>
+          <w:b/>
+          <w:color w:val="FFFFFF" w:themeColor="background1"/>
+          <w:sz w:val="18"/>
+          <w:szCs w:val="18"/>
+        </w:rPr>
+        <w:t>&lt;&lt;INSERTAR_CRONOGRAMA_AQUI&gt;&gt;</w:t>
       </w:r>
     </w:p>
     <w:p>
@@ -51576,10 +51621,18 @@
 </file>
 
 <file path=customXml/item1.xml><?xml version="1.0" encoding="utf-8"?>
+<p:properties xmlns:p="http://schemas.microsoft.com/office/2006/metadata/properties" xmlns:xsi="http://www.w3.org/2001/XMLSchema-instance" xmlns:pc="http://schemas.microsoft.com/office/infopath/2007/PartnerControls">
+  <documentManagement>
+    <_activity xmlns="1c364c2e-a9e5-4d0d-8b0c-60f96943b919" xsi:nil="true"/>
+  </documentManagement>
+</p:properties>
+</file>
+
+<file path=customXml/item2.xml><?xml version="1.0" encoding="utf-8"?>
 <b:Sources xmlns:b="http://schemas.openxmlformats.org/officeDocument/2006/bibliography" xmlns="http://schemas.openxmlformats.org/officeDocument/2006/bibliography" SelectedStyle="\APASixthEditionOfficeOnline.xsl" StyleName="APA" Version="6"/>
 </file>
 
-<file path=customXml/item2.xml><?xml version="1.0" encoding="utf-8"?>
+<file path=customXml/item3.xml><?xml version="1.0" encoding="utf-8"?>
 <?mso-contentType ?>
 <FormTemplates xmlns="http://schemas.microsoft.com/sharepoint/v3/contenttype/forms">
   <Display>DocumentLibraryForm</Display>
@@ -51588,13 +51641,13 @@
 </FormTemplates>
 </file>
 
-<file path=customXml/item3.xml><?xml version="1.0" encoding="utf-8"?>
+<file path=customXml/item4.xml><?xml version="1.0" encoding="utf-8"?>
 <go:gDocsCustomXmlDataStorage xmlns:go="http://customooxmlschemas.google.com/" xmlns:r="http://schemas.openxmlformats.org/officeDocument/2006/relationships" uri="GoogleDocsCustomDataVersion2">
   <go:docsCustomData xmlns:go="http://customooxmlschemas.google.com/" roundtripDataSignature="AMtx7mi65SlRJfsAaB/f5FQ/QJjSa7JTRg==">CgMxLjAyCGguZ2pkZ3hzMgloLjMwajB6bGwyCWguMWZvYjl0ZTIJaC4zem55c2g3MgloLjJldDkycDAyCGgudHlqY3d0MgloLjNkeTZ2a20yCWguMXQzaDVzZjIJaC40ZDM0b2c4MgloLjJzOGV5bzEyCWguMTdkcDh2dTIJaC4zcmRjcmpuMgloLjI2aW4xcmcyCGgubG54Yno5MgloLjM1bmt1bjI4AHIhMVB3QlM0WUsxeVpEc0RYM1hkSnRydEtfT2RVVDZQNW5I</go:docsCustomData>
 </go:gDocsCustomXmlDataStorage>
 </file>
 
-<file path=customXml/item4.xml><?xml version="1.0" encoding="utf-8"?>
+<file path=customXml/item5.xml><?xml version="1.0" encoding="utf-8"?>
 <ct:contentTypeSchema xmlns:ct="http://schemas.microsoft.com/office/2006/metadata/contentType" xmlns:ma="http://schemas.microsoft.com/office/2006/metadata/properties/metaAttributes" ct:_="" ma:_="" ma:contentTypeName="Document" ma:contentTypeID="0x01010063B0DD29DB0EF346B1F1544CEBE0D2A7" ma:contentTypeVersion="18" ma:contentTypeDescription="Create a new document." ma:contentTypeScope="" ma:versionID="f944625a855169ca68f7a121b194bb92">
   <xsd:schema xmlns:xsd="http://www.w3.org/2001/XMLSchema" xmlns:xs="http://www.w3.org/2001/XMLSchema" xmlns:p="http://schemas.microsoft.com/office/2006/metadata/properties" xmlns:ns3="1c364c2e-a9e5-4d0d-8b0c-60f96943b919" xmlns:ns4="65ea09c1-7372-4828-95fe-f2a9534e8332" targetNamespace="http://schemas.microsoft.com/office/2006/metadata/properties" ma:root="true" ma:fieldsID="205ea4d9cf7dc04f23d4fe395e4eb5de" ns3:_="" ns4:_="">
     <xsd:import namespace="1c364c2e-a9e5-4d0d-8b0c-60f96943b919"/>
@@ -51847,15 +51900,17 @@
 </ct:contentTypeSchema>
 </file>
 
-<file path=customXml/item5.xml><?xml version="1.0" encoding="utf-8"?>
-<p:properties xmlns:p="http://schemas.microsoft.com/office/2006/metadata/properties" xmlns:xsi="http://www.w3.org/2001/XMLSchema-instance" xmlns:pc="http://schemas.microsoft.com/office/infopath/2007/PartnerControls">
-  <documentManagement>
-    <_activity xmlns="1c364c2e-a9e5-4d0d-8b0c-60f96943b919" xsi:nil="true"/>
-  </documentManagement>
-</p:properties>
+<file path=customXml/itemProps1.xml><?xml version="1.0" encoding="utf-8"?>
+<ds:datastoreItem xmlns:ds="http://schemas.openxmlformats.org/officeDocument/2006/customXml" ds:itemID="{D829E601-C5D7-4EB3-859E-E162E4261A98}">
+  <ds:schemaRefs>
+    <ds:schemaRef ds:uri="http://schemas.microsoft.com/office/2006/metadata/properties"/>
+    <ds:schemaRef ds:uri="http://schemas.microsoft.com/office/infopath/2007/PartnerControls"/>
+    <ds:schemaRef ds:uri="1c364c2e-a9e5-4d0d-8b0c-60f96943b919"/>
+  </ds:schemaRefs>
+</ds:datastoreItem>
 </file>
 
-<file path=customXml/itemProps1.xml><?xml version="1.0" encoding="utf-8"?>
+<file path=customXml/itemProps2.xml><?xml version="1.0" encoding="utf-8"?>
 <ds:datastoreItem xmlns:ds="http://schemas.openxmlformats.org/officeDocument/2006/customXml" ds:itemID="{02C867CF-6023-4BBE-9EB8-8D3F09F43338}">
   <ds:schemaRefs>
     <ds:schemaRef ds:uri="http://schemas.openxmlformats.org/officeDocument/2006/bibliography"/>
@@ -51863,7 +51918,7 @@
 </ds:datastoreItem>
 </file>
 
-<file path=customXml/itemProps2.xml><?xml version="1.0" encoding="utf-8"?>
+<file path=customXml/itemProps3.xml><?xml version="1.0" encoding="utf-8"?>
 <ds:datastoreItem xmlns:ds="http://schemas.openxmlformats.org/officeDocument/2006/customXml" ds:itemID="{DD1BD535-DABA-4752-B724-9FD5D9237B7F}">
   <ds:schemaRefs>
     <ds:schemaRef ds:uri="http://schemas.microsoft.com/sharepoint/v3/contenttype/forms"/>
@@ -51871,7 +51926,7 @@
 </ds:datastoreItem>
 </file>
 
-<file path=customXml/itemProps3.xml><?xml version="1.0" encoding="utf-8"?>
+<file path=customXml/itemProps4.xml><?xml version="1.0" encoding="utf-8"?>
 <ds:datastoreItem xmlns:ds="http://schemas.openxmlformats.org/officeDocument/2006/customXml" ds:itemID="{11111111-1234-1234-1234-123412341234}">
   <ds:schemaRefs>
     <ds:schemaRef ds:uri="http://customooxmlschemas.google.com/"/>
@@ -51880,7 +51935,7 @@
 </ds:datastoreItem>
 </file>
 
-<file path=customXml/itemProps4.xml><?xml version="1.0" encoding="utf-8"?>
+<file path=customXml/itemProps5.xml><?xml version="1.0" encoding="utf-8"?>
 <ds:datastoreItem xmlns:ds="http://schemas.openxmlformats.org/officeDocument/2006/customXml" ds:itemID="{F24A4505-FFC0-4551-A77A-5910F586F04D}">
   <ds:schemaRefs>
     <ds:schemaRef ds:uri="http://schemas.microsoft.com/office/2006/metadata/contentType"/>
@@ -51897,14 +51952,4 @@
     <ds:schemaRef ds:uri="http://schemas.microsoft.com/internal/obd"/>
   </ds:schemaRefs>
 </ds:datastoreItem>
-</file>
-
-<file path=customXml/itemProps5.xml><?xml version="1.0" encoding="utf-8"?>
-<ds:datastoreItem xmlns:ds="http://schemas.openxmlformats.org/officeDocument/2006/customXml" ds:itemID="{D829E601-C5D7-4EB3-859E-E162E4261A98}">
-  <ds:schemaRefs>
-    <ds:schemaRef ds:uri="http://schemas.microsoft.com/office/2006/metadata/properties"/>
-    <ds:schemaRef ds:uri="http://schemas.microsoft.com/office/infopath/2007/PartnerControls"/>
-    <ds:schemaRef ds:uri="1c364c2e-a9e5-4d0d-8b0c-60f96943b919"/>
-  </ds:schemaRefs>
-</ds:datastoreItem>
 </file>
</xml_diff>

<commit_message>
add ajustes en adjudicaciones
</commit_message>
<xml_diff>
--- a/Features/CostsModule/Features/AdjudicacionesFeature/Templates/plantilla_instalacion_con_placeholders.docx
+++ b/Features/CostsModule/Features/AdjudicacionesFeature/Templates/plantilla_instalacion_con_placeholders.docx
@@ -1098,33 +1098,7 @@
           <w:u w:val="single"/>
           <w:lang w:val="es-ES"/>
         </w:rPr>
-        <w:t>{{NUM_CONTRATO</w:t>
-      </w:r>
-      <w:proofErr w:type="gramStart"/>
-      <w:r>
-        <w:rPr>
-          <w:rFonts w:ascii="Arial Narrow" w:eastAsia="Arial Narrow" w:hAnsi="Arial Narrow" w:cs="Arial Narrow"/>
-          <w:b/>
-          <w:color w:val="000000"/>
-          <w:sz w:val="18"/>
-          <w:szCs w:val="18"/>
-          <w:u w:val="single"/>
-          <w:lang w:val="es-ES"/>
-        </w:rPr>
-        <w:t>}}{</w:t>
-      </w:r>
-      <w:proofErr w:type="gramEnd"/>
-      <w:r>
-        <w:rPr>
-          <w:rFonts w:ascii="Arial Narrow" w:eastAsia="Arial Narrow" w:hAnsi="Arial Narrow" w:cs="Arial Narrow"/>
-          <w:b/>
-          <w:color w:val="000000"/>
-          <w:sz w:val="18"/>
-          <w:szCs w:val="18"/>
-          <w:u w:val="single"/>
-          <w:lang w:val="es-ES"/>
-        </w:rPr>
-        <w:t>{PROYECTO_ABREVIATURA}}-{{AÑO_ACTUAL}} A {{TIPO_CONTRATO}} POR EL {{PARTIDA}}</w:t>
+        <w:t>{{NUM_CONTRATO}}{{PROYECTO_ABREVIATURA}}-{{AÑO_ACTUAL}} A {{TIPO_CONTRATO}} POR EL {{PARTIDA}}</w:t>
       </w:r>
     </w:p>
     <w:p>
@@ -1204,31 +1178,7 @@
           <w:szCs w:val="18"/>
           <w:lang w:val="es-ES"/>
         </w:rPr>
-        <w:t>. {{NUM_CONTRATO</w:t>
-      </w:r>
-      <w:proofErr w:type="gramStart"/>
-      <w:r>
-        <w:rPr>
-          <w:rFonts w:ascii="Arial Narrow" w:eastAsia="Arial Narrow" w:hAnsi="Arial Narrow" w:cs="Arial Narrow"/>
-          <w:b/>
-          <w:bCs/>
-          <w:sz w:val="18"/>
-          <w:szCs w:val="18"/>
-          <w:lang w:val="es-ES"/>
-        </w:rPr>
-        <w:t>}}{</w:t>
-      </w:r>
-      <w:proofErr w:type="gramEnd"/>
-      <w:r>
-        <w:rPr>
-          <w:rFonts w:ascii="Arial Narrow" w:eastAsia="Arial Narrow" w:hAnsi="Arial Narrow" w:cs="Arial Narrow"/>
-          <w:b/>
-          <w:bCs/>
-          <w:sz w:val="18"/>
-          <w:szCs w:val="18"/>
-          <w:lang w:val="es-ES"/>
-        </w:rPr>
-        <w:t>{PROYECTO_ABREVIATURA}}-{{AÑO_ACTUAL}} A {{TIPO_CONTRATO}}</w:t>
+        <w:t>. {{NUM_CONTRATO}}{{PROYECTO_ABREVIATURA}}-{{AÑO_ACTUAL}} A {{TIPO_CONTRATO}}</w:t>
       </w:r>
       <w:r>
         <w:rPr>
@@ -1761,25 +1711,7 @@
           <w:sz w:val="18"/>
           <w:szCs w:val="18"/>
         </w:rPr>
-        <w:t xml:space="preserve"> el mismo que será ejecutado en un terreno de su propiedad ubicado en Av. Máximo </w:t>
-      </w:r>
-      <w:proofErr w:type="gramStart"/>
-      <w:r>
-        <w:rPr>
-          <w:rFonts w:ascii="Arial Narrow" w:eastAsia="Arial Narrow" w:hAnsi="Arial Narrow" w:cs="Arial Narrow"/>
-          <w:sz w:val="18"/>
-          <w:szCs w:val="18"/>
-        </w:rPr>
-        <w:t>Abril</w:t>
-      </w:r>
-      <w:proofErr w:type="gramEnd"/>
-      <w:r>
-        <w:rPr>
-          <w:rFonts w:ascii="Arial Narrow" w:eastAsia="Arial Narrow" w:hAnsi="Arial Narrow" w:cs="Arial Narrow"/>
-          <w:sz w:val="18"/>
-          <w:szCs w:val="18"/>
-        </w:rPr>
-        <w:t xml:space="preserve"> 576, distrito de Jesús María, provincia y departamento de Lima.</w:t>
+        <w:t xml:space="preserve"> el mismo que será ejecutado en un terreno de su propiedad ubicado en Av. Máximo Abril 576, distrito de Jesús María, provincia y departamento de Lima.</w:t>
       </w:r>
     </w:p>
     <w:p>
@@ -2777,29 +2709,7 @@
           <w:szCs w:val="18"/>
           <w:lang w:val="es-ES"/>
         </w:rPr>
-        <w:t xml:space="preserve"> podrá ordenar por escrito, </w:t>
-      </w:r>
-      <w:proofErr w:type="gramStart"/>
-      <w:r>
-        <w:rPr>
-          <w:rFonts w:ascii="Arial Narrow" w:eastAsia="Arial Narrow" w:hAnsi="Arial Narrow" w:cs="Arial Narrow"/>
-          <w:color w:val="000000" w:themeColor="text1"/>
-          <w:sz w:val="18"/>
-          <w:szCs w:val="18"/>
-          <w:lang w:val="es-ES"/>
-        </w:rPr>
-        <w:t>de acuerdo a</w:t>
-      </w:r>
-      <w:proofErr w:type="gramEnd"/>
-      <w:r>
-        <w:rPr>
-          <w:rFonts w:ascii="Arial Narrow" w:eastAsia="Arial Narrow" w:hAnsi="Arial Narrow" w:cs="Arial Narrow"/>
-          <w:color w:val="000000" w:themeColor="text1"/>
-          <w:sz w:val="18"/>
-          <w:szCs w:val="18"/>
-          <w:lang w:val="es-ES"/>
-        </w:rPr>
-        <w:t xml:space="preserve"> lo establecido en el numeral precedente, cuando lo estime conveniente, la ejecución de variaciones en </w:t>
+        <w:t xml:space="preserve"> podrá ordenar por escrito, de acuerdo a lo establecido en el numeral precedente, cuando lo estime conveniente, la ejecución de variaciones en </w:t>
       </w:r>
       <w:r>
         <w:rPr>
@@ -5475,29 +5385,7 @@
           <w:szCs w:val="18"/>
           <w:lang w:val="es-ES"/>
         </w:rPr>
-        <w:t xml:space="preserve">se obliga a realizar los exámenes médicos correspondientes para todo el personal bajo su cargo según corresponda, </w:t>
-      </w:r>
-      <w:proofErr w:type="gramStart"/>
-      <w:r>
-        <w:rPr>
-          <w:rFonts w:ascii="Arial Narrow" w:eastAsia="Arial Narrow" w:hAnsi="Arial Narrow" w:cs="Arial Narrow"/>
-          <w:color w:val="000000" w:themeColor="text1"/>
-          <w:sz w:val="18"/>
-          <w:szCs w:val="18"/>
-          <w:lang w:val="es-ES"/>
-        </w:rPr>
-        <w:t>de acuerdo a</w:t>
-      </w:r>
-      <w:proofErr w:type="gramEnd"/>
-      <w:r>
-        <w:rPr>
-          <w:rFonts w:ascii="Arial Narrow" w:eastAsia="Arial Narrow" w:hAnsi="Arial Narrow" w:cs="Arial Narrow"/>
-          <w:color w:val="000000" w:themeColor="text1"/>
-          <w:sz w:val="18"/>
-          <w:szCs w:val="18"/>
-          <w:lang w:val="es-ES"/>
-        </w:rPr>
-        <w:t xml:space="preserve"> ley, contra liquidación del trabajo realizado y devolución del fondo de garantía, bajo cuenta y costo propio.</w:t>
+        <w:t>se obliga a realizar los exámenes médicos correspondientes para todo el personal bajo su cargo según corresponda, de acuerdo a ley, contra liquidación del trabajo realizado y devolución del fondo de garantía, bajo cuenta y costo propio.</w:t>
       </w:r>
     </w:p>
     <w:p>
@@ -8172,51 +8060,7 @@
           <w:szCs w:val="18"/>
           <w:lang w:val="es-ES"/>
         </w:rPr>
-        <w:t xml:space="preserve"> deberá participar de las reuniones semanales en obra con un representante que tenga poder de decisión, la no participación a dichas reuniones será penalizado con S/.1,000 (Un mil Soles), por un TOPE MÁXIMO DEL 10% del monto total del presente contrato. El horario de las reuniones semanales será pactado por el Residente de Obra. Asimismo, el gerente deberá asistir a por lo menos una reunión cada 15 días. De no presentarse en ese </w:t>
-      </w:r>
-      <w:proofErr w:type="gramStart"/>
-      <w:r>
-        <w:rPr>
-          <w:rFonts w:ascii="Arial Narrow" w:eastAsia="Arial Narrow" w:hAnsi="Arial Narrow" w:cs="Arial Narrow"/>
-          <w:color w:val="000000" w:themeColor="text1"/>
-          <w:sz w:val="18"/>
-          <w:szCs w:val="18"/>
-          <w:lang w:val="es-ES"/>
-        </w:rPr>
-        <w:t>lapso de tiempo</w:t>
-      </w:r>
-      <w:proofErr w:type="gramEnd"/>
-      <w:r>
-        <w:rPr>
-          <w:rFonts w:ascii="Arial Narrow" w:eastAsia="Arial Narrow" w:hAnsi="Arial Narrow" w:cs="Arial Narrow"/>
-          <w:color w:val="000000" w:themeColor="text1"/>
-          <w:sz w:val="18"/>
-          <w:szCs w:val="18"/>
-          <w:lang w:val="es-ES"/>
-        </w:rPr>
-        <w:t>, será penalizado con S/.1,000 (</w:t>
-      </w:r>
-      <w:proofErr w:type="gramStart"/>
-      <w:r>
-        <w:rPr>
-          <w:rFonts w:ascii="Arial Narrow" w:eastAsia="Arial Narrow" w:hAnsi="Arial Narrow" w:cs="Arial Narrow"/>
-          <w:color w:val="000000" w:themeColor="text1"/>
-          <w:sz w:val="18"/>
-          <w:szCs w:val="18"/>
-          <w:lang w:val="es-ES"/>
-        </w:rPr>
-        <w:t>Un mil soles</w:t>
-      </w:r>
-      <w:proofErr w:type="gramEnd"/>
-      <w:r>
-        <w:rPr>
-          <w:rFonts w:ascii="Arial Narrow" w:eastAsia="Arial Narrow" w:hAnsi="Arial Narrow" w:cs="Arial Narrow"/>
-          <w:color w:val="000000" w:themeColor="text1"/>
-          <w:sz w:val="18"/>
-          <w:szCs w:val="18"/>
-          <w:lang w:val="es-ES"/>
-        </w:rPr>
-        <w:t>).</w:t>
+        <w:t xml:space="preserve"> deberá participar de las reuniones semanales en obra con un representante que tenga poder de decisión, la no participación a dichas reuniones será penalizado con S/.1,000 (Un mil Soles), por un TOPE MÁXIMO DEL 10% del monto total del presente contrato. El horario de las reuniones semanales será pactado por el Residente de Obra. Asimismo, el gerente deberá asistir a por lo menos una reunión cada 15 días. De no presentarse en ese lapso de tiempo, será penalizado con S/.1,000 (Un mil soles).</w:t>
       </w:r>
     </w:p>
     <w:p>
@@ -9223,29 +9067,7 @@
           <w:szCs w:val="18"/>
           <w:lang w:val="es-ES"/>
         </w:rPr>
-        <w:t xml:space="preserve"> no cumpliera por responsabilidad, omisión y/ o deficiencias propias con el frente parcial establecido, este será penalizado </w:t>
-      </w:r>
-      <w:proofErr w:type="gramStart"/>
-      <w:r>
-        <w:rPr>
-          <w:rFonts w:ascii="Arial Narrow" w:eastAsia="Arial Narrow" w:hAnsi="Arial Narrow" w:cs="Arial Narrow"/>
-          <w:color w:val="000000" w:themeColor="text1"/>
-          <w:sz w:val="18"/>
-          <w:szCs w:val="18"/>
-          <w:lang w:val="es-ES"/>
-        </w:rPr>
-        <w:t>de acuerdo a</w:t>
-      </w:r>
-      <w:proofErr w:type="gramEnd"/>
-      <w:r>
-        <w:rPr>
-          <w:rFonts w:ascii="Arial Narrow" w:eastAsia="Arial Narrow" w:hAnsi="Arial Narrow" w:cs="Arial Narrow"/>
-          <w:color w:val="000000" w:themeColor="text1"/>
-          <w:sz w:val="18"/>
-          <w:szCs w:val="18"/>
-          <w:lang w:val="es-ES"/>
-        </w:rPr>
-        <w:t xml:space="preserve"> lo establecido en la Orden de Trabajo hasta un máximo de 30% del total contratado.</w:t>
+        <w:t xml:space="preserve"> no cumpliera por responsabilidad, omisión y/ o deficiencias propias con el frente parcial establecido, este será penalizado de acuerdo a lo establecido en la Orden de Trabajo hasta un máximo de 30% del total contratado.</w:t>
       </w:r>
     </w:p>
     <w:p>
@@ -9357,51 +9179,7 @@
           <w:szCs w:val="18"/>
           <w:lang w:val="es-ES"/>
         </w:rPr>
-        <w:t xml:space="preserve">se presentara déficit de personal y/o herramientas idóneas para continuar con la ejecución de la obra encargada y no se pudiera presentar el avance de </w:t>
-      </w:r>
-      <w:proofErr w:type="gramStart"/>
-      <w:r>
-        <w:rPr>
-          <w:rFonts w:ascii="Arial Narrow" w:eastAsia="Arial Narrow" w:hAnsi="Arial Narrow" w:cs="Arial Narrow"/>
-          <w:color w:val="000000" w:themeColor="text1"/>
-          <w:sz w:val="18"/>
-          <w:szCs w:val="18"/>
-          <w:lang w:val="es-ES"/>
-        </w:rPr>
-        <w:t>la misma</w:t>
-      </w:r>
-      <w:proofErr w:type="gramEnd"/>
-      <w:r>
-        <w:rPr>
-          <w:rFonts w:ascii="Arial Narrow" w:eastAsia="Arial Narrow" w:hAnsi="Arial Narrow" w:cs="Arial Narrow"/>
-          <w:color w:val="000000" w:themeColor="text1"/>
-          <w:sz w:val="18"/>
-          <w:szCs w:val="18"/>
-          <w:lang w:val="es-ES"/>
-        </w:rPr>
-        <w:t xml:space="preserve"> </w:t>
-      </w:r>
-      <w:proofErr w:type="gramStart"/>
-      <w:r>
-        <w:rPr>
-          <w:rFonts w:ascii="Arial Narrow" w:eastAsia="Arial Narrow" w:hAnsi="Arial Narrow" w:cs="Arial Narrow"/>
-          <w:color w:val="000000" w:themeColor="text1"/>
-          <w:sz w:val="18"/>
-          <w:szCs w:val="18"/>
-          <w:lang w:val="es-ES"/>
-        </w:rPr>
-        <w:t>de acuerdo al</w:t>
-      </w:r>
-      <w:proofErr w:type="gramEnd"/>
-      <w:r>
-        <w:rPr>
-          <w:rFonts w:ascii="Arial Narrow" w:eastAsia="Arial Narrow" w:hAnsi="Arial Narrow" w:cs="Arial Narrow"/>
-          <w:color w:val="000000" w:themeColor="text1"/>
-          <w:sz w:val="18"/>
-          <w:szCs w:val="18"/>
-          <w:lang w:val="es-ES"/>
-        </w:rPr>
-        <w:t xml:space="preserve"> cronograma respectivo, sin perjuicio de las penalidades descritas en la cláusula</w:t>
+        <w:t>se presentara déficit de personal y/o herramientas idóneas para continuar con la ejecución de la obra encargada y no se pudiera presentar el avance de la misma de acuerdo al cronograma respectivo, sin perjuicio de las penalidades descritas en la cláusula</w:t>
       </w:r>
       <w:r>
         <w:rPr>
@@ -10561,27 +10339,7 @@
           <w:szCs w:val="18"/>
           <w:lang w:val="es-ES"/>
         </w:rPr>
-        <w:t xml:space="preserve">con poder de decisión en todos los aspectos, el cual deberá asistir a las reuniones semanales convocadas por el Ing. Residente de obra, la no asistencia a las reuniones semanales se penalizará </w:t>
-      </w:r>
-      <w:proofErr w:type="gramStart"/>
-      <w:r>
-        <w:rPr>
-          <w:rFonts w:ascii="Arial Narrow" w:eastAsia="Arial Narrow" w:hAnsi="Arial Narrow" w:cs="Arial Narrow"/>
-          <w:sz w:val="18"/>
-          <w:szCs w:val="18"/>
-          <w:lang w:val="es-ES"/>
-        </w:rPr>
-        <w:t>de acuerdo al</w:t>
-      </w:r>
-      <w:proofErr w:type="gramEnd"/>
-      <w:r>
-        <w:rPr>
-          <w:rFonts w:ascii="Arial Narrow" w:eastAsia="Arial Narrow" w:hAnsi="Arial Narrow" w:cs="Arial Narrow"/>
-          <w:sz w:val="18"/>
-          <w:szCs w:val="18"/>
-          <w:lang w:val="es-ES"/>
-        </w:rPr>
-        <w:t xml:space="preserve"> acápite 7.2 del presente.</w:t>
+        <w:t>con poder de decisión en todos los aspectos, el cual deberá asistir a las reuniones semanales convocadas por el Ing. Residente de obra, la no asistencia a las reuniones semanales se penalizará de acuerdo al acápite 7.2 del presente.</w:t>
       </w:r>
       <w:r>
         <w:rPr>
@@ -10640,27 +10398,7 @@
           <w:szCs w:val="18"/>
           <w:lang w:val="es-ES"/>
         </w:rPr>
-        <w:t xml:space="preserve">9.1.4. Contar con personal idóneo y especializado para la prestación del servicio materia del presente contrato, pudiendo ser el mismo 9.1.2. si así lo desea, asumiendo, de forma exclusiva, la dirección y ejecución de los trabajos. Sin perjuicio de ello, el trabajo se deberá ejecutar </w:t>
-      </w:r>
-      <w:proofErr w:type="gramStart"/>
-      <w:r>
-        <w:rPr>
-          <w:rFonts w:ascii="Arial Narrow" w:eastAsia="Arial Narrow" w:hAnsi="Arial Narrow" w:cs="Arial Narrow"/>
-          <w:sz w:val="18"/>
-          <w:szCs w:val="18"/>
-          <w:lang w:val="es-ES"/>
-        </w:rPr>
-        <w:t>de acuerdo al</w:t>
-      </w:r>
-      <w:proofErr w:type="gramEnd"/>
-      <w:r>
-        <w:rPr>
-          <w:rFonts w:ascii="Arial Narrow" w:eastAsia="Arial Narrow" w:hAnsi="Arial Narrow" w:cs="Arial Narrow"/>
-          <w:sz w:val="18"/>
-          <w:szCs w:val="18"/>
-          <w:lang w:val="es-ES"/>
-        </w:rPr>
-        <w:t xml:space="preserve"> Anexo </w:t>
+        <w:t xml:space="preserve">9.1.4. Contar con personal idóneo y especializado para la prestación del servicio materia del presente contrato, pudiendo ser el mismo 9.1.2. si así lo desea, asumiendo, de forma exclusiva, la dirección y ejecución de los trabajos. Sin perjuicio de ello, el trabajo se deberá ejecutar de acuerdo al Anexo </w:t>
       </w:r>
       <w:proofErr w:type="spellStart"/>
       <w:r>
@@ -11162,27 +10900,7 @@
           <w:szCs w:val="18"/>
           <w:lang w:val="es-ES"/>
         </w:rPr>
-        <w:t xml:space="preserve">, a solicitud de esta, los documentos que aseguren </w:t>
-      </w:r>
-      <w:proofErr w:type="gramStart"/>
-      <w:r>
-        <w:rPr>
-          <w:rFonts w:ascii="Arial Narrow" w:eastAsia="Arial Narrow" w:hAnsi="Arial Narrow" w:cs="Arial Narrow"/>
-          <w:sz w:val="18"/>
-          <w:szCs w:val="18"/>
-          <w:lang w:val="es-ES"/>
-        </w:rPr>
-        <w:t>el  cumplimiento</w:t>
-      </w:r>
-      <w:proofErr w:type="gramEnd"/>
-      <w:r>
-        <w:rPr>
-          <w:rFonts w:ascii="Arial Narrow" w:eastAsia="Arial Narrow" w:hAnsi="Arial Narrow" w:cs="Arial Narrow"/>
-          <w:sz w:val="18"/>
-          <w:szCs w:val="18"/>
-          <w:lang w:val="es-ES"/>
-        </w:rPr>
-        <w:t xml:space="preserve"> de las obligaciones laborales y previsionales de su personal desplazado en las instalaciones de </w:t>
+        <w:t xml:space="preserve">, a solicitud de esta, los documentos que aseguren el  cumplimiento de las obligaciones laborales y previsionales de su personal desplazado en las instalaciones de </w:t>
       </w:r>
       <w:r>
         <w:rPr>
@@ -11475,27 +11193,7 @@
           <w:szCs w:val="18"/>
           <w:lang w:val="es-ES"/>
         </w:rPr>
-        <w:t xml:space="preserve">. Si se realizan trabajos de altura, este responsable deberá de ser un prevencionista necesariamente, asimismo, se debe verificar el fiel cumplimiento de las leyes laborales en lo relativo al reglamento de la </w:t>
-      </w:r>
-      <w:proofErr w:type="gramStart"/>
-      <w:r>
-        <w:rPr>
-          <w:rFonts w:ascii="Arial Narrow" w:eastAsia="Arial Narrow" w:hAnsi="Arial Narrow" w:cs="Arial Narrow"/>
-          <w:sz w:val="18"/>
-          <w:szCs w:val="18"/>
-          <w:lang w:val="es-ES"/>
-        </w:rPr>
-        <w:t>seguridad industrial e higiene industrial</w:t>
-      </w:r>
-      <w:proofErr w:type="gramEnd"/>
-      <w:r>
-        <w:rPr>
-          <w:rFonts w:ascii="Arial Narrow" w:eastAsia="Arial Narrow" w:hAnsi="Arial Narrow" w:cs="Arial Narrow"/>
-          <w:sz w:val="18"/>
-          <w:szCs w:val="18"/>
-          <w:lang w:val="es-ES"/>
-        </w:rPr>
-        <w:t>, previstas en el Decreto Supremo 42-F, Ley de Seguridad y salud en el trabajo N°29783 y sus modificatorias y reglamento D.S. 005-2012-TR y su modificatorias y N.T.E. G.050 Seguridad durante la construcción, en lo que les resulte aplicable.</w:t>
+        <w:t>. Si se realizan trabajos de altura, este responsable deberá de ser un prevencionista necesariamente, asimismo, se debe verificar el fiel cumplimiento de las leyes laborales en lo relativo al reglamento de la seguridad industrial e higiene industrial, previstas en el Decreto Supremo 42-F, Ley de Seguridad y salud en el trabajo N°29783 y sus modificatorias y reglamento D.S. 005-2012-TR y su modificatorias y N.T.E. G.050 Seguridad durante la construcción, en lo que les resulte aplicable.</w:t>
       </w:r>
     </w:p>
     <w:p>
@@ -12983,27 +12681,7 @@
           <w:szCs w:val="18"/>
           <w:lang w:val="es-ES"/>
         </w:rPr>
-        <w:t xml:space="preserve">deberá implementar el EPP especifico </w:t>
-      </w:r>
-      <w:proofErr w:type="gramStart"/>
-      <w:r>
-        <w:rPr>
-          <w:rFonts w:ascii="Arial Narrow" w:eastAsia="Arial Narrow" w:hAnsi="Arial Narrow" w:cs="Arial Narrow"/>
-          <w:sz w:val="18"/>
-          <w:szCs w:val="18"/>
-          <w:lang w:val="es-ES"/>
-        </w:rPr>
-        <w:t>de acuerdo a</w:t>
-      </w:r>
-      <w:proofErr w:type="gramEnd"/>
-      <w:r>
-        <w:rPr>
-          <w:rFonts w:ascii="Arial Narrow" w:eastAsia="Arial Narrow" w:hAnsi="Arial Narrow" w:cs="Arial Narrow"/>
-          <w:sz w:val="18"/>
-          <w:szCs w:val="18"/>
-          <w:lang w:val="es-ES"/>
-        </w:rPr>
-        <w:t xml:space="preserve"> la evaluación realizada en el IPERC </w:t>
+        <w:t xml:space="preserve">deberá implementar el EPP especifico de acuerdo a la evaluación realizada en el IPERC </w:t>
       </w:r>
       <w:proofErr w:type="spellStart"/>
       <w:r>
@@ -15234,29 +14912,7 @@
           <w:szCs w:val="18"/>
           <w:lang w:val="es-ES"/>
         </w:rPr>
-        <w:t xml:space="preserve">no deberá dañar las instalaciones eléctricas y sanitarias en su zona de trabajo, si fuese el caso, se procederá a descontar en las siguientes valorizaciones el costo de reparación de </w:t>
-      </w:r>
-      <w:proofErr w:type="gramStart"/>
-      <w:r>
-        <w:rPr>
-          <w:rFonts w:ascii="Arial Narrow" w:eastAsia="Arial Narrow" w:hAnsi="Arial Narrow" w:cs="Arial Narrow"/>
-          <w:color w:val="000000" w:themeColor="text1"/>
-          <w:sz w:val="18"/>
-          <w:szCs w:val="18"/>
-          <w:lang w:val="es-ES"/>
-        </w:rPr>
-        <w:t>las mismas</w:t>
-      </w:r>
-      <w:proofErr w:type="gramEnd"/>
-      <w:r>
-        <w:rPr>
-          <w:rFonts w:ascii="Arial Narrow" w:eastAsia="Arial Narrow" w:hAnsi="Arial Narrow" w:cs="Arial Narrow"/>
-          <w:color w:val="000000" w:themeColor="text1"/>
-          <w:sz w:val="18"/>
-          <w:szCs w:val="18"/>
-          <w:lang w:val="es-ES"/>
-        </w:rPr>
-        <w:t>.</w:t>
+        <w:t>no deberá dañar las instalaciones eléctricas y sanitarias en su zona de trabajo, si fuese el caso, se procederá a descontar en las siguientes valorizaciones el costo de reparación de las mismas.</w:t>
       </w:r>
     </w:p>
     <w:p>
@@ -15320,29 +14976,7 @@
           <w:szCs w:val="18"/>
           <w:lang w:val="es-ES"/>
         </w:rPr>
-        <w:t xml:space="preserve"> deberá cumplir la entrega de los pisos </w:t>
-      </w:r>
-      <w:proofErr w:type="gramStart"/>
-      <w:r>
-        <w:rPr>
-          <w:rFonts w:ascii="Arial Narrow" w:eastAsia="Arial Narrow" w:hAnsi="Arial Narrow" w:cs="Arial Narrow"/>
-          <w:color w:val="000000" w:themeColor="text1"/>
-          <w:sz w:val="18"/>
-          <w:szCs w:val="18"/>
-          <w:lang w:val="es-ES"/>
-        </w:rPr>
-        <w:t>de acuerdo a</w:t>
-      </w:r>
-      <w:proofErr w:type="gramEnd"/>
-      <w:r>
-        <w:rPr>
-          <w:rFonts w:ascii="Arial Narrow" w:eastAsia="Arial Narrow" w:hAnsi="Arial Narrow" w:cs="Arial Narrow"/>
-          <w:color w:val="000000" w:themeColor="text1"/>
-          <w:sz w:val="18"/>
-          <w:szCs w:val="18"/>
-          <w:lang w:val="es-ES"/>
-        </w:rPr>
-        <w:t xml:space="preserve"> lo indicado en el cronograma que forma parte del presente contrato, caso contrario, se podrá descontar de sus valorizaciones los trabajos de corrección que debieron realizar en este plazo establecido.</w:t>
+        <w:t xml:space="preserve"> deberá cumplir la entrega de los pisos de acuerdo a lo indicado en el cronograma que forma parte del presente contrato, caso contrario, se podrá descontar de sus valorizaciones los trabajos de corrección que debieron realizar en este plazo establecido.</w:t>
       </w:r>
     </w:p>
     <w:p>
@@ -15408,95 +15042,7 @@
           <w:szCs w:val="18"/>
           <w:lang w:val="es-ES"/>
         </w:rPr>
-        <w:t xml:space="preserve">deberá garantizar el avance de 2 pisos por semana, como mínimo, lo mismo sucederá con las entregas en el mismo plazo, caso contrario se podrá contratar a otra empresa para que </w:t>
-      </w:r>
-      <w:proofErr w:type="gramStart"/>
-      <w:r>
-        <w:rPr>
-          <w:rFonts w:ascii="Arial Narrow" w:eastAsia="Arial Narrow" w:hAnsi="Arial Narrow" w:cs="Arial Narrow"/>
-          <w:color w:val="000000"/>
-          <w:sz w:val="18"/>
-          <w:szCs w:val="18"/>
-          <w:lang w:val="es-ES"/>
-        </w:rPr>
-        <w:t>termine  dichos</w:t>
-      </w:r>
-      <w:proofErr w:type="gramEnd"/>
-      <w:r>
-        <w:rPr>
-          <w:rFonts w:ascii="Arial Narrow" w:eastAsia="Arial Narrow" w:hAnsi="Arial Narrow" w:cs="Arial Narrow"/>
-          <w:color w:val="000000"/>
-          <w:sz w:val="18"/>
-          <w:szCs w:val="18"/>
-          <w:lang w:val="es-ES"/>
-        </w:rPr>
-        <w:t xml:space="preserve"> </w:t>
-      </w:r>
-      <w:proofErr w:type="gramStart"/>
-      <w:r>
-        <w:rPr>
-          <w:rFonts w:ascii="Arial Narrow" w:eastAsia="Arial Narrow" w:hAnsi="Arial Narrow" w:cs="Arial Narrow"/>
-          <w:color w:val="000000"/>
-          <w:sz w:val="18"/>
-          <w:szCs w:val="18"/>
-          <w:lang w:val="es-ES"/>
-        </w:rPr>
-        <w:t>trabajos,  todos</w:t>
-      </w:r>
-      <w:proofErr w:type="gramEnd"/>
-      <w:r>
-        <w:rPr>
-          <w:rFonts w:ascii="Arial Narrow" w:eastAsia="Arial Narrow" w:hAnsi="Arial Narrow" w:cs="Arial Narrow"/>
-          <w:color w:val="000000"/>
-          <w:sz w:val="18"/>
-          <w:szCs w:val="18"/>
-          <w:lang w:val="es-ES"/>
-        </w:rPr>
-        <w:t xml:space="preserve"> </w:t>
-      </w:r>
-      <w:proofErr w:type="gramStart"/>
-      <w:r>
-        <w:rPr>
-          <w:rFonts w:ascii="Arial Narrow" w:eastAsia="Arial Narrow" w:hAnsi="Arial Narrow" w:cs="Arial Narrow"/>
-          <w:color w:val="000000"/>
-          <w:sz w:val="18"/>
-          <w:szCs w:val="18"/>
-          <w:lang w:val="es-ES"/>
-        </w:rPr>
-        <w:t>los  retrabajos</w:t>
-      </w:r>
-      <w:proofErr w:type="gramEnd"/>
-      <w:r>
-        <w:rPr>
-          <w:rFonts w:ascii="Arial Narrow" w:eastAsia="Arial Narrow" w:hAnsi="Arial Narrow" w:cs="Arial Narrow"/>
-          <w:color w:val="000000"/>
-          <w:sz w:val="18"/>
-          <w:szCs w:val="18"/>
-          <w:lang w:val="es-ES"/>
-        </w:rPr>
-        <w:t xml:space="preserve"> si se diesen el caso </w:t>
-      </w:r>
-      <w:proofErr w:type="gramStart"/>
-      <w:r>
-        <w:rPr>
-          <w:rFonts w:ascii="Arial Narrow" w:eastAsia="Arial Narrow" w:hAnsi="Arial Narrow" w:cs="Arial Narrow"/>
-          <w:color w:val="000000"/>
-          <w:sz w:val="18"/>
-          <w:szCs w:val="18"/>
-          <w:lang w:val="es-ES"/>
-        </w:rPr>
-        <w:t>se  podrán</w:t>
-      </w:r>
-      <w:proofErr w:type="gramEnd"/>
-      <w:r>
-        <w:rPr>
-          <w:rFonts w:ascii="Arial Narrow" w:eastAsia="Arial Narrow" w:hAnsi="Arial Narrow" w:cs="Arial Narrow"/>
-          <w:color w:val="000000"/>
-          <w:sz w:val="18"/>
-          <w:szCs w:val="18"/>
-          <w:lang w:val="es-ES"/>
-        </w:rPr>
-        <w:t xml:space="preserve">  cobrar en las valorizaciones siguientes</w:t>
+        <w:t>deberá garantizar el avance de 2 pisos por semana, como mínimo, lo mismo sucederá con las entregas en el mismo plazo, caso contrario se podrá contratar a otra empresa para que termine  dichos trabajos,  todos los  retrabajos si se diesen el caso se  podrán  cobrar en las valorizaciones siguientes</w:t>
       </w:r>
       <w:r>
         <w:rPr>
@@ -16230,29 +15776,7 @@
           <w:szCs w:val="18"/>
           <w:lang w:val="es-ES"/>
         </w:rPr>
-        <w:t xml:space="preserve">, etc.) en su zona de trabajo, si fuese el caso, se procederá a descontar en las siguientes valorizaciones el costo de reparación de </w:t>
-      </w:r>
-      <w:proofErr w:type="gramStart"/>
-      <w:r>
-        <w:rPr>
-          <w:rFonts w:ascii="Arial Narrow" w:eastAsia="Arial Narrow" w:hAnsi="Arial Narrow" w:cs="Arial Narrow"/>
-          <w:color w:val="000000" w:themeColor="text1"/>
-          <w:sz w:val="18"/>
-          <w:szCs w:val="18"/>
-          <w:lang w:val="es-ES"/>
-        </w:rPr>
-        <w:t>las mismas</w:t>
-      </w:r>
-      <w:proofErr w:type="gramEnd"/>
-      <w:r>
-        <w:rPr>
-          <w:rFonts w:ascii="Arial Narrow" w:eastAsia="Arial Narrow" w:hAnsi="Arial Narrow" w:cs="Arial Narrow"/>
-          <w:color w:val="000000" w:themeColor="text1"/>
-          <w:sz w:val="18"/>
-          <w:szCs w:val="18"/>
-          <w:lang w:val="es-ES"/>
-        </w:rPr>
-        <w:t>.</w:t>
+        <w:t>, etc.) en su zona de trabajo, si fuese el caso, se procederá a descontar en las siguientes valorizaciones el costo de reparación de las mismas.</w:t>
       </w:r>
     </w:p>
     <w:p>
@@ -16615,27 +16139,7 @@
           <w:szCs w:val="18"/>
           <w:lang w:val="es-ES"/>
         </w:rPr>
-        <w:t xml:space="preserve">Incluye </w:t>
-      </w:r>
-      <w:proofErr w:type="gramStart"/>
-      <w:r>
-        <w:rPr>
-          <w:rFonts w:ascii="Arial Narrow" w:eastAsia="Arial Narrow" w:hAnsi="Arial Narrow" w:cs="Arial Narrow"/>
-          <w:sz w:val="18"/>
-          <w:szCs w:val="18"/>
-          <w:lang w:val="es-ES"/>
-        </w:rPr>
-        <w:t>Carnet</w:t>
-      </w:r>
-      <w:proofErr w:type="gramEnd"/>
-      <w:r>
-        <w:rPr>
-          <w:rFonts w:ascii="Arial Narrow" w:eastAsia="Arial Narrow" w:hAnsi="Arial Narrow" w:cs="Arial Narrow"/>
-          <w:sz w:val="18"/>
-          <w:szCs w:val="18"/>
-          <w:lang w:val="es-ES"/>
-        </w:rPr>
-        <w:t xml:space="preserve"> RETCC vigente.</w:t>
+        <w:t>Incluye Carnet RETCC vigente.</w:t>
       </w:r>
     </w:p>
     <w:p>
@@ -16667,27 +16171,7 @@
           <w:szCs w:val="18"/>
           <w:lang w:val="es-ES"/>
         </w:rPr>
-        <w:t xml:space="preserve">Incluye DNI </w:t>
-      </w:r>
-      <w:proofErr w:type="gramStart"/>
-      <w:r>
-        <w:rPr>
-          <w:rFonts w:ascii="Arial Narrow" w:eastAsia="Arial Narrow" w:hAnsi="Arial Narrow" w:cs="Arial Narrow"/>
-          <w:sz w:val="18"/>
-          <w:szCs w:val="18"/>
-          <w:lang w:val="es-ES"/>
-        </w:rPr>
-        <w:t>Vigente.(</w:t>
-      </w:r>
-      <w:proofErr w:type="gramEnd"/>
-      <w:r>
-        <w:rPr>
-          <w:rFonts w:ascii="Arial Narrow" w:eastAsia="Arial Narrow" w:hAnsi="Arial Narrow" w:cs="Arial Narrow"/>
-          <w:sz w:val="18"/>
-          <w:szCs w:val="18"/>
-          <w:lang w:val="es-ES"/>
-        </w:rPr>
-        <w:t xml:space="preserve"> </w:t>
+        <w:t xml:space="preserve">Incluye DNI Vigente.( </w:t>
       </w:r>
       <w:proofErr w:type="spellStart"/>
       <w:r>
@@ -16822,27 +16306,7 @@
           <w:szCs w:val="18"/>
           <w:lang w:val="es-ES"/>
         </w:rPr>
-        <w:t xml:space="preserve"> certificado </w:t>
-      </w:r>
-      <w:proofErr w:type="gramStart"/>
-      <w:r>
-        <w:rPr>
-          <w:rFonts w:ascii="Arial Narrow" w:eastAsia="Arial Narrow" w:hAnsi="Arial Narrow" w:cs="Arial Narrow"/>
-          <w:sz w:val="18"/>
-          <w:szCs w:val="18"/>
-          <w:lang w:val="es-ES"/>
-        </w:rPr>
-        <w:t>( barandas</w:t>
-      </w:r>
-      <w:proofErr w:type="gramEnd"/>
-      <w:r>
-        <w:rPr>
-          <w:rFonts w:ascii="Arial Narrow" w:eastAsia="Arial Narrow" w:hAnsi="Arial Narrow" w:cs="Arial Narrow"/>
-          <w:sz w:val="18"/>
-          <w:szCs w:val="18"/>
-          <w:lang w:val="es-ES"/>
-        </w:rPr>
-        <w:t xml:space="preserve"> y escalera interna) hasta 2 cuerpos. Mayor a ello, deberá ser andamios multidireccionales. </w:t>
+        <w:t xml:space="preserve"> certificado ( barandas y escalera interna) hasta 2 cuerpos. Mayor a ello, deberá ser andamios multidireccionales. </w:t>
       </w:r>
     </w:p>
     <w:p>
@@ -16874,27 +16338,7 @@
           <w:szCs w:val="18"/>
           <w:lang w:val="es-ES"/>
         </w:rPr>
-        <w:t xml:space="preserve">Considerar el sistema de protección anticaídas </w:t>
-      </w:r>
-      <w:proofErr w:type="gramStart"/>
-      <w:r>
-        <w:rPr>
-          <w:rFonts w:ascii="Arial Narrow" w:eastAsia="Arial Narrow" w:hAnsi="Arial Narrow" w:cs="Arial Narrow"/>
-          <w:sz w:val="18"/>
-          <w:szCs w:val="18"/>
-          <w:lang w:val="es-ES"/>
-        </w:rPr>
-        <w:t>de acuerdo al</w:t>
-      </w:r>
-      <w:proofErr w:type="gramEnd"/>
-      <w:r>
-        <w:rPr>
-          <w:rFonts w:ascii="Arial Narrow" w:eastAsia="Arial Narrow" w:hAnsi="Arial Narrow" w:cs="Arial Narrow"/>
-          <w:sz w:val="18"/>
-          <w:szCs w:val="18"/>
-          <w:lang w:val="es-ES"/>
-        </w:rPr>
-        <w:t xml:space="preserve"> riesgo expuesto (restricción, posición, caída libre limitada, detención de caídas). </w:t>
+        <w:t xml:space="preserve">Considerar el sistema de protección anticaídas de acuerdo al riesgo expuesto (restricción, posición, caída libre limitada, detención de caídas). </w:t>
       </w:r>
     </w:p>
     <w:p>
@@ -17425,27 +16869,7 @@
           <w:szCs w:val="18"/>
           <w:lang w:val="es-ES"/>
         </w:rPr>
-        <w:t xml:space="preserve"> cuando ésta se lo requiera, sin mediar notificación previa, como lo establece las auditorias mencionadas en la Cláusula </w:t>
-      </w:r>
-      <w:proofErr w:type="gramStart"/>
-      <w:r>
-        <w:rPr>
-          <w:rFonts w:ascii="Arial Narrow" w:eastAsia="Arial Narrow" w:hAnsi="Arial Narrow" w:cs="Arial Narrow"/>
-          <w:sz w:val="18"/>
-          <w:szCs w:val="18"/>
-          <w:lang w:val="es-ES"/>
-        </w:rPr>
-        <w:t>Décimo Quinta</w:t>
-      </w:r>
-      <w:proofErr w:type="gramEnd"/>
-      <w:r>
-        <w:rPr>
-          <w:rFonts w:ascii="Arial Narrow" w:eastAsia="Arial Narrow" w:hAnsi="Arial Narrow" w:cs="Arial Narrow"/>
-          <w:sz w:val="18"/>
-          <w:szCs w:val="18"/>
-          <w:lang w:val="es-ES"/>
-        </w:rPr>
-        <w:t>.</w:t>
+        <w:t xml:space="preserve"> cuando ésta se lo requiera, sin mediar notificación previa, como lo establece las auditorias mencionadas en la Cláusula Décimo Quinta.</w:t>
       </w:r>
     </w:p>
     <w:p>
@@ -17613,27 +17037,7 @@
           <w:szCs w:val="18"/>
           <w:lang w:val="es-ES"/>
         </w:rPr>
-        <w:t xml:space="preserve">Las actividades que son objeto del CONTRATO celebrado y a los riesgos a los que </w:t>
-      </w:r>
-      <w:proofErr w:type="gramStart"/>
-      <w:r>
-        <w:rPr>
-          <w:rFonts w:ascii="Arial Narrow" w:eastAsia="Arial Narrow" w:hAnsi="Arial Narrow" w:cs="Arial Narrow"/>
-          <w:sz w:val="18"/>
-          <w:szCs w:val="18"/>
-          <w:lang w:val="es-ES"/>
-        </w:rPr>
-        <w:t>los trabajadores está</w:t>
-      </w:r>
-      <w:proofErr w:type="gramEnd"/>
-      <w:r>
-        <w:rPr>
-          <w:rFonts w:ascii="Arial Narrow" w:eastAsia="Arial Narrow" w:hAnsi="Arial Narrow" w:cs="Arial Narrow"/>
-          <w:sz w:val="18"/>
-          <w:szCs w:val="18"/>
-          <w:lang w:val="es-ES"/>
-        </w:rPr>
-        <w:t xml:space="preserve"> expuesto por la naturaleza de los servicios.</w:t>
+        <w:t>Las actividades que son objeto del CONTRATO celebrado y a los riesgos a los que los trabajadores está expuesto por la naturaleza de los servicios.</w:t>
       </w:r>
     </w:p>
     <w:p>
@@ -17666,27 +17070,7 @@
           <w:szCs w:val="18"/>
           <w:lang w:val="es-ES"/>
         </w:rPr>
-        <w:t xml:space="preserve">El lugar en donde se </w:t>
-      </w:r>
-      <w:proofErr w:type="gramStart"/>
-      <w:r>
-        <w:rPr>
-          <w:rFonts w:ascii="Arial Narrow" w:eastAsia="Arial Narrow" w:hAnsi="Arial Narrow" w:cs="Arial Narrow"/>
-          <w:sz w:val="18"/>
-          <w:szCs w:val="18"/>
-          <w:lang w:val="es-ES"/>
-        </w:rPr>
-        <w:t>ejecutaran</w:t>
-      </w:r>
-      <w:proofErr w:type="gramEnd"/>
-      <w:r>
-        <w:rPr>
-          <w:rFonts w:ascii="Arial Narrow" w:eastAsia="Arial Narrow" w:hAnsi="Arial Narrow" w:cs="Arial Narrow"/>
-          <w:sz w:val="18"/>
-          <w:szCs w:val="18"/>
-          <w:lang w:val="es-ES"/>
-        </w:rPr>
-        <w:t xml:space="preserve"> las actividades mencionadas.</w:t>
+        <w:t>El lugar en donde se ejecutaran las actividades mencionadas.</w:t>
       </w:r>
     </w:p>
     <w:p>
@@ -17895,27 +17279,7 @@
           <w:szCs w:val="18"/>
           <w:lang w:val="es-ES"/>
         </w:rPr>
-        <w:t xml:space="preserve">, no causando deterioro, pérdida o mal uso de </w:t>
-      </w:r>
-      <w:proofErr w:type="gramStart"/>
-      <w:r>
-        <w:rPr>
-          <w:rFonts w:ascii="Arial Narrow" w:eastAsia="Arial Narrow" w:hAnsi="Arial Narrow" w:cs="Arial Narrow"/>
-          <w:sz w:val="18"/>
-          <w:szCs w:val="18"/>
-          <w:lang w:val="es-ES"/>
-        </w:rPr>
-        <w:t>los mismos</w:t>
-      </w:r>
-      <w:proofErr w:type="gramEnd"/>
-      <w:r>
-        <w:rPr>
-          <w:rFonts w:ascii="Arial Narrow" w:eastAsia="Arial Narrow" w:hAnsi="Arial Narrow" w:cs="Arial Narrow"/>
-          <w:sz w:val="18"/>
-          <w:szCs w:val="18"/>
-          <w:lang w:val="es-ES"/>
-        </w:rPr>
-        <w:t>.</w:t>
+        <w:t>, no causando deterioro, pérdida o mal uso de los mismos.</w:t>
       </w:r>
     </w:p>
     <w:p>
@@ -17979,27 +17343,7 @@
           <w:szCs w:val="18"/>
           <w:lang w:val="es-ES"/>
         </w:rPr>
-        <w:t xml:space="preserve"> deberá mantener durante la ejecución de los Trabajos Contratados, a un </w:t>
-      </w:r>
-      <w:proofErr w:type="gramStart"/>
-      <w:r>
-        <w:rPr>
-          <w:rFonts w:ascii="Arial Narrow" w:eastAsia="Arial Narrow" w:hAnsi="Arial Narrow" w:cs="Arial Narrow"/>
-          <w:sz w:val="18"/>
-          <w:szCs w:val="18"/>
-          <w:lang w:val="es-ES"/>
-        </w:rPr>
-        <w:t>Jefe</w:t>
-      </w:r>
-      <w:proofErr w:type="gramEnd"/>
-      <w:r>
-        <w:rPr>
-          <w:rFonts w:ascii="Arial Narrow" w:eastAsia="Arial Narrow" w:hAnsi="Arial Narrow" w:cs="Arial Narrow"/>
-          <w:sz w:val="18"/>
-          <w:szCs w:val="18"/>
-          <w:lang w:val="es-ES"/>
-        </w:rPr>
-        <w:t xml:space="preserve"> de Grupo al 100% de disponibilidad con facultades suficientes para recibir y ejecutar con plena responsabilidad cuantas órdenes e indicaciones le haga </w:t>
+        <w:t xml:space="preserve"> deberá mantener durante la ejecución de los Trabajos Contratados, a un Jefe de Grupo al 100% de disponibilidad con facultades suficientes para recibir y ejecutar con plena responsabilidad cuantas órdenes e indicaciones le haga </w:t>
       </w:r>
       <w:r>
         <w:rPr>
@@ -18845,29 +18189,7 @@
           <w:szCs w:val="18"/>
           <w:lang w:val="es-ES"/>
         </w:rPr>
-        <w:t xml:space="preserve">los materiales suministrados y la Instalación de </w:t>
-      </w:r>
-      <w:proofErr w:type="gramStart"/>
-      <w:r>
-        <w:rPr>
-          <w:rFonts w:ascii="Arial Narrow" w:eastAsia="Arial Narrow" w:hAnsi="Arial Narrow" w:cs="Arial Narrow"/>
-          <w:color w:val="000000"/>
-          <w:sz w:val="18"/>
-          <w:szCs w:val="18"/>
-          <w:lang w:val="es-ES"/>
-        </w:rPr>
-        <w:t>los mismos</w:t>
-      </w:r>
-      <w:proofErr w:type="gramEnd"/>
-      <w:r>
-        <w:rPr>
-          <w:rFonts w:ascii="Arial Narrow" w:eastAsia="Arial Narrow" w:hAnsi="Arial Narrow" w:cs="Arial Narrow"/>
-          <w:color w:val="000000"/>
-          <w:sz w:val="18"/>
-          <w:szCs w:val="18"/>
-          <w:lang w:val="es-ES"/>
-        </w:rPr>
-        <w:t>.</w:t>
+        <w:t>los materiales suministrados y la Instalación de los mismos.</w:t>
       </w:r>
       <w:permEnd w:id="844235876"/>
     </w:p>
@@ -19759,29 +19081,7 @@
           <w:szCs w:val="18"/>
           <w:lang w:val="es-ES"/>
         </w:rPr>
-        <w:t xml:space="preserve">Usar sólo materiales y equipos </w:t>
-      </w:r>
-      <w:proofErr w:type="gramStart"/>
-      <w:r>
-        <w:rPr>
-          <w:rFonts w:ascii="Arial Narrow" w:eastAsia="Arial Narrow" w:hAnsi="Arial Narrow" w:cs="Arial Narrow"/>
-          <w:color w:val="000000" w:themeColor="text1"/>
-          <w:sz w:val="18"/>
-          <w:szCs w:val="18"/>
-          <w:lang w:val="es-ES"/>
-        </w:rPr>
-        <w:t>que</w:t>
-      </w:r>
-      <w:proofErr w:type="gramEnd"/>
-      <w:r>
-        <w:rPr>
-          <w:rFonts w:ascii="Arial Narrow" w:eastAsia="Arial Narrow" w:hAnsi="Arial Narrow" w:cs="Arial Narrow"/>
-          <w:color w:val="000000" w:themeColor="text1"/>
-          <w:sz w:val="18"/>
-          <w:szCs w:val="18"/>
-          <w:lang w:val="es-ES"/>
-        </w:rPr>
-        <w:t xml:space="preserve"> de primera calidad, sin defectos ni imperfecciones, ajustándose rigurosamente a las especificaciones técnicas previamente establecidas, a la normatividad vigente según el Reglamento Nacional de Edificaciones, establecido por el Ministerio de Vivienda, Construcción y Saneamiento.</w:t>
+        <w:t>Usar sólo materiales y equipos que de primera calidad, sin defectos ni imperfecciones, ajustándose rigurosamente a las especificaciones técnicas previamente establecidas, a la normatividad vigente según el Reglamento Nacional de Edificaciones, establecido por el Ministerio de Vivienda, Construcción y Saneamiento.</w:t>
       </w:r>
     </w:p>
     <w:p>
@@ -20063,29 +19363,7 @@
           <w:szCs w:val="18"/>
           <w:lang w:val="es-ES"/>
         </w:rPr>
-        <w:t xml:space="preserve">La penalidad por atraso </w:t>
-      </w:r>
-      <w:proofErr w:type="gramStart"/>
-      <w:r>
-        <w:rPr>
-          <w:rFonts w:ascii="Arial Narrow" w:eastAsia="Arial Narrow" w:hAnsi="Arial Narrow" w:cs="Arial Narrow"/>
-          <w:color w:val="000000" w:themeColor="text1"/>
-          <w:sz w:val="18"/>
-          <w:szCs w:val="18"/>
-          <w:lang w:val="es-ES"/>
-        </w:rPr>
-        <w:t>de acuerdo al</w:t>
-      </w:r>
-      <w:proofErr w:type="gramEnd"/>
-      <w:r>
-        <w:rPr>
-          <w:rFonts w:ascii="Arial Narrow" w:eastAsia="Arial Narrow" w:hAnsi="Arial Narrow" w:cs="Arial Narrow"/>
-          <w:color w:val="000000" w:themeColor="text1"/>
-          <w:sz w:val="18"/>
-          <w:szCs w:val="18"/>
-          <w:lang w:val="es-ES"/>
-        </w:rPr>
-        <w:t xml:space="preserve"> cronograma será de 1/1000 del monto contractual por las primeras 2 semanas de atraso, a partir de la 3ra semana la penalidad será de 5/1000 del monto contractual; además, de no presentar un plan de acción a partir de la 2da semana de atraso, el contratante tiene la potestad de intervenir la partida atrasada y el sobrecosto deberá ser asumido íntegramente por la contratista intervenida.</w:t>
+        <w:t>La penalidad por atraso de acuerdo al cronograma será de 1/1000 del monto contractual por las primeras 2 semanas de atraso, a partir de la 3ra semana la penalidad será de 5/1000 del monto contractual; además, de no presentar un plan de acción a partir de la 2da semana de atraso, el contratante tiene la potestad de intervenir la partida atrasada y el sobrecosto deberá ser asumido íntegramente por la contratista intervenida.</w:t>
       </w:r>
     </w:p>
     <w:p>
@@ -20288,29 +19566,7 @@
           <w:szCs w:val="18"/>
           <w:lang w:val="es-ES"/>
         </w:rPr>
-        <w:t xml:space="preserve"> o producción en el punto indicado por </w:t>
-      </w:r>
-      <w:proofErr w:type="gramStart"/>
-      <w:r>
-        <w:rPr>
-          <w:rFonts w:ascii="Arial Narrow" w:eastAsia="Arial Narrow" w:hAnsi="Arial Narrow" w:cs="Arial Narrow"/>
-          <w:color w:val="000000" w:themeColor="text1"/>
-          <w:sz w:val="18"/>
-          <w:szCs w:val="18"/>
-          <w:lang w:val="es-ES"/>
-        </w:rPr>
-        <w:t>obra ,</w:t>
-      </w:r>
-      <w:proofErr w:type="gramEnd"/>
-      <w:r>
-        <w:rPr>
-          <w:rFonts w:ascii="Arial Narrow" w:eastAsia="Arial Narrow" w:hAnsi="Arial Narrow" w:cs="Arial Narrow"/>
-          <w:color w:val="000000" w:themeColor="text1"/>
-          <w:sz w:val="18"/>
-          <w:szCs w:val="18"/>
-          <w:lang w:val="es-ES"/>
-        </w:rPr>
-        <w:t xml:space="preserve"> cercano al chite o punto de </w:t>
+        <w:t xml:space="preserve"> o producción en el punto indicado por obra , cercano al chite o punto de </w:t>
       </w:r>
       <w:proofErr w:type="spellStart"/>
       <w:r>
@@ -20673,27 +19929,7 @@
           <w:sz w:val="18"/>
           <w:szCs w:val="18"/>
         </w:rPr>
-        <w:t xml:space="preserve">EL CONTRATISTA se obliga a ejecutar la M.O para las instalaciones sanitarias respetando estrictamente las especificaciones técnicas, planos y normativas vigentes, garantizando que la ejecución de obras provisionales no afecte, altere ni modifique </w:t>
-      </w:r>
-      <w:proofErr w:type="gramStart"/>
-      <w:r>
-        <w:rPr>
-          <w:rFonts w:ascii="Arial Narrow" w:eastAsia="Arial Narrow" w:hAnsi="Arial Narrow" w:cs="Arial Narrow"/>
-          <w:color w:val="000000"/>
-          <w:sz w:val="18"/>
-          <w:szCs w:val="18"/>
-        </w:rPr>
-        <w:t>bajo ninguna circunstancia</w:t>
-      </w:r>
-      <w:proofErr w:type="gramEnd"/>
-      <w:r>
-        <w:rPr>
-          <w:rFonts w:ascii="Arial Narrow" w:eastAsia="Arial Narrow" w:hAnsi="Arial Narrow" w:cs="Arial Narrow"/>
-          <w:color w:val="000000"/>
-          <w:sz w:val="18"/>
-          <w:szCs w:val="18"/>
-        </w:rPr>
-        <w:t xml:space="preserve"> los elementos estructurales del proyecto. Cualquier intervención que implique una posible interferencia con elementos estructurales deberá ser previamente comunicada por escrito a EL CONTRATANTE y ejecutada únicamente con su autorización formal y expresa.</w:t>
+        <w:t>EL CONTRATISTA se obliga a ejecutar la M.O para las instalaciones sanitarias respetando estrictamente las especificaciones técnicas, planos y normativas vigentes, garantizando que la ejecución de obras provisionales no afecte, altere ni modifique bajo ninguna circunstancia los elementos estructurales del proyecto. Cualquier intervención que implique una posible interferencia con elementos estructurales deberá ser previamente comunicada por escrito a EL CONTRATANTE y ejecutada únicamente con su autorización formal y expresa.</w:t>
       </w:r>
     </w:p>
     <w:p>
@@ -22094,29 +21330,7 @@
           <w:szCs w:val="18"/>
           <w:lang w:val="es-ES"/>
         </w:rPr>
-        <w:t xml:space="preserve">Cumplir con todas las obligaciones formales, laborales, previsionales, tributarias y de cualquier otra índole que le correspondan </w:t>
-      </w:r>
-      <w:proofErr w:type="gramStart"/>
-      <w:r>
-        <w:rPr>
-          <w:rFonts w:ascii="Arial Narrow" w:eastAsia="Arial Narrow" w:hAnsi="Arial Narrow" w:cs="Arial Narrow"/>
-          <w:color w:val="000000" w:themeColor="text1"/>
-          <w:sz w:val="18"/>
-          <w:szCs w:val="18"/>
-          <w:lang w:val="es-ES"/>
-        </w:rPr>
-        <w:t>de acuerdo a</w:t>
-      </w:r>
-      <w:proofErr w:type="gramEnd"/>
-      <w:r>
-        <w:rPr>
-          <w:rFonts w:ascii="Arial Narrow" w:eastAsia="Arial Narrow" w:hAnsi="Arial Narrow" w:cs="Arial Narrow"/>
-          <w:color w:val="000000" w:themeColor="text1"/>
-          <w:sz w:val="18"/>
-          <w:szCs w:val="18"/>
-          <w:lang w:val="es-ES"/>
-        </w:rPr>
-        <w:t xml:space="preserve"> ley, para el desarrollo de las actividades que ejecutará conforme a este contrato, debiendo acreditar ante </w:t>
+        <w:t xml:space="preserve">Cumplir con todas las obligaciones formales, laborales, previsionales, tributarias y de cualquier otra índole que le correspondan de acuerdo a ley, para el desarrollo de las actividades que ejecutará conforme a este contrato, debiendo acreditar ante </w:t>
       </w:r>
       <w:r>
         <w:rPr>
@@ -22767,27 +21981,7 @@
           <w:szCs w:val="18"/>
           <w:lang w:val="es-ES"/>
         </w:rPr>
-        <w:t xml:space="preserve">, según los formatos y frecuencia establecida por Ley. Este formato debe de estar a disposición de las </w:t>
-      </w:r>
-      <w:proofErr w:type="gramStart"/>
-      <w:r>
-        <w:rPr>
-          <w:rFonts w:ascii="Arial Narrow" w:eastAsia="Arial Narrow" w:hAnsi="Arial Narrow" w:cs="Arial Narrow"/>
-          <w:sz w:val="18"/>
-          <w:szCs w:val="18"/>
-          <w:lang w:val="es-ES"/>
-        </w:rPr>
-        <w:t>autoridades públicas</w:t>
-      </w:r>
-      <w:proofErr w:type="gramEnd"/>
-      <w:r>
-        <w:rPr>
-          <w:rFonts w:ascii="Arial Narrow" w:eastAsia="Arial Narrow" w:hAnsi="Arial Narrow" w:cs="Arial Narrow"/>
-          <w:sz w:val="18"/>
-          <w:szCs w:val="18"/>
-          <w:lang w:val="es-ES"/>
-        </w:rPr>
-        <w:t xml:space="preserve"> y/o privadas que lo requieran, así como también debe estar a disposición de </w:t>
+        <w:t xml:space="preserve">, según los formatos y frecuencia establecida por Ley. Este formato debe de estar a disposición de las autoridades públicas y/o privadas que lo requieran, así como también debe estar a disposición de </w:t>
       </w:r>
       <w:r>
         <w:rPr>
@@ -24212,27 +23406,7 @@
           <w:szCs w:val="18"/>
           <w:lang w:val="es-ES"/>
         </w:rPr>
-        <w:t xml:space="preserve"> o sus empleados, </w:t>
-      </w:r>
-      <w:proofErr w:type="gramStart"/>
-      <w:r>
-        <w:rPr>
-          <w:rFonts w:ascii="Arial Narrow" w:eastAsia="Arial Narrow" w:hAnsi="Arial Narrow" w:cs="Arial Narrow"/>
-          <w:sz w:val="18"/>
-          <w:szCs w:val="18"/>
-          <w:lang w:val="es-ES"/>
-        </w:rPr>
-        <w:t>en relación a</w:t>
-      </w:r>
-      <w:proofErr w:type="gramEnd"/>
-      <w:r>
-        <w:rPr>
-          <w:rFonts w:ascii="Arial Narrow" w:eastAsia="Arial Narrow" w:hAnsi="Arial Narrow" w:cs="Arial Narrow"/>
-          <w:sz w:val="18"/>
-          <w:szCs w:val="18"/>
-          <w:lang w:val="es-ES"/>
-        </w:rPr>
-        <w:t xml:space="preserve"> la ejecución de la obra.</w:t>
+        <w:t xml:space="preserve"> o sus empleados, en relación a la ejecución de la obra.</w:t>
       </w:r>
     </w:p>
     <w:p>
@@ -25184,29 +24358,7 @@
           <w:szCs w:val="18"/>
           <w:lang w:val="es-ES"/>
         </w:rPr>
-        <w:t xml:space="preserve">Trabajos y obras no realizados </w:t>
-      </w:r>
-      <w:proofErr w:type="gramStart"/>
-      <w:r>
-        <w:rPr>
-          <w:rFonts w:ascii="Arial Narrow" w:eastAsia="Arial Narrow" w:hAnsi="Arial Narrow" w:cs="Arial Narrow"/>
-          <w:color w:val="000000" w:themeColor="text1"/>
-          <w:sz w:val="18"/>
-          <w:szCs w:val="18"/>
-          <w:lang w:val="es-ES"/>
-        </w:rPr>
-        <w:t>de acuerdo a</w:t>
-      </w:r>
-      <w:proofErr w:type="gramEnd"/>
-      <w:r>
-        <w:rPr>
-          <w:rFonts w:ascii="Arial Narrow" w:eastAsia="Arial Narrow" w:hAnsi="Arial Narrow" w:cs="Arial Narrow"/>
-          <w:color w:val="000000" w:themeColor="text1"/>
-          <w:sz w:val="18"/>
-          <w:szCs w:val="18"/>
-          <w:lang w:val="es-ES"/>
-        </w:rPr>
-        <w:t xml:space="preserve"> las (i) reglas de arte e ingeniería (</w:t>
+        <w:t>Trabajos y obras no realizados de acuerdo a las (i) reglas de arte e ingeniería (</w:t>
       </w:r>
       <w:proofErr w:type="spellStart"/>
       <w:r>
@@ -27939,27 +27091,7 @@
           <w:szCs w:val="18"/>
           <w:lang w:val="es-ES"/>
         </w:rPr>
-        <w:t xml:space="preserve">Si se produce la </w:t>
-      </w:r>
-      <w:proofErr w:type="gramStart"/>
-      <w:r>
-        <w:rPr>
-          <w:rFonts w:ascii="Arial Narrow" w:eastAsia="Arial Narrow" w:hAnsi="Arial Narrow" w:cs="Arial Narrow"/>
-          <w:sz w:val="18"/>
-          <w:szCs w:val="18"/>
-          <w:lang w:val="es-ES"/>
-        </w:rPr>
-        <w:t>entrada en vigencia</w:t>
-      </w:r>
-      <w:proofErr w:type="gramEnd"/>
-      <w:r>
-        <w:rPr>
-          <w:rFonts w:ascii="Arial Narrow" w:eastAsia="Arial Narrow" w:hAnsi="Arial Narrow" w:cs="Arial Narrow"/>
-          <w:sz w:val="18"/>
-          <w:szCs w:val="18"/>
-          <w:lang w:val="es-ES"/>
-        </w:rPr>
-        <w:t xml:space="preserve"> de alguna norma, disposición o decisión de cualquier autoridad que prohíba o haga material o jurídicamente imposible la ejecución parcial o total del contrato.</w:t>
+        <w:t>Si se produce la entrada en vigencia de alguna norma, disposición o decisión de cualquier autoridad que prohíba o haga material o jurídicamente imposible la ejecución parcial o total del contrato.</w:t>
       </w:r>
     </w:p>
     <w:p>
@@ -30538,29 +29670,7 @@
           <w:szCs w:val="18"/>
           <w:lang w:val="es-ES"/>
         </w:rPr>
-        <w:t xml:space="preserve">Constancia de No-Adeudo expedida por el </w:t>
-      </w:r>
-      <w:proofErr w:type="gramStart"/>
-      <w:r>
-        <w:rPr>
-          <w:rFonts w:ascii="Arial Narrow" w:eastAsia="Arial Narrow" w:hAnsi="Arial Narrow" w:cs="Arial Narrow"/>
-          <w:color w:val="000000" w:themeColor="text1"/>
-          <w:sz w:val="18"/>
-          <w:szCs w:val="18"/>
-          <w:lang w:val="es-ES"/>
-        </w:rPr>
-        <w:t>Jefe</w:t>
-      </w:r>
-      <w:proofErr w:type="gramEnd"/>
-      <w:r>
-        <w:rPr>
-          <w:rFonts w:ascii="Arial Narrow" w:eastAsia="Arial Narrow" w:hAnsi="Arial Narrow" w:cs="Arial Narrow"/>
-          <w:color w:val="000000" w:themeColor="text1"/>
-          <w:sz w:val="18"/>
-          <w:szCs w:val="18"/>
-          <w:lang w:val="es-ES"/>
-        </w:rPr>
-        <w:t xml:space="preserve"> de Almacén de </w:t>
+        <w:t xml:space="preserve">Constancia de No-Adeudo expedida por el Jefe de Almacén de </w:t>
       </w:r>
       <w:r>
         <w:rPr>
@@ -30729,29 +29839,7 @@
           <w:szCs w:val="18"/>
           <w:lang w:val="es-ES"/>
         </w:rPr>
-        <w:t xml:space="preserve"> del trabajo ejecutado firmado y sellado por el ingeniero colegiado y habitado de la especialidad que corresponda y con registro </w:t>
-      </w:r>
-      <w:proofErr w:type="gramStart"/>
-      <w:r>
-        <w:rPr>
-          <w:rFonts w:ascii="Arial Narrow" w:eastAsia="Arial Narrow" w:hAnsi="Arial Narrow" w:cs="Arial Narrow"/>
-          <w:color w:val="000000" w:themeColor="text1"/>
-          <w:sz w:val="18"/>
-          <w:szCs w:val="18"/>
-          <w:lang w:val="es-ES"/>
-        </w:rPr>
-        <w:t>auxiliar  IG</w:t>
-      </w:r>
-      <w:proofErr w:type="gramEnd"/>
-      <w:r>
-        <w:rPr>
-          <w:rFonts w:ascii="Arial Narrow" w:eastAsia="Arial Narrow" w:hAnsi="Arial Narrow" w:cs="Arial Narrow"/>
-          <w:color w:val="000000" w:themeColor="text1"/>
-          <w:sz w:val="18"/>
-          <w:szCs w:val="18"/>
-          <w:lang w:val="es-ES"/>
-        </w:rPr>
-        <w:t>-3 según corresponda (solo aplicable para los trabajos de instalaciones sanitarias, eléctricas y mecánicas).</w:t>
+        <w:t xml:space="preserve"> del trabajo ejecutado firmado y sellado por el ingeniero colegiado y habitado de la especialidad que corresponda y con registro auxiliar  IG-3 según corresponda (solo aplicable para los trabajos de instalaciones sanitarias, eléctricas y mecánicas).</w:t>
       </w:r>
     </w:p>
     <w:p>
@@ -31906,7 +30994,6 @@
         <w:t xml:space="preserve"> obligado a llenar el Acta de Postventa detallando todo el proceso que se ha llevado a cabo en su proceso </w:t>
       </w:r>
       <w:proofErr w:type="spellStart"/>
-      <w:proofErr w:type="gramStart"/>
       <w:r>
         <w:rPr>
           <w:rFonts w:ascii="Arial Narrow" w:eastAsia="Arial Narrow" w:hAnsi="Arial Narrow" w:cs="Arial Narrow"/>
@@ -31926,18 +31013,7 @@
           <w:szCs w:val="18"/>
           <w:lang w:val="es-ES"/>
         </w:rPr>
-        <w:t xml:space="preserve"> ,</w:t>
-      </w:r>
-      <w:proofErr w:type="gramEnd"/>
-      <w:r>
-        <w:rPr>
-          <w:rFonts w:ascii="Arial Narrow" w:eastAsia="Arial Narrow" w:hAnsi="Arial Narrow" w:cs="Arial Narrow"/>
-          <w:color w:val="000000" w:themeColor="text1"/>
-          <w:sz w:val="18"/>
-          <w:szCs w:val="18"/>
-          <w:lang w:val="es-ES"/>
-        </w:rPr>
-        <w:t xml:space="preserve"> </w:t>
+        <w:t xml:space="preserve"> , </w:t>
       </w:r>
       <w:proofErr w:type="spellStart"/>
       <w:r>
@@ -33341,29 +32417,7 @@
           <w:szCs w:val="18"/>
           <w:lang w:val="es-ES"/>
         </w:rPr>
-        <w:t xml:space="preserve">fuera requerido por alguna </w:t>
-      </w:r>
-      <w:proofErr w:type="gramStart"/>
-      <w:r>
-        <w:rPr>
-          <w:rFonts w:ascii="Arial Narrow" w:eastAsia="Arial Narrow" w:hAnsi="Arial Narrow" w:cs="Arial Narrow"/>
-          <w:color w:val="000000" w:themeColor="text1"/>
-          <w:sz w:val="18"/>
-          <w:szCs w:val="18"/>
-          <w:lang w:val="es-ES"/>
-        </w:rPr>
-        <w:t>autoridad pública</w:t>
-      </w:r>
-      <w:proofErr w:type="gramEnd"/>
-      <w:r>
-        <w:rPr>
-          <w:rFonts w:ascii="Arial Narrow" w:eastAsia="Arial Narrow" w:hAnsi="Arial Narrow" w:cs="Arial Narrow"/>
-          <w:color w:val="000000" w:themeColor="text1"/>
-          <w:sz w:val="18"/>
-          <w:szCs w:val="18"/>
-          <w:lang w:val="es-ES"/>
-        </w:rPr>
-        <w:t xml:space="preserve"> para entregar datos personales o base de datos personales a los que haya tenido acceso en virtud del </w:t>
+        <w:t xml:space="preserve">fuera requerido por alguna autoridad pública para entregar datos personales o base de datos personales a los que haya tenido acceso en virtud del </w:t>
       </w:r>
       <w:r>
         <w:rPr>
@@ -33544,6 +32598,35 @@
     </w:p>
     <w:p>
       <w:pPr>
+        <w:jc w:val="both"/>
+        <w:rPr>
+          <w:rFonts w:ascii="Arial Narrow" w:eastAsia="Arial Narrow" w:hAnsi="Arial Narrow" w:cs="Arial Narrow"/>
+          <w:sz w:val="18"/>
+          <w:szCs w:val="18"/>
+          <w:lang w:val="es-PE"/>
+        </w:rPr>
+      </w:pPr>
+      <w:r>
+        <w:rPr>
+          <w:rFonts w:ascii="Arial Narrow" w:eastAsia="Arial Narrow" w:hAnsi="Arial Narrow" w:cs="Arial Narrow"/>
+          <w:sz w:val="18"/>
+          <w:szCs w:val="18"/>
+          <w:lang w:val="es-ES"/>
+        </w:rPr>
+        <w:t xml:space="preserve">En señal de conformidad las partes suscriben el presente documento en la ciudad de Lima, </w:t>
+      </w:r>
+      <w:r>
+        <w:rPr>
+          <w:rFonts w:ascii="Arial Narrow" w:eastAsia="Arial Narrow" w:hAnsi="Arial Narrow" w:cs="Arial Narrow"/>
+          <w:sz w:val="18"/>
+          <w:szCs w:val="18"/>
+          <w:lang w:val="es-PE"/>
+        </w:rPr>
+        <w:t>{{FECHA_FIRMA_DEL_CONTRATO}}</w:t>
+      </w:r>
+    </w:p>
+    <w:p>
+      <w:pPr>
         <w:ind w:left="0" w:firstLine="0"/>
         <w:jc w:val="both"/>
         <w:rPr>
@@ -33558,7 +32641,7 @@
           <w:szCs w:val="18"/>
           <w:lang w:val="es-ES"/>
         </w:rPr>
-        <w:t>En señal de conformidad las partes suscriben el presente documento en la ciudad de Lima, 12 de enero del 2026.</w:t>
+        <w:t>.</w:t>
       </w:r>
     </w:p>
     <w:p>
@@ -50643,7 +49726,6 @@
   <w:style w:type="character" w:default="1" w:styleId="Fuentedeprrafopredeter">
     <w:name w:val="Default Paragraph Font"/>
     <w:uiPriority w:val="1"/>
-    <w:semiHidden/>
     <w:unhideWhenUsed/>
   </w:style>
   <w:style w:type="table" w:default="1" w:styleId="Tablanormal">
@@ -51621,6 +50703,10 @@
 </file>
 
 <file path=customXml/item1.xml><?xml version="1.0" encoding="utf-8"?>
+<b:Sources xmlns:b="http://schemas.openxmlformats.org/officeDocument/2006/bibliography" xmlns="http://schemas.openxmlformats.org/officeDocument/2006/bibliography" SelectedStyle="\APASixthEditionOfficeOnline.xsl" StyleName="APA" Version="6"/>
+</file>
+
+<file path=customXml/item2.xml><?xml version="1.0" encoding="utf-8"?>
 <p:properties xmlns:p="http://schemas.microsoft.com/office/2006/metadata/properties" xmlns:xsi="http://www.w3.org/2001/XMLSchema-instance" xmlns:pc="http://schemas.microsoft.com/office/infopath/2007/PartnerControls">
   <documentManagement>
     <_activity xmlns="1c364c2e-a9e5-4d0d-8b0c-60f96943b919" xsi:nil="true"/>
@@ -51628,26 +50714,7 @@
 </p:properties>
 </file>
 
-<file path=customXml/item2.xml><?xml version="1.0" encoding="utf-8"?>
-<b:Sources xmlns:b="http://schemas.openxmlformats.org/officeDocument/2006/bibliography" xmlns="http://schemas.openxmlformats.org/officeDocument/2006/bibliography" SelectedStyle="\APASixthEditionOfficeOnline.xsl" StyleName="APA" Version="6"/>
-</file>
-
 <file path=customXml/item3.xml><?xml version="1.0" encoding="utf-8"?>
-<?mso-contentType ?>
-<FormTemplates xmlns="http://schemas.microsoft.com/sharepoint/v3/contenttype/forms">
-  <Display>DocumentLibraryForm</Display>
-  <Edit>DocumentLibraryForm</Edit>
-  <New>DocumentLibraryForm</New>
-</FormTemplates>
-</file>
-
-<file path=customXml/item4.xml><?xml version="1.0" encoding="utf-8"?>
-<go:gDocsCustomXmlDataStorage xmlns:go="http://customooxmlschemas.google.com/" xmlns:r="http://schemas.openxmlformats.org/officeDocument/2006/relationships" uri="GoogleDocsCustomDataVersion2">
-  <go:docsCustomData xmlns:go="http://customooxmlschemas.google.com/" roundtripDataSignature="AMtx7mi65SlRJfsAaB/f5FQ/QJjSa7JTRg==">CgMxLjAyCGguZ2pkZ3hzMgloLjMwajB6bGwyCWguMWZvYjl0ZTIJaC4zem55c2g3MgloLjJldDkycDAyCGgudHlqY3d0MgloLjNkeTZ2a20yCWguMXQzaDVzZjIJaC40ZDM0b2c4MgloLjJzOGV5bzEyCWguMTdkcDh2dTIJaC4zcmRjcmpuMgloLjI2aW4xcmcyCGgubG54Yno5MgloLjM1bmt1bjI4AHIhMVB3QlM0WUsxeVpEc0RYM1hkSnRydEtfT2RVVDZQNW5I</go:docsCustomData>
-</go:gDocsCustomXmlDataStorage>
-</file>
-
-<file path=customXml/item5.xml><?xml version="1.0" encoding="utf-8"?>
 <ct:contentTypeSchema xmlns:ct="http://schemas.microsoft.com/office/2006/metadata/contentType" xmlns:ma="http://schemas.microsoft.com/office/2006/metadata/properties/metaAttributes" ct:_="" ma:_="" ma:contentTypeName="Document" ma:contentTypeID="0x01010063B0DD29DB0EF346B1F1544CEBE0D2A7" ma:contentTypeVersion="18" ma:contentTypeDescription="Create a new document." ma:contentTypeScope="" ma:versionID="f944625a855169ca68f7a121b194bb92">
   <xsd:schema xmlns:xsd="http://www.w3.org/2001/XMLSchema" xmlns:xs="http://www.w3.org/2001/XMLSchema" xmlns:p="http://schemas.microsoft.com/office/2006/metadata/properties" xmlns:ns3="1c364c2e-a9e5-4d0d-8b0c-60f96943b919" xmlns:ns4="65ea09c1-7372-4828-95fe-f2a9534e8332" targetNamespace="http://schemas.microsoft.com/office/2006/metadata/properties" ma:root="true" ma:fieldsID="205ea4d9cf7dc04f23d4fe395e4eb5de" ns3:_="" ns4:_="">
     <xsd:import namespace="1c364c2e-a9e5-4d0d-8b0c-60f96943b919"/>
@@ -51900,7 +50967,30 @@
 </ct:contentTypeSchema>
 </file>
 
+<file path=customXml/item4.xml><?xml version="1.0" encoding="utf-8"?>
+<go:gDocsCustomXmlDataStorage xmlns:go="http://customooxmlschemas.google.com/" xmlns:r="http://schemas.openxmlformats.org/officeDocument/2006/relationships" uri="GoogleDocsCustomDataVersion2">
+  <go:docsCustomData xmlns:go="http://customooxmlschemas.google.com/" roundtripDataSignature="AMtx7mi65SlRJfsAaB/f5FQ/QJjSa7JTRg==">CgMxLjAyCGguZ2pkZ3hzMgloLjMwajB6bGwyCWguMWZvYjl0ZTIJaC4zem55c2g3MgloLjJldDkycDAyCGgudHlqY3d0MgloLjNkeTZ2a20yCWguMXQzaDVzZjIJaC40ZDM0b2c4MgloLjJzOGV5bzEyCWguMTdkcDh2dTIJaC4zcmRjcmpuMgloLjI2aW4xcmcyCGgubG54Yno5MgloLjM1bmt1bjI4AHIhMVB3QlM0WUsxeVpEc0RYM1hkSnRydEtfT2RVVDZQNW5I</go:docsCustomData>
+</go:gDocsCustomXmlDataStorage>
+</file>
+
+<file path=customXml/item5.xml><?xml version="1.0" encoding="utf-8"?>
+<?mso-contentType ?>
+<FormTemplates xmlns="http://schemas.microsoft.com/sharepoint/v3/contenttype/forms">
+  <Display>DocumentLibraryForm</Display>
+  <Edit>DocumentLibraryForm</Edit>
+  <New>DocumentLibraryForm</New>
+</FormTemplates>
+</file>
+
 <file path=customXml/itemProps1.xml><?xml version="1.0" encoding="utf-8"?>
+<ds:datastoreItem xmlns:ds="http://schemas.openxmlformats.org/officeDocument/2006/customXml" ds:itemID="{02C867CF-6023-4BBE-9EB8-8D3F09F43338}">
+  <ds:schemaRefs>
+    <ds:schemaRef ds:uri="http://schemas.openxmlformats.org/officeDocument/2006/bibliography"/>
+  </ds:schemaRefs>
+</ds:datastoreItem>
+</file>
+
+<file path=customXml/itemProps2.xml><?xml version="1.0" encoding="utf-8"?>
 <ds:datastoreItem xmlns:ds="http://schemas.openxmlformats.org/officeDocument/2006/customXml" ds:itemID="{D829E601-C5D7-4EB3-859E-E162E4261A98}">
   <ds:schemaRefs>
     <ds:schemaRef ds:uri="http://schemas.microsoft.com/office/2006/metadata/properties"/>
@@ -51910,32 +51000,7 @@
 </ds:datastoreItem>
 </file>
 
-<file path=customXml/itemProps2.xml><?xml version="1.0" encoding="utf-8"?>
-<ds:datastoreItem xmlns:ds="http://schemas.openxmlformats.org/officeDocument/2006/customXml" ds:itemID="{02C867CF-6023-4BBE-9EB8-8D3F09F43338}">
-  <ds:schemaRefs>
-    <ds:schemaRef ds:uri="http://schemas.openxmlformats.org/officeDocument/2006/bibliography"/>
-  </ds:schemaRefs>
-</ds:datastoreItem>
-</file>
-
 <file path=customXml/itemProps3.xml><?xml version="1.0" encoding="utf-8"?>
-<ds:datastoreItem xmlns:ds="http://schemas.openxmlformats.org/officeDocument/2006/customXml" ds:itemID="{DD1BD535-DABA-4752-B724-9FD5D9237B7F}">
-  <ds:schemaRefs>
-    <ds:schemaRef ds:uri="http://schemas.microsoft.com/sharepoint/v3/contenttype/forms"/>
-  </ds:schemaRefs>
-</ds:datastoreItem>
-</file>
-
-<file path=customXml/itemProps4.xml><?xml version="1.0" encoding="utf-8"?>
-<ds:datastoreItem xmlns:ds="http://schemas.openxmlformats.org/officeDocument/2006/customXml" ds:itemID="{11111111-1234-1234-1234-123412341234}">
-  <ds:schemaRefs>
-    <ds:schemaRef ds:uri="http://customooxmlschemas.google.com/"/>
-    <ds:schemaRef ds:uri="http://schemas.openxmlformats.org/officeDocument/2006/relationships"/>
-  </ds:schemaRefs>
-</ds:datastoreItem>
-</file>
-
-<file path=customXml/itemProps5.xml><?xml version="1.0" encoding="utf-8"?>
 <ds:datastoreItem xmlns:ds="http://schemas.openxmlformats.org/officeDocument/2006/customXml" ds:itemID="{F24A4505-FFC0-4551-A77A-5910F586F04D}">
   <ds:schemaRefs>
     <ds:schemaRef ds:uri="http://schemas.microsoft.com/office/2006/metadata/contentType"/>
@@ -51952,4 +51017,21 @@
     <ds:schemaRef ds:uri="http://schemas.microsoft.com/internal/obd"/>
   </ds:schemaRefs>
 </ds:datastoreItem>
+</file>
+
+<file path=customXml/itemProps4.xml><?xml version="1.0" encoding="utf-8"?>
+<ds:datastoreItem xmlns:ds="http://schemas.openxmlformats.org/officeDocument/2006/customXml" ds:itemID="{11111111-1234-1234-1234-123412341234}">
+  <ds:schemaRefs>
+    <ds:schemaRef ds:uri="http://customooxmlschemas.google.com/"/>
+    <ds:schemaRef ds:uri="http://schemas.openxmlformats.org/officeDocument/2006/relationships"/>
+  </ds:schemaRefs>
+</ds:datastoreItem>
+</file>
+
+<file path=customXml/itemProps5.xml><?xml version="1.0" encoding="utf-8"?>
+<ds:datastoreItem xmlns:ds="http://schemas.openxmlformats.org/officeDocument/2006/customXml" ds:itemID="{DD1BD535-DABA-4752-B724-9FD5D9237B7F}">
+  <ds:schemaRefs>
+    <ds:schemaRef ds:uri="http://schemas.microsoft.com/sharepoint/v3/contenttype/forms"/>
+  </ds:schemaRefs>
+</ds:datastoreItem>
 </file>
</xml_diff>

<commit_message>
fix desglose de grupo de correos en lecciones aprendidas
</commit_message>
<xml_diff>
--- a/Features/CostsModule/Features/AdjudicacionesFeature/Templates/plantilla_instalacion_con_placeholders.docx
+++ b/Features/CostsModule/Features/AdjudicacionesFeature/Templates/plantilla_instalacion_con_placeholders.docx
@@ -20204,6 +20204,7 @@
         <w:tabs>
           <w:tab w:val="clear" w:pos="1440"/>
         </w:tabs>
+        <w:ind w:left="0" w:firstLine="0"/>
         <w:jc w:val="both"/>
         <w:rPr>
           <w:rFonts w:ascii="Arial Narrow" w:eastAsia="Arial Narrow" w:hAnsi="Arial Narrow" w:cs="Arial Narrow"/>
@@ -20242,7 +20243,7 @@
           <w:sz w:val="18"/>
           <w:szCs w:val="18"/>
         </w:rPr>
-        <w:t xml:space="preserve">EL CONTRATISTA se obliga a presentar todas las solicitudes de materiales requeridas para la ejecución de las instalaciones sanitarias, adjuntando un </w:t>
+        <w:t xml:space="preserve">Queda expresamente prohibido el uso de ratios genéricos o estimaciones globales como base para la solicitud de materiales. Todo </w:t>
       </w:r>
       <w:proofErr w:type="spellStart"/>
       <w:r>
@@ -20262,23 +20263,12 @@
           <w:sz w:val="18"/>
           <w:szCs w:val="18"/>
         </w:rPr>
-        <w:t xml:space="preserve"> detallado que sustente las cantidades solicitadas por piso, conforme a los planos y especificaciones técnicas del proyecto.</w:t>
-      </w:r>
-    </w:p>
-    <w:p>
-      <w:pPr>
-        <w:pBdr>
-          <w:top w:val="nil"/>
-          <w:left w:val="nil"/>
-          <w:bottom w:val="nil"/>
-          <w:right w:val="nil"/>
-          <w:between w:val="nil"/>
-        </w:pBdr>
-        <w:tabs>
-          <w:tab w:val="clear" w:pos="1440"/>
-        </w:tabs>
-        <w:ind w:left="709" w:firstLine="0"/>
-        <w:jc w:val="both"/>
+        <w:t xml:space="preserve"> deberá estar debidamente justificado con el desglose de cantidades por nivel, asegurando la trazabilidad y el control eficiente del suministro.</w:t>
+      </w:r>
+    </w:p>
+    <w:p>
+      <w:pPr>
+        <w:pStyle w:val="Prrafodelista"/>
         <w:rPr>
           <w:rFonts w:ascii="Arial Narrow" w:eastAsia="Arial Narrow" w:hAnsi="Arial Narrow" w:cs="Arial Narrow"/>
           <w:color w:val="000000"/>
@@ -20316,27 +20306,7 @@
           <w:sz w:val="18"/>
           <w:szCs w:val="18"/>
         </w:rPr>
-        <w:t xml:space="preserve">Queda expresamente prohibido el uso de ratios genéricos o estimaciones globales como base para la solicitud de materiales. Todo </w:t>
-      </w:r>
-      <w:proofErr w:type="spellStart"/>
-      <w:r>
-        <w:rPr>
-          <w:rFonts w:ascii="Arial Narrow" w:eastAsia="Arial Narrow" w:hAnsi="Arial Narrow" w:cs="Arial Narrow"/>
-          <w:color w:val="000000"/>
-          <w:sz w:val="18"/>
-          <w:szCs w:val="18"/>
-        </w:rPr>
-        <w:t>metrado</w:t>
-      </w:r>
-      <w:proofErr w:type="spellEnd"/>
-      <w:r>
-        <w:rPr>
-          <w:rFonts w:ascii="Arial Narrow" w:eastAsia="Arial Narrow" w:hAnsi="Arial Narrow" w:cs="Arial Narrow"/>
-          <w:color w:val="000000"/>
-          <w:sz w:val="18"/>
-          <w:szCs w:val="18"/>
-        </w:rPr>
-        <w:t xml:space="preserve"> deberá estar debidamente justificado con el desglose de cantidades por nivel, asegurando la trazabilidad y el control eficiente del suministro.</w:t>
+        <w:t>EL CONTRATANTE se reserva el derecho de rechazar, solicitar ajustes o retener aprobaciones de solicitudes de materiales que no cumplan con este requisito, sin que ello genere responsabilidad alguna por retrasos en la ejecución.</w:t>
       </w:r>
     </w:p>
     <w:p>
@@ -20379,49 +20349,6 @@
           <w:sz w:val="18"/>
           <w:szCs w:val="18"/>
         </w:rPr>
-        <w:t>EL CONTRATANTE se reserva el derecho de rechazar, solicitar ajustes o retener aprobaciones de solicitudes de materiales que no cumplan con este requisito, sin que ello genere responsabilidad alguna por retrasos en la ejecución.</w:t>
-      </w:r>
-    </w:p>
-    <w:p>
-      <w:pPr>
-        <w:pStyle w:val="Prrafodelista"/>
-        <w:rPr>
-          <w:rFonts w:ascii="Arial Narrow" w:eastAsia="Arial Narrow" w:hAnsi="Arial Narrow" w:cs="Arial Narrow"/>
-          <w:color w:val="000000"/>
-          <w:sz w:val="18"/>
-          <w:szCs w:val="18"/>
-        </w:rPr>
-      </w:pPr>
-    </w:p>
-    <w:p>
-      <w:pPr>
-        <w:numPr>
-          <w:ilvl w:val="1"/>
-          <w:numId w:val="13"/>
-        </w:numPr>
-        <w:pBdr>
-          <w:top w:val="nil"/>
-          <w:left w:val="nil"/>
-          <w:bottom w:val="nil"/>
-          <w:right w:val="nil"/>
-          <w:between w:val="nil"/>
-        </w:pBdr>
-        <w:ind w:left="709" w:hanging="709"/>
-        <w:jc w:val="both"/>
-        <w:rPr>
-          <w:rFonts w:ascii="Arial Narrow" w:eastAsia="Arial Narrow" w:hAnsi="Arial Narrow" w:cs="Arial Narrow"/>
-          <w:color w:val="000000"/>
-          <w:sz w:val="18"/>
-          <w:szCs w:val="18"/>
-        </w:rPr>
-      </w:pPr>
-      <w:r>
-        <w:rPr>
-          <w:rFonts w:ascii="Arial Narrow" w:eastAsia="Arial Narrow" w:hAnsi="Arial Narrow" w:cs="Arial Narrow"/>
-          <w:color w:val="000000"/>
-          <w:sz w:val="18"/>
-          <w:szCs w:val="18"/>
-        </w:rPr>
         <w:t>Las partes acuerdan la realización de reuniones técnicas de coordinación (reuniones ICE) con el objetivo de revisar y validar los planos, así como de detectar posibles interferencias o inconsistencias en el diseño antes de su ejecución. Si, a pesar de estas instancias de revisión, se generan ajustes o retrabajos debido a incompatibilidades no advertidas oportunamente por el equipo técnico del CONTRATISTA, y existiera evidencia documentada de que los planos fueron revisados y aprobados, dichos trabajos adicionales serán asumidos por el CONTRATISTA. Esto implica que los costos asociados, tanto de materiales como de mano de obra, no serán reconocidos por el CONTRATANTE ni considerados como modificaciones al contrato.</w:t>
       </w:r>
     </w:p>
@@ -20494,7 +20421,6 @@
           <w:szCs w:val="18"/>
           <w:u w:val="single"/>
         </w:rPr>
-        <w:lastRenderedPageBreak/>
         <w:t>DECIMO: SEGUROS E INDEMNIZACIONES:</w:t>
       </w:r>
       <w:r>
@@ -20539,6 +20465,7 @@
           <w:sz w:val="18"/>
           <w:szCs w:val="18"/>
         </w:rPr>
+        <w:lastRenderedPageBreak/>
         <w:t>LA CONTRATISTA</w:t>
       </w:r>
       <w:r>
@@ -21991,7 +21918,6 @@
           <w:sz w:val="18"/>
           <w:szCs w:val="18"/>
         </w:rPr>
-        <w:lastRenderedPageBreak/>
         <w:t xml:space="preserve">Por las razones expuestas, </w:t>
       </w:r>
       <w:r>
@@ -22079,6 +22005,7 @@
           <w:sz w:val="18"/>
           <w:szCs w:val="18"/>
         </w:rPr>
+        <w:lastRenderedPageBreak/>
         <w:t xml:space="preserve">En caso </w:t>
       </w:r>
       <w:r>
@@ -23687,7 +23614,6 @@
           <w:sz w:val="18"/>
           <w:szCs w:val="18"/>
         </w:rPr>
-        <w:lastRenderedPageBreak/>
         <w:t xml:space="preserve"> </w:t>
       </w:r>
     </w:p>
@@ -23824,6 +23750,7 @@
           <w:sz w:val="18"/>
           <w:szCs w:val="18"/>
         </w:rPr>
+        <w:lastRenderedPageBreak/>
         <w:t>Suministrar los servicios higiénicos básicos para el personal en obra.</w:t>
       </w:r>
     </w:p>
@@ -25558,7 +25485,6 @@
           <w:sz w:val="18"/>
           <w:szCs w:val="18"/>
         </w:rPr>
-        <w:lastRenderedPageBreak/>
         <w:t xml:space="preserve">13.3 </w:t>
       </w:r>
       <w:r>
@@ -27164,18 +27090,7 @@
           <w:szCs w:val="18"/>
           <w:lang w:val="es-ES"/>
         </w:rPr>
-        <w:t xml:space="preserve">, en cualquier momento podrá resolver el presente contrato, sin expresión de causa, siendo independiente de la intervención, cursando una comunicación notarial a la otra Parte en el domicilio señalado por esta última en el presente documento, con treinta (15) días calendario de anticipación a la fecha en que quede resuelto el contrato. De acuerdo con lo antes expresado, el contrato quedará resuelto automáticamente, de pleno derecho, en el momento </w:t>
-      </w:r>
-      <w:r>
-        <w:rPr>
-          <w:rFonts w:ascii="Arial Narrow" w:eastAsia="Arial Narrow" w:hAnsi="Arial Narrow" w:cs="Arial Narrow"/>
-          <w:color w:val="000000" w:themeColor="text1"/>
-          <w:sz w:val="18"/>
-          <w:szCs w:val="18"/>
-          <w:lang w:val="es-ES"/>
-        </w:rPr>
-        <w:lastRenderedPageBreak/>
-        <w:t>en que transcurran los treinta (15) días calendario contados a partir de la entrega de la carta notarial, no siendo necesario que se curse ninguna comunicación adicional respecto a la mencionada resolución. La decisión de resolución expresada en el presente párrafo no generará a favor del otro parte derecho a reclamar daños, perjuicios, lucro cesante ni cualquier otro concepto, ni judicial ni extrajudicialmente.</w:t>
+        <w:t>, en cualquier momento podrá resolver el presente contrato, sin expresión de causa, siendo independiente de la intervención, cursando una comunicación notarial a la otra Parte en el domicilio señalado por esta última en el presente documento, con treinta (15) días calendario de anticipación a la fecha en que quede resuelto el contrato. De acuerdo con lo antes expresado, el contrato quedará resuelto automáticamente, de pleno derecho, en el momento en que transcurran los treinta (15) días calendario contados a partir de la entrega de la carta notarial, no siendo necesario que se curse ninguna comunicación adicional respecto a la mencionada resolución. La decisión de resolución expresada en el presente párrafo no generará a favor del otro parte derecho a reclamar daños, perjuicios, lucro cesante ni cualquier otro concepto, ni judicial ni extrajudicialmente.</w:t>
       </w:r>
     </w:p>
     <w:p>
@@ -28473,7 +28388,6 @@
           <w:szCs w:val="18"/>
           <w:lang w:val="es-ES"/>
         </w:rPr>
-        <w:lastRenderedPageBreak/>
         <w:t>21.5.</w:t>
       </w:r>
       <w:r>
@@ -30320,7 +30234,18 @@
           <w:szCs w:val="18"/>
           <w:lang w:val="es-ES"/>
         </w:rPr>
-        <w:t xml:space="preserve">) cumplir con el plazo acordado para la refacción o reposición respecto a </w:t>
+        <w:t xml:space="preserve">) cumplir </w:t>
+      </w:r>
+      <w:r>
+        <w:rPr>
+          <w:rFonts w:ascii="Arial Narrow" w:eastAsia="Arial Narrow" w:hAnsi="Arial Narrow" w:cs="Arial Narrow"/>
+          <w:color w:val="000000" w:themeColor="text1"/>
+          <w:sz w:val="18"/>
+          <w:szCs w:val="18"/>
+          <w:lang w:val="es-ES"/>
+        </w:rPr>
+        <w:lastRenderedPageBreak/>
+        <w:t xml:space="preserve">con el plazo acordado para la refacción o reposición respecto a </w:t>
       </w:r>
       <w:r>
         <w:rPr>
@@ -32070,6 +31995,7 @@
           <w:szCs w:val="18"/>
           <w:lang w:val="es-ES"/>
         </w:rPr>
+        <w:lastRenderedPageBreak/>
         <w:t>EL CONTRATISTA</w:t>
       </w:r>
       <w:r>
@@ -50642,33 +50568,6 @@
 </file>
 
 <file path=customXml/item1.xml><?xml version="1.0" encoding="utf-8"?>
-<p:properties xmlns:p="http://schemas.microsoft.com/office/2006/metadata/properties" xmlns:xsi="http://www.w3.org/2001/XMLSchema-instance" xmlns:pc="http://schemas.microsoft.com/office/infopath/2007/PartnerControls">
-  <documentManagement>
-    <_activity xmlns="1c364c2e-a9e5-4d0d-8b0c-60f96943b919" xsi:nil="true"/>
-  </documentManagement>
-</p:properties>
-</file>
-
-<file path=customXml/item2.xml><?xml version="1.0" encoding="utf-8"?>
-<b:Sources xmlns:b="http://schemas.openxmlformats.org/officeDocument/2006/bibliography" xmlns="http://schemas.openxmlformats.org/officeDocument/2006/bibliography" SelectedStyle="\APASixthEditionOfficeOnline.xsl" StyleName="APA" Version="6"/>
-</file>
-
-<file path=customXml/item3.xml><?xml version="1.0" encoding="utf-8"?>
-<?mso-contentType ?>
-<FormTemplates xmlns="http://schemas.microsoft.com/sharepoint/v3/contenttype/forms">
-  <Display>DocumentLibraryForm</Display>
-  <Edit>DocumentLibraryForm</Edit>
-  <New>DocumentLibraryForm</New>
-</FormTemplates>
-</file>
-
-<file path=customXml/item4.xml><?xml version="1.0" encoding="utf-8"?>
-<go:gDocsCustomXmlDataStorage xmlns:go="http://customooxmlschemas.google.com/" xmlns:r="http://schemas.openxmlformats.org/officeDocument/2006/relationships" uri="GoogleDocsCustomDataVersion2">
-  <go:docsCustomData xmlns:go="http://customooxmlschemas.google.com/" roundtripDataSignature="AMtx7mi65SlRJfsAaB/f5FQ/QJjSa7JTRg==">CgMxLjAyCGguZ2pkZ3hzMgloLjMwajB6bGwyCWguMWZvYjl0ZTIJaC4zem55c2g3MgloLjJldDkycDAyCGgudHlqY3d0MgloLjNkeTZ2a20yCWguMXQzaDVzZjIJaC40ZDM0b2c4MgloLjJzOGV5bzEyCWguMTdkcDh2dTIJaC4zcmRjcmpuMgloLjI2aW4xcmcyCGgubG54Yno5MgloLjM1bmt1bjI4AHIhMVB3QlM0WUsxeVpEc0RYM1hkSnRydEtfT2RVVDZQNW5I</go:docsCustomData>
-</go:gDocsCustomXmlDataStorage>
-</file>
-
-<file path=customXml/item5.xml><?xml version="1.0" encoding="utf-8"?>
 <ct:contentTypeSchema xmlns:ct="http://schemas.microsoft.com/office/2006/metadata/contentType" xmlns:ma="http://schemas.microsoft.com/office/2006/metadata/properties/metaAttributes" ct:_="" ma:_="" ma:contentTypeName="Document" ma:contentTypeID="0x01010063B0DD29DB0EF346B1F1544CEBE0D2A7" ma:contentTypeVersion="18" ma:contentTypeDescription="Create a new document." ma:contentTypeScope="" ma:versionID="f944625a855169ca68f7a121b194bb92">
   <xsd:schema xmlns:xsd="http://www.w3.org/2001/XMLSchema" xmlns:xs="http://www.w3.org/2001/XMLSchema" xmlns:p="http://schemas.microsoft.com/office/2006/metadata/properties" xmlns:ns3="1c364c2e-a9e5-4d0d-8b0c-60f96943b919" xmlns:ns4="65ea09c1-7372-4828-95fe-f2a9534e8332" targetNamespace="http://schemas.microsoft.com/office/2006/metadata/properties" ma:root="true" ma:fieldsID="205ea4d9cf7dc04f23d4fe395e4eb5de" ns3:_="" ns4:_="">
     <xsd:import namespace="1c364c2e-a9e5-4d0d-8b0c-60f96943b919"/>
@@ -50921,42 +50820,34 @@
 </ct:contentTypeSchema>
 </file>
 
-<file path=customXml/itemProps1.xml><?xml version="1.0" encoding="utf-8"?>
-<ds:datastoreItem xmlns:ds="http://schemas.openxmlformats.org/officeDocument/2006/customXml" ds:itemID="{D829E601-C5D7-4EB3-859E-E162E4261A98}">
-  <ds:schemaRefs>
-    <ds:schemaRef ds:uri="http://schemas.microsoft.com/office/2006/metadata/properties"/>
-    <ds:schemaRef ds:uri="http://schemas.microsoft.com/office/infopath/2007/PartnerControls"/>
-    <ds:schemaRef ds:uri="1c364c2e-a9e5-4d0d-8b0c-60f96943b919"/>
-  </ds:schemaRefs>
-</ds:datastoreItem>
+<file path=customXml/item2.xml><?xml version="1.0" encoding="utf-8"?>
+<go:gDocsCustomXmlDataStorage xmlns:go="http://customooxmlschemas.google.com/" xmlns:r="http://schemas.openxmlformats.org/officeDocument/2006/relationships" uri="GoogleDocsCustomDataVersion2">
+  <go:docsCustomData xmlns:go="http://customooxmlschemas.google.com/" roundtripDataSignature="AMtx7mi65SlRJfsAaB/f5FQ/QJjSa7JTRg==">CgMxLjAyCGguZ2pkZ3hzMgloLjMwajB6bGwyCWguMWZvYjl0ZTIJaC4zem55c2g3MgloLjJldDkycDAyCGgudHlqY3d0MgloLjNkeTZ2a20yCWguMXQzaDVzZjIJaC40ZDM0b2c4MgloLjJzOGV5bzEyCWguMTdkcDh2dTIJaC4zcmRjcmpuMgloLjI2aW4xcmcyCGgubG54Yno5MgloLjM1bmt1bjI4AHIhMVB3QlM0WUsxeVpEc0RYM1hkSnRydEtfT2RVVDZQNW5I</go:docsCustomData>
+</go:gDocsCustomXmlDataStorage>
 </file>
 
-<file path=customXml/itemProps2.xml><?xml version="1.0" encoding="utf-8"?>
-<ds:datastoreItem xmlns:ds="http://schemas.openxmlformats.org/officeDocument/2006/customXml" ds:itemID="{02C867CF-6023-4BBE-9EB8-8D3F09F43338}">
-  <ds:schemaRefs>
-    <ds:schemaRef ds:uri="http://schemas.openxmlformats.org/officeDocument/2006/bibliography"/>
-  </ds:schemaRefs>
-</ds:datastoreItem>
+<file path=customXml/item3.xml><?xml version="1.0" encoding="utf-8"?>
+<?mso-contentType ?>
+<FormTemplates xmlns="http://schemas.microsoft.com/sharepoint/v3/contenttype/forms">
+  <Display>DocumentLibraryForm</Display>
+  <Edit>DocumentLibraryForm</Edit>
+  <New>DocumentLibraryForm</New>
+</FormTemplates>
 </file>
 
-<file path=customXml/itemProps3.xml><?xml version="1.0" encoding="utf-8"?>
-<ds:datastoreItem xmlns:ds="http://schemas.openxmlformats.org/officeDocument/2006/customXml" ds:itemID="{DD1BD535-DABA-4752-B724-9FD5D9237B7F}">
-  <ds:schemaRefs>
-    <ds:schemaRef ds:uri="http://schemas.microsoft.com/sharepoint/v3/contenttype/forms"/>
-  </ds:schemaRefs>
-</ds:datastoreItem>
+<file path=customXml/item4.xml><?xml version="1.0" encoding="utf-8"?>
+<b:Sources xmlns:b="http://schemas.openxmlformats.org/officeDocument/2006/bibliography" xmlns="http://schemas.openxmlformats.org/officeDocument/2006/bibliography" SelectedStyle="\APASixthEditionOfficeOnline.xsl" StyleName="APA" Version="6"/>
 </file>
 
-<file path=customXml/itemProps4.xml><?xml version="1.0" encoding="utf-8"?>
-<ds:datastoreItem xmlns:ds="http://schemas.openxmlformats.org/officeDocument/2006/customXml" ds:itemID="{11111111-1234-1234-1234-123412341234}">
-  <ds:schemaRefs>
-    <ds:schemaRef ds:uri="http://customooxmlschemas.google.com/"/>
-    <ds:schemaRef ds:uri="http://schemas.openxmlformats.org/officeDocument/2006/relationships"/>
-  </ds:schemaRefs>
-</ds:datastoreItem>
+<file path=customXml/item5.xml><?xml version="1.0" encoding="utf-8"?>
+<p:properties xmlns:p="http://schemas.microsoft.com/office/2006/metadata/properties" xmlns:xsi="http://www.w3.org/2001/XMLSchema-instance" xmlns:pc="http://schemas.microsoft.com/office/infopath/2007/PartnerControls">
+  <documentManagement>
+    <_activity xmlns="1c364c2e-a9e5-4d0d-8b0c-60f96943b919" xsi:nil="true"/>
+  </documentManagement>
+</p:properties>
 </file>
 
-<file path=customXml/itemProps5.xml><?xml version="1.0" encoding="utf-8"?>
+<file path=customXml/itemProps1.xml><?xml version="1.0" encoding="utf-8"?>
 <ds:datastoreItem xmlns:ds="http://schemas.openxmlformats.org/officeDocument/2006/customXml" ds:itemID="{F24A4505-FFC0-4551-A77A-5910F586F04D}">
   <ds:schemaRefs>
     <ds:schemaRef ds:uri="http://schemas.microsoft.com/office/2006/metadata/contentType"/>
@@ -50973,4 +50864,39 @@
     <ds:schemaRef ds:uri="http://schemas.microsoft.com/internal/obd"/>
   </ds:schemaRefs>
 </ds:datastoreItem>
+</file>
+
+<file path=customXml/itemProps2.xml><?xml version="1.0" encoding="utf-8"?>
+<ds:datastoreItem xmlns:ds="http://schemas.openxmlformats.org/officeDocument/2006/customXml" ds:itemID="{11111111-1234-1234-1234-123412341234}">
+  <ds:schemaRefs>
+    <ds:schemaRef ds:uri="http://customooxmlschemas.google.com/"/>
+    <ds:schemaRef ds:uri="http://schemas.openxmlformats.org/officeDocument/2006/relationships"/>
+  </ds:schemaRefs>
+</ds:datastoreItem>
+</file>
+
+<file path=customXml/itemProps3.xml><?xml version="1.0" encoding="utf-8"?>
+<ds:datastoreItem xmlns:ds="http://schemas.openxmlformats.org/officeDocument/2006/customXml" ds:itemID="{DD1BD535-DABA-4752-B724-9FD5D9237B7F}">
+  <ds:schemaRefs>
+    <ds:schemaRef ds:uri="http://schemas.microsoft.com/sharepoint/v3/contenttype/forms"/>
+  </ds:schemaRefs>
+</ds:datastoreItem>
+</file>
+
+<file path=customXml/itemProps4.xml><?xml version="1.0" encoding="utf-8"?>
+<ds:datastoreItem xmlns:ds="http://schemas.openxmlformats.org/officeDocument/2006/customXml" ds:itemID="{02C867CF-6023-4BBE-9EB8-8D3F09F43338}">
+  <ds:schemaRefs>
+    <ds:schemaRef ds:uri="http://schemas.openxmlformats.org/officeDocument/2006/bibliography"/>
+  </ds:schemaRefs>
+</ds:datastoreItem>
+</file>
+
+<file path=customXml/itemProps5.xml><?xml version="1.0" encoding="utf-8"?>
+<ds:datastoreItem xmlns:ds="http://schemas.openxmlformats.org/officeDocument/2006/customXml" ds:itemID="{D829E601-C5D7-4EB3-859E-E162E4261A98}">
+  <ds:schemaRefs>
+    <ds:schemaRef ds:uri="http://schemas.microsoft.com/office/2006/metadata/properties"/>
+    <ds:schemaRef ds:uri="http://schemas.microsoft.com/office/infopath/2007/PartnerControls"/>
+    <ds:schemaRef ds:uri="1c364c2e-a9e5-4d0d-8b0c-60f96943b919"/>
+  </ds:schemaRefs>
+</ds:datastoreItem>
 </file>
</xml_diff>

<commit_message>
refactorizacion de lecciones aprendidas, arreglado filtros, cambiado plantilla de instalacion en adjudicaciones
</commit_message>
<xml_diff>
--- a/Features/CostsModule/Features/AdjudicacionesFeature/Templates/plantilla_instalacion_con_placeholders.docx
+++ b/Features/CostsModule/Features/AdjudicacionesFeature/Templates/plantilla_instalacion_con_placeholders.docx
@@ -19848,7 +19848,7 @@
     </w:p>
     <w:p>
       <w:pPr>
-        <w:pStyle w:val="Prrafodelista"/>
+        <w:ind w:left="0" w:firstLine="0"/>
         <w:rPr>
           <w:rFonts w:ascii="Arial Narrow" w:eastAsia="Arial Narrow" w:hAnsi="Arial Narrow" w:cs="Arial Narrow"/>
           <w:color w:val="000000"/>
@@ -19886,12 +19886,240 @@
           <w:sz w:val="18"/>
           <w:szCs w:val="18"/>
         </w:rPr>
-        <w:t>EL CONTRATISTA es responsable de la primera revisión total de aparatos sanitarios y griferías, y el plazo máximo para realizar esta actividad es de tres (3) días hábiles desde que el producto ha llegado a obra. Esto de acuerdo con las tolerancias del protocolo de revisión de aparatos sanitarios y griferías</w:t>
-      </w:r>
-    </w:p>
-    <w:p>
-      <w:pPr>
-        <w:pStyle w:val="Prrafodelista"/>
+        <w:t>EL CONTRATISTA se obliga a llevar a cabo la revisión integral de incompatibilidades, consultas y propuestas de mejora relacionadas con la ejecución de las instalaciones eléctricas, mediante la metodología ICE (</w:t>
+      </w:r>
+      <w:proofErr w:type="spellStart"/>
+      <w:r>
+        <w:rPr>
+          <w:rFonts w:ascii="Arial Narrow" w:eastAsia="Arial Narrow" w:hAnsi="Arial Narrow" w:cs="Arial Narrow"/>
+          <w:color w:val="000000"/>
+          <w:sz w:val="18"/>
+          <w:szCs w:val="18"/>
+        </w:rPr>
+        <w:t>Integrated</w:t>
+      </w:r>
+      <w:proofErr w:type="spellEnd"/>
+      <w:r>
+        <w:rPr>
+          <w:rFonts w:ascii="Arial Narrow" w:eastAsia="Arial Narrow" w:hAnsi="Arial Narrow" w:cs="Arial Narrow"/>
+          <w:color w:val="000000"/>
+          <w:sz w:val="18"/>
+          <w:szCs w:val="18"/>
+        </w:rPr>
+        <w:t xml:space="preserve"> </w:t>
+      </w:r>
+      <w:proofErr w:type="spellStart"/>
+      <w:r>
+        <w:rPr>
+          <w:rFonts w:ascii="Arial Narrow" w:eastAsia="Arial Narrow" w:hAnsi="Arial Narrow" w:cs="Arial Narrow"/>
+          <w:color w:val="000000"/>
+          <w:sz w:val="18"/>
+          <w:szCs w:val="18"/>
+        </w:rPr>
+        <w:t>Concurrent</w:t>
+      </w:r>
+      <w:proofErr w:type="spellEnd"/>
+      <w:r>
+        <w:rPr>
+          <w:rFonts w:ascii="Arial Narrow" w:eastAsia="Arial Narrow" w:hAnsi="Arial Narrow" w:cs="Arial Narrow"/>
+          <w:color w:val="000000"/>
+          <w:sz w:val="18"/>
+          <w:szCs w:val="18"/>
+        </w:rPr>
+        <w:t xml:space="preserve"> </w:t>
+      </w:r>
+      <w:proofErr w:type="spellStart"/>
+      <w:r>
+        <w:rPr>
+          <w:rFonts w:ascii="Arial Narrow" w:eastAsia="Arial Narrow" w:hAnsi="Arial Narrow" w:cs="Arial Narrow"/>
+          <w:color w:val="000000"/>
+          <w:sz w:val="18"/>
+          <w:szCs w:val="18"/>
+        </w:rPr>
+        <w:t>Engineering</w:t>
+      </w:r>
+      <w:proofErr w:type="spellEnd"/>
+      <w:r>
+        <w:rPr>
+          <w:rFonts w:ascii="Arial Narrow" w:eastAsia="Arial Narrow" w:hAnsi="Arial Narrow" w:cs="Arial Narrow"/>
+          <w:color w:val="000000"/>
+          <w:sz w:val="18"/>
+          <w:szCs w:val="18"/>
+        </w:rPr>
+        <w:t>), garantizando el cumplimiento de las siguientes etapas de revisión:</w:t>
+      </w:r>
+    </w:p>
+    <w:p>
+      <w:pPr>
+        <w:ind w:left="0" w:firstLine="0"/>
+        <w:rPr>
+          <w:rFonts w:ascii="Arial Narrow" w:eastAsia="Arial Narrow" w:hAnsi="Arial Narrow" w:cs="Arial Narrow"/>
+          <w:color w:val="000000"/>
+          <w:sz w:val="18"/>
+          <w:szCs w:val="18"/>
+        </w:rPr>
+      </w:pPr>
+    </w:p>
+    <w:p>
+      <w:pPr>
+        <w:pBdr>
+          <w:top w:val="nil"/>
+          <w:left w:val="nil"/>
+          <w:bottom w:val="nil"/>
+          <w:right w:val="nil"/>
+          <w:between w:val="nil"/>
+        </w:pBdr>
+        <w:tabs>
+          <w:tab w:val="clear" w:pos="1440"/>
+        </w:tabs>
+        <w:ind w:left="709" w:firstLine="0"/>
+        <w:jc w:val="both"/>
+        <w:rPr>
+          <w:rFonts w:ascii="Arial Narrow" w:eastAsia="Arial Narrow" w:hAnsi="Arial Narrow" w:cs="Arial Narrow"/>
+          <w:color w:val="000000"/>
+          <w:sz w:val="18"/>
+          <w:szCs w:val="18"/>
+        </w:rPr>
+      </w:pPr>
+      <w:r>
+        <w:rPr>
+          <w:rFonts w:ascii="Arial Narrow" w:eastAsia="Arial Narrow" w:hAnsi="Arial Narrow" w:cs="Arial Narrow"/>
+          <w:color w:val="000000"/>
+          <w:sz w:val="18"/>
+          <w:szCs w:val="18"/>
+        </w:rPr>
+        <w:t>a) Revisión hasta cimentación</w:t>
+      </w:r>
+    </w:p>
+    <w:p>
+      <w:pPr>
+        <w:pBdr>
+          <w:top w:val="nil"/>
+          <w:left w:val="nil"/>
+          <w:bottom w:val="nil"/>
+          <w:right w:val="nil"/>
+          <w:between w:val="nil"/>
+        </w:pBdr>
+        <w:tabs>
+          <w:tab w:val="clear" w:pos="1440"/>
+        </w:tabs>
+        <w:ind w:left="709" w:firstLine="0"/>
+        <w:jc w:val="both"/>
+        <w:rPr>
+          <w:rFonts w:ascii="Arial Narrow" w:eastAsia="Arial Narrow" w:hAnsi="Arial Narrow" w:cs="Arial Narrow"/>
+          <w:color w:val="000000"/>
+          <w:sz w:val="18"/>
+          <w:szCs w:val="18"/>
+        </w:rPr>
+      </w:pPr>
+      <w:r>
+        <w:rPr>
+          <w:rFonts w:ascii="Arial Narrow" w:eastAsia="Arial Narrow" w:hAnsi="Arial Narrow" w:cs="Arial Narrow"/>
+          <w:color w:val="000000"/>
+          <w:sz w:val="18"/>
+          <w:szCs w:val="18"/>
+        </w:rPr>
+        <w:t>b) Revisión de estructura de sótanos</w:t>
+      </w:r>
+    </w:p>
+    <w:p>
+      <w:pPr>
+        <w:pBdr>
+          <w:top w:val="nil"/>
+          <w:left w:val="nil"/>
+          <w:bottom w:val="nil"/>
+          <w:right w:val="nil"/>
+          <w:between w:val="nil"/>
+        </w:pBdr>
+        <w:tabs>
+          <w:tab w:val="clear" w:pos="1440"/>
+        </w:tabs>
+        <w:ind w:left="709" w:firstLine="0"/>
+        <w:jc w:val="both"/>
+        <w:rPr>
+          <w:rFonts w:ascii="Arial Narrow" w:eastAsia="Arial Narrow" w:hAnsi="Arial Narrow" w:cs="Arial Narrow"/>
+          <w:color w:val="000000"/>
+          <w:sz w:val="18"/>
+          <w:szCs w:val="18"/>
+        </w:rPr>
+      </w:pPr>
+      <w:r>
+        <w:rPr>
+          <w:rFonts w:ascii="Arial Narrow" w:eastAsia="Arial Narrow" w:hAnsi="Arial Narrow" w:cs="Arial Narrow"/>
+          <w:color w:val="000000"/>
+          <w:sz w:val="18"/>
+          <w:szCs w:val="18"/>
+        </w:rPr>
+        <w:t>c) Revisión de estructura de torre</w:t>
+      </w:r>
+    </w:p>
+    <w:p>
+      <w:pPr>
+        <w:pBdr>
+          <w:top w:val="nil"/>
+          <w:left w:val="nil"/>
+          <w:bottom w:val="nil"/>
+          <w:right w:val="nil"/>
+          <w:between w:val="nil"/>
+        </w:pBdr>
+        <w:tabs>
+          <w:tab w:val="clear" w:pos="1440"/>
+        </w:tabs>
+        <w:ind w:left="709" w:firstLine="0"/>
+        <w:jc w:val="both"/>
+        <w:rPr>
+          <w:rFonts w:ascii="Arial Narrow" w:eastAsia="Arial Narrow" w:hAnsi="Arial Narrow" w:cs="Arial Narrow"/>
+          <w:color w:val="000000"/>
+          <w:sz w:val="18"/>
+          <w:szCs w:val="18"/>
+        </w:rPr>
+      </w:pPr>
+    </w:p>
+    <w:p>
+      <w:pPr>
+        <w:pBdr>
+          <w:top w:val="nil"/>
+          <w:left w:val="nil"/>
+          <w:bottom w:val="nil"/>
+          <w:right w:val="nil"/>
+          <w:between w:val="nil"/>
+        </w:pBdr>
+        <w:tabs>
+          <w:tab w:val="clear" w:pos="1440"/>
+        </w:tabs>
+        <w:ind w:left="709" w:firstLine="0"/>
+        <w:jc w:val="both"/>
+        <w:rPr>
+          <w:rFonts w:ascii="Arial Narrow" w:eastAsia="Arial Narrow" w:hAnsi="Arial Narrow" w:cs="Arial Narrow"/>
+          <w:color w:val="000000"/>
+          <w:sz w:val="18"/>
+          <w:szCs w:val="18"/>
+        </w:rPr>
+      </w:pPr>
+      <w:r>
+        <w:rPr>
+          <w:rFonts w:ascii="Arial Narrow" w:eastAsia="Arial Narrow" w:hAnsi="Arial Narrow" w:cs="Arial Narrow"/>
+          <w:color w:val="000000"/>
+          <w:sz w:val="18"/>
+          <w:szCs w:val="18"/>
+        </w:rPr>
+        <w:t>Cada una de estas revisiones deberá realizarse en coordinación con EL CONTRATANTE y demás especialidades involucradas en el proyecto. Al término de cada etapa, se deberá levantar un acta formal que registre los acuerdos, soluciones adoptadas y la conformidad de las partes, debiendo ser firmada por los representantes técnicos de EL CONTRATANTE y EL CONTRATISTA, quienes certificarán la culminación de cada fase.</w:t>
+      </w:r>
+    </w:p>
+    <w:p>
+      <w:pPr>
+        <w:pBdr>
+          <w:top w:val="nil"/>
+          <w:left w:val="nil"/>
+          <w:bottom w:val="nil"/>
+          <w:right w:val="nil"/>
+          <w:between w:val="nil"/>
+        </w:pBdr>
+        <w:tabs>
+          <w:tab w:val="clear" w:pos="1440"/>
+        </w:tabs>
+        <w:ind w:left="0" w:firstLine="0"/>
+        <w:jc w:val="both"/>
         <w:rPr>
           <w:rFonts w:ascii="Arial Narrow" w:eastAsia="Arial Narrow" w:hAnsi="Arial Narrow" w:cs="Arial Narrow"/>
           <w:color w:val="000000"/>
@@ -19929,7 +20157,27 @@
           <w:sz w:val="18"/>
           <w:szCs w:val="18"/>
         </w:rPr>
-        <w:t>EL CONTRATISTA se obliga a gestionar sus Solicitudes de Información (RFI) conforme a los procedimientos contractuales establecidos, asegurando que toda consulta, aclaración o propuesta técnica relacionada con la ejecución de las instalaciones sanitarias sea previamente revisada y validada por un Ingeniero Sanitario colegiado y habilitado, antes de su envío a EL CONTRATANTE. Toda RFI deberá estar debidamente sustentada con la documentación técnica correspondiente y cumplir con los estándares normativos aplicables. EL CONTRATANTE se reserva el derecho de rechazar cualquier RFI que no cumpla con este requisito o que carezca de sustento técnico adecuado.</w:t>
+        <w:t xml:space="preserve">Queda expresamente prohibido el uso de ratios genéricos o estimaciones globales como base para la solicitud de materiales. Todo </w:t>
+      </w:r>
+      <w:proofErr w:type="spellStart"/>
+      <w:r>
+        <w:rPr>
+          <w:rFonts w:ascii="Arial Narrow" w:eastAsia="Arial Narrow" w:hAnsi="Arial Narrow" w:cs="Arial Narrow"/>
+          <w:color w:val="000000"/>
+          <w:sz w:val="18"/>
+          <w:szCs w:val="18"/>
+        </w:rPr>
+        <w:t>metrado</w:t>
+      </w:r>
+      <w:proofErr w:type="spellEnd"/>
+      <w:r>
+        <w:rPr>
+          <w:rFonts w:ascii="Arial Narrow" w:eastAsia="Arial Narrow" w:hAnsi="Arial Narrow" w:cs="Arial Narrow"/>
+          <w:color w:val="000000"/>
+          <w:sz w:val="18"/>
+          <w:szCs w:val="18"/>
+        </w:rPr>
+        <w:t xml:space="preserve"> deberá estar debidamente justificado con el desglose de cantidades por nivel, asegurando la trazabilidad y el control eficiente del suministro.</w:t>
       </w:r>
     </w:p>
     <w:p>
@@ -19972,240 +20220,12 @@
           <w:sz w:val="18"/>
           <w:szCs w:val="18"/>
         </w:rPr>
-        <w:t>EL CONTRATISTA se obliga a llevar a cabo la revisión integral de incompatibilidades, consultas y propuestas de mejora relacionadas con la ejecución de las instalaciones eléctricas, mediante la metodología ICE (</w:t>
-      </w:r>
-      <w:proofErr w:type="spellStart"/>
-      <w:r>
-        <w:rPr>
-          <w:rFonts w:ascii="Arial Narrow" w:eastAsia="Arial Narrow" w:hAnsi="Arial Narrow" w:cs="Arial Narrow"/>
-          <w:color w:val="000000"/>
-          <w:sz w:val="18"/>
-          <w:szCs w:val="18"/>
-        </w:rPr>
-        <w:t>Integrated</w:t>
-      </w:r>
-      <w:proofErr w:type="spellEnd"/>
-      <w:r>
-        <w:rPr>
-          <w:rFonts w:ascii="Arial Narrow" w:eastAsia="Arial Narrow" w:hAnsi="Arial Narrow" w:cs="Arial Narrow"/>
-          <w:color w:val="000000"/>
-          <w:sz w:val="18"/>
-          <w:szCs w:val="18"/>
-        </w:rPr>
-        <w:t xml:space="preserve"> </w:t>
-      </w:r>
-      <w:proofErr w:type="spellStart"/>
-      <w:r>
-        <w:rPr>
-          <w:rFonts w:ascii="Arial Narrow" w:eastAsia="Arial Narrow" w:hAnsi="Arial Narrow" w:cs="Arial Narrow"/>
-          <w:color w:val="000000"/>
-          <w:sz w:val="18"/>
-          <w:szCs w:val="18"/>
-        </w:rPr>
-        <w:t>Concurrent</w:t>
-      </w:r>
-      <w:proofErr w:type="spellEnd"/>
-      <w:r>
-        <w:rPr>
-          <w:rFonts w:ascii="Arial Narrow" w:eastAsia="Arial Narrow" w:hAnsi="Arial Narrow" w:cs="Arial Narrow"/>
-          <w:color w:val="000000"/>
-          <w:sz w:val="18"/>
-          <w:szCs w:val="18"/>
-        </w:rPr>
-        <w:t xml:space="preserve"> </w:t>
-      </w:r>
-      <w:proofErr w:type="spellStart"/>
-      <w:r>
-        <w:rPr>
-          <w:rFonts w:ascii="Arial Narrow" w:eastAsia="Arial Narrow" w:hAnsi="Arial Narrow" w:cs="Arial Narrow"/>
-          <w:color w:val="000000"/>
-          <w:sz w:val="18"/>
-          <w:szCs w:val="18"/>
-        </w:rPr>
-        <w:t>Engineering</w:t>
-      </w:r>
-      <w:proofErr w:type="spellEnd"/>
-      <w:r>
-        <w:rPr>
-          <w:rFonts w:ascii="Arial Narrow" w:eastAsia="Arial Narrow" w:hAnsi="Arial Narrow" w:cs="Arial Narrow"/>
-          <w:color w:val="000000"/>
-          <w:sz w:val="18"/>
-          <w:szCs w:val="18"/>
-        </w:rPr>
-        <w:t>), garantizando el cumplimiento de las siguientes etapas de revisión:</w:t>
-      </w:r>
-    </w:p>
-    <w:p>
-      <w:pPr>
-        <w:ind w:left="0" w:firstLine="0"/>
-        <w:rPr>
-          <w:rFonts w:ascii="Arial Narrow" w:eastAsia="Arial Narrow" w:hAnsi="Arial Narrow" w:cs="Arial Narrow"/>
-          <w:color w:val="000000"/>
-          <w:sz w:val="18"/>
-          <w:szCs w:val="18"/>
-        </w:rPr>
-      </w:pPr>
-    </w:p>
-    <w:p>
-      <w:pPr>
-        <w:pBdr>
-          <w:top w:val="nil"/>
-          <w:left w:val="nil"/>
-          <w:bottom w:val="nil"/>
-          <w:right w:val="nil"/>
-          <w:between w:val="nil"/>
-        </w:pBdr>
-        <w:tabs>
-          <w:tab w:val="clear" w:pos="1440"/>
-        </w:tabs>
-        <w:ind w:left="709" w:firstLine="0"/>
-        <w:jc w:val="both"/>
-        <w:rPr>
-          <w:rFonts w:ascii="Arial Narrow" w:eastAsia="Arial Narrow" w:hAnsi="Arial Narrow" w:cs="Arial Narrow"/>
-          <w:color w:val="000000"/>
-          <w:sz w:val="18"/>
-          <w:szCs w:val="18"/>
-        </w:rPr>
-      </w:pPr>
-      <w:r>
-        <w:rPr>
-          <w:rFonts w:ascii="Arial Narrow" w:eastAsia="Arial Narrow" w:hAnsi="Arial Narrow" w:cs="Arial Narrow"/>
-          <w:color w:val="000000"/>
-          <w:sz w:val="18"/>
-          <w:szCs w:val="18"/>
-        </w:rPr>
-        <w:t>a) Revisión hasta cimentación</w:t>
-      </w:r>
-    </w:p>
-    <w:p>
-      <w:pPr>
-        <w:pBdr>
-          <w:top w:val="nil"/>
-          <w:left w:val="nil"/>
-          <w:bottom w:val="nil"/>
-          <w:right w:val="nil"/>
-          <w:between w:val="nil"/>
-        </w:pBdr>
-        <w:tabs>
-          <w:tab w:val="clear" w:pos="1440"/>
-        </w:tabs>
-        <w:ind w:left="709" w:firstLine="0"/>
-        <w:jc w:val="both"/>
-        <w:rPr>
-          <w:rFonts w:ascii="Arial Narrow" w:eastAsia="Arial Narrow" w:hAnsi="Arial Narrow" w:cs="Arial Narrow"/>
-          <w:color w:val="000000"/>
-          <w:sz w:val="18"/>
-          <w:szCs w:val="18"/>
-        </w:rPr>
-      </w:pPr>
-      <w:r>
-        <w:rPr>
-          <w:rFonts w:ascii="Arial Narrow" w:eastAsia="Arial Narrow" w:hAnsi="Arial Narrow" w:cs="Arial Narrow"/>
-          <w:color w:val="000000"/>
-          <w:sz w:val="18"/>
-          <w:szCs w:val="18"/>
-        </w:rPr>
-        <w:t>b) Revisión de estructura de sótanos</w:t>
-      </w:r>
-    </w:p>
-    <w:p>
-      <w:pPr>
-        <w:pBdr>
-          <w:top w:val="nil"/>
-          <w:left w:val="nil"/>
-          <w:bottom w:val="nil"/>
-          <w:right w:val="nil"/>
-          <w:between w:val="nil"/>
-        </w:pBdr>
-        <w:tabs>
-          <w:tab w:val="clear" w:pos="1440"/>
-        </w:tabs>
-        <w:ind w:left="709" w:firstLine="0"/>
-        <w:jc w:val="both"/>
-        <w:rPr>
-          <w:rFonts w:ascii="Arial Narrow" w:eastAsia="Arial Narrow" w:hAnsi="Arial Narrow" w:cs="Arial Narrow"/>
-          <w:color w:val="000000"/>
-          <w:sz w:val="18"/>
-          <w:szCs w:val="18"/>
-        </w:rPr>
-      </w:pPr>
-      <w:r>
-        <w:rPr>
-          <w:rFonts w:ascii="Arial Narrow" w:eastAsia="Arial Narrow" w:hAnsi="Arial Narrow" w:cs="Arial Narrow"/>
-          <w:color w:val="000000"/>
-          <w:sz w:val="18"/>
-          <w:szCs w:val="18"/>
-        </w:rPr>
-        <w:t>c) Revisión de estructura de torre</w:t>
-      </w:r>
-    </w:p>
-    <w:p>
-      <w:pPr>
-        <w:pBdr>
-          <w:top w:val="nil"/>
-          <w:left w:val="nil"/>
-          <w:bottom w:val="nil"/>
-          <w:right w:val="nil"/>
-          <w:between w:val="nil"/>
-        </w:pBdr>
-        <w:tabs>
-          <w:tab w:val="clear" w:pos="1440"/>
-        </w:tabs>
-        <w:ind w:left="709" w:firstLine="0"/>
-        <w:jc w:val="both"/>
-        <w:rPr>
-          <w:rFonts w:ascii="Arial Narrow" w:eastAsia="Arial Narrow" w:hAnsi="Arial Narrow" w:cs="Arial Narrow"/>
-          <w:color w:val="000000"/>
-          <w:sz w:val="18"/>
-          <w:szCs w:val="18"/>
-        </w:rPr>
-      </w:pPr>
-    </w:p>
-    <w:p>
-      <w:pPr>
-        <w:pBdr>
-          <w:top w:val="nil"/>
-          <w:left w:val="nil"/>
-          <w:bottom w:val="nil"/>
-          <w:right w:val="nil"/>
-          <w:between w:val="nil"/>
-        </w:pBdr>
-        <w:tabs>
-          <w:tab w:val="clear" w:pos="1440"/>
-        </w:tabs>
-        <w:ind w:left="709" w:firstLine="0"/>
-        <w:jc w:val="both"/>
-        <w:rPr>
-          <w:rFonts w:ascii="Arial Narrow" w:eastAsia="Arial Narrow" w:hAnsi="Arial Narrow" w:cs="Arial Narrow"/>
-          <w:color w:val="000000"/>
-          <w:sz w:val="18"/>
-          <w:szCs w:val="18"/>
-        </w:rPr>
-      </w:pPr>
-      <w:r>
-        <w:rPr>
-          <w:rFonts w:ascii="Arial Narrow" w:eastAsia="Arial Narrow" w:hAnsi="Arial Narrow" w:cs="Arial Narrow"/>
-          <w:color w:val="000000"/>
-          <w:sz w:val="18"/>
-          <w:szCs w:val="18"/>
-        </w:rPr>
-        <w:t>Cada una de estas revisiones deberá realizarse en coordinación con EL CONTRATANTE y demás especialidades involucradas en el proyecto. Al término de cada etapa, se deberá levantar un acta formal que registre los acuerdos, soluciones adoptadas y la conformidad de las partes, debiendo ser firmada por los representantes técnicos de EL CONTRATANTE y EL CONTRATISTA, quienes certificarán la culminación de cada fase.</w:t>
-      </w:r>
-    </w:p>
-    <w:p>
-      <w:pPr>
-        <w:pBdr>
-          <w:top w:val="nil"/>
-          <w:left w:val="nil"/>
-          <w:bottom w:val="nil"/>
-          <w:right w:val="nil"/>
-          <w:between w:val="nil"/>
-        </w:pBdr>
-        <w:tabs>
-          <w:tab w:val="clear" w:pos="1440"/>
-        </w:tabs>
-        <w:ind w:left="0" w:firstLine="0"/>
-        <w:jc w:val="both"/>
+        <w:t>EL CONTRATANTE se reserva el derecho de rechazar, solicitar ajustes o retener aprobaciones de solicitudes de materiales que no cumplan con este requisito, sin que ello genere responsabilidad alguna por retrasos en la ejecución.</w:t>
+      </w:r>
+    </w:p>
+    <w:p>
+      <w:pPr>
+        <w:pStyle w:val="Prrafodelista"/>
         <w:rPr>
           <w:rFonts w:ascii="Arial Narrow" w:eastAsia="Arial Narrow" w:hAnsi="Arial Narrow" w:cs="Arial Narrow"/>
           <w:color w:val="000000"/>
@@ -20243,112 +20263,6 @@
           <w:sz w:val="18"/>
           <w:szCs w:val="18"/>
         </w:rPr>
-        <w:t xml:space="preserve">Queda expresamente prohibido el uso de ratios genéricos o estimaciones globales como base para la solicitud de materiales. Todo </w:t>
-      </w:r>
-      <w:proofErr w:type="spellStart"/>
-      <w:r>
-        <w:rPr>
-          <w:rFonts w:ascii="Arial Narrow" w:eastAsia="Arial Narrow" w:hAnsi="Arial Narrow" w:cs="Arial Narrow"/>
-          <w:color w:val="000000"/>
-          <w:sz w:val="18"/>
-          <w:szCs w:val="18"/>
-        </w:rPr>
-        <w:t>metrado</w:t>
-      </w:r>
-      <w:proofErr w:type="spellEnd"/>
-      <w:r>
-        <w:rPr>
-          <w:rFonts w:ascii="Arial Narrow" w:eastAsia="Arial Narrow" w:hAnsi="Arial Narrow" w:cs="Arial Narrow"/>
-          <w:color w:val="000000"/>
-          <w:sz w:val="18"/>
-          <w:szCs w:val="18"/>
-        </w:rPr>
-        <w:t xml:space="preserve"> deberá estar debidamente justificado con el desglose de cantidades por nivel, asegurando la trazabilidad y el control eficiente del suministro.</w:t>
-      </w:r>
-    </w:p>
-    <w:p>
-      <w:pPr>
-        <w:pStyle w:val="Prrafodelista"/>
-        <w:rPr>
-          <w:rFonts w:ascii="Arial Narrow" w:eastAsia="Arial Narrow" w:hAnsi="Arial Narrow" w:cs="Arial Narrow"/>
-          <w:color w:val="000000"/>
-          <w:sz w:val="18"/>
-          <w:szCs w:val="18"/>
-        </w:rPr>
-      </w:pPr>
-    </w:p>
-    <w:p>
-      <w:pPr>
-        <w:numPr>
-          <w:ilvl w:val="1"/>
-          <w:numId w:val="13"/>
-        </w:numPr>
-        <w:pBdr>
-          <w:top w:val="nil"/>
-          <w:left w:val="nil"/>
-          <w:bottom w:val="nil"/>
-          <w:right w:val="nil"/>
-          <w:between w:val="nil"/>
-        </w:pBdr>
-        <w:ind w:left="709" w:hanging="709"/>
-        <w:jc w:val="both"/>
-        <w:rPr>
-          <w:rFonts w:ascii="Arial Narrow" w:eastAsia="Arial Narrow" w:hAnsi="Arial Narrow" w:cs="Arial Narrow"/>
-          <w:color w:val="000000"/>
-          <w:sz w:val="18"/>
-          <w:szCs w:val="18"/>
-        </w:rPr>
-      </w:pPr>
-      <w:r>
-        <w:rPr>
-          <w:rFonts w:ascii="Arial Narrow" w:eastAsia="Arial Narrow" w:hAnsi="Arial Narrow" w:cs="Arial Narrow"/>
-          <w:color w:val="000000"/>
-          <w:sz w:val="18"/>
-          <w:szCs w:val="18"/>
-        </w:rPr>
-        <w:t>EL CONTRATANTE se reserva el derecho de rechazar, solicitar ajustes o retener aprobaciones de solicitudes de materiales que no cumplan con este requisito, sin que ello genere responsabilidad alguna por retrasos en la ejecución.</w:t>
-      </w:r>
-    </w:p>
-    <w:p>
-      <w:pPr>
-        <w:pStyle w:val="Prrafodelista"/>
-        <w:rPr>
-          <w:rFonts w:ascii="Arial Narrow" w:eastAsia="Arial Narrow" w:hAnsi="Arial Narrow" w:cs="Arial Narrow"/>
-          <w:color w:val="000000"/>
-          <w:sz w:val="18"/>
-          <w:szCs w:val="18"/>
-        </w:rPr>
-      </w:pPr>
-    </w:p>
-    <w:p>
-      <w:pPr>
-        <w:numPr>
-          <w:ilvl w:val="1"/>
-          <w:numId w:val="13"/>
-        </w:numPr>
-        <w:pBdr>
-          <w:top w:val="nil"/>
-          <w:left w:val="nil"/>
-          <w:bottom w:val="nil"/>
-          <w:right w:val="nil"/>
-          <w:between w:val="nil"/>
-        </w:pBdr>
-        <w:ind w:left="709" w:hanging="709"/>
-        <w:jc w:val="both"/>
-        <w:rPr>
-          <w:rFonts w:ascii="Arial Narrow" w:eastAsia="Arial Narrow" w:hAnsi="Arial Narrow" w:cs="Arial Narrow"/>
-          <w:color w:val="000000"/>
-          <w:sz w:val="18"/>
-          <w:szCs w:val="18"/>
-        </w:rPr>
-      </w:pPr>
-      <w:r>
-        <w:rPr>
-          <w:rFonts w:ascii="Arial Narrow" w:eastAsia="Arial Narrow" w:hAnsi="Arial Narrow" w:cs="Arial Narrow"/>
-          <w:color w:val="000000"/>
-          <w:sz w:val="18"/>
-          <w:szCs w:val="18"/>
-        </w:rPr>
         <w:t>Las partes acuerdan la realización de reuniones técnicas de coordinación (reuniones ICE) con el objetivo de revisar y validar los planos, así como de detectar posibles interferencias o inconsistencias en el diseño antes de su ejecución. Si, a pesar de estas instancias de revisión, se generan ajustes o retrabajos debido a incompatibilidades no advertidas oportunamente por el equipo técnico del CONTRATISTA, y existiera evidencia documentada de que los planos fueron revisados y aprobados, dichos trabajos adicionales serán asumidos por el CONTRATISTA. Esto implica que los costos asociados, tanto de materiales como de mano de obra, no serán reconocidos por el CONTRATANTE ni considerados como modificaciones al contrato.</w:t>
       </w:r>
     </w:p>
@@ -20465,7 +20379,6 @@
           <w:sz w:val="18"/>
           <w:szCs w:val="18"/>
         </w:rPr>
-        <w:lastRenderedPageBreak/>
         <w:t>LA CONTRATISTA</w:t>
       </w:r>
       <w:r>
@@ -20764,7 +20677,17 @@
           <w:sz w:val="18"/>
           <w:szCs w:val="18"/>
         </w:rPr>
-        <w:t xml:space="preserve">o a la Oficina de Normalización Previsional o a cualquier otra entidad de similar naturaleza, como consecuencia del incumplimiento en la contratación o demora en los pagos del SCTR por parte de </w:t>
+        <w:t xml:space="preserve">o a la Oficina de Normalización Previsional o a cualquier otra entidad de similar naturaleza, como consecuencia del incumplimiento en </w:t>
+      </w:r>
+      <w:r>
+        <w:rPr>
+          <w:rFonts w:ascii="Arial Narrow" w:eastAsia="Arial Narrow" w:hAnsi="Arial Narrow" w:cs="Arial Narrow"/>
+          <w:color w:val="000000"/>
+          <w:sz w:val="18"/>
+          <w:szCs w:val="18"/>
+        </w:rPr>
+        <w:lastRenderedPageBreak/>
+        <w:t xml:space="preserve">la contratación o demora en los pagos del SCTR por parte de </w:t>
       </w:r>
       <w:r>
         <w:rPr>
@@ -22005,7 +21928,6 @@
           <w:sz w:val="18"/>
           <w:szCs w:val="18"/>
         </w:rPr>
-        <w:lastRenderedPageBreak/>
         <w:t xml:space="preserve">En caso </w:t>
       </w:r>
       <w:r>
@@ -22400,6 +22322,7 @@
           <w:sz w:val="18"/>
           <w:szCs w:val="18"/>
         </w:rPr>
+        <w:lastRenderedPageBreak/>
         <w:t xml:space="preserve">11.7         Al iniciarse la obra, </w:t>
       </w:r>
       <w:r>
@@ -23750,7 +23673,6 @@
           <w:sz w:val="18"/>
           <w:szCs w:val="18"/>
         </w:rPr>
-        <w:lastRenderedPageBreak/>
         <w:t>Suministrar los servicios higiénicos básicos para el personal en obra.</w:t>
       </w:r>
     </w:p>
@@ -25855,6 +25777,7 @@
           <w:szCs w:val="18"/>
           <w:lang w:val="es-ES"/>
         </w:rPr>
+        <w:lastRenderedPageBreak/>
         <w:t>14.2.</w:t>
       </w:r>
       <w:r>
@@ -27327,6 +27250,7 @@
           <w:szCs w:val="18"/>
           <w:lang w:val="es-ES"/>
         </w:rPr>
+        <w:lastRenderedPageBreak/>
         <w:t>17.1.     Todo litigio, controversia, desavenencia o reclamación resultante, relacionada o derivada de este acto jurídico o que guarde relación con él, incluidas las relativas a su validez, eficacia o terminación incluso las del convenio arbitral en el incluido, serán resueltas mediante arbitraje de derecho, cuyo laudo será definitivo e inapelable, de conformidad con los reglamentos y el Estatuto de Centro de Arbitraje de la Cámara de Comercio de Lima a cuyas normas, administración y decisión se someten las Partes en forma incondicional, declarando conocerlas y aceptarlas en su integridad.</w:t>
       </w:r>
     </w:p>
@@ -28678,6 +28602,7 @@
           <w:szCs w:val="18"/>
           <w:lang w:val="es-ES"/>
         </w:rPr>
+        <w:lastRenderedPageBreak/>
         <w:t xml:space="preserve">EL CONTRATISTA </w:t>
       </w:r>
       <w:r>
@@ -30234,18 +30159,7 @@
           <w:szCs w:val="18"/>
           <w:lang w:val="es-ES"/>
         </w:rPr>
-        <w:t xml:space="preserve">) cumplir </w:t>
-      </w:r>
-      <w:r>
-        <w:rPr>
-          <w:rFonts w:ascii="Arial Narrow" w:eastAsia="Arial Narrow" w:hAnsi="Arial Narrow" w:cs="Arial Narrow"/>
-          <w:color w:val="000000" w:themeColor="text1"/>
-          <w:sz w:val="18"/>
-          <w:szCs w:val="18"/>
-          <w:lang w:val="es-ES"/>
-        </w:rPr>
-        <w:lastRenderedPageBreak/>
-        <w:t xml:space="preserve">con el plazo acordado para la refacción o reposición respecto a </w:t>
+        <w:t xml:space="preserve">) cumplir con el plazo acordado para la refacción o reposición respecto a </w:t>
       </w:r>
       <w:r>
         <w:rPr>
@@ -30495,6 +30409,7 @@
           <w:szCs w:val="18"/>
           <w:lang w:val="es-ES"/>
         </w:rPr>
+        <w:lastRenderedPageBreak/>
         <w:t xml:space="preserve">En caso </w:t>
       </w:r>
       <w:r>
@@ -31995,7 +31910,6 @@
           <w:szCs w:val="18"/>
           <w:lang w:val="es-ES"/>
         </w:rPr>
-        <w:lastRenderedPageBreak/>
         <w:t>EL CONTRATISTA</w:t>
       </w:r>
       <w:r>
@@ -32260,6 +32174,7 @@
           <w:szCs w:val="18"/>
           <w:lang w:val="es-ES"/>
         </w:rPr>
+        <w:lastRenderedPageBreak/>
         <w:t>En caso</w:t>
       </w:r>
       <w:r>
@@ -50568,6 +50483,12 @@
 </file>
 
 <file path=customXml/item1.xml><?xml version="1.0" encoding="utf-8"?>
+<go:gDocsCustomXmlDataStorage xmlns:go="http://customooxmlschemas.google.com/" xmlns:r="http://schemas.openxmlformats.org/officeDocument/2006/relationships" uri="GoogleDocsCustomDataVersion2">
+  <go:docsCustomData xmlns:go="http://customooxmlschemas.google.com/" roundtripDataSignature="AMtx7mi65SlRJfsAaB/f5FQ/QJjSa7JTRg==">CgMxLjAyCGguZ2pkZ3hzMgloLjMwajB6bGwyCWguMWZvYjl0ZTIJaC4zem55c2g3MgloLjJldDkycDAyCGgudHlqY3d0MgloLjNkeTZ2a20yCWguMXQzaDVzZjIJaC40ZDM0b2c4MgloLjJzOGV5bzEyCWguMTdkcDh2dTIJaC4zcmRjcmpuMgloLjI2aW4xcmcyCGgubG54Yno5MgloLjM1bmt1bjI4AHIhMVB3QlM0WUsxeVpEc0RYM1hkSnRydEtfT2RVVDZQNW5I</go:docsCustomData>
+</go:gDocsCustomXmlDataStorage>
+</file>
+
+<file path=customXml/item2.xml><?xml version="1.0" encoding="utf-8"?>
 <ct:contentTypeSchema xmlns:ct="http://schemas.microsoft.com/office/2006/metadata/contentType" xmlns:ma="http://schemas.microsoft.com/office/2006/metadata/properties/metaAttributes" ct:_="" ma:_="" ma:contentTypeName="Document" ma:contentTypeID="0x01010063B0DD29DB0EF346B1F1544CEBE0D2A7" ma:contentTypeVersion="18" ma:contentTypeDescription="Create a new document." ma:contentTypeScope="" ma:versionID="f944625a855169ca68f7a121b194bb92">
   <xsd:schema xmlns:xsd="http://www.w3.org/2001/XMLSchema" xmlns:xs="http://www.w3.org/2001/XMLSchema" xmlns:p="http://schemas.microsoft.com/office/2006/metadata/properties" xmlns:ns3="1c364c2e-a9e5-4d0d-8b0c-60f96943b919" xmlns:ns4="65ea09c1-7372-4828-95fe-f2a9534e8332" targetNamespace="http://schemas.microsoft.com/office/2006/metadata/properties" ma:root="true" ma:fieldsID="205ea4d9cf7dc04f23d4fe395e4eb5de" ns3:_="" ns4:_="">
     <xsd:import namespace="1c364c2e-a9e5-4d0d-8b0c-60f96943b919"/>
@@ -50820,13 +50741,19 @@
 </ct:contentTypeSchema>
 </file>
 
-<file path=customXml/item2.xml><?xml version="1.0" encoding="utf-8"?>
-<go:gDocsCustomXmlDataStorage xmlns:go="http://customooxmlschemas.google.com/" xmlns:r="http://schemas.openxmlformats.org/officeDocument/2006/relationships" uri="GoogleDocsCustomDataVersion2">
-  <go:docsCustomData xmlns:go="http://customooxmlschemas.google.com/" roundtripDataSignature="AMtx7mi65SlRJfsAaB/f5FQ/QJjSa7JTRg==">CgMxLjAyCGguZ2pkZ3hzMgloLjMwajB6bGwyCWguMWZvYjl0ZTIJaC4zem55c2g3MgloLjJldDkycDAyCGgudHlqY3d0MgloLjNkeTZ2a20yCWguMXQzaDVzZjIJaC40ZDM0b2c4MgloLjJzOGV5bzEyCWguMTdkcDh2dTIJaC4zcmRjcmpuMgloLjI2aW4xcmcyCGgubG54Yno5MgloLjM1bmt1bjI4AHIhMVB3QlM0WUsxeVpEc0RYM1hkSnRydEtfT2RVVDZQNW5I</go:docsCustomData>
-</go:gDocsCustomXmlDataStorage>
+<file path=customXml/item3.xml><?xml version="1.0" encoding="utf-8"?>
+<p:properties xmlns:p="http://schemas.microsoft.com/office/2006/metadata/properties" xmlns:xsi="http://www.w3.org/2001/XMLSchema-instance" xmlns:pc="http://schemas.microsoft.com/office/infopath/2007/PartnerControls">
+  <documentManagement>
+    <_activity xmlns="1c364c2e-a9e5-4d0d-8b0c-60f96943b919" xsi:nil="true"/>
+  </documentManagement>
+</p:properties>
 </file>
 
-<file path=customXml/item3.xml><?xml version="1.0" encoding="utf-8"?>
+<file path=customXml/item4.xml><?xml version="1.0" encoding="utf-8"?>
+<b:Sources xmlns:b="http://schemas.openxmlformats.org/officeDocument/2006/bibliography" xmlns="http://schemas.openxmlformats.org/officeDocument/2006/bibliography" SelectedStyle="\APASixthEditionOfficeOnline.xsl" StyleName="APA" Version="6"/>
+</file>
+
+<file path=customXml/item5.xml><?xml version="1.0" encoding="utf-8"?>
 <?mso-contentType ?>
 <FormTemplates xmlns="http://schemas.microsoft.com/sharepoint/v3/contenttype/forms">
   <Display>DocumentLibraryForm</Display>
@@ -50835,19 +50762,16 @@
 </FormTemplates>
 </file>
 
-<file path=customXml/item4.xml><?xml version="1.0" encoding="utf-8"?>
-<b:Sources xmlns:b="http://schemas.openxmlformats.org/officeDocument/2006/bibliography" xmlns="http://schemas.openxmlformats.org/officeDocument/2006/bibliography" SelectedStyle="\APASixthEditionOfficeOnline.xsl" StyleName="APA" Version="6"/>
+<file path=customXml/itemProps1.xml><?xml version="1.0" encoding="utf-8"?>
+<ds:datastoreItem xmlns:ds="http://schemas.openxmlformats.org/officeDocument/2006/customXml" ds:itemID="{11111111-1234-1234-1234-123412341234}">
+  <ds:schemaRefs>
+    <ds:schemaRef ds:uri="http://customooxmlschemas.google.com/"/>
+    <ds:schemaRef ds:uri="http://schemas.openxmlformats.org/officeDocument/2006/relationships"/>
+  </ds:schemaRefs>
+</ds:datastoreItem>
 </file>
 
-<file path=customXml/item5.xml><?xml version="1.0" encoding="utf-8"?>
-<p:properties xmlns:p="http://schemas.microsoft.com/office/2006/metadata/properties" xmlns:xsi="http://www.w3.org/2001/XMLSchema-instance" xmlns:pc="http://schemas.microsoft.com/office/infopath/2007/PartnerControls">
-  <documentManagement>
-    <_activity xmlns="1c364c2e-a9e5-4d0d-8b0c-60f96943b919" xsi:nil="true"/>
-  </documentManagement>
-</p:properties>
-</file>
-
-<file path=customXml/itemProps1.xml><?xml version="1.0" encoding="utf-8"?>
+<file path=customXml/itemProps2.xml><?xml version="1.0" encoding="utf-8"?>
 <ds:datastoreItem xmlns:ds="http://schemas.openxmlformats.org/officeDocument/2006/customXml" ds:itemID="{F24A4505-FFC0-4551-A77A-5910F586F04D}">
   <ds:schemaRefs>
     <ds:schemaRef ds:uri="http://schemas.microsoft.com/office/2006/metadata/contentType"/>
@@ -50866,19 +50790,12 @@
 </ds:datastoreItem>
 </file>
 
-<file path=customXml/itemProps2.xml><?xml version="1.0" encoding="utf-8"?>
-<ds:datastoreItem xmlns:ds="http://schemas.openxmlformats.org/officeDocument/2006/customXml" ds:itemID="{11111111-1234-1234-1234-123412341234}">
+<file path=customXml/itemProps3.xml><?xml version="1.0" encoding="utf-8"?>
+<ds:datastoreItem xmlns:ds="http://schemas.openxmlformats.org/officeDocument/2006/customXml" ds:itemID="{D829E601-C5D7-4EB3-859E-E162E4261A98}">
   <ds:schemaRefs>
-    <ds:schemaRef ds:uri="http://customooxmlschemas.google.com/"/>
-    <ds:schemaRef ds:uri="http://schemas.openxmlformats.org/officeDocument/2006/relationships"/>
-  </ds:schemaRefs>
-</ds:datastoreItem>
-</file>
-
-<file path=customXml/itemProps3.xml><?xml version="1.0" encoding="utf-8"?>
-<ds:datastoreItem xmlns:ds="http://schemas.openxmlformats.org/officeDocument/2006/customXml" ds:itemID="{DD1BD535-DABA-4752-B724-9FD5D9237B7F}">
-  <ds:schemaRefs>
-    <ds:schemaRef ds:uri="http://schemas.microsoft.com/sharepoint/v3/contenttype/forms"/>
+    <ds:schemaRef ds:uri="http://schemas.microsoft.com/office/2006/metadata/properties"/>
+    <ds:schemaRef ds:uri="http://schemas.microsoft.com/office/infopath/2007/PartnerControls"/>
+    <ds:schemaRef ds:uri="1c364c2e-a9e5-4d0d-8b0c-60f96943b919"/>
   </ds:schemaRefs>
 </ds:datastoreItem>
 </file>
@@ -50892,11 +50809,9 @@
 </file>
 
 <file path=customXml/itemProps5.xml><?xml version="1.0" encoding="utf-8"?>
-<ds:datastoreItem xmlns:ds="http://schemas.openxmlformats.org/officeDocument/2006/customXml" ds:itemID="{D829E601-C5D7-4EB3-859E-E162E4261A98}">
+<ds:datastoreItem xmlns:ds="http://schemas.openxmlformats.org/officeDocument/2006/customXml" ds:itemID="{DD1BD535-DABA-4752-B724-9FD5D9237B7F}">
   <ds:schemaRefs>
-    <ds:schemaRef ds:uri="http://schemas.microsoft.com/office/2006/metadata/properties"/>
-    <ds:schemaRef ds:uri="http://schemas.microsoft.com/office/infopath/2007/PartnerControls"/>
-    <ds:schemaRef ds:uri="1c364c2e-a9e5-4d0d-8b0c-60f96943b919"/>
+    <ds:schemaRef ds:uri="http://schemas.microsoft.com/sharepoint/v3/contenttype/forms"/>
   </ds:schemaRefs>
 </ds:datastoreItem>
 </file>
</xml_diff>

<commit_message>
fix cosas del contrato de adjudicaciones
</commit_message>
<xml_diff>
--- a/Features/CostsModule/Features/AdjudicacionesFeature/Templates/plantilla_instalacion_con_placeholders.docx
+++ b/Features/CostsModule/Features/AdjudicacionesFeature/Templates/plantilla_instalacion_con_placeholders.docx
@@ -441,7 +441,7 @@
           <w:szCs w:val="24"/>
           <w:lang w:val="es-ES"/>
         </w:rPr>
-        <w:t>{{ADVANCE_PERCENTAGE}}</w:t>
+        <w:t>{{HOJA_RESUMEN_ADELANTO_MONTO}}</w:t>
       </w:r>
     </w:p>
     <w:p>
@@ -771,7 +771,29 @@
           <w:szCs w:val="24"/>
           <w:lang w:val="es-ES"/>
         </w:rPr>
-        <w:t xml:space="preserve">                         {{ADVANCE_AMOUNT}} Inc. IGV</w:t>
+        <w:t xml:space="preserve">                      </w:t>
+      </w:r>
+      <w:proofErr w:type="gramStart"/>
+      <w:r>
+        <w:rPr>
+          <w:rFonts w:ascii="Calibri" w:eastAsia="Calibri" w:hAnsi="Calibri" w:cs="Calibri"/>
+          <w:color w:val="000000" w:themeColor="text1"/>
+          <w:sz w:val="24"/>
+          <w:szCs w:val="24"/>
+          <w:lang w:val="es-ES"/>
+        </w:rPr>
+        <w:t xml:space="preserve">   {</w:t>
+      </w:r>
+      <w:proofErr w:type="gramEnd"/>
+      <w:r>
+        <w:rPr>
+          <w:rFonts w:ascii="Calibri" w:eastAsia="Calibri" w:hAnsi="Calibri" w:cs="Calibri"/>
+          <w:color w:val="000000" w:themeColor="text1"/>
+          <w:sz w:val="24"/>
+          <w:szCs w:val="24"/>
+          <w:lang w:val="es-ES"/>
+        </w:rPr>
+        <w:t>{ADVANCE_AMOUNT}}</w:t>
       </w:r>
     </w:p>
     <w:p>
@@ -922,7 +944,15 @@
           <w:szCs w:val="24"/>
         </w:rPr>
         <w:tab/>
-        <w:t>{{FORMA_DE_PAGO}} {{FORMA_DE_PAGO_ADVANCE_PERCENTAGE}}, saldo valorizaciones a 7 días hábiles</w:t>
+      </w:r>
+      <w:r>
+        <w:rPr>
+          <w:rFonts w:ascii="Calibri" w:eastAsia="Calibri" w:hAnsi="Calibri" w:cs="Calibri"/>
+          <w:color w:val="000000"/>
+          <w:sz w:val="24"/>
+          <w:szCs w:val="24"/>
+        </w:rPr>
+        <w:t>{{HOJA_RESUMEN_FORMA_DE_PAGO}}</w:t>
       </w:r>
     </w:p>
     <w:p>
@@ -1098,7 +1128,57 @@
           <w:u w:val="single"/>
           <w:lang w:val="es-ES"/>
         </w:rPr>
-        <w:t>{{NUM_CONTRATO}}{{PROYECTO_ABREVIATURA}}-{{AÑO_ACTUAL}} A {{TIPO_CONTRATO}} POR EL {{PARTIDA}}</w:t>
+        <w:t>{{NUM_CONTRATO</w:t>
+      </w:r>
+      <w:proofErr w:type="gramStart"/>
+      <w:r>
+        <w:rPr>
+          <w:rFonts w:ascii="Arial Narrow" w:eastAsia="Arial Narrow" w:hAnsi="Arial Narrow" w:cs="Arial Narrow"/>
+          <w:b/>
+          <w:color w:val="000000"/>
+          <w:sz w:val="18"/>
+          <w:szCs w:val="18"/>
+          <w:u w:val="single"/>
+          <w:lang w:val="es-ES"/>
+        </w:rPr>
+        <w:t>}}{</w:t>
+      </w:r>
+      <w:proofErr w:type="gramEnd"/>
+      <w:r>
+        <w:rPr>
+          <w:rFonts w:ascii="Arial Narrow" w:eastAsia="Arial Narrow" w:hAnsi="Arial Narrow" w:cs="Arial Narrow"/>
+          <w:b/>
+          <w:color w:val="000000"/>
+          <w:sz w:val="18"/>
+          <w:szCs w:val="18"/>
+          <w:u w:val="single"/>
+          <w:lang w:val="es-ES"/>
+        </w:rPr>
+        <w:t xml:space="preserve">{PROYECTO_ABREVIATURA}}-{{AÑO_ACTUAL}} A </w:t>
+      </w:r>
+      <w:r>
+        <w:rPr>
+          <w:rFonts w:ascii="Arial Narrow" w:eastAsia="Arial Narrow" w:hAnsi="Arial Narrow" w:cs="Arial Narrow"/>
+          <w:b/>
+          <w:color w:val="000000"/>
+          <w:sz w:val="18"/>
+          <w:szCs w:val="18"/>
+          <w:u w:val="single"/>
+          <w:lang w:val="es-ES"/>
+        </w:rPr>
+        <w:t>{{TIPO_CONTRATO_MAYÚSCULA}}</w:t>
+      </w:r>
+      <w:r>
+        <w:rPr>
+          <w:rFonts w:ascii="Arial Narrow" w:eastAsia="Arial Narrow" w:hAnsi="Arial Narrow" w:cs="Arial Narrow"/>
+          <w:b/>
+          <w:color w:val="000000"/>
+          <w:sz w:val="18"/>
+          <w:szCs w:val="18"/>
+          <w:u w:val="single"/>
+          <w:lang w:val="es-ES"/>
+        </w:rPr>
+        <w:t xml:space="preserve"> POR EL {{PARTIDA}}</w:t>
       </w:r>
     </w:p>
     <w:p>
@@ -1178,7 +1258,53 @@
           <w:szCs w:val="18"/>
           <w:lang w:val="es-ES"/>
         </w:rPr>
-        <w:t>. {{NUM_CONTRATO}}{{PROYECTO_ABREVIATURA}}-{{AÑO_ACTUAL}} A {{TIPO_CONTRATO}}</w:t>
+        <w:t>. {{NUM_CONTRATO</w:t>
+      </w:r>
+      <w:proofErr w:type="gramStart"/>
+      <w:r>
+        <w:rPr>
+          <w:rFonts w:ascii="Arial Narrow" w:eastAsia="Arial Narrow" w:hAnsi="Arial Narrow" w:cs="Arial Narrow"/>
+          <w:b/>
+          <w:bCs/>
+          <w:sz w:val="18"/>
+          <w:szCs w:val="18"/>
+          <w:lang w:val="es-ES"/>
+        </w:rPr>
+        <w:t>}}{</w:t>
+      </w:r>
+      <w:proofErr w:type="gramEnd"/>
+      <w:r>
+        <w:rPr>
+          <w:rFonts w:ascii="Arial Narrow" w:eastAsia="Arial Narrow" w:hAnsi="Arial Narrow" w:cs="Arial Narrow"/>
+          <w:b/>
+          <w:bCs/>
+          <w:sz w:val="18"/>
+          <w:szCs w:val="18"/>
+          <w:lang w:val="es-ES"/>
+        </w:rPr>
+        <w:t>{PROYECTO_ABREVIATURA}}-{{AÑO_ACTUAL}} A {{TIPO_CONTRATO</w:t>
+      </w:r>
+      <w:r>
+        <w:rPr>
+          <w:rFonts w:ascii="Arial Narrow" w:eastAsia="Arial Narrow" w:hAnsi="Arial Narrow" w:cs="Arial Narrow"/>
+          <w:b/>
+          <w:bCs/>
+          <w:sz w:val="18"/>
+          <w:szCs w:val="18"/>
+          <w:lang w:val="es-ES"/>
+        </w:rPr>
+        <w:t>_MAYÚSCULA</w:t>
+      </w:r>
+      <w:r>
+        <w:rPr>
+          <w:rFonts w:ascii="Arial Narrow" w:eastAsia="Arial Narrow" w:hAnsi="Arial Narrow" w:cs="Arial Narrow"/>
+          <w:b/>
+          <w:bCs/>
+          <w:sz w:val="18"/>
+          <w:szCs w:val="18"/>
+          <w:lang w:val="es-ES"/>
+        </w:rPr>
+        <w:t>}}</w:t>
       </w:r>
       <w:r>
         <w:rPr>
@@ -4222,29 +4348,7 @@
           <w:szCs w:val="18"/>
           <w:lang w:val="es-ES"/>
         </w:rPr>
-        <w:t xml:space="preserve">Pago mediante valorizaciones {{FORMA_DE_PAGO}}, pagaderas a los 7 días hábiles siguientes de </w:t>
-      </w:r>
-      <w:proofErr w:type="spellStart"/>
-      <w:r>
-        <w:rPr>
-          <w:rFonts w:ascii="Arial Narrow" w:eastAsia="Arial Narrow" w:hAnsi="Arial Narrow" w:cs="Arial Narrow"/>
-          <w:color w:val="000000" w:themeColor="text1"/>
-          <w:sz w:val="18"/>
-          <w:szCs w:val="18"/>
-          <w:lang w:val="es-ES"/>
-        </w:rPr>
-        <w:t>recepcionada</w:t>
-      </w:r>
-      <w:proofErr w:type="spellEnd"/>
-      <w:r>
-        <w:rPr>
-          <w:rFonts w:ascii="Arial Narrow" w:eastAsia="Arial Narrow" w:hAnsi="Arial Narrow" w:cs="Arial Narrow"/>
-          <w:color w:val="000000" w:themeColor="text1"/>
-          <w:sz w:val="18"/>
-          <w:szCs w:val="18"/>
-          <w:lang w:val="es-ES"/>
-        </w:rPr>
-        <w:t xml:space="preserve"> la factura y/o valorización correspondiente, debidamente emitida, con la respectiva retención del fondo de garantía. Las valorizaciones se determinan a partir del inicio de los trabajos en obra. </w:t>
+        <w:t>{{CLÁUSULAS_ADELANTO}}</w:t>
       </w:r>
     </w:p>
     <w:p>
@@ -4508,7 +4612,6 @@
           <w:sz w:val="18"/>
           <w:szCs w:val="18"/>
         </w:rPr>
-        <w:lastRenderedPageBreak/>
         <w:t xml:space="preserve">Tales documentos deberán ser presentados a </w:t>
       </w:r>
       <w:r>
@@ -4645,6 +4748,7 @@
           <w:szCs w:val="18"/>
           <w:lang w:val="es-ES"/>
         </w:rPr>
+        <w:lastRenderedPageBreak/>
         <w:t xml:space="preserve">Cada valorización deberá presentarse acompañada de la documentación que la sustente, y adicionalmente por aquella necesaria, para demostrar el cumplimiento de las disposiciones laborales y previsionales del personal y de los subcontratista, en caso se haya autorizado a alguno, dentro de las cuales se incluyen los pagos mensuales a </w:t>
       </w:r>
       <w:proofErr w:type="spellStart"/>
@@ -6062,7 +6166,6 @@
           <w:szCs w:val="18"/>
           <w:lang w:val="es-ES"/>
         </w:rPr>
-        <w:lastRenderedPageBreak/>
         <w:t>EL CONTRATANTE</w:t>
       </w:r>
       <w:r>
@@ -6116,7 +6219,7 @@
           <w:szCs w:val="18"/>
           <w:lang w:val="es-ES"/>
         </w:rPr>
-        <w:t xml:space="preserve"> días después de entregada la obra con acta Recepción Definitiva suscrita por </w:t>
+        <w:t xml:space="preserve"> después de entregada la obra con acta Recepción Definitiva suscrita por </w:t>
       </w:r>
       <w:r>
         <w:rPr>
@@ -6191,6 +6294,7 @@
           <w:sz w:val="18"/>
           <w:szCs w:val="18"/>
         </w:rPr>
+        <w:lastRenderedPageBreak/>
         <w:t xml:space="preserve">En caso de que la ejecución de la obra no se realice de acuerdo con lo pactado en la cláusula segunda y a los cambios y/o trabajos adicionales que fueron dispuestos, </w:t>
       </w:r>
       <w:r>
@@ -9295,19 +9399,7 @@
           <w:szCs w:val="18"/>
           <w:lang w:val="es-ES"/>
         </w:rPr>
-        <w:t xml:space="preserve">EL </w:t>
-      </w:r>
-      <w:r>
-        <w:rPr>
-          <w:rFonts w:ascii="Arial Narrow" w:eastAsia="Arial Narrow" w:hAnsi="Arial Narrow" w:cs="Arial Narrow"/>
-          <w:b/>
-          <w:color w:val="000000" w:themeColor="text1"/>
-          <w:sz w:val="18"/>
-          <w:szCs w:val="18"/>
-          <w:lang w:val="es-ES"/>
-        </w:rPr>
-        <w:lastRenderedPageBreak/>
-        <w:t xml:space="preserve">CONTRATISTA </w:t>
+        <w:t xml:space="preserve">EL CONTRATISTA </w:t>
       </w:r>
       <w:r>
         <w:rPr>
@@ -9389,6 +9481,7 @@
           <w:sz w:val="18"/>
           <w:szCs w:val="18"/>
         </w:rPr>
+        <w:lastRenderedPageBreak/>
         <w:t xml:space="preserve">Sin perjuicio de ello, </w:t>
       </w:r>
       <w:r>
@@ -10785,8 +10878,93 @@
           <w:szCs w:val="18"/>
           <w:lang w:val="es-ES"/>
         </w:rPr>
+        <w:t xml:space="preserve">9.1.10. </w:t>
+      </w:r>
+      <w:r>
+        <w:rPr>
+          <w:rFonts w:ascii="Arial Narrow" w:eastAsia="Arial Narrow" w:hAnsi="Arial Narrow" w:cs="Arial Narrow"/>
+          <w:b/>
+          <w:sz w:val="18"/>
+          <w:szCs w:val="18"/>
+          <w:lang w:val="es-ES"/>
+        </w:rPr>
+        <w:t>EL CONTRATISTA</w:t>
+      </w:r>
+      <w:r>
+        <w:rPr>
+          <w:rFonts w:ascii="Arial Narrow" w:eastAsia="Arial Narrow" w:hAnsi="Arial Narrow" w:cs="Arial Narrow"/>
+          <w:sz w:val="18"/>
+          <w:szCs w:val="18"/>
+          <w:lang w:val="es-ES"/>
+        </w:rPr>
+        <w:t xml:space="preserve"> pondrá a disposición, a solo requerimiento de </w:t>
+      </w:r>
+      <w:r>
+        <w:rPr>
+          <w:rFonts w:ascii="Arial Narrow" w:eastAsia="Arial Narrow" w:hAnsi="Arial Narrow" w:cs="Arial Narrow"/>
+          <w:b/>
+          <w:sz w:val="18"/>
+          <w:szCs w:val="18"/>
+          <w:lang w:val="es-ES"/>
+        </w:rPr>
+        <w:t>EL CONTRATANTE</w:t>
+      </w:r>
+      <w:r>
+        <w:rPr>
+          <w:rFonts w:ascii="Arial Narrow" w:eastAsia="Arial Narrow" w:hAnsi="Arial Narrow" w:cs="Arial Narrow"/>
+          <w:sz w:val="18"/>
+          <w:szCs w:val="18"/>
+          <w:lang w:val="es-ES"/>
+        </w:rPr>
+        <w:t xml:space="preserve"> o de cualquier autoridad pública la información que permita verificar los pagos efectuados por </w:t>
+      </w:r>
+      <w:r>
+        <w:rPr>
+          <w:rFonts w:ascii="Arial Narrow" w:eastAsia="Arial Narrow" w:hAnsi="Arial Narrow" w:cs="Arial Narrow"/>
+          <w:b/>
+          <w:sz w:val="18"/>
+          <w:szCs w:val="18"/>
+          <w:lang w:val="es-ES"/>
+        </w:rPr>
+        <w:t>EL CONTRATISTA</w:t>
+      </w:r>
+      <w:r>
+        <w:rPr>
+          <w:rFonts w:ascii="Arial Narrow" w:eastAsia="Arial Narrow" w:hAnsi="Arial Narrow" w:cs="Arial Narrow"/>
+          <w:sz w:val="18"/>
+          <w:szCs w:val="18"/>
+          <w:lang w:val="es-ES"/>
+        </w:rPr>
+        <w:t xml:space="preserve"> a sus servidores, de cualquier nivel o condición, incluyendo personal de supervisión y administrativos desplazados a las instalaciones de </w:t>
+      </w:r>
+      <w:r>
+        <w:rPr>
+          <w:rFonts w:ascii="Arial Narrow" w:eastAsia="Arial Narrow" w:hAnsi="Arial Narrow" w:cs="Arial Narrow"/>
+          <w:b/>
+          <w:sz w:val="18"/>
+          <w:szCs w:val="18"/>
+          <w:lang w:val="es-ES"/>
+        </w:rPr>
+        <w:t>EL CONTRATANTE</w:t>
+      </w:r>
+      <w:r>
+        <w:rPr>
+          <w:rFonts w:ascii="Arial Narrow" w:eastAsia="Arial Narrow" w:hAnsi="Arial Narrow" w:cs="Arial Narrow"/>
+          <w:sz w:val="18"/>
+          <w:szCs w:val="18"/>
+          <w:lang w:val="es-ES"/>
+        </w:rPr>
+        <w:t xml:space="preserve"> y podrá ser hecha cuantas veces lo </w:t>
+      </w:r>
+      <w:r>
+        <w:rPr>
+          <w:rFonts w:ascii="Arial Narrow" w:eastAsia="Arial Narrow" w:hAnsi="Arial Narrow" w:cs="Arial Narrow"/>
+          <w:sz w:val="18"/>
+          <w:szCs w:val="18"/>
+          <w:lang w:val="es-ES"/>
+        </w:rPr>
         <w:lastRenderedPageBreak/>
-        <w:t xml:space="preserve">9.1.10. </w:t>
+        <w:t xml:space="preserve">estime necesario, sin requerimiento ni aviso previo, ya sea se trate de libros de planillas, libros contables, boletas de pago y otros documentos que demuestren el cumplimiento de las obligaciones antes indicadas. Sin perjuicio de lo anterior, </w:t>
       </w:r>
       <w:r>
         <w:rPr>
@@ -10805,7 +10983,7 @@
           <w:szCs w:val="18"/>
           <w:lang w:val="es-ES"/>
         </w:rPr>
-        <w:t xml:space="preserve"> pondrá a disposición, a solo requerimiento de </w:t>
+        <w:t xml:space="preserve"> se obliga a presentar mensualmente a </w:t>
       </w:r>
       <w:r>
         <w:rPr>
@@ -10824,7 +11002,26 @@
           <w:szCs w:val="18"/>
           <w:lang w:val="es-ES"/>
         </w:rPr>
-        <w:t xml:space="preserve"> o de cualquier autoridad pública la información que permita verificar los pagos efectuados por </w:t>
+        <w:t xml:space="preserve">, a solicitud de esta, los documentos que aseguren el  cumplimiento de las obligaciones laborales y previsionales de su personal desplazado en las instalaciones de </w:t>
+      </w:r>
+      <w:r>
+        <w:rPr>
+          <w:rFonts w:ascii="Arial Narrow" w:eastAsia="Arial Narrow" w:hAnsi="Arial Narrow" w:cs="Arial Narrow"/>
+          <w:b/>
+          <w:sz w:val="18"/>
+          <w:szCs w:val="18"/>
+          <w:lang w:val="es-ES"/>
+        </w:rPr>
+        <w:t>EL CONTRATANTE</w:t>
+      </w:r>
+      <w:r>
+        <w:rPr>
+          <w:rFonts w:ascii="Arial Narrow" w:eastAsia="Arial Narrow" w:hAnsi="Arial Narrow" w:cs="Arial Narrow"/>
+          <w:sz w:val="18"/>
+          <w:szCs w:val="18"/>
+          <w:lang w:val="es-ES"/>
+        </w:rPr>
+        <w:t xml:space="preserve">. En caso de que de la revisión resultara que </w:t>
       </w:r>
       <w:r>
         <w:rPr>
@@ -10843,7 +11040,7 @@
           <w:szCs w:val="18"/>
           <w:lang w:val="es-ES"/>
         </w:rPr>
-        <w:t xml:space="preserve"> a sus servidores, de cualquier nivel o condición, incluyendo personal de supervisión y administrativos desplazados a las instalaciones de </w:t>
+        <w:t xml:space="preserve"> no viene cumpliendo con sus obligaciones tributarias, previsionales y/o laborales, </w:t>
       </w:r>
       <w:r>
         <w:rPr>
@@ -10862,7 +11059,78 @@
           <w:szCs w:val="18"/>
           <w:lang w:val="es-ES"/>
         </w:rPr>
-        <w:t xml:space="preserve"> y podrá ser hecha cuantas veces lo estime necesario, sin requerimiento ni aviso previo, ya sea se trate de libros de planillas, libros contables, boletas de pago y otros documentos que demuestren el cumplimiento de las obligaciones antes indicadas. Sin perjuicio de lo anterior, </w:t>
+        <w:t xml:space="preserve"> queda facultado para resolver automáticamente este CONTRATO, sin perjuicio de ejecutar las fianzas emitidas a favor de </w:t>
+      </w:r>
+      <w:r>
+        <w:rPr>
+          <w:rFonts w:ascii="Arial Narrow" w:eastAsia="Arial Narrow" w:hAnsi="Arial Narrow" w:cs="Arial Narrow"/>
+          <w:b/>
+          <w:sz w:val="18"/>
+          <w:szCs w:val="18"/>
+          <w:lang w:val="es-ES"/>
+        </w:rPr>
+        <w:t>EL CONTRATANTE</w:t>
+      </w:r>
+      <w:r>
+        <w:rPr>
+          <w:rFonts w:ascii="Arial Narrow" w:eastAsia="Arial Narrow" w:hAnsi="Arial Narrow" w:cs="Arial Narrow"/>
+          <w:sz w:val="18"/>
+          <w:szCs w:val="18"/>
+          <w:lang w:val="es-ES"/>
+        </w:rPr>
+        <w:t>, según sea el caso.</w:t>
+      </w:r>
+    </w:p>
+    <w:p>
+      <w:pPr>
+        <w:ind w:left="709" w:firstLine="0"/>
+        <w:jc w:val="both"/>
+        <w:rPr>
+          <w:rFonts w:ascii="Arial Narrow" w:eastAsia="Arial Narrow" w:hAnsi="Arial Narrow" w:cs="Arial Narrow"/>
+          <w:sz w:val="18"/>
+          <w:szCs w:val="18"/>
+        </w:rPr>
+      </w:pPr>
+    </w:p>
+    <w:p>
+      <w:pPr>
+        <w:ind w:left="709" w:firstLine="0"/>
+        <w:jc w:val="both"/>
+        <w:rPr>
+          <w:rFonts w:ascii="Arial Narrow" w:eastAsia="Arial Narrow" w:hAnsi="Arial Narrow" w:cs="Arial Narrow"/>
+          <w:sz w:val="18"/>
+          <w:szCs w:val="18"/>
+          <w:lang w:val="es-ES"/>
+        </w:rPr>
+      </w:pPr>
+      <w:r>
+        <w:rPr>
+          <w:rFonts w:ascii="Arial Narrow" w:eastAsia="Arial Narrow" w:hAnsi="Arial Narrow" w:cs="Arial Narrow"/>
+          <w:sz w:val="18"/>
+          <w:szCs w:val="18"/>
+          <w:lang w:val="es-ES"/>
+        </w:rPr>
+        <w:t xml:space="preserve">9.1.11. Adoptar y mantener todas las medidas de seguridad necesarias para el resguardo de sus trabajadores, según la naturaleza y circunstancias que requieran los trabajos encomendados, incluyendo el uso de equipos de protección personal, (EPP específicos para los trabajos, la entrega de estos equipos de protección personal debe registrarse permanentemente en una hoja por cada trabajador con la firma del mismo como medida de control) antes del ingreso a la obra deberá tener la aprobación de los EPP, herramientas y/o equipos de trabajo por el área de prevención de “LA OBRA” y la contratación de los seguros que fueran necesarios (SCTR, seguro TREC, </w:t>
+      </w:r>
+      <w:proofErr w:type="spellStart"/>
+      <w:r>
+        <w:rPr>
+          <w:rFonts w:ascii="Arial Narrow" w:eastAsia="Arial Narrow" w:hAnsi="Arial Narrow" w:cs="Arial Narrow"/>
+          <w:sz w:val="18"/>
+          <w:szCs w:val="18"/>
+          <w:lang w:val="es-ES"/>
+        </w:rPr>
+        <w:t>etc</w:t>
+      </w:r>
+      <w:proofErr w:type="spellEnd"/>
+      <w:r>
+        <w:rPr>
+          <w:rFonts w:ascii="Arial Narrow" w:eastAsia="Arial Narrow" w:hAnsi="Arial Narrow" w:cs="Arial Narrow"/>
+          <w:sz w:val="18"/>
+          <w:szCs w:val="18"/>
+          <w:lang w:val="es-ES"/>
+        </w:rPr>
+        <w:t xml:space="preserve">). </w:t>
       </w:r>
       <w:r>
         <w:rPr>
@@ -10881,7 +11149,7 @@
           <w:szCs w:val="18"/>
           <w:lang w:val="es-ES"/>
         </w:rPr>
-        <w:t xml:space="preserve"> se obliga a presentar mensualmente a </w:t>
+        <w:t xml:space="preserve"> se obliga a tener en todo momento los equipos de protección personal (EPP) al momento de realizar los trabajos contratados, caso contrario será único y exclusivo responsable por cualquier daño material o personal que pudiese ocasionar.  Si como consecuencia de la inobservancia de esta obligación </w:t>
       </w:r>
       <w:r>
         <w:rPr>
@@ -10900,7 +11168,7 @@
           <w:szCs w:val="18"/>
           <w:lang w:val="es-ES"/>
         </w:rPr>
-        <w:t xml:space="preserve">, a solicitud de esta, los documentos que aseguren el  cumplimiento de las obligaciones laborales y previsionales de su personal desplazado en las instalaciones de </w:t>
+        <w:t xml:space="preserve"> tuviese que pagar alguna multa o se haya iniciado algún procedimiento en contra de este </w:t>
       </w:r>
       <w:r>
         <w:rPr>
@@ -10919,7 +11187,7 @@
           <w:szCs w:val="18"/>
           <w:lang w:val="es-ES"/>
         </w:rPr>
-        <w:t xml:space="preserve">. En caso de que de la revisión resultara que </w:t>
+        <w:t xml:space="preserve"> podrá requerir el reembolso a </w:t>
       </w:r>
       <w:r>
         <w:rPr>
@@ -10938,7 +11206,58 @@
           <w:szCs w:val="18"/>
           <w:lang w:val="es-ES"/>
         </w:rPr>
-        <w:t xml:space="preserve"> no viene cumpliendo con sus obligaciones tributarias, previsionales y/o laborales, </w:t>
+        <w:t xml:space="preserve"> inclusive a pagar todos las costas, costos y honorarios de abogados que sean necesarios.</w:t>
+      </w:r>
+    </w:p>
+    <w:p>
+      <w:pPr>
+        <w:ind w:left="709" w:firstLine="0"/>
+        <w:jc w:val="both"/>
+        <w:rPr>
+          <w:rFonts w:ascii="Arial Narrow" w:eastAsia="Arial Narrow" w:hAnsi="Arial Narrow" w:cs="Arial Narrow"/>
+          <w:sz w:val="18"/>
+          <w:szCs w:val="18"/>
+        </w:rPr>
+      </w:pPr>
+    </w:p>
+    <w:p>
+      <w:pPr>
+        <w:ind w:left="709" w:firstLine="0"/>
+        <w:jc w:val="both"/>
+        <w:rPr>
+          <w:rFonts w:ascii="Arial Narrow" w:eastAsia="Arial Narrow" w:hAnsi="Arial Narrow" w:cs="Arial Narrow"/>
+          <w:sz w:val="18"/>
+          <w:szCs w:val="18"/>
+          <w:lang w:val="es-ES"/>
+        </w:rPr>
+      </w:pPr>
+      <w:r>
+        <w:rPr>
+          <w:rFonts w:ascii="Arial Narrow" w:eastAsia="Arial Narrow" w:hAnsi="Arial Narrow" w:cs="Arial Narrow"/>
+          <w:sz w:val="18"/>
+          <w:szCs w:val="18"/>
+          <w:lang w:val="es-ES"/>
+        </w:rPr>
+        <w:t xml:space="preserve">9.1.12. </w:t>
+      </w:r>
+      <w:r>
+        <w:rPr>
+          <w:rFonts w:ascii="Arial Narrow" w:eastAsia="Arial Narrow" w:hAnsi="Arial Narrow" w:cs="Arial Narrow"/>
+          <w:b/>
+          <w:sz w:val="18"/>
+          <w:szCs w:val="18"/>
+          <w:lang w:val="es-ES"/>
+        </w:rPr>
+        <w:t>EL CONTRATISTA</w:t>
+      </w:r>
+      <w:r>
+        <w:rPr>
+          <w:rFonts w:ascii="Arial Narrow" w:eastAsia="Arial Narrow" w:hAnsi="Arial Narrow" w:cs="Arial Narrow"/>
+          <w:sz w:val="18"/>
+          <w:szCs w:val="18"/>
+          <w:lang w:val="es-ES"/>
+        </w:rPr>
+        <w:t xml:space="preserve"> deberá mantener durante la ejecución de los Trabajos Contratados a un Responsable de Seguridad, que cumpla con el apartado 6.32 de la Norma G.050 de la NTE del Ministerio de Vivienda, Construcción y Saneamiento, dedicado exclusivamente a la seguridad si son más de 20 trabajadores o las labores de la empresa lo requiere como trabajos en altura el cual deberá contar con las facultades suficientes para recibir y ejecutar con plena responsabilidad cuantas ordenes e indicaciones le haga </w:t>
       </w:r>
       <w:r>
         <w:rPr>
@@ -10957,7 +11276,7 @@
           <w:szCs w:val="18"/>
           <w:lang w:val="es-ES"/>
         </w:rPr>
-        <w:t xml:space="preserve"> queda facultado para resolver automáticamente este CONTRATO, sin perjuicio de ejecutar las fianzas emitidas a favor de </w:t>
+        <w:t xml:space="preserve"> respecto al tema de seguridad, salud y medio ambiente, este representante no podrá reemplazarse durante el desarrollo de los trabajos, sin la autorización previa de </w:t>
       </w:r>
       <w:r>
         <w:rPr>
@@ -10976,7 +11295,7 @@
           <w:szCs w:val="18"/>
           <w:lang w:val="es-ES"/>
         </w:rPr>
-        <w:t>, según sea el caso.</w:t>
+        <w:t>. Si se realizan trabajos de altura, este responsable deberá de ser un prevencionista necesariamente, asimismo, se debe verificar el fiel cumplimiento de las leyes laborales en lo relativo al reglamento de la seguridad industrial e higiene industrial, previstas en el Decreto Supremo 42-F, Ley de Seguridad y salud en el trabajo N°29783 y sus modificatorias y reglamento D.S. 005-2012-TR y su modificatorias y N.T.E. G.050 Seguridad durante la construcción, en lo que les resulte aplicable.</w:t>
       </w:r>
     </w:p>
     <w:p>
@@ -11008,7 +11327,7 @@
           <w:szCs w:val="18"/>
           <w:lang w:val="es-ES"/>
         </w:rPr>
-        <w:t xml:space="preserve">9.1.11. Adoptar y mantener todas las medidas de seguridad necesarias para el resguardo de sus trabajadores, según la naturaleza y circunstancias que requieran los trabajos encomendados, incluyendo el uso de equipos de protección personal, (EPP específicos para los trabajos, la entrega de estos equipos de protección personal debe registrarse permanentemente en una hoja por cada trabajador con la firma del mismo como medida de control) antes del ingreso a la obra deberá tener la aprobación de los EPP, herramientas y/o equipos de trabajo por el área de prevención de “LA OBRA” y la contratación de los seguros que fueran necesarios (SCTR, seguro TREC, </w:t>
+        <w:t xml:space="preserve">9.1.13. Verificar el fiel cumplimiento de la Resolución Ministerial </w:t>
       </w:r>
       <w:proofErr w:type="spellStart"/>
       <w:r>
@@ -11018,7 +11337,7 @@
           <w:szCs w:val="18"/>
           <w:lang w:val="es-ES"/>
         </w:rPr>
-        <w:t>etc</w:t>
+        <w:t>N°</w:t>
       </w:r>
       <w:proofErr w:type="spellEnd"/>
       <w:r>
@@ -11028,7 +11347,131 @@
           <w:szCs w:val="18"/>
           <w:lang w:val="es-ES"/>
         </w:rPr>
-        <w:t xml:space="preserve">). </w:t>
+        <w:t xml:space="preserve"> 312-2011- MINSA documento técnico – “Protocolos de Exámenes Medico Ocupacionales y guías de diagnóstico de los Exámenes Médicos obligatorios por actitud.</w:t>
+      </w:r>
+    </w:p>
+    <w:p>
+      <w:pPr>
+        <w:ind w:left="709" w:firstLine="0"/>
+        <w:jc w:val="both"/>
+        <w:rPr>
+          <w:rFonts w:ascii="Arial Narrow" w:eastAsia="Arial Narrow" w:hAnsi="Arial Narrow" w:cs="Arial Narrow"/>
+          <w:sz w:val="18"/>
+          <w:szCs w:val="18"/>
+        </w:rPr>
+      </w:pPr>
+    </w:p>
+    <w:p>
+      <w:pPr>
+        <w:ind w:left="709" w:firstLine="0"/>
+        <w:jc w:val="both"/>
+        <w:rPr>
+          <w:rFonts w:ascii="Arial Narrow" w:eastAsia="Arial Narrow" w:hAnsi="Arial Narrow" w:cs="Arial Narrow"/>
+          <w:sz w:val="18"/>
+          <w:szCs w:val="18"/>
+          <w:lang w:val="es-ES"/>
+        </w:rPr>
+      </w:pPr>
+      <w:r>
+        <w:rPr>
+          <w:rFonts w:ascii="Arial Narrow" w:eastAsia="Arial Narrow" w:hAnsi="Arial Narrow" w:cs="Arial Narrow"/>
+          <w:sz w:val="18"/>
+          <w:szCs w:val="18"/>
+          <w:lang w:val="es-ES"/>
+        </w:rPr>
+        <w:t xml:space="preserve">9.1.14. Cumplimiento de la Ley </w:t>
+      </w:r>
+      <w:proofErr w:type="spellStart"/>
+      <w:r>
+        <w:rPr>
+          <w:rFonts w:ascii="Arial Narrow" w:eastAsia="Arial Narrow" w:hAnsi="Arial Narrow" w:cs="Arial Narrow"/>
+          <w:sz w:val="18"/>
+          <w:szCs w:val="18"/>
+          <w:lang w:val="es-ES"/>
+        </w:rPr>
+        <w:t>N°</w:t>
+      </w:r>
+      <w:proofErr w:type="spellEnd"/>
+      <w:r>
+        <w:rPr>
+          <w:rFonts w:ascii="Arial Narrow" w:eastAsia="Arial Narrow" w:hAnsi="Arial Narrow" w:cs="Arial Narrow"/>
+          <w:sz w:val="18"/>
+          <w:szCs w:val="18"/>
+          <w:lang w:val="es-ES"/>
+        </w:rPr>
+        <w:t xml:space="preserve"> 28611 Ley General del Ambiente, Decreto Supremo N°019-2009-MINAM, Reglamento de la Ley 27446 del Sistema Nacional de Evaluación de Impacto Ambiental y el Decreto Legislativo </w:t>
+      </w:r>
+      <w:proofErr w:type="spellStart"/>
+      <w:r>
+        <w:rPr>
+          <w:rFonts w:ascii="Arial Narrow" w:eastAsia="Arial Narrow" w:hAnsi="Arial Narrow" w:cs="Arial Narrow"/>
+          <w:sz w:val="18"/>
+          <w:szCs w:val="18"/>
+          <w:lang w:val="es-ES"/>
+        </w:rPr>
+        <w:t>N°</w:t>
+      </w:r>
+      <w:proofErr w:type="spellEnd"/>
+      <w:r>
+        <w:rPr>
+          <w:rFonts w:ascii="Arial Narrow" w:eastAsia="Arial Narrow" w:hAnsi="Arial Narrow" w:cs="Arial Narrow"/>
+          <w:sz w:val="18"/>
+          <w:szCs w:val="18"/>
+          <w:lang w:val="es-ES"/>
+        </w:rPr>
+        <w:t xml:space="preserve"> 1278 y sus modificatorias, y su Reglamento Decreto Supremo </w:t>
+      </w:r>
+      <w:proofErr w:type="spellStart"/>
+      <w:r>
+        <w:rPr>
+          <w:rFonts w:ascii="Arial Narrow" w:eastAsia="Arial Narrow" w:hAnsi="Arial Narrow" w:cs="Arial Narrow"/>
+          <w:sz w:val="18"/>
+          <w:szCs w:val="18"/>
+          <w:lang w:val="es-ES"/>
+        </w:rPr>
+        <w:t>Nº</w:t>
+      </w:r>
+      <w:proofErr w:type="spellEnd"/>
+      <w:r>
+        <w:rPr>
+          <w:rFonts w:ascii="Arial Narrow" w:eastAsia="Arial Narrow" w:hAnsi="Arial Narrow" w:cs="Arial Narrow"/>
+          <w:sz w:val="18"/>
+          <w:szCs w:val="18"/>
+          <w:lang w:val="es-ES"/>
+        </w:rPr>
+        <w:t xml:space="preserve"> 014-2017-MINAM y sus modificatorias, en lo que resulte aplicable.</w:t>
+      </w:r>
+    </w:p>
+    <w:p>
+      <w:pPr>
+        <w:ind w:left="709" w:firstLine="0"/>
+        <w:jc w:val="both"/>
+        <w:rPr>
+          <w:rFonts w:ascii="Arial Narrow" w:eastAsia="Arial Narrow" w:hAnsi="Arial Narrow" w:cs="Arial Narrow"/>
+          <w:sz w:val="18"/>
+          <w:szCs w:val="18"/>
+        </w:rPr>
+      </w:pPr>
+    </w:p>
+    <w:p>
+      <w:pPr>
+        <w:ind w:left="709" w:firstLine="0"/>
+        <w:jc w:val="both"/>
+        <w:rPr>
+          <w:rFonts w:ascii="Arial Narrow" w:eastAsia="Arial Narrow" w:hAnsi="Arial Narrow" w:cs="Arial Narrow"/>
+          <w:sz w:val="18"/>
+          <w:szCs w:val="18"/>
+          <w:lang w:val="es-ES"/>
+        </w:rPr>
+      </w:pPr>
+      <w:r>
+        <w:rPr>
+          <w:rFonts w:ascii="Arial Narrow" w:eastAsia="Arial Narrow" w:hAnsi="Arial Narrow" w:cs="Arial Narrow"/>
+          <w:sz w:val="18"/>
+          <w:szCs w:val="18"/>
+          <w:lang w:val="es-ES"/>
+        </w:rPr>
+        <w:t xml:space="preserve">9.1.15. Dar cumplimiento a las leyes, reglamentos, resoluciones y ordenanzas municipales relativas a la industria de la construcción, así como a las normas que regulan el transporte de materiales de construcción que resulten aplicables. Asimismo, </w:t>
       </w:r>
       <w:r>
         <w:rPr>
@@ -11047,7 +11490,7 @@
           <w:szCs w:val="18"/>
           <w:lang w:val="es-ES"/>
         </w:rPr>
-        <w:t xml:space="preserve"> se obliga a tener en todo momento los equipos de protección personal (EPP) al momento de realizar los trabajos contratados, caso contrario será único y exclusivo responsable por cualquier daño material o personal que pudiese ocasionar.  Si como consecuencia de la inobservancia de esta obligación </w:t>
+        <w:t xml:space="preserve"> cumplirá todas las obligaciones laborales y reglamentarias en materia laboral, de previsión social y sanitaria, higiene y seguridad de la industria de la construcción N.T.E. G.050 Seguridad durante la construcción y mantendrá a </w:t>
       </w:r>
       <w:r>
         <w:rPr>
@@ -11066,7 +11509,39 @@
           <w:szCs w:val="18"/>
           <w:lang w:val="es-ES"/>
         </w:rPr>
-        <w:t xml:space="preserve"> tuviese que pagar alguna multa o se haya iniciado algún procedimiento en contra de este </w:t>
+        <w:t xml:space="preserve"> libre de toda responsabilidad por todos estos conceptos.</w:t>
+      </w:r>
+    </w:p>
+    <w:p>
+      <w:pPr>
+        <w:ind w:left="709" w:firstLine="0"/>
+        <w:jc w:val="both"/>
+        <w:rPr>
+          <w:rFonts w:ascii="Arial Narrow" w:eastAsia="Arial Narrow" w:hAnsi="Arial Narrow" w:cs="Arial Narrow"/>
+          <w:sz w:val="18"/>
+          <w:szCs w:val="18"/>
+        </w:rPr>
+      </w:pPr>
+    </w:p>
+    <w:p>
+      <w:pPr>
+        <w:ind w:left="709" w:firstLine="0"/>
+        <w:jc w:val="both"/>
+        <w:rPr>
+          <w:rFonts w:ascii="Arial Narrow" w:eastAsia="Arial Narrow" w:hAnsi="Arial Narrow" w:cs="Arial Narrow"/>
+          <w:sz w:val="18"/>
+          <w:szCs w:val="18"/>
+          <w:lang w:val="es-ES"/>
+        </w:rPr>
+      </w:pPr>
+      <w:r>
+        <w:rPr>
+          <w:rFonts w:ascii="Arial Narrow" w:eastAsia="Arial Narrow" w:hAnsi="Arial Narrow" w:cs="Arial Narrow"/>
+          <w:sz w:val="18"/>
+          <w:szCs w:val="18"/>
+          <w:lang w:val="es-ES"/>
+        </w:rPr>
+        <w:t xml:space="preserve">9.1.16. Elaborar y mantener los procedimientos de emergencias, para actuar en forma planificada y sistemática, en caso de presentarse algún accidente que genere o pueda generar daños en los activos, imagen, costos, nivel de servicio o personal de </w:t>
       </w:r>
       <w:r>
         <w:rPr>
@@ -11085,7 +11560,7 @@
           <w:szCs w:val="18"/>
           <w:lang w:val="es-ES"/>
         </w:rPr>
-        <w:t xml:space="preserve"> podrá requerir el reembolso a </w:t>
+        <w:t xml:space="preserve">, así como de </w:t>
       </w:r>
       <w:r>
         <w:rPr>
@@ -11104,7 +11579,7 @@
           <w:szCs w:val="18"/>
           <w:lang w:val="es-ES"/>
         </w:rPr>
-        <w:t xml:space="preserve"> inclusive a pagar todos las costas, costos y honorarios de abogados que sean necesarios.</w:t>
+        <w:t>.</w:t>
       </w:r>
     </w:p>
     <w:p>
@@ -11126,25 +11601,41 @@
           <w:rFonts w:ascii="Arial Narrow" w:eastAsia="Arial Narrow" w:hAnsi="Arial Narrow" w:cs="Arial Narrow"/>
           <w:sz w:val="18"/>
           <w:szCs w:val="18"/>
-          <w:lang w:val="es-ES"/>
-        </w:rPr>
-      </w:pPr>
-      <w:r>
-        <w:rPr>
-          <w:rFonts w:ascii="Arial Narrow" w:eastAsia="Arial Narrow" w:hAnsi="Arial Narrow" w:cs="Arial Narrow"/>
-          <w:sz w:val="18"/>
-          <w:szCs w:val="18"/>
-          <w:lang w:val="es-ES"/>
-        </w:rPr>
-        <w:t xml:space="preserve">9.1.12. </w:t>
-      </w:r>
-      <w:r>
-        <w:rPr>
-          <w:rFonts w:ascii="Arial Narrow" w:eastAsia="Arial Narrow" w:hAnsi="Arial Narrow" w:cs="Arial Narrow"/>
-          <w:b/>
-          <w:sz w:val="18"/>
-          <w:szCs w:val="18"/>
-          <w:lang w:val="es-ES"/>
+        </w:rPr>
+      </w:pPr>
+      <w:r>
+        <w:rPr>
+          <w:rFonts w:ascii="Arial Narrow" w:eastAsia="Arial Narrow" w:hAnsi="Arial Narrow" w:cs="Arial Narrow"/>
+          <w:sz w:val="18"/>
+          <w:szCs w:val="18"/>
+        </w:rPr>
+        <w:t xml:space="preserve">9.1.17. Reportar inmediatamente a </w:t>
+      </w:r>
+      <w:r>
+        <w:rPr>
+          <w:rFonts w:ascii="Arial Narrow" w:eastAsia="Arial Narrow" w:hAnsi="Arial Narrow" w:cs="Arial Narrow"/>
+          <w:b/>
+          <w:bCs/>
+          <w:sz w:val="18"/>
+          <w:szCs w:val="18"/>
+        </w:rPr>
+        <w:t>EL CONTRATANTE</w:t>
+      </w:r>
+      <w:r>
+        <w:rPr>
+          <w:rFonts w:ascii="Arial Narrow" w:eastAsia="Arial Narrow" w:hAnsi="Arial Narrow" w:cs="Arial Narrow"/>
+          <w:sz w:val="18"/>
+          <w:szCs w:val="18"/>
+        </w:rPr>
+        <w:t xml:space="preserve"> cualquier accidente del personal de </w:t>
+      </w:r>
+      <w:r>
+        <w:rPr>
+          <w:rFonts w:ascii="Arial Narrow" w:eastAsia="Arial Narrow" w:hAnsi="Arial Narrow" w:cs="Arial Narrow"/>
+          <w:b/>
+          <w:bCs/>
+          <w:sz w:val="18"/>
+          <w:szCs w:val="18"/>
         </w:rPr>
         <w:t>EL CONTRATISTA</w:t>
       </w:r>
@@ -11153,17 +11644,100 @@
           <w:rFonts w:ascii="Arial Narrow" w:eastAsia="Arial Narrow" w:hAnsi="Arial Narrow" w:cs="Arial Narrow"/>
           <w:sz w:val="18"/>
           <w:szCs w:val="18"/>
-          <w:lang w:val="es-ES"/>
-        </w:rPr>
-        <w:t xml:space="preserve"> deberá mantener durante la ejecución de los Trabajos Contratados a un Responsable de Seguridad, que cumpla con el apartado 6.32 de la Norma G.050 de la NTE del Ministerio de Vivienda, Construcción y Saneamiento, dedicado exclusivamente a la seguridad si son más de 20 trabajadores o las labores de la empresa lo requiere como trabajos en altura el cual deberá contar con las facultades suficientes para recibir y ejecutar con plena responsabilidad cuantas ordenes e indicaciones le haga </w:t>
-      </w:r>
-      <w:r>
-        <w:rPr>
-          <w:rFonts w:ascii="Arial Narrow" w:eastAsia="Arial Narrow" w:hAnsi="Arial Narrow" w:cs="Arial Narrow"/>
-          <w:b/>
-          <w:sz w:val="18"/>
-          <w:szCs w:val="18"/>
-          <w:lang w:val="es-ES"/>
+        </w:rPr>
+        <w:t xml:space="preserve"> o bienes que se encuentren vinculados con la prestación de servicios.</w:t>
+      </w:r>
+    </w:p>
+    <w:p>
+      <w:pPr>
+        <w:ind w:left="360" w:firstLine="0"/>
+        <w:jc w:val="both"/>
+        <w:rPr>
+          <w:rFonts w:ascii="Arial Narrow" w:eastAsia="Arial Narrow" w:hAnsi="Arial Narrow" w:cs="Arial Narrow"/>
+          <w:sz w:val="18"/>
+          <w:szCs w:val="18"/>
+        </w:rPr>
+      </w:pPr>
+    </w:p>
+    <w:p>
+      <w:pPr>
+        <w:ind w:left="709" w:firstLine="0"/>
+        <w:jc w:val="both"/>
+        <w:rPr>
+          <w:rFonts w:ascii="Arial Narrow" w:eastAsia="Arial Narrow" w:hAnsi="Arial Narrow" w:cs="Arial Narrow"/>
+          <w:sz w:val="18"/>
+          <w:szCs w:val="18"/>
+        </w:rPr>
+      </w:pPr>
+      <w:r>
+        <w:rPr>
+          <w:rFonts w:ascii="Arial Narrow" w:eastAsia="Arial Narrow" w:hAnsi="Arial Narrow" w:cs="Arial Narrow"/>
+          <w:sz w:val="18"/>
+          <w:szCs w:val="18"/>
+        </w:rPr>
+        <w:t xml:space="preserve">9.1.18. </w:t>
+      </w:r>
+      <w:r>
+        <w:rPr>
+          <w:rFonts w:ascii="Arial Narrow" w:eastAsia="Arial Narrow" w:hAnsi="Arial Narrow" w:cs="Arial Narrow"/>
+          <w:b/>
+          <w:bCs/>
+          <w:sz w:val="18"/>
+          <w:szCs w:val="18"/>
+        </w:rPr>
+        <w:t>EL CONTRATISTA</w:t>
+      </w:r>
+      <w:r>
+        <w:rPr>
+          <w:rFonts w:ascii="Arial Narrow" w:eastAsia="Arial Narrow" w:hAnsi="Arial Narrow" w:cs="Arial Narrow"/>
+          <w:b/>
+          <w:sz w:val="18"/>
+          <w:szCs w:val="18"/>
+        </w:rPr>
+        <w:t xml:space="preserve"> </w:t>
+      </w:r>
+      <w:r>
+        <w:rPr>
+          <w:rFonts w:ascii="Arial Narrow" w:eastAsia="Arial Narrow" w:hAnsi="Arial Narrow" w:cs="Arial Narrow"/>
+          <w:sz w:val="18"/>
+          <w:szCs w:val="18"/>
+        </w:rPr>
+        <w:t xml:space="preserve">deberá cumplir con las Normas de Seguridad y Salud. Dichas disposiciones deberán ser acatadas en su integridad, bajo su responsabilidad, por </w:t>
+      </w:r>
+      <w:r>
+        <w:rPr>
+          <w:rFonts w:ascii="Arial Narrow" w:eastAsia="Arial Narrow" w:hAnsi="Arial Narrow" w:cs="Arial Narrow"/>
+          <w:b/>
+          <w:bCs/>
+          <w:sz w:val="18"/>
+          <w:szCs w:val="18"/>
+        </w:rPr>
+        <w:t>EL CONTRATISTA</w:t>
+      </w:r>
+      <w:r>
+        <w:rPr>
+          <w:rFonts w:ascii="Arial Narrow" w:eastAsia="Arial Narrow" w:hAnsi="Arial Narrow" w:cs="Arial Narrow"/>
+          <w:b/>
+          <w:sz w:val="18"/>
+          <w:szCs w:val="18"/>
+        </w:rPr>
+        <w:t xml:space="preserve"> </w:t>
+      </w:r>
+      <w:r>
+        <w:rPr>
+          <w:rFonts w:ascii="Arial Narrow" w:eastAsia="Arial Narrow" w:hAnsi="Arial Narrow" w:cs="Arial Narrow"/>
+          <w:sz w:val="18"/>
+          <w:szCs w:val="18"/>
+        </w:rPr>
+        <w:t xml:space="preserve">y el personal a su cargo, a efectos de protegerse de contingencias previsibles, producto de sus labores cotidianas en la ejecución de la obra encargada, quedando </w:t>
+      </w:r>
+      <w:r>
+        <w:rPr>
+          <w:rFonts w:ascii="Arial Narrow" w:eastAsia="Arial Narrow" w:hAnsi="Arial Narrow" w:cs="Arial Narrow"/>
+          <w:b/>
+          <w:bCs/>
+          <w:sz w:val="18"/>
+          <w:szCs w:val="18"/>
         </w:rPr>
         <w:t>EL CONTRATANTE</w:t>
       </w:r>
@@ -11172,17 +11746,73 @@
           <w:rFonts w:ascii="Arial Narrow" w:eastAsia="Arial Narrow" w:hAnsi="Arial Narrow" w:cs="Arial Narrow"/>
           <w:sz w:val="18"/>
           <w:szCs w:val="18"/>
-          <w:lang w:val="es-ES"/>
-        </w:rPr>
-        <w:t xml:space="preserve"> respecto al tema de seguridad, salud y medio ambiente, este representante no podrá reemplazarse durante el desarrollo de los trabajos, sin la autorización previa de </w:t>
-      </w:r>
-      <w:r>
-        <w:rPr>
-          <w:rFonts w:ascii="Arial Narrow" w:eastAsia="Arial Narrow" w:hAnsi="Arial Narrow" w:cs="Arial Narrow"/>
-          <w:b/>
-          <w:sz w:val="18"/>
-          <w:szCs w:val="18"/>
-          <w:lang w:val="es-ES"/>
+        </w:rPr>
+        <w:t xml:space="preserve"> liberado de cualquier tipo de responsabilidad ante los accidentes que por negligencia de </w:t>
+      </w:r>
+      <w:r>
+        <w:rPr>
+          <w:rFonts w:ascii="Arial Narrow" w:eastAsia="Arial Narrow" w:hAnsi="Arial Narrow" w:cs="Arial Narrow"/>
+          <w:b/>
+          <w:bCs/>
+          <w:sz w:val="18"/>
+          <w:szCs w:val="18"/>
+        </w:rPr>
+        <w:t>EL CONTRATISTA</w:t>
+      </w:r>
+      <w:r>
+        <w:rPr>
+          <w:rFonts w:ascii="Arial Narrow" w:eastAsia="Arial Narrow" w:hAnsi="Arial Narrow" w:cs="Arial Narrow"/>
+          <w:b/>
+          <w:sz w:val="18"/>
+          <w:szCs w:val="18"/>
+        </w:rPr>
+        <w:t xml:space="preserve"> </w:t>
+      </w:r>
+      <w:r>
+        <w:rPr>
+          <w:rFonts w:ascii="Arial Narrow" w:eastAsia="Arial Narrow" w:hAnsi="Arial Narrow" w:cs="Arial Narrow"/>
+          <w:sz w:val="18"/>
+          <w:szCs w:val="18"/>
+        </w:rPr>
+        <w:t>y su personal se produjeran.</w:t>
+      </w:r>
+    </w:p>
+    <w:p>
+      <w:pPr>
+        <w:ind w:left="709" w:firstLine="0"/>
+        <w:jc w:val="both"/>
+        <w:rPr>
+          <w:rFonts w:ascii="Arial Narrow" w:eastAsia="Arial Narrow" w:hAnsi="Arial Narrow" w:cs="Arial Narrow"/>
+          <w:sz w:val="18"/>
+          <w:szCs w:val="18"/>
+        </w:rPr>
+      </w:pPr>
+    </w:p>
+    <w:p>
+      <w:pPr>
+        <w:ind w:left="709" w:firstLine="0"/>
+        <w:jc w:val="both"/>
+        <w:rPr>
+          <w:rFonts w:ascii="Arial Narrow" w:eastAsia="Arial Narrow" w:hAnsi="Arial Narrow" w:cs="Arial Narrow"/>
+          <w:sz w:val="18"/>
+          <w:szCs w:val="18"/>
+        </w:rPr>
+      </w:pPr>
+      <w:r>
+        <w:rPr>
+          <w:rFonts w:ascii="Arial Narrow" w:eastAsia="Arial Narrow" w:hAnsi="Arial Narrow" w:cs="Arial Narrow"/>
+          <w:sz w:val="18"/>
+          <w:szCs w:val="18"/>
+        </w:rPr>
+        <w:t xml:space="preserve">9.1.19.  Lo anterior incluye el respeto a las normas internas, directivas y políticas establecidas por </w:t>
+      </w:r>
+      <w:r>
+        <w:rPr>
+          <w:rFonts w:ascii="Arial Narrow" w:eastAsia="Arial Narrow" w:hAnsi="Arial Narrow" w:cs="Arial Narrow"/>
+          <w:b/>
+          <w:bCs/>
+          <w:sz w:val="18"/>
+          <w:szCs w:val="18"/>
         </w:rPr>
         <w:t>EL CONTRATANTE</w:t>
       </w:r>
@@ -11191,9 +11821,26 @@
           <w:rFonts w:ascii="Arial Narrow" w:eastAsia="Arial Narrow" w:hAnsi="Arial Narrow" w:cs="Arial Narrow"/>
           <w:sz w:val="18"/>
           <w:szCs w:val="18"/>
-          <w:lang w:val="es-ES"/>
-        </w:rPr>
-        <w:t>. Si se realizan trabajos de altura, este responsable deberá de ser un prevencionista necesariamente, asimismo, se debe verificar el fiel cumplimiento de las leyes laborales en lo relativo al reglamento de la seguridad industrial e higiene industrial, previstas en el Decreto Supremo 42-F, Ley de Seguridad y salud en el trabajo N°29783 y sus modificatorias y reglamento D.S. 005-2012-TR y su modificatorias y N.T.E. G.050 Seguridad durante la construcción, en lo que les resulte aplicable.</w:t>
+        </w:rPr>
+        <w:t xml:space="preserve"> en materia de Seguridad y Salud en el Trabajo, las mismas que </w:t>
+      </w:r>
+      <w:r>
+        <w:rPr>
+          <w:rFonts w:ascii="Arial Narrow" w:eastAsia="Arial Narrow" w:hAnsi="Arial Narrow" w:cs="Arial Narrow"/>
+          <w:b/>
+          <w:bCs/>
+          <w:sz w:val="18"/>
+          <w:szCs w:val="18"/>
+        </w:rPr>
+        <w:t>EL CONTRATISTA</w:t>
+      </w:r>
+      <w:r>
+        <w:rPr>
+          <w:rFonts w:ascii="Arial Narrow" w:eastAsia="Arial Narrow" w:hAnsi="Arial Narrow" w:cs="Arial Narrow"/>
+          <w:sz w:val="18"/>
+          <w:szCs w:val="18"/>
+        </w:rPr>
+        <w:t xml:space="preserve"> declara conocer, el cual incluye la instalación de casetas provisionales y casilleros para el uso de su personal en obra.</w:t>
       </w:r>
     </w:p>
     <w:p>
@@ -11215,169 +11862,23 @@
           <w:rFonts w:ascii="Arial Narrow" w:eastAsia="Arial Narrow" w:hAnsi="Arial Narrow" w:cs="Arial Narrow"/>
           <w:sz w:val="18"/>
           <w:szCs w:val="18"/>
-          <w:lang w:val="es-ES"/>
-        </w:rPr>
-      </w:pPr>
-      <w:r>
-        <w:rPr>
-          <w:rFonts w:ascii="Arial Narrow" w:eastAsia="Arial Narrow" w:hAnsi="Arial Narrow" w:cs="Arial Narrow"/>
-          <w:sz w:val="18"/>
-          <w:szCs w:val="18"/>
-          <w:lang w:val="es-ES"/>
-        </w:rPr>
-        <w:t xml:space="preserve">9.1.13. Verificar el fiel cumplimiento de la Resolución Ministerial </w:t>
-      </w:r>
-      <w:proofErr w:type="spellStart"/>
-      <w:r>
-        <w:rPr>
-          <w:rFonts w:ascii="Arial Narrow" w:eastAsia="Arial Narrow" w:hAnsi="Arial Narrow" w:cs="Arial Narrow"/>
-          <w:sz w:val="18"/>
-          <w:szCs w:val="18"/>
-          <w:lang w:val="es-ES"/>
-        </w:rPr>
-        <w:t>N°</w:t>
-      </w:r>
-      <w:proofErr w:type="spellEnd"/>
-      <w:r>
-        <w:rPr>
-          <w:rFonts w:ascii="Arial Narrow" w:eastAsia="Arial Narrow" w:hAnsi="Arial Narrow" w:cs="Arial Narrow"/>
-          <w:sz w:val="18"/>
-          <w:szCs w:val="18"/>
-          <w:lang w:val="es-ES"/>
-        </w:rPr>
-        <w:t xml:space="preserve"> 312-2011- MINSA documento técnico – “Protocolos de Exámenes Medico Ocupacionales y guías de diagnóstico de los Exámenes Médicos obligatorios por actitud.</w:t>
-      </w:r>
-    </w:p>
-    <w:p>
-      <w:pPr>
-        <w:ind w:left="709" w:firstLine="0"/>
-        <w:jc w:val="both"/>
-        <w:rPr>
-          <w:rFonts w:ascii="Arial Narrow" w:eastAsia="Arial Narrow" w:hAnsi="Arial Narrow" w:cs="Arial Narrow"/>
-          <w:sz w:val="18"/>
-          <w:szCs w:val="18"/>
-        </w:rPr>
-      </w:pPr>
-    </w:p>
-    <w:p>
-      <w:pPr>
-        <w:ind w:left="709" w:firstLine="0"/>
-        <w:jc w:val="both"/>
-        <w:rPr>
-          <w:rFonts w:ascii="Arial Narrow" w:eastAsia="Arial Narrow" w:hAnsi="Arial Narrow" w:cs="Arial Narrow"/>
-          <w:sz w:val="18"/>
-          <w:szCs w:val="18"/>
-          <w:lang w:val="es-ES"/>
-        </w:rPr>
-      </w:pPr>
-      <w:r>
-        <w:rPr>
-          <w:rFonts w:ascii="Arial Narrow" w:eastAsia="Arial Narrow" w:hAnsi="Arial Narrow" w:cs="Arial Narrow"/>
-          <w:sz w:val="18"/>
-          <w:szCs w:val="18"/>
-          <w:lang w:val="es-ES"/>
-        </w:rPr>
-        <w:t xml:space="preserve">9.1.14. Cumplimiento de la Ley </w:t>
-      </w:r>
-      <w:proofErr w:type="spellStart"/>
-      <w:r>
-        <w:rPr>
-          <w:rFonts w:ascii="Arial Narrow" w:eastAsia="Arial Narrow" w:hAnsi="Arial Narrow" w:cs="Arial Narrow"/>
-          <w:sz w:val="18"/>
-          <w:szCs w:val="18"/>
-          <w:lang w:val="es-ES"/>
-        </w:rPr>
-        <w:t>N°</w:t>
-      </w:r>
-      <w:proofErr w:type="spellEnd"/>
-      <w:r>
-        <w:rPr>
-          <w:rFonts w:ascii="Arial Narrow" w:eastAsia="Arial Narrow" w:hAnsi="Arial Narrow" w:cs="Arial Narrow"/>
-          <w:sz w:val="18"/>
-          <w:szCs w:val="18"/>
-          <w:lang w:val="es-ES"/>
-        </w:rPr>
-        <w:t xml:space="preserve"> 28611 Ley General del Ambiente, Decreto Supremo N°019-2009-MINAM, Reglamento de la Ley 27446 del Sistema Nacional de Evaluación de Impacto Ambiental y el Decreto Legislativo </w:t>
-      </w:r>
-      <w:proofErr w:type="spellStart"/>
-      <w:r>
-        <w:rPr>
-          <w:rFonts w:ascii="Arial Narrow" w:eastAsia="Arial Narrow" w:hAnsi="Arial Narrow" w:cs="Arial Narrow"/>
-          <w:sz w:val="18"/>
-          <w:szCs w:val="18"/>
-          <w:lang w:val="es-ES"/>
-        </w:rPr>
-        <w:t>N°</w:t>
-      </w:r>
-      <w:proofErr w:type="spellEnd"/>
-      <w:r>
-        <w:rPr>
-          <w:rFonts w:ascii="Arial Narrow" w:eastAsia="Arial Narrow" w:hAnsi="Arial Narrow" w:cs="Arial Narrow"/>
-          <w:sz w:val="18"/>
-          <w:szCs w:val="18"/>
-          <w:lang w:val="es-ES"/>
-        </w:rPr>
-        <w:t xml:space="preserve"> 1278 y sus modificatorias, y su Reglamento Decreto Supremo </w:t>
-      </w:r>
-      <w:proofErr w:type="spellStart"/>
-      <w:r>
-        <w:rPr>
-          <w:rFonts w:ascii="Arial Narrow" w:eastAsia="Arial Narrow" w:hAnsi="Arial Narrow" w:cs="Arial Narrow"/>
-          <w:sz w:val="18"/>
-          <w:szCs w:val="18"/>
-          <w:lang w:val="es-ES"/>
-        </w:rPr>
-        <w:t>Nº</w:t>
-      </w:r>
-      <w:proofErr w:type="spellEnd"/>
-      <w:r>
-        <w:rPr>
-          <w:rFonts w:ascii="Arial Narrow" w:eastAsia="Arial Narrow" w:hAnsi="Arial Narrow" w:cs="Arial Narrow"/>
-          <w:sz w:val="18"/>
-          <w:szCs w:val="18"/>
-          <w:lang w:val="es-ES"/>
-        </w:rPr>
-        <w:t xml:space="preserve"> 014-2017-MINAM y sus modificatorias, en lo que resulte aplicable.</w:t>
-      </w:r>
-    </w:p>
-    <w:p>
-      <w:pPr>
-        <w:ind w:left="709" w:firstLine="0"/>
-        <w:jc w:val="both"/>
-        <w:rPr>
-          <w:rFonts w:ascii="Arial Narrow" w:eastAsia="Arial Narrow" w:hAnsi="Arial Narrow" w:cs="Arial Narrow"/>
-          <w:sz w:val="18"/>
-          <w:szCs w:val="18"/>
-        </w:rPr>
-      </w:pPr>
-    </w:p>
-    <w:p>
-      <w:pPr>
-        <w:ind w:left="709" w:firstLine="0"/>
-        <w:jc w:val="both"/>
-        <w:rPr>
-          <w:rFonts w:ascii="Arial Narrow" w:eastAsia="Arial Narrow" w:hAnsi="Arial Narrow" w:cs="Arial Narrow"/>
-          <w:sz w:val="18"/>
-          <w:szCs w:val="18"/>
-          <w:lang w:val="es-ES"/>
-        </w:rPr>
-      </w:pPr>
-      <w:r>
-        <w:rPr>
-          <w:rFonts w:ascii="Arial Narrow" w:eastAsia="Arial Narrow" w:hAnsi="Arial Narrow" w:cs="Arial Narrow"/>
-          <w:sz w:val="18"/>
-          <w:szCs w:val="18"/>
-          <w:lang w:val="es-ES"/>
-        </w:rPr>
-        <w:t xml:space="preserve">9.1.15. Dar cumplimiento a las leyes, reglamentos, resoluciones y ordenanzas municipales relativas a la industria de la construcción, así como a las normas que regulan el transporte de materiales de construcción que resulten aplicables. Asimismo, </w:t>
-      </w:r>
-      <w:r>
-        <w:rPr>
-          <w:rFonts w:ascii="Arial Narrow" w:eastAsia="Arial Narrow" w:hAnsi="Arial Narrow" w:cs="Arial Narrow"/>
-          <w:b/>
-          <w:sz w:val="18"/>
-          <w:szCs w:val="18"/>
-          <w:lang w:val="es-ES"/>
+        </w:rPr>
+      </w:pPr>
+      <w:r>
+        <w:rPr>
+          <w:rFonts w:ascii="Arial Narrow" w:eastAsia="Arial Narrow" w:hAnsi="Arial Narrow" w:cs="Arial Narrow"/>
+          <w:sz w:val="18"/>
+          <w:szCs w:val="18"/>
+        </w:rPr>
+        <w:t xml:space="preserve">9.1.20. Prestar sus servicios de acuerdo con el avance y al planeamiento establecido en obra. Asimismo, con anterioridad al inicio de la ejecución de sus obligaciones, así como cuando se produzcan modificaciones o actualizaciones, </w:t>
+      </w:r>
+      <w:r>
+        <w:rPr>
+          <w:rFonts w:ascii="Arial Narrow" w:eastAsia="Arial Narrow" w:hAnsi="Arial Narrow" w:cs="Arial Narrow"/>
+          <w:b/>
+          <w:bCs/>
+          <w:sz w:val="18"/>
+          <w:szCs w:val="18"/>
         </w:rPr>
         <w:t>EL CONTRATISTA</w:t>
       </w:r>
@@ -11386,17 +11887,16 @@
           <w:rFonts w:ascii="Arial Narrow" w:eastAsia="Arial Narrow" w:hAnsi="Arial Narrow" w:cs="Arial Narrow"/>
           <w:sz w:val="18"/>
           <w:szCs w:val="18"/>
-          <w:lang w:val="es-ES"/>
-        </w:rPr>
-        <w:t xml:space="preserve"> cumplirá todas las obligaciones laborales y reglamentarias en materia laboral, de previsión social y sanitaria, higiene y seguridad de la industria de la construcción N.T.E. G.050 Seguridad durante la construcción y mantendrá a </w:t>
-      </w:r>
-      <w:r>
-        <w:rPr>
-          <w:rFonts w:ascii="Arial Narrow" w:eastAsia="Arial Narrow" w:hAnsi="Arial Narrow" w:cs="Arial Narrow"/>
-          <w:b/>
-          <w:sz w:val="18"/>
-          <w:szCs w:val="18"/>
-          <w:lang w:val="es-ES"/>
+        </w:rPr>
+        <w:t xml:space="preserve"> entregará a </w:t>
+      </w:r>
+      <w:r>
+        <w:rPr>
+          <w:rFonts w:ascii="Arial Narrow" w:eastAsia="Arial Narrow" w:hAnsi="Arial Narrow" w:cs="Arial Narrow"/>
+          <w:b/>
+          <w:bCs/>
+          <w:sz w:val="18"/>
+          <w:szCs w:val="18"/>
         </w:rPr>
         <w:t>EL CONTRATANTE</w:t>
       </w:r>
@@ -11405,190 +11905,11 @@
           <w:rFonts w:ascii="Arial Narrow" w:eastAsia="Arial Narrow" w:hAnsi="Arial Narrow" w:cs="Arial Narrow"/>
           <w:sz w:val="18"/>
           <w:szCs w:val="18"/>
-          <w:lang w:val="es-ES"/>
-        </w:rPr>
-        <w:t xml:space="preserve"> libre de toda responsabilidad por todos estos conceptos.</w:t>
-      </w:r>
-    </w:p>
-    <w:p>
-      <w:pPr>
-        <w:ind w:left="709" w:firstLine="0"/>
-        <w:jc w:val="both"/>
-        <w:rPr>
-          <w:rFonts w:ascii="Arial Narrow" w:eastAsia="Arial Narrow" w:hAnsi="Arial Narrow" w:cs="Arial Narrow"/>
-          <w:sz w:val="18"/>
-          <w:szCs w:val="18"/>
-        </w:rPr>
-      </w:pPr>
-    </w:p>
-    <w:p>
-      <w:pPr>
-        <w:ind w:left="709" w:firstLine="0"/>
-        <w:jc w:val="both"/>
-        <w:rPr>
-          <w:rFonts w:ascii="Arial Narrow" w:eastAsia="Arial Narrow" w:hAnsi="Arial Narrow" w:cs="Arial Narrow"/>
-          <w:sz w:val="18"/>
-          <w:szCs w:val="18"/>
-          <w:lang w:val="es-ES"/>
-        </w:rPr>
-      </w:pPr>
-      <w:r>
-        <w:rPr>
-          <w:rFonts w:ascii="Arial Narrow" w:eastAsia="Arial Narrow" w:hAnsi="Arial Narrow" w:cs="Arial Narrow"/>
-          <w:sz w:val="18"/>
-          <w:szCs w:val="18"/>
-          <w:lang w:val="es-ES"/>
-        </w:rPr>
-        <w:t xml:space="preserve">9.1.16. Elaborar y mantener los procedimientos de emergencias, para actuar en forma planificada y sistemática, en caso de presentarse algún accidente que genere o pueda generar daños en los activos, imagen, costos, nivel de servicio o personal de </w:t>
-      </w:r>
-      <w:r>
-        <w:rPr>
-          <w:rFonts w:ascii="Arial Narrow" w:eastAsia="Arial Narrow" w:hAnsi="Arial Narrow" w:cs="Arial Narrow"/>
-          <w:b/>
-          <w:sz w:val="18"/>
-          <w:szCs w:val="18"/>
-          <w:lang w:val="es-ES"/>
-        </w:rPr>
-        <w:t>EL CONTRATANTE</w:t>
-      </w:r>
-      <w:r>
-        <w:rPr>
-          <w:rFonts w:ascii="Arial Narrow" w:eastAsia="Arial Narrow" w:hAnsi="Arial Narrow" w:cs="Arial Narrow"/>
-          <w:sz w:val="18"/>
-          <w:szCs w:val="18"/>
-          <w:lang w:val="es-ES"/>
-        </w:rPr>
-        <w:t xml:space="preserve">, así como de </w:t>
-      </w:r>
-      <w:r>
-        <w:rPr>
-          <w:rFonts w:ascii="Arial Narrow" w:eastAsia="Arial Narrow" w:hAnsi="Arial Narrow" w:cs="Arial Narrow"/>
-          <w:b/>
-          <w:sz w:val="18"/>
-          <w:szCs w:val="18"/>
-          <w:lang w:val="es-ES"/>
-        </w:rPr>
-        <w:t>EL CONTRATISTA</w:t>
-      </w:r>
-      <w:r>
-        <w:rPr>
-          <w:rFonts w:ascii="Arial Narrow" w:eastAsia="Arial Narrow" w:hAnsi="Arial Narrow" w:cs="Arial Narrow"/>
-          <w:sz w:val="18"/>
-          <w:szCs w:val="18"/>
-          <w:lang w:val="es-ES"/>
-        </w:rPr>
-        <w:t>.</w:t>
-      </w:r>
-    </w:p>
-    <w:p>
-      <w:pPr>
-        <w:ind w:left="709" w:firstLine="0"/>
-        <w:jc w:val="both"/>
-        <w:rPr>
-          <w:rFonts w:ascii="Arial Narrow" w:eastAsia="Arial Narrow" w:hAnsi="Arial Narrow" w:cs="Arial Narrow"/>
-          <w:sz w:val="18"/>
-          <w:szCs w:val="18"/>
-        </w:rPr>
-      </w:pPr>
-    </w:p>
-    <w:p>
-      <w:pPr>
-        <w:ind w:left="709" w:firstLine="0"/>
-        <w:jc w:val="both"/>
-        <w:rPr>
-          <w:rFonts w:ascii="Arial Narrow" w:eastAsia="Arial Narrow" w:hAnsi="Arial Narrow" w:cs="Arial Narrow"/>
-          <w:sz w:val="18"/>
-          <w:szCs w:val="18"/>
-        </w:rPr>
-      </w:pPr>
-      <w:r>
-        <w:rPr>
-          <w:rFonts w:ascii="Arial Narrow" w:eastAsia="Arial Narrow" w:hAnsi="Arial Narrow" w:cs="Arial Narrow"/>
-          <w:sz w:val="18"/>
-          <w:szCs w:val="18"/>
-        </w:rPr>
-        <w:t xml:space="preserve">9.1.17. Reportar inmediatamente a </w:t>
-      </w:r>
-      <w:r>
-        <w:rPr>
-          <w:rFonts w:ascii="Arial Narrow" w:eastAsia="Arial Narrow" w:hAnsi="Arial Narrow" w:cs="Arial Narrow"/>
-          <w:b/>
-          <w:bCs/>
-          <w:sz w:val="18"/>
-          <w:szCs w:val="18"/>
-        </w:rPr>
-        <w:t>EL CONTRATANTE</w:t>
-      </w:r>
-      <w:r>
-        <w:rPr>
-          <w:rFonts w:ascii="Arial Narrow" w:eastAsia="Arial Narrow" w:hAnsi="Arial Narrow" w:cs="Arial Narrow"/>
-          <w:sz w:val="18"/>
-          <w:szCs w:val="18"/>
-        </w:rPr>
-        <w:t xml:space="preserve"> cualquier accidente del personal de </w:t>
-      </w:r>
-      <w:r>
-        <w:rPr>
-          <w:rFonts w:ascii="Arial Narrow" w:eastAsia="Arial Narrow" w:hAnsi="Arial Narrow" w:cs="Arial Narrow"/>
-          <w:b/>
-          <w:bCs/>
-          <w:sz w:val="18"/>
-          <w:szCs w:val="18"/>
-        </w:rPr>
-        <w:t>EL CONTRATISTA</w:t>
-      </w:r>
-      <w:r>
-        <w:rPr>
-          <w:rFonts w:ascii="Arial Narrow" w:eastAsia="Arial Narrow" w:hAnsi="Arial Narrow" w:cs="Arial Narrow"/>
-          <w:sz w:val="18"/>
-          <w:szCs w:val="18"/>
-        </w:rPr>
-        <w:t xml:space="preserve"> o bienes que se encuentren vinculados con la prestación de servicios.</w:t>
-      </w:r>
-    </w:p>
-    <w:p>
-      <w:pPr>
-        <w:ind w:left="360" w:firstLine="0"/>
-        <w:jc w:val="both"/>
-        <w:rPr>
-          <w:rFonts w:ascii="Arial Narrow" w:eastAsia="Arial Narrow" w:hAnsi="Arial Narrow" w:cs="Arial Narrow"/>
-          <w:sz w:val="18"/>
-          <w:szCs w:val="18"/>
-        </w:rPr>
-      </w:pPr>
-    </w:p>
-    <w:p>
-      <w:pPr>
-        <w:ind w:left="709" w:firstLine="0"/>
-        <w:jc w:val="both"/>
-        <w:rPr>
-          <w:rFonts w:ascii="Arial Narrow" w:eastAsia="Arial Narrow" w:hAnsi="Arial Narrow" w:cs="Arial Narrow"/>
-          <w:sz w:val="18"/>
-          <w:szCs w:val="18"/>
-        </w:rPr>
-      </w:pPr>
-      <w:r>
-        <w:rPr>
-          <w:rFonts w:ascii="Arial Narrow" w:eastAsia="Arial Narrow" w:hAnsi="Arial Narrow" w:cs="Arial Narrow"/>
-          <w:sz w:val="18"/>
-          <w:szCs w:val="18"/>
-        </w:rPr>
-        <w:t xml:space="preserve">9.1.18. </w:t>
-      </w:r>
-      <w:r>
-        <w:rPr>
-          <w:rFonts w:ascii="Arial Narrow" w:eastAsia="Arial Narrow" w:hAnsi="Arial Narrow" w:cs="Arial Narrow"/>
-          <w:b/>
-          <w:bCs/>
-          <w:sz w:val="18"/>
-          <w:szCs w:val="18"/>
-        </w:rPr>
-        <w:t>EL CONTRATISTA</w:t>
-      </w:r>
-      <w:r>
-        <w:rPr>
-          <w:rFonts w:ascii="Arial Narrow" w:eastAsia="Arial Narrow" w:hAnsi="Arial Narrow" w:cs="Arial Narrow"/>
-          <w:b/>
+        </w:rPr>
+        <w:t xml:space="preserve"> la documentación señalada en el ANEXO 3 Y en el Estándar</w:t>
+      </w:r>
+      <w:r>
+        <w:rPr>
           <w:sz w:val="18"/>
           <w:szCs w:val="18"/>
         </w:rPr>
@@ -11600,225 +11921,6 @@
           <w:sz w:val="18"/>
           <w:szCs w:val="18"/>
         </w:rPr>
-        <w:t xml:space="preserve">deberá cumplir con las Normas de Seguridad y Salud. Dichas disposiciones deberán ser acatadas en su integridad, bajo su responsabilidad, por </w:t>
-      </w:r>
-      <w:r>
-        <w:rPr>
-          <w:rFonts w:ascii="Arial Narrow" w:eastAsia="Arial Narrow" w:hAnsi="Arial Narrow" w:cs="Arial Narrow"/>
-          <w:b/>
-          <w:bCs/>
-          <w:sz w:val="18"/>
-          <w:szCs w:val="18"/>
-        </w:rPr>
-        <w:t>EL CONTRATISTA</w:t>
-      </w:r>
-      <w:r>
-        <w:rPr>
-          <w:rFonts w:ascii="Arial Narrow" w:eastAsia="Arial Narrow" w:hAnsi="Arial Narrow" w:cs="Arial Narrow"/>
-          <w:b/>
-          <w:sz w:val="18"/>
-          <w:szCs w:val="18"/>
-        </w:rPr>
-        <w:t xml:space="preserve"> </w:t>
-      </w:r>
-      <w:r>
-        <w:rPr>
-          <w:rFonts w:ascii="Arial Narrow" w:eastAsia="Arial Narrow" w:hAnsi="Arial Narrow" w:cs="Arial Narrow"/>
-          <w:sz w:val="18"/>
-          <w:szCs w:val="18"/>
-        </w:rPr>
-        <w:t xml:space="preserve">y el personal a su cargo, a efectos de protegerse de contingencias previsibles, producto de sus labores cotidianas en la ejecución de la obra encargada, quedando </w:t>
-      </w:r>
-      <w:r>
-        <w:rPr>
-          <w:rFonts w:ascii="Arial Narrow" w:eastAsia="Arial Narrow" w:hAnsi="Arial Narrow" w:cs="Arial Narrow"/>
-          <w:b/>
-          <w:bCs/>
-          <w:sz w:val="18"/>
-          <w:szCs w:val="18"/>
-        </w:rPr>
-        <w:t>EL CONTRATANTE</w:t>
-      </w:r>
-      <w:r>
-        <w:rPr>
-          <w:rFonts w:ascii="Arial Narrow" w:eastAsia="Arial Narrow" w:hAnsi="Arial Narrow" w:cs="Arial Narrow"/>
-          <w:sz w:val="18"/>
-          <w:szCs w:val="18"/>
-        </w:rPr>
-        <w:t xml:space="preserve"> liberado de cualquier tipo de responsabilidad ante los accidentes que por negligencia de </w:t>
-      </w:r>
-      <w:r>
-        <w:rPr>
-          <w:rFonts w:ascii="Arial Narrow" w:eastAsia="Arial Narrow" w:hAnsi="Arial Narrow" w:cs="Arial Narrow"/>
-          <w:b/>
-          <w:bCs/>
-          <w:sz w:val="18"/>
-          <w:szCs w:val="18"/>
-        </w:rPr>
-        <w:t>EL CONTRATISTA</w:t>
-      </w:r>
-      <w:r>
-        <w:rPr>
-          <w:rFonts w:ascii="Arial Narrow" w:eastAsia="Arial Narrow" w:hAnsi="Arial Narrow" w:cs="Arial Narrow"/>
-          <w:b/>
-          <w:sz w:val="18"/>
-          <w:szCs w:val="18"/>
-        </w:rPr>
-        <w:t xml:space="preserve"> </w:t>
-      </w:r>
-      <w:r>
-        <w:rPr>
-          <w:rFonts w:ascii="Arial Narrow" w:eastAsia="Arial Narrow" w:hAnsi="Arial Narrow" w:cs="Arial Narrow"/>
-          <w:sz w:val="18"/>
-          <w:szCs w:val="18"/>
-        </w:rPr>
-        <w:t>y su personal se produjeran.</w:t>
-      </w:r>
-    </w:p>
-    <w:p>
-      <w:pPr>
-        <w:ind w:left="709" w:firstLine="0"/>
-        <w:jc w:val="both"/>
-        <w:rPr>
-          <w:rFonts w:ascii="Arial Narrow" w:eastAsia="Arial Narrow" w:hAnsi="Arial Narrow" w:cs="Arial Narrow"/>
-          <w:sz w:val="18"/>
-          <w:szCs w:val="18"/>
-        </w:rPr>
-      </w:pPr>
-    </w:p>
-    <w:p>
-      <w:pPr>
-        <w:ind w:left="709" w:firstLine="0"/>
-        <w:jc w:val="both"/>
-        <w:rPr>
-          <w:rFonts w:ascii="Arial Narrow" w:eastAsia="Arial Narrow" w:hAnsi="Arial Narrow" w:cs="Arial Narrow"/>
-          <w:sz w:val="18"/>
-          <w:szCs w:val="18"/>
-        </w:rPr>
-      </w:pPr>
-      <w:r>
-        <w:rPr>
-          <w:rFonts w:ascii="Arial Narrow" w:eastAsia="Arial Narrow" w:hAnsi="Arial Narrow" w:cs="Arial Narrow"/>
-          <w:sz w:val="18"/>
-          <w:szCs w:val="18"/>
-        </w:rPr>
-        <w:t xml:space="preserve">9.1.19.  Lo anterior incluye el respeto a las normas internas, directivas y políticas establecidas por </w:t>
-      </w:r>
-      <w:r>
-        <w:rPr>
-          <w:rFonts w:ascii="Arial Narrow" w:eastAsia="Arial Narrow" w:hAnsi="Arial Narrow" w:cs="Arial Narrow"/>
-          <w:b/>
-          <w:bCs/>
-          <w:sz w:val="18"/>
-          <w:szCs w:val="18"/>
-        </w:rPr>
-        <w:t>EL CONTRATANTE</w:t>
-      </w:r>
-      <w:r>
-        <w:rPr>
-          <w:rFonts w:ascii="Arial Narrow" w:eastAsia="Arial Narrow" w:hAnsi="Arial Narrow" w:cs="Arial Narrow"/>
-          <w:sz w:val="18"/>
-          <w:szCs w:val="18"/>
-        </w:rPr>
-        <w:t xml:space="preserve"> en materia de Seguridad y Salud en el Trabajo, las mismas que </w:t>
-      </w:r>
-      <w:r>
-        <w:rPr>
-          <w:rFonts w:ascii="Arial Narrow" w:eastAsia="Arial Narrow" w:hAnsi="Arial Narrow" w:cs="Arial Narrow"/>
-          <w:b/>
-          <w:bCs/>
-          <w:sz w:val="18"/>
-          <w:szCs w:val="18"/>
-        </w:rPr>
-        <w:t>EL CONTRATISTA</w:t>
-      </w:r>
-      <w:r>
-        <w:rPr>
-          <w:rFonts w:ascii="Arial Narrow" w:eastAsia="Arial Narrow" w:hAnsi="Arial Narrow" w:cs="Arial Narrow"/>
-          <w:sz w:val="18"/>
-          <w:szCs w:val="18"/>
-        </w:rPr>
-        <w:t xml:space="preserve"> declara conocer, el cual incluye la instalación de casetas provisionales y casilleros para el uso de su personal en obra.</w:t>
-      </w:r>
-    </w:p>
-    <w:p>
-      <w:pPr>
-        <w:ind w:left="709" w:firstLine="0"/>
-        <w:jc w:val="both"/>
-        <w:rPr>
-          <w:rFonts w:ascii="Arial Narrow" w:eastAsia="Arial Narrow" w:hAnsi="Arial Narrow" w:cs="Arial Narrow"/>
-          <w:sz w:val="18"/>
-          <w:szCs w:val="18"/>
-        </w:rPr>
-      </w:pPr>
-    </w:p>
-    <w:p>
-      <w:pPr>
-        <w:ind w:left="709" w:firstLine="0"/>
-        <w:jc w:val="both"/>
-        <w:rPr>
-          <w:rFonts w:ascii="Arial Narrow" w:eastAsia="Arial Narrow" w:hAnsi="Arial Narrow" w:cs="Arial Narrow"/>
-          <w:sz w:val="18"/>
-          <w:szCs w:val="18"/>
-        </w:rPr>
-      </w:pPr>
-      <w:r>
-        <w:rPr>
-          <w:rFonts w:ascii="Arial Narrow" w:eastAsia="Arial Narrow" w:hAnsi="Arial Narrow" w:cs="Arial Narrow"/>
-          <w:sz w:val="18"/>
-          <w:szCs w:val="18"/>
-        </w:rPr>
-        <w:t xml:space="preserve">9.1.20. Prestar sus servicios de acuerdo con el avance y al planeamiento establecido en obra. Asimismo, con anterioridad al inicio de la ejecución de sus obligaciones, así como cuando se produzcan modificaciones o actualizaciones, </w:t>
-      </w:r>
-      <w:r>
-        <w:rPr>
-          <w:rFonts w:ascii="Arial Narrow" w:eastAsia="Arial Narrow" w:hAnsi="Arial Narrow" w:cs="Arial Narrow"/>
-          <w:b/>
-          <w:bCs/>
-          <w:sz w:val="18"/>
-          <w:szCs w:val="18"/>
-        </w:rPr>
-        <w:t>EL CONTRATISTA</w:t>
-      </w:r>
-      <w:r>
-        <w:rPr>
-          <w:rFonts w:ascii="Arial Narrow" w:eastAsia="Arial Narrow" w:hAnsi="Arial Narrow" w:cs="Arial Narrow"/>
-          <w:sz w:val="18"/>
-          <w:szCs w:val="18"/>
-        </w:rPr>
-        <w:t xml:space="preserve"> entregará a </w:t>
-      </w:r>
-      <w:r>
-        <w:rPr>
-          <w:rFonts w:ascii="Arial Narrow" w:eastAsia="Arial Narrow" w:hAnsi="Arial Narrow" w:cs="Arial Narrow"/>
-          <w:b/>
-          <w:bCs/>
-          <w:sz w:val="18"/>
-          <w:szCs w:val="18"/>
-        </w:rPr>
-        <w:t>EL CONTRATANTE</w:t>
-      </w:r>
-      <w:r>
-        <w:rPr>
-          <w:rFonts w:ascii="Arial Narrow" w:eastAsia="Arial Narrow" w:hAnsi="Arial Narrow" w:cs="Arial Narrow"/>
-          <w:sz w:val="18"/>
-          <w:szCs w:val="18"/>
-        </w:rPr>
-        <w:t xml:space="preserve"> la documentación señalada en el ANEXO 3 Y en el Estándar</w:t>
-      </w:r>
-      <w:r>
-        <w:rPr>
-          <w:sz w:val="18"/>
-          <w:szCs w:val="18"/>
-        </w:rPr>
-        <w:t xml:space="preserve"> </w:t>
-      </w:r>
-      <w:r>
-        <w:rPr>
-          <w:rFonts w:ascii="Arial Narrow" w:eastAsia="Arial Narrow" w:hAnsi="Arial Narrow" w:cs="Arial Narrow"/>
-          <w:sz w:val="18"/>
-          <w:szCs w:val="18"/>
-        </w:rPr>
         <w:t xml:space="preserve">de Requisitos para Ingreso de Contratistas a Obra, que señala como documentos obligatorios, al menos unos 05 (cinco) días previos a su ingreso a obra: </w:t>
       </w:r>
     </w:p>
@@ -11889,7 +11991,6 @@
           <w:szCs w:val="18"/>
           <w:lang w:val="es-ES"/>
         </w:rPr>
-        <w:lastRenderedPageBreak/>
         <w:t>b)</w:t>
       </w:r>
       <w:r>
@@ -11984,6 +12085,7 @@
           <w:szCs w:val="18"/>
           <w:lang w:val="es-ES"/>
         </w:rPr>
+        <w:lastRenderedPageBreak/>
         <w:t>e)</w:t>
       </w:r>
       <w:r>
@@ -15031,7 +15133,6 @@
           <w:szCs w:val="18"/>
           <w:lang w:val="es-ES"/>
         </w:rPr>
-        <w:lastRenderedPageBreak/>
         <w:t xml:space="preserve">EL CONTRATISTA </w:t>
       </w:r>
       <w:r>
@@ -15109,6 +15210,7 @@
           <w:sz w:val="18"/>
           <w:szCs w:val="18"/>
         </w:rPr>
+        <w:lastRenderedPageBreak/>
         <w:t>EL CONTRATISTA</w:t>
       </w:r>
       <w:r>
@@ -16596,7 +16698,6 @@
           <w:sz w:val="18"/>
           <w:szCs w:val="18"/>
         </w:rPr>
-        <w:lastRenderedPageBreak/>
         <w:t xml:space="preserve">Sin perjuicio de lo anterior, </w:t>
       </w:r>
       <w:r>
@@ -16675,6 +16776,7 @@
           <w:szCs w:val="18"/>
           <w:lang w:val="es-ES"/>
         </w:rPr>
+        <w:lastRenderedPageBreak/>
         <w:t xml:space="preserve">Entregar a </w:t>
       </w:r>
       <w:r>
@@ -19231,7 +19333,34 @@
           <w:sz w:val="18"/>
           <w:szCs w:val="18"/>
         </w:rPr>
-        <w:t>La garantía por la instalación del presente CONTRATO es de {{FONDO_GARANTÍA_PLAZO_EN_AÑOS}}; y comienza a partir del acta de conformidad firmada por el propietario y/o cliente</w:t>
+        <w:t>La garantía por la instalación del presente CONTRATO es de</w:t>
+      </w:r>
+      <w:r>
+        <w:rPr>
+          <w:rFonts w:ascii="Arial Narrow" w:eastAsia="Arial Narrow" w:hAnsi="Arial Narrow" w:cs="Arial Narrow"/>
+          <w:color w:val="000000"/>
+          <w:sz w:val="18"/>
+          <w:szCs w:val="18"/>
+        </w:rPr>
+        <w:t xml:space="preserve"> </w:t>
+      </w:r>
+      <w:r>
+        <w:rPr>
+          <w:rFonts w:ascii="Arial Narrow" w:eastAsia="Arial Narrow" w:hAnsi="Arial Narrow" w:cs="Arial Narrow"/>
+          <w:color w:val="000000"/>
+          <w:sz w:val="18"/>
+          <w:szCs w:val="18"/>
+        </w:rPr>
+        <w:t>{{PERIODO_VALIDEZ_GARANTIA}}</w:t>
+      </w:r>
+      <w:r>
+        <w:rPr>
+          <w:rFonts w:ascii="Arial Narrow" w:eastAsia="Arial Narrow" w:hAnsi="Arial Narrow" w:cs="Arial Narrow"/>
+          <w:color w:val="000000"/>
+          <w:sz w:val="18"/>
+          <w:szCs w:val="18"/>
+        </w:rPr>
+        <w:t>; y comienza a partir del acta de conformidad firmada por el propietario y/o cliente</w:t>
       </w:r>
     </w:p>
     <w:p>
@@ -19459,7 +19588,6 @@
           <w:sz w:val="18"/>
           <w:szCs w:val="18"/>
         </w:rPr>
-        <w:lastRenderedPageBreak/>
         <w:t xml:space="preserve">En caso EL CONTRATISTA presente 1 o más semanas de atraso y retire personal de obra a pesar de ese atraso, se multará con S/200 por cada trabajador retirado por día; además faculta a la contratante a contratar personal por casa y la planilla será descontada a EL CONTRATISTA. </w:t>
       </w:r>
       <w:r>
@@ -19499,6 +19627,7 @@
           <w:sz w:val="18"/>
           <w:szCs w:val="18"/>
         </w:rPr>
+        <w:lastRenderedPageBreak/>
         <w:t>En caso EL CONTRATISTA incumpla con colocar 1 supervisor permanente de su partida, se aplicará una penalidad de S/200 por cada día sin supervisor, adicionalmente si el contratista retira o hace faltar a su supervisor de obra sin tener la validación de staff de obra se aplicará también esta penalidad por cada día que no se tenga supervisor</w:t>
       </w:r>
     </w:p>
@@ -20677,17 +20806,7 @@
           <w:sz w:val="18"/>
           <w:szCs w:val="18"/>
         </w:rPr>
-        <w:t xml:space="preserve">o a la Oficina de Normalización Previsional o a cualquier otra entidad de similar naturaleza, como consecuencia del incumplimiento en </w:t>
-      </w:r>
-      <w:r>
-        <w:rPr>
-          <w:rFonts w:ascii="Arial Narrow" w:eastAsia="Arial Narrow" w:hAnsi="Arial Narrow" w:cs="Arial Narrow"/>
-          <w:color w:val="000000"/>
-          <w:sz w:val="18"/>
-          <w:szCs w:val="18"/>
-        </w:rPr>
-        <w:lastRenderedPageBreak/>
-        <w:t xml:space="preserve">la contratación o demora en los pagos del SCTR por parte de </w:t>
+        <w:t xml:space="preserve">o a la Oficina de Normalización Previsional o a cualquier otra entidad de similar naturaleza, como consecuencia del incumplimiento en la contratación o demora en los pagos del SCTR por parte de </w:t>
       </w:r>
       <w:r>
         <w:rPr>
@@ -20738,6 +20857,7 @@
           <w:sz w:val="18"/>
           <w:szCs w:val="18"/>
         </w:rPr>
+        <w:lastRenderedPageBreak/>
         <w:t>LA CONTRATISTA</w:t>
       </w:r>
       <w:r>
@@ -22322,97 +22442,105 @@
           <w:sz w:val="18"/>
           <w:szCs w:val="18"/>
         </w:rPr>
+        <w:t xml:space="preserve">11.7         Al iniciarse la obra, </w:t>
+      </w:r>
+      <w:r>
+        <w:rPr>
+          <w:rFonts w:ascii="Arial Narrow" w:eastAsia="Arial Narrow" w:hAnsi="Arial Narrow" w:cs="Arial Narrow"/>
+          <w:b/>
+          <w:bCs/>
+          <w:sz w:val="18"/>
+          <w:szCs w:val="18"/>
+        </w:rPr>
+        <w:t>EL CONTRATISTA</w:t>
+      </w:r>
+      <w:r>
+        <w:rPr>
+          <w:rFonts w:ascii="Arial Narrow" w:eastAsia="Arial Narrow" w:hAnsi="Arial Narrow" w:cs="Arial Narrow"/>
+          <w:sz w:val="18"/>
+          <w:szCs w:val="18"/>
+        </w:rPr>
+        <w:t xml:space="preserve"> presentará a </w:t>
+      </w:r>
+      <w:r>
+        <w:rPr>
+          <w:rFonts w:ascii="Arial Narrow" w:eastAsia="Arial Narrow" w:hAnsi="Arial Narrow" w:cs="Arial Narrow"/>
+          <w:b/>
+          <w:bCs/>
+          <w:sz w:val="18"/>
+          <w:szCs w:val="18"/>
+        </w:rPr>
+        <w:t>EL CONTRATANTE</w:t>
+      </w:r>
+      <w:r>
+        <w:rPr>
+          <w:rFonts w:ascii="Arial Narrow" w:eastAsia="Arial Narrow" w:hAnsi="Arial Narrow" w:cs="Arial Narrow"/>
+          <w:b/>
+          <w:sz w:val="18"/>
+          <w:szCs w:val="18"/>
+        </w:rPr>
+        <w:t xml:space="preserve"> </w:t>
+      </w:r>
+      <w:r>
+        <w:rPr>
+          <w:rFonts w:ascii="Arial Narrow" w:eastAsia="Arial Narrow" w:hAnsi="Arial Narrow" w:cs="Arial Narrow"/>
+          <w:sz w:val="18"/>
+          <w:szCs w:val="18"/>
+        </w:rPr>
+        <w:t xml:space="preserve">la nómina de profesionales, técnicos, personal, cada vez que </w:t>
+      </w:r>
+      <w:r>
+        <w:rPr>
+          <w:rFonts w:ascii="Arial Narrow" w:eastAsia="Arial Narrow" w:hAnsi="Arial Narrow" w:cs="Arial Narrow"/>
+          <w:b/>
+          <w:bCs/>
+          <w:sz w:val="18"/>
+          <w:szCs w:val="18"/>
+        </w:rPr>
+        <w:t>EL CONTRATANTE</w:t>
+      </w:r>
+      <w:r>
+        <w:rPr>
+          <w:rFonts w:ascii="Arial Narrow" w:eastAsia="Arial Narrow" w:hAnsi="Arial Narrow" w:cs="Arial Narrow"/>
+          <w:b/>
+          <w:sz w:val="18"/>
+          <w:szCs w:val="18"/>
+        </w:rPr>
+        <w:t xml:space="preserve"> </w:t>
+      </w:r>
+      <w:r>
+        <w:rPr>
+          <w:rFonts w:ascii="Arial Narrow" w:eastAsia="Arial Narrow" w:hAnsi="Arial Narrow" w:cs="Arial Narrow"/>
+          <w:sz w:val="18"/>
+          <w:szCs w:val="18"/>
+        </w:rPr>
+        <w:t xml:space="preserve">se lo solicite.  También se podrá exigir al </w:t>
+      </w:r>
+      <w:r>
+        <w:rPr>
+          <w:rFonts w:ascii="Arial Narrow" w:eastAsia="Arial Narrow" w:hAnsi="Arial Narrow" w:cs="Arial Narrow"/>
+          <w:b/>
+          <w:sz w:val="18"/>
+          <w:szCs w:val="18"/>
+        </w:rPr>
+        <w:t xml:space="preserve">CONTRATISTA, </w:t>
+      </w:r>
+      <w:r>
+        <w:rPr>
+          <w:rFonts w:ascii="Arial Narrow" w:eastAsia="Arial Narrow" w:hAnsi="Arial Narrow" w:cs="Arial Narrow"/>
+          <w:sz w:val="18"/>
+          <w:szCs w:val="18"/>
+        </w:rPr>
+        <w:t xml:space="preserve">en cualquier tiempo, la exhibición de liquidaciones de </w:t>
+      </w:r>
+      <w:r>
+        <w:rPr>
+          <w:rFonts w:ascii="Arial Narrow" w:eastAsia="Arial Narrow" w:hAnsi="Arial Narrow" w:cs="Arial Narrow"/>
+          <w:sz w:val="18"/>
+          <w:szCs w:val="18"/>
+        </w:rPr>
         <w:lastRenderedPageBreak/>
-        <w:t xml:space="preserve">11.7         Al iniciarse la obra, </w:t>
-      </w:r>
-      <w:r>
-        <w:rPr>
-          <w:rFonts w:ascii="Arial Narrow" w:eastAsia="Arial Narrow" w:hAnsi="Arial Narrow" w:cs="Arial Narrow"/>
-          <w:b/>
-          <w:bCs/>
-          <w:sz w:val="18"/>
-          <w:szCs w:val="18"/>
-        </w:rPr>
-        <w:t>EL CONTRATISTA</w:t>
-      </w:r>
-      <w:r>
-        <w:rPr>
-          <w:rFonts w:ascii="Arial Narrow" w:eastAsia="Arial Narrow" w:hAnsi="Arial Narrow" w:cs="Arial Narrow"/>
-          <w:sz w:val="18"/>
-          <w:szCs w:val="18"/>
-        </w:rPr>
-        <w:t xml:space="preserve"> presentará a </w:t>
-      </w:r>
-      <w:r>
-        <w:rPr>
-          <w:rFonts w:ascii="Arial Narrow" w:eastAsia="Arial Narrow" w:hAnsi="Arial Narrow" w:cs="Arial Narrow"/>
-          <w:b/>
-          <w:bCs/>
-          <w:sz w:val="18"/>
-          <w:szCs w:val="18"/>
-        </w:rPr>
-        <w:t>EL CONTRATANTE</w:t>
-      </w:r>
-      <w:r>
-        <w:rPr>
-          <w:rFonts w:ascii="Arial Narrow" w:eastAsia="Arial Narrow" w:hAnsi="Arial Narrow" w:cs="Arial Narrow"/>
-          <w:b/>
-          <w:sz w:val="18"/>
-          <w:szCs w:val="18"/>
-        </w:rPr>
-        <w:t xml:space="preserve"> </w:t>
-      </w:r>
-      <w:r>
-        <w:rPr>
-          <w:rFonts w:ascii="Arial Narrow" w:eastAsia="Arial Narrow" w:hAnsi="Arial Narrow" w:cs="Arial Narrow"/>
-          <w:sz w:val="18"/>
-          <w:szCs w:val="18"/>
-        </w:rPr>
-        <w:t xml:space="preserve">la nómina de profesionales, técnicos, personal, cada vez que </w:t>
-      </w:r>
-      <w:r>
-        <w:rPr>
-          <w:rFonts w:ascii="Arial Narrow" w:eastAsia="Arial Narrow" w:hAnsi="Arial Narrow" w:cs="Arial Narrow"/>
-          <w:b/>
-          <w:bCs/>
-          <w:sz w:val="18"/>
-          <w:szCs w:val="18"/>
-        </w:rPr>
-        <w:t>EL CONTRATANTE</w:t>
-      </w:r>
-      <w:r>
-        <w:rPr>
-          <w:rFonts w:ascii="Arial Narrow" w:eastAsia="Arial Narrow" w:hAnsi="Arial Narrow" w:cs="Arial Narrow"/>
-          <w:b/>
-          <w:sz w:val="18"/>
-          <w:szCs w:val="18"/>
-        </w:rPr>
-        <w:t xml:space="preserve"> </w:t>
-      </w:r>
-      <w:r>
-        <w:rPr>
-          <w:rFonts w:ascii="Arial Narrow" w:eastAsia="Arial Narrow" w:hAnsi="Arial Narrow" w:cs="Arial Narrow"/>
-          <w:sz w:val="18"/>
-          <w:szCs w:val="18"/>
-        </w:rPr>
-        <w:t xml:space="preserve">se lo solicite.  También se podrá exigir al </w:t>
-      </w:r>
-      <w:r>
-        <w:rPr>
-          <w:rFonts w:ascii="Arial Narrow" w:eastAsia="Arial Narrow" w:hAnsi="Arial Narrow" w:cs="Arial Narrow"/>
-          <w:b/>
-          <w:sz w:val="18"/>
-          <w:szCs w:val="18"/>
-        </w:rPr>
-        <w:t xml:space="preserve">CONTRATISTA, </w:t>
-      </w:r>
-      <w:r>
-        <w:rPr>
-          <w:rFonts w:ascii="Arial Narrow" w:eastAsia="Arial Narrow" w:hAnsi="Arial Narrow" w:cs="Arial Narrow"/>
-          <w:sz w:val="18"/>
-          <w:szCs w:val="18"/>
-        </w:rPr>
-        <w:t xml:space="preserve">en cualquier tiempo, la exhibición de liquidaciones de remuneraciones firmadas por sus trabajadores destinados a la obra, correspondientes al tiempo trabajado en ella.  </w:t>
+        <w:t xml:space="preserve">remuneraciones firmadas por sus trabajadores destinados a la obra, correspondientes al tiempo trabajado en ella.  </w:t>
       </w:r>
       <w:r>
         <w:rPr>
@@ -23990,6 +24118,7 @@
           <w:sz w:val="18"/>
           <w:szCs w:val="18"/>
         </w:rPr>
+        <w:lastRenderedPageBreak/>
         <w:t>EL CONTRATANTE</w:t>
       </w:r>
       <w:r>
@@ -25777,130 +25906,140 @@
           <w:szCs w:val="18"/>
           <w:lang w:val="es-ES"/>
         </w:rPr>
+        <w:t>14.2.</w:t>
+      </w:r>
+      <w:r>
+        <w:rPr>
+          <w:rFonts w:eastAsia="Arial Narrow"/>
+          <w:sz w:val="18"/>
+          <w:szCs w:val="18"/>
+        </w:rPr>
+        <w:tab/>
+      </w:r>
+      <w:r>
+        <w:rPr>
+          <w:rFonts w:ascii="Arial Narrow" w:eastAsia="Arial Narrow" w:hAnsi="Arial Narrow" w:cs="Arial Narrow"/>
+          <w:color w:val="000000" w:themeColor="text1"/>
+          <w:sz w:val="18"/>
+          <w:szCs w:val="18"/>
+          <w:lang w:val="es-ES"/>
+        </w:rPr>
+        <w:t xml:space="preserve">Todo cambio o variación que resulte ser indispensable para la ejecución de la </w:t>
+      </w:r>
+      <w:r>
+        <w:rPr>
+          <w:rFonts w:ascii="Arial Narrow" w:eastAsia="Arial Narrow" w:hAnsi="Arial Narrow" w:cs="Arial Narrow"/>
+          <w:b/>
+          <w:color w:val="000000" w:themeColor="text1"/>
+          <w:sz w:val="18"/>
+          <w:szCs w:val="18"/>
+          <w:lang w:val="es-ES"/>
+        </w:rPr>
+        <w:t>OBRA</w:t>
+      </w:r>
+      <w:r>
+        <w:rPr>
+          <w:rFonts w:ascii="Arial Narrow" w:eastAsia="Arial Narrow" w:hAnsi="Arial Narrow" w:cs="Arial Narrow"/>
+          <w:color w:val="000000" w:themeColor="text1"/>
+          <w:sz w:val="18"/>
+          <w:szCs w:val="18"/>
+          <w:lang w:val="es-ES"/>
+        </w:rPr>
+        <w:t xml:space="preserve"> deberá ser comunicada por escrito a través de un RFI (</w:t>
+      </w:r>
+      <w:proofErr w:type="spellStart"/>
+      <w:r>
+        <w:rPr>
+          <w:rFonts w:ascii="Arial Narrow" w:eastAsia="Arial Narrow" w:hAnsi="Arial Narrow" w:cs="Arial Narrow"/>
+          <w:color w:val="000000" w:themeColor="text1"/>
+          <w:sz w:val="18"/>
+          <w:szCs w:val="18"/>
+          <w:lang w:val="es-ES"/>
+        </w:rPr>
+        <w:t>Request</w:t>
+      </w:r>
+      <w:proofErr w:type="spellEnd"/>
+      <w:r>
+        <w:rPr>
+          <w:rFonts w:ascii="Arial Narrow" w:eastAsia="Arial Narrow" w:hAnsi="Arial Narrow" w:cs="Arial Narrow"/>
+          <w:color w:val="000000" w:themeColor="text1"/>
+          <w:sz w:val="18"/>
+          <w:szCs w:val="18"/>
+          <w:lang w:val="es-ES"/>
+        </w:rPr>
+        <w:t xml:space="preserve"> For </w:t>
+      </w:r>
+      <w:proofErr w:type="spellStart"/>
+      <w:r>
+        <w:rPr>
+          <w:rFonts w:ascii="Arial Narrow" w:eastAsia="Arial Narrow" w:hAnsi="Arial Narrow" w:cs="Arial Narrow"/>
+          <w:color w:val="000000" w:themeColor="text1"/>
+          <w:sz w:val="18"/>
+          <w:szCs w:val="18"/>
+          <w:lang w:val="es-ES"/>
+        </w:rPr>
+        <w:t>Information</w:t>
+      </w:r>
+      <w:proofErr w:type="spellEnd"/>
+      <w:r>
+        <w:rPr>
+          <w:rFonts w:ascii="Arial Narrow" w:eastAsia="Arial Narrow" w:hAnsi="Arial Narrow" w:cs="Arial Narrow"/>
+          <w:color w:val="000000" w:themeColor="text1"/>
+          <w:sz w:val="18"/>
+          <w:szCs w:val="18"/>
+          <w:lang w:val="es-ES"/>
+        </w:rPr>
+        <w:t xml:space="preserve">) señalando la base normativa que lo sustente a </w:t>
+      </w:r>
+      <w:r>
+        <w:rPr>
+          <w:rFonts w:ascii="Arial Narrow" w:eastAsia="Arial Narrow" w:hAnsi="Arial Narrow" w:cs="Arial Narrow"/>
+          <w:b/>
+          <w:color w:val="000000" w:themeColor="text1"/>
+          <w:sz w:val="18"/>
+          <w:szCs w:val="18"/>
+          <w:lang w:val="es-ES"/>
+        </w:rPr>
+        <w:t>EL CONTRATANTE</w:t>
+      </w:r>
+      <w:r>
+        <w:rPr>
+          <w:rFonts w:ascii="Arial Narrow" w:eastAsia="Arial Narrow" w:hAnsi="Arial Narrow" w:cs="Arial Narrow"/>
+          <w:color w:val="000000" w:themeColor="text1"/>
+          <w:sz w:val="18"/>
+          <w:szCs w:val="18"/>
+          <w:lang w:val="es-ES"/>
+        </w:rPr>
+        <w:t xml:space="preserve"> y en </w:t>
+      </w:r>
+      <w:r>
+        <w:rPr>
+          <w:rFonts w:eastAsia="Arial Narrow"/>
+          <w:sz w:val="18"/>
+          <w:szCs w:val="18"/>
+        </w:rPr>
+        <w:tab/>
+      </w:r>
+      <w:r>
+        <w:rPr>
+          <w:rFonts w:ascii="Arial Narrow" w:eastAsia="Arial Narrow" w:hAnsi="Arial Narrow" w:cs="Arial Narrow"/>
+          <w:color w:val="000000" w:themeColor="text1"/>
+          <w:sz w:val="18"/>
+          <w:szCs w:val="18"/>
+          <w:lang w:val="es-ES"/>
+        </w:rPr>
+        <w:t xml:space="preserve">caso de ser aceptada, </w:t>
+      </w:r>
+      <w:r>
+        <w:rPr>
+          <w:rFonts w:ascii="Arial Narrow" w:eastAsia="Arial Narrow" w:hAnsi="Arial Narrow" w:cs="Arial Narrow"/>
+          <w:color w:val="000000" w:themeColor="text1"/>
+          <w:sz w:val="18"/>
+          <w:szCs w:val="18"/>
+          <w:lang w:val="es-ES"/>
+        </w:rPr>
         <w:lastRenderedPageBreak/>
-        <w:t>14.2.</w:t>
-      </w:r>
-      <w:r>
-        <w:rPr>
-          <w:rFonts w:eastAsia="Arial Narrow"/>
-          <w:sz w:val="18"/>
-          <w:szCs w:val="18"/>
-        </w:rPr>
-        <w:tab/>
-      </w:r>
-      <w:r>
-        <w:rPr>
-          <w:rFonts w:ascii="Arial Narrow" w:eastAsia="Arial Narrow" w:hAnsi="Arial Narrow" w:cs="Arial Narrow"/>
-          <w:color w:val="000000" w:themeColor="text1"/>
-          <w:sz w:val="18"/>
-          <w:szCs w:val="18"/>
-          <w:lang w:val="es-ES"/>
-        </w:rPr>
-        <w:t xml:space="preserve">Todo cambio o variación que resulte ser indispensable para la ejecución de la </w:t>
-      </w:r>
-      <w:r>
-        <w:rPr>
-          <w:rFonts w:ascii="Arial Narrow" w:eastAsia="Arial Narrow" w:hAnsi="Arial Narrow" w:cs="Arial Narrow"/>
-          <w:b/>
-          <w:color w:val="000000" w:themeColor="text1"/>
-          <w:sz w:val="18"/>
-          <w:szCs w:val="18"/>
-          <w:lang w:val="es-ES"/>
-        </w:rPr>
-        <w:t>OBRA</w:t>
-      </w:r>
-      <w:r>
-        <w:rPr>
-          <w:rFonts w:ascii="Arial Narrow" w:eastAsia="Arial Narrow" w:hAnsi="Arial Narrow" w:cs="Arial Narrow"/>
-          <w:color w:val="000000" w:themeColor="text1"/>
-          <w:sz w:val="18"/>
-          <w:szCs w:val="18"/>
-          <w:lang w:val="es-ES"/>
-        </w:rPr>
-        <w:t xml:space="preserve"> deberá ser comunicada por escrito a través de un RFI (</w:t>
-      </w:r>
-      <w:proofErr w:type="spellStart"/>
-      <w:r>
-        <w:rPr>
-          <w:rFonts w:ascii="Arial Narrow" w:eastAsia="Arial Narrow" w:hAnsi="Arial Narrow" w:cs="Arial Narrow"/>
-          <w:color w:val="000000" w:themeColor="text1"/>
-          <w:sz w:val="18"/>
-          <w:szCs w:val="18"/>
-          <w:lang w:val="es-ES"/>
-        </w:rPr>
-        <w:t>Request</w:t>
-      </w:r>
-      <w:proofErr w:type="spellEnd"/>
-      <w:r>
-        <w:rPr>
-          <w:rFonts w:ascii="Arial Narrow" w:eastAsia="Arial Narrow" w:hAnsi="Arial Narrow" w:cs="Arial Narrow"/>
-          <w:color w:val="000000" w:themeColor="text1"/>
-          <w:sz w:val="18"/>
-          <w:szCs w:val="18"/>
-          <w:lang w:val="es-ES"/>
-        </w:rPr>
-        <w:t xml:space="preserve"> For </w:t>
-      </w:r>
-      <w:proofErr w:type="spellStart"/>
-      <w:r>
-        <w:rPr>
-          <w:rFonts w:ascii="Arial Narrow" w:eastAsia="Arial Narrow" w:hAnsi="Arial Narrow" w:cs="Arial Narrow"/>
-          <w:color w:val="000000" w:themeColor="text1"/>
-          <w:sz w:val="18"/>
-          <w:szCs w:val="18"/>
-          <w:lang w:val="es-ES"/>
-        </w:rPr>
-        <w:t>Information</w:t>
-      </w:r>
-      <w:proofErr w:type="spellEnd"/>
-      <w:r>
-        <w:rPr>
-          <w:rFonts w:ascii="Arial Narrow" w:eastAsia="Arial Narrow" w:hAnsi="Arial Narrow" w:cs="Arial Narrow"/>
-          <w:color w:val="000000" w:themeColor="text1"/>
-          <w:sz w:val="18"/>
-          <w:szCs w:val="18"/>
-          <w:lang w:val="es-ES"/>
-        </w:rPr>
-        <w:t xml:space="preserve">) señalando la base normativa que lo sustente a </w:t>
-      </w:r>
-      <w:r>
-        <w:rPr>
-          <w:rFonts w:ascii="Arial Narrow" w:eastAsia="Arial Narrow" w:hAnsi="Arial Narrow" w:cs="Arial Narrow"/>
-          <w:b/>
-          <w:color w:val="000000" w:themeColor="text1"/>
-          <w:sz w:val="18"/>
-          <w:szCs w:val="18"/>
-          <w:lang w:val="es-ES"/>
-        </w:rPr>
-        <w:t>EL CONTRATANTE</w:t>
-      </w:r>
-      <w:r>
-        <w:rPr>
-          <w:rFonts w:ascii="Arial Narrow" w:eastAsia="Arial Narrow" w:hAnsi="Arial Narrow" w:cs="Arial Narrow"/>
-          <w:color w:val="000000" w:themeColor="text1"/>
-          <w:sz w:val="18"/>
-          <w:szCs w:val="18"/>
-          <w:lang w:val="es-ES"/>
-        </w:rPr>
-        <w:t xml:space="preserve"> y en </w:t>
-      </w:r>
-      <w:r>
-        <w:rPr>
-          <w:rFonts w:eastAsia="Arial Narrow"/>
-          <w:sz w:val="18"/>
-          <w:szCs w:val="18"/>
-        </w:rPr>
-        <w:tab/>
-      </w:r>
-      <w:r>
-        <w:rPr>
-          <w:rFonts w:ascii="Arial Narrow" w:eastAsia="Arial Narrow" w:hAnsi="Arial Narrow" w:cs="Arial Narrow"/>
-          <w:color w:val="000000" w:themeColor="text1"/>
-          <w:sz w:val="18"/>
-          <w:szCs w:val="18"/>
-          <w:lang w:val="es-ES"/>
-        </w:rPr>
-        <w:t xml:space="preserve">caso de ser aceptada, esta aceptación será por escrito. Esta variación deberá tener la aprobación y validación de Gerencia de Proyectos de </w:t>
+        <w:t xml:space="preserve">esta aceptación será por escrito. Esta variación deberá tener la aprobación y validación de Gerencia de Proyectos de </w:t>
       </w:r>
       <w:r>
         <w:rPr>
@@ -27250,8 +27389,17 @@
           <w:szCs w:val="18"/>
           <w:lang w:val="es-ES"/>
         </w:rPr>
+        <w:t xml:space="preserve">17.1.     Todo litigio, controversia, desavenencia o reclamación resultante, relacionada o derivada de este acto jurídico o que guarde relación con él, incluidas las relativas a su validez, eficacia o terminación incluso las del convenio arbitral en el incluido, serán resueltas mediante arbitraje de derecho, cuyo laudo será definitivo e inapelable, de conformidad con los reglamentos y el Estatuto de Centro de Arbitraje de la Cámara </w:t>
+      </w:r>
+      <w:r>
+        <w:rPr>
+          <w:rFonts w:ascii="Arial Narrow" w:eastAsia="Arial Narrow" w:hAnsi="Arial Narrow" w:cs="Arial Narrow"/>
+          <w:sz w:val="18"/>
+          <w:szCs w:val="18"/>
+          <w:lang w:val="es-ES"/>
+        </w:rPr>
         <w:lastRenderedPageBreak/>
-        <w:t>17.1.     Todo litigio, controversia, desavenencia o reclamación resultante, relacionada o derivada de este acto jurídico o que guarde relación con él, incluidas las relativas a su validez, eficacia o terminación incluso las del convenio arbitral en el incluido, serán resueltas mediante arbitraje de derecho, cuyo laudo será definitivo e inapelable, de conformidad con los reglamentos y el Estatuto de Centro de Arbitraje de la Cámara de Comercio de Lima a cuyas normas, administración y decisión se someten las Partes en forma incondicional, declarando conocerlas y aceptarlas en su integridad.</w:t>
+        <w:t>de Comercio de Lima a cuyas normas, administración y decisión se someten las Partes en forma incondicional, declarando conocerlas y aceptarlas en su integridad.</w:t>
       </w:r>
     </w:p>
     <w:p>
@@ -28602,7 +28750,6 @@
           <w:szCs w:val="18"/>
           <w:lang w:val="es-ES"/>
         </w:rPr>
-        <w:lastRenderedPageBreak/>
         <w:t xml:space="preserve">EL CONTRATISTA </w:t>
       </w:r>
       <w:r>
@@ -28708,6 +28855,7 @@
           <w:szCs w:val="18"/>
           <w:lang w:val="es-ES"/>
         </w:rPr>
+        <w:lastRenderedPageBreak/>
         <w:t xml:space="preserve">La liquidación de </w:t>
       </w:r>
       <w:r>
@@ -30409,50 +30557,60 @@
           <w:szCs w:val="18"/>
           <w:lang w:val="es-ES"/>
         </w:rPr>
+        <w:t xml:space="preserve">En caso </w:t>
+      </w:r>
+      <w:r>
+        <w:rPr>
+          <w:rFonts w:ascii="Arial Narrow" w:eastAsia="Arial Narrow" w:hAnsi="Arial Narrow" w:cs="Arial Narrow"/>
+          <w:b/>
+          <w:color w:val="000000" w:themeColor="text1"/>
+          <w:sz w:val="18"/>
+          <w:szCs w:val="18"/>
+          <w:lang w:val="es-ES"/>
+        </w:rPr>
+        <w:t>EL CONTRATISTA</w:t>
+      </w:r>
+      <w:r>
+        <w:rPr>
+          <w:rFonts w:ascii="Arial Narrow" w:eastAsia="Arial Narrow" w:hAnsi="Arial Narrow" w:cs="Arial Narrow"/>
+          <w:color w:val="000000" w:themeColor="text1"/>
+          <w:sz w:val="18"/>
+          <w:szCs w:val="18"/>
+          <w:lang w:val="es-ES"/>
+        </w:rPr>
+        <w:t xml:space="preserve"> no cumpla en dar respuesta y/o cumplir dentro del plazo correspondiente con atender la observación o reclamo, </w:t>
+      </w:r>
+      <w:r>
+        <w:rPr>
+          <w:rFonts w:ascii="Arial Narrow" w:eastAsia="Arial Narrow" w:hAnsi="Arial Narrow" w:cs="Arial Narrow"/>
+          <w:b/>
+          <w:color w:val="000000" w:themeColor="text1"/>
+          <w:sz w:val="18"/>
+          <w:szCs w:val="18"/>
+          <w:lang w:val="es-ES"/>
+        </w:rPr>
+        <w:t>EL CONTRATANTE</w:t>
+      </w:r>
+      <w:r>
+        <w:rPr>
+          <w:rFonts w:ascii="Arial Narrow" w:eastAsia="Arial Narrow" w:hAnsi="Arial Narrow" w:cs="Arial Narrow"/>
+          <w:color w:val="000000" w:themeColor="text1"/>
+          <w:sz w:val="18"/>
+          <w:szCs w:val="18"/>
+          <w:lang w:val="es-ES"/>
+        </w:rPr>
+        <w:t xml:space="preserve"> se encontrará facultado para formar una cuadrilla para subsanar las observaciones, ya sea directamente o </w:t>
+      </w:r>
+      <w:r>
+        <w:rPr>
+          <w:rFonts w:ascii="Arial Narrow" w:eastAsia="Arial Narrow" w:hAnsi="Arial Narrow" w:cs="Arial Narrow"/>
+          <w:color w:val="000000" w:themeColor="text1"/>
+          <w:sz w:val="18"/>
+          <w:szCs w:val="18"/>
+          <w:lang w:val="es-ES"/>
+        </w:rPr>
         <w:lastRenderedPageBreak/>
-        <w:t xml:space="preserve">En caso </w:t>
-      </w:r>
-      <w:r>
-        <w:rPr>
-          <w:rFonts w:ascii="Arial Narrow" w:eastAsia="Arial Narrow" w:hAnsi="Arial Narrow" w:cs="Arial Narrow"/>
-          <w:b/>
-          <w:color w:val="000000" w:themeColor="text1"/>
-          <w:sz w:val="18"/>
-          <w:szCs w:val="18"/>
-          <w:lang w:val="es-ES"/>
-        </w:rPr>
-        <w:t>EL CONTRATISTA</w:t>
-      </w:r>
-      <w:r>
-        <w:rPr>
-          <w:rFonts w:ascii="Arial Narrow" w:eastAsia="Arial Narrow" w:hAnsi="Arial Narrow" w:cs="Arial Narrow"/>
-          <w:color w:val="000000" w:themeColor="text1"/>
-          <w:sz w:val="18"/>
-          <w:szCs w:val="18"/>
-          <w:lang w:val="es-ES"/>
-        </w:rPr>
-        <w:t xml:space="preserve"> no cumpla en dar respuesta y/o cumplir dentro del plazo correspondiente con atender la observación o reclamo, </w:t>
-      </w:r>
-      <w:r>
-        <w:rPr>
-          <w:rFonts w:ascii="Arial Narrow" w:eastAsia="Arial Narrow" w:hAnsi="Arial Narrow" w:cs="Arial Narrow"/>
-          <w:b/>
-          <w:color w:val="000000" w:themeColor="text1"/>
-          <w:sz w:val="18"/>
-          <w:szCs w:val="18"/>
-          <w:lang w:val="es-ES"/>
-        </w:rPr>
-        <w:t>EL CONTRATANTE</w:t>
-      </w:r>
-      <w:r>
-        <w:rPr>
-          <w:rFonts w:ascii="Arial Narrow" w:eastAsia="Arial Narrow" w:hAnsi="Arial Narrow" w:cs="Arial Narrow"/>
-          <w:color w:val="000000" w:themeColor="text1"/>
-          <w:sz w:val="18"/>
-          <w:szCs w:val="18"/>
-          <w:lang w:val="es-ES"/>
-        </w:rPr>
-        <w:t xml:space="preserve"> se encontrará facultado para formar una cuadrilla para subsanar las observaciones, ya sea directamente o a través de un tercero, trasladando dicho costo a </w:t>
+        <w:t xml:space="preserve">a través de un tercero, trasladando dicho costo a </w:t>
       </w:r>
       <w:r>
         <w:rPr>
@@ -32174,7 +32332,6 @@
           <w:szCs w:val="18"/>
           <w:lang w:val="es-ES"/>
         </w:rPr>
-        <w:lastRenderedPageBreak/>
         <w:t>En caso</w:t>
       </w:r>
       <w:r>
@@ -32281,6 +32438,7 @@
           <w:sz w:val="18"/>
           <w:szCs w:val="18"/>
         </w:rPr>
+        <w:lastRenderedPageBreak/>
         <w:t>EL CONTRATISTA</w:t>
       </w:r>
       <w:r>

</xml_diff>

<commit_message>
add mejoras varias al contrato de suministro
</commit_message>
<xml_diff>
--- a/Features/CostsModule/Features/AdjudicacionesFeature/Templates/plantilla_instalacion_con_placeholders.docx
+++ b/Features/CostsModule/Features/AdjudicacionesFeature/Templates/plantilla_instalacion_con_placeholders.docx
@@ -634,7 +634,17 @@
           <w:lang w:val="es-ES"/>
         </w:rPr>
         <w:tab/>
-        <w:t>{{FONDO_GARANTÍA_PORCENTAJE}} Fondo de Garantía</w:t>
+        <w:t>{</w:t>
+      </w:r>
+      <w:r>
+        <w:rPr>
+          <w:rFonts w:ascii="Calibri" w:eastAsia="Calibri" w:hAnsi="Calibri" w:cs="Calibri"/>
+          <w:color w:val="000000"/>
+          <w:sz w:val="24"/>
+          <w:szCs w:val="24"/>
+          <w:lang w:val="es-ES"/>
+        </w:rPr>
+        <w:t>{HOJA_RESUMEN_FONDO_GARANTÍA_PORCENTAJE}}</w:t>
       </w:r>
     </w:p>
     <w:p>
@@ -50683,12 +50693,18 @@
 </file>
 
 <file path=customXml/item1.xml><?xml version="1.0" encoding="utf-8"?>
-<go:gDocsCustomXmlDataStorage xmlns:go="http://customooxmlschemas.google.com/" xmlns:r="http://schemas.openxmlformats.org/officeDocument/2006/relationships" uri="GoogleDocsCustomDataVersion2">
-  <go:docsCustomData xmlns:go="http://customooxmlschemas.google.com/" roundtripDataSignature="AMtx7mi65SlRJfsAaB/f5FQ/QJjSa7JTRg==">CgMxLjAyCGguZ2pkZ3hzMgloLjMwajB6bGwyCWguMWZvYjl0ZTIJaC4zem55c2g3MgloLjJldDkycDAyCGgudHlqY3d0MgloLjNkeTZ2a20yCWguMXQzaDVzZjIJaC40ZDM0b2c4MgloLjJzOGV5bzEyCWguMTdkcDh2dTIJaC4zcmRjcmpuMgloLjI2aW4xcmcyCGgubG54Yno5MgloLjM1bmt1bjI4AHIhMVB3QlM0WUsxeVpEc0RYM1hkSnRydEtfT2RVVDZQNW5I</go:docsCustomData>
-</go:gDocsCustomXmlDataStorage>
+<b:Sources xmlns:b="http://schemas.openxmlformats.org/officeDocument/2006/bibliography" xmlns="http://schemas.openxmlformats.org/officeDocument/2006/bibliography" SelectedStyle="\APASixthEditionOfficeOnline.xsl" StyleName="APA" Version="6"/>
 </file>
 
 <file path=customXml/item2.xml><?xml version="1.0" encoding="utf-8"?>
+<p:properties xmlns:p="http://schemas.microsoft.com/office/2006/metadata/properties" xmlns:xsi="http://www.w3.org/2001/XMLSchema-instance" xmlns:pc="http://schemas.microsoft.com/office/infopath/2007/PartnerControls">
+  <documentManagement>
+    <_activity xmlns="1c364c2e-a9e5-4d0d-8b0c-60f96943b919" xsi:nil="true"/>
+  </documentManagement>
+</p:properties>
+</file>
+
+<file path=customXml/item3.xml><?xml version="1.0" encoding="utf-8"?>
 <ct:contentTypeSchema xmlns:ct="http://schemas.microsoft.com/office/2006/metadata/contentType" xmlns:ma="http://schemas.microsoft.com/office/2006/metadata/properties/metaAttributes" ct:_="" ma:_="" ma:contentTypeName="Document" ma:contentTypeID="0x01010063B0DD29DB0EF346B1F1544CEBE0D2A7" ma:contentTypeVersion="18" ma:contentTypeDescription="Create a new document." ma:contentTypeScope="" ma:versionID="f944625a855169ca68f7a121b194bb92">
   <xsd:schema xmlns:xsd="http://www.w3.org/2001/XMLSchema" xmlns:xs="http://www.w3.org/2001/XMLSchema" xmlns:p="http://schemas.microsoft.com/office/2006/metadata/properties" xmlns:ns3="1c364c2e-a9e5-4d0d-8b0c-60f96943b919" xmlns:ns4="65ea09c1-7372-4828-95fe-f2a9534e8332" targetNamespace="http://schemas.microsoft.com/office/2006/metadata/properties" ma:root="true" ma:fieldsID="205ea4d9cf7dc04f23d4fe395e4eb5de" ns3:_="" ns4:_="">
     <xsd:import namespace="1c364c2e-a9e5-4d0d-8b0c-60f96943b919"/>
@@ -50941,16 +50957,10 @@
 </ct:contentTypeSchema>
 </file>
 
-<file path=customXml/item3.xml><?xml version="1.0" encoding="utf-8"?>
-<p:properties xmlns:p="http://schemas.microsoft.com/office/2006/metadata/properties" xmlns:xsi="http://www.w3.org/2001/XMLSchema-instance" xmlns:pc="http://schemas.microsoft.com/office/infopath/2007/PartnerControls">
-  <documentManagement>
-    <_activity xmlns="1c364c2e-a9e5-4d0d-8b0c-60f96943b919" xsi:nil="true"/>
-  </documentManagement>
-</p:properties>
-</file>
-
 <file path=customXml/item4.xml><?xml version="1.0" encoding="utf-8"?>
-<b:Sources xmlns:b="http://schemas.openxmlformats.org/officeDocument/2006/bibliography" xmlns="http://schemas.openxmlformats.org/officeDocument/2006/bibliography" SelectedStyle="\APASixthEditionOfficeOnline.xsl" StyleName="APA" Version="6"/>
+<go:gDocsCustomXmlDataStorage xmlns:go="http://customooxmlschemas.google.com/" xmlns:r="http://schemas.openxmlformats.org/officeDocument/2006/relationships" uri="GoogleDocsCustomDataVersion2">
+  <go:docsCustomData xmlns:go="http://customooxmlschemas.google.com/" roundtripDataSignature="AMtx7mi65SlRJfsAaB/f5FQ/QJjSa7JTRg==">CgMxLjAyCGguZ2pkZ3hzMgloLjMwajB6bGwyCWguMWZvYjl0ZTIJaC4zem55c2g3MgloLjJldDkycDAyCGgudHlqY3d0MgloLjNkeTZ2a20yCWguMXQzaDVzZjIJaC40ZDM0b2c4MgloLjJzOGV5bzEyCWguMTdkcDh2dTIJaC4zcmRjcmpuMgloLjI2aW4xcmcyCGgubG54Yno5MgloLjM1bmt1bjI4AHIhMVB3QlM0WUsxeVpEc0RYM1hkSnRydEtfT2RVVDZQNW5I</go:docsCustomData>
+</go:gDocsCustomXmlDataStorage>
 </file>
 
 <file path=customXml/item5.xml><?xml version="1.0" encoding="utf-8"?>
@@ -50963,15 +50973,24 @@
 </file>
 
 <file path=customXml/itemProps1.xml><?xml version="1.0" encoding="utf-8"?>
-<ds:datastoreItem xmlns:ds="http://schemas.openxmlformats.org/officeDocument/2006/customXml" ds:itemID="{11111111-1234-1234-1234-123412341234}">
+<ds:datastoreItem xmlns:ds="http://schemas.openxmlformats.org/officeDocument/2006/customXml" ds:itemID="{02C867CF-6023-4BBE-9EB8-8D3F09F43338}">
   <ds:schemaRefs>
-    <ds:schemaRef ds:uri="http://customooxmlschemas.google.com/"/>
-    <ds:schemaRef ds:uri="http://schemas.openxmlformats.org/officeDocument/2006/relationships"/>
+    <ds:schemaRef ds:uri="http://schemas.openxmlformats.org/officeDocument/2006/bibliography"/>
   </ds:schemaRefs>
 </ds:datastoreItem>
 </file>
 
 <file path=customXml/itemProps2.xml><?xml version="1.0" encoding="utf-8"?>
+<ds:datastoreItem xmlns:ds="http://schemas.openxmlformats.org/officeDocument/2006/customXml" ds:itemID="{D829E601-C5D7-4EB3-859E-E162E4261A98}">
+  <ds:schemaRefs>
+    <ds:schemaRef ds:uri="http://schemas.microsoft.com/office/2006/metadata/properties"/>
+    <ds:schemaRef ds:uri="http://schemas.microsoft.com/office/infopath/2007/PartnerControls"/>
+    <ds:schemaRef ds:uri="1c364c2e-a9e5-4d0d-8b0c-60f96943b919"/>
+  </ds:schemaRefs>
+</ds:datastoreItem>
+</file>
+
+<file path=customXml/itemProps3.xml><?xml version="1.0" encoding="utf-8"?>
 <ds:datastoreItem xmlns:ds="http://schemas.openxmlformats.org/officeDocument/2006/customXml" ds:itemID="{F24A4505-FFC0-4551-A77A-5910F586F04D}">
   <ds:schemaRefs>
     <ds:schemaRef ds:uri="http://schemas.microsoft.com/office/2006/metadata/contentType"/>
@@ -50990,20 +51009,11 @@
 </ds:datastoreItem>
 </file>
 
-<file path=customXml/itemProps3.xml><?xml version="1.0" encoding="utf-8"?>
-<ds:datastoreItem xmlns:ds="http://schemas.openxmlformats.org/officeDocument/2006/customXml" ds:itemID="{D829E601-C5D7-4EB3-859E-E162E4261A98}">
+<file path=customXml/itemProps4.xml><?xml version="1.0" encoding="utf-8"?>
+<ds:datastoreItem xmlns:ds="http://schemas.openxmlformats.org/officeDocument/2006/customXml" ds:itemID="{11111111-1234-1234-1234-123412341234}">
   <ds:schemaRefs>
-    <ds:schemaRef ds:uri="http://schemas.microsoft.com/office/2006/metadata/properties"/>
-    <ds:schemaRef ds:uri="http://schemas.microsoft.com/office/infopath/2007/PartnerControls"/>
-    <ds:schemaRef ds:uri="1c364c2e-a9e5-4d0d-8b0c-60f96943b919"/>
-  </ds:schemaRefs>
-</ds:datastoreItem>
-</file>
-
-<file path=customXml/itemProps4.xml><?xml version="1.0" encoding="utf-8"?>
-<ds:datastoreItem xmlns:ds="http://schemas.openxmlformats.org/officeDocument/2006/customXml" ds:itemID="{02C867CF-6023-4BBE-9EB8-8D3F09F43338}">
-  <ds:schemaRefs>
-    <ds:schemaRef ds:uri="http://schemas.openxmlformats.org/officeDocument/2006/bibliography"/>
+    <ds:schemaRef ds:uri="http://customooxmlschemas.google.com/"/>
+    <ds:schemaRef ds:uri="http://schemas.openxmlformats.org/officeDocument/2006/relationships"/>
   </ds:schemaRefs>
 </ds:datastoreItem>
 </file>

</xml_diff>

<commit_message>
add cambios a adjudicaciones
</commit_message>
<xml_diff>
--- a/Features/CostsModule/Features/AdjudicacionesFeature/Templates/plantilla_instalacion_con_placeholders.docx
+++ b/Features/CostsModule/Features/AdjudicacionesFeature/Templates/plantilla_instalacion_con_placeholders.docx
@@ -32614,341 +32614,1004 @@
         <w:t>{{FECHA_FIRMA_DEL_CONTRATO}}</w:t>
       </w:r>
     </w:p>
-    <w:p>
-      <w:pPr>
-        <w:ind w:left="0" w:firstLine="0"/>
-        <w:jc w:val="both"/>
-        <w:rPr>
-          <w:rFonts w:ascii="Arial Narrow" w:eastAsia="Arial Narrow" w:hAnsi="Arial Narrow" w:cs="Arial Narrow"/>
-          <w:b/>
-        </w:rPr>
-      </w:pPr>
-      <w:r>
-        <w:rPr>
-          <w:rFonts w:ascii="Arial Narrow" w:eastAsia="Arial Narrow" w:hAnsi="Arial Narrow" w:cs="Arial Narrow"/>
-          <w:sz w:val="18"/>
-          <w:szCs w:val="18"/>
-          <w:lang w:val="es-ES"/>
-        </w:rPr>
-        <w:t>.</w:t>
-      </w:r>
-    </w:p>
-    <w:p>
-      <w:pPr>
-        <w:ind w:left="0" w:firstLine="0"/>
-        <w:rPr>
-          <w:rFonts w:ascii="Arial Narrow" w:eastAsia="Arial Narrow" w:hAnsi="Arial Narrow" w:cs="Arial Narrow"/>
-          <w:b/>
-        </w:rPr>
-      </w:pPr>
-    </w:p>
-    <w:p>
-      <w:pPr>
-        <w:ind w:left="0" w:firstLine="0"/>
-        <w:rPr>
-          <w:rFonts w:ascii="Arial Narrow" w:eastAsia="Arial Narrow" w:hAnsi="Arial Narrow" w:cs="Arial Narrow"/>
-          <w:b/>
-        </w:rPr>
-      </w:pPr>
-    </w:p>
-    <w:p>
-      <w:pPr>
-        <w:ind w:left="0" w:firstLine="0"/>
-        <w:rPr>
-          <w:rFonts w:ascii="Arial Narrow" w:eastAsia="Arial Narrow" w:hAnsi="Arial Narrow" w:cs="Arial Narrow"/>
-          <w:b/>
-        </w:rPr>
-      </w:pPr>
-    </w:p>
-    <w:p>
-      <w:pPr>
-        <w:ind w:left="0" w:firstLine="0"/>
-        <w:rPr>
-          <w:rFonts w:ascii="Arial Narrow" w:eastAsia="Arial Narrow" w:hAnsi="Arial Narrow" w:cs="Arial Narrow"/>
-          <w:b/>
-        </w:rPr>
-      </w:pPr>
-    </w:p>
-    <w:p>
-      <w:pPr>
-        <w:ind w:left="0" w:firstLine="0"/>
-        <w:rPr>
-          <w:rFonts w:ascii="Arial Narrow" w:eastAsia="Arial Narrow" w:hAnsi="Arial Narrow" w:cs="Arial Narrow"/>
-          <w:b/>
-        </w:rPr>
-      </w:pPr>
-    </w:p>
-    <w:p>
-      <w:pPr>
-        <w:ind w:left="0" w:firstLine="0"/>
-        <w:rPr>
-          <w:rFonts w:ascii="Arial Narrow" w:eastAsia="Arial Narrow" w:hAnsi="Arial Narrow" w:cs="Arial Narrow"/>
-          <w:b/>
-        </w:rPr>
-      </w:pPr>
-    </w:p>
-    <w:p>
-      <w:pPr>
-        <w:ind w:left="0" w:firstLine="0"/>
-        <w:rPr>
-          <w:rFonts w:ascii="Arial Narrow" w:eastAsia="Arial Narrow" w:hAnsi="Arial Narrow" w:cs="Arial Narrow"/>
-          <w:b/>
-        </w:rPr>
-      </w:pPr>
-    </w:p>
-    <w:p>
-      <w:pPr>
-        <w:ind w:left="0" w:firstLine="0"/>
-        <w:rPr>
-          <w:rFonts w:ascii="Arial Narrow" w:eastAsia="Arial Narrow" w:hAnsi="Arial Narrow" w:cs="Arial Narrow"/>
-          <w:b/>
-        </w:rPr>
-      </w:pPr>
-    </w:p>
-    <w:p>
-      <w:pPr>
-        <w:ind w:left="0" w:firstLine="0"/>
-        <w:rPr>
-          <w:rFonts w:ascii="Arial Narrow" w:eastAsia="Arial Narrow" w:hAnsi="Arial Narrow" w:cs="Arial Narrow"/>
-          <w:b/>
-        </w:rPr>
-      </w:pPr>
-      <w:r>
-        <w:rPr>
-          <w:rFonts w:ascii="Arial Narrow" w:eastAsia="Arial Narrow" w:hAnsi="Arial Narrow" w:cs="Arial Narrow"/>
-          <w:b/>
-        </w:rPr>
-        <w:tab/>
-      </w:r>
-      <w:r>
-        <w:rPr>
-          <w:rFonts w:ascii="Arial Narrow" w:eastAsia="Arial Narrow" w:hAnsi="Arial Narrow" w:cs="Arial Narrow"/>
-          <w:b/>
-        </w:rPr>
-        <w:t>____________________________</w:t>
-      </w:r>
-      <w:r>
-        <w:rPr>
-          <w:rFonts w:ascii="Arial Narrow" w:eastAsia="Arial Narrow" w:hAnsi="Arial Narrow" w:cs="Arial Narrow"/>
-          <w:b/>
-        </w:rPr>
-        <w:t>___</w:t>
-      </w:r>
-      <w:r>
-        <w:rPr>
-          <w:rFonts w:ascii="Arial Narrow" w:eastAsia="Arial Narrow" w:hAnsi="Arial Narrow" w:cs="Arial Narrow"/>
-          <w:b/>
-        </w:rPr>
-        <w:tab/>
-      </w:r>
-      <w:r>
-        <w:rPr>
-          <w:rFonts w:ascii="Arial Narrow" w:eastAsia="Arial Narrow" w:hAnsi="Arial Narrow" w:cs="Arial Narrow"/>
-          <w:b/>
-        </w:rPr>
-        <w:tab/>
-      </w:r>
-      <w:r>
-        <w:rPr>
-          <w:rFonts w:ascii="Arial Narrow" w:eastAsia="Arial Narrow" w:hAnsi="Arial Narrow" w:cs="Arial Narrow"/>
-          <w:b/>
-        </w:rPr>
-        <w:tab/>
-      </w:r>
-      <w:r>
-        <w:rPr>
-          <w:rFonts w:ascii="Arial Narrow" w:eastAsia="Arial Narrow" w:hAnsi="Arial Narrow" w:cs="Arial Narrow"/>
-          <w:b/>
-        </w:rPr>
-        <w:t>_____________________________</w:t>
-      </w:r>
-      <w:r>
-        <w:rPr>
-          <w:rFonts w:ascii="Arial Narrow" w:eastAsia="Arial Narrow" w:hAnsi="Arial Narrow" w:cs="Arial Narrow"/>
-          <w:b/>
-        </w:rPr>
-        <w:t>_</w:t>
-      </w:r>
-    </w:p>
-    <w:p>
-      <w:pPr>
-        <w:ind w:left="720" w:firstLine="1440"/>
-        <w:rPr>
-          <w:rFonts w:ascii="Arial Narrow" w:eastAsia="Arial Narrow" w:hAnsi="Arial Narrow" w:cs="Arial Narrow"/>
-          <w:b/>
-        </w:rPr>
-      </w:pPr>
-      <w:r>
-        <w:rPr>
-          <w:noProof/>
-          <w:sz w:val="18"/>
-          <w:szCs w:val="18"/>
-        </w:rPr>
-        <mc:AlternateContent>
-          <mc:Choice Requires="wps">
-            <w:drawing>
-              <wp:anchor distT="0" distB="0" distL="114300" distR="114300" simplePos="0" relativeHeight="251658240" behindDoc="0" locked="0" layoutInCell="1" hidden="0" allowOverlap="1" wp14:anchorId="20A22524" wp14:editId="20A22525">
-                <wp:simplePos x="0" y="0"/>
-                <wp:positionH relativeFrom="column">
-                  <wp:posOffset>139700</wp:posOffset>
-                </wp:positionH>
-                <wp:positionV relativeFrom="paragraph">
-                  <wp:posOffset>76200</wp:posOffset>
-                </wp:positionV>
-                <wp:extent cx="0" cy="12700"/>
-                <wp:effectExtent l="0" t="0" r="0" b="0"/>
-                <wp:wrapNone/>
-                <wp:docPr id="6" name="Conector recto de flecha 6"/>
-                <wp:cNvGraphicFramePr/>
-                <a:graphic xmlns:a="http://schemas.openxmlformats.org/drawingml/2006/main">
-                  <a:graphicData uri="http://schemas.microsoft.com/office/word/2010/wordprocessingShape">
-                    <wps:wsp>
-                      <wps:cNvCnPr/>
-                      <wps:spPr>
-                        <a:xfrm>
-                          <a:off x="4045838" y="3780000"/>
-                          <a:ext cx="2600325" cy="0"/>
-                        </a:xfrm>
-                        <a:prstGeom prst="straightConnector1">
-                          <a:avLst/>
-                        </a:prstGeom>
-                        <a:noFill/>
-                        <a:ln w="9525" cap="flat" cmpd="sng">
-                          <a:solidFill>
-                            <a:srgbClr val="000000"/>
-                          </a:solidFill>
-                          <a:prstDash val="solid"/>
-                          <a:round/>
-                          <a:headEnd type="none" w="sm" len="sm"/>
-                          <a:tailEnd type="none" w="sm" len="sm"/>
-                        </a:ln>
-                      </wps:spPr>
-                      <wps:bodyPr/>
-                    </wps:wsp>
-                  </a:graphicData>
-                </a:graphic>
-              </wp:anchor>
-            </w:drawing>
-          </mc:Choice>
-          <mc:Fallback>
-            <w:pict>
-              <v:shapetype w14:anchorId="4C5B765C" id="_x0000_t32" coordsize="21600,21600" o:spt="32" o:oned="t" path="m,l21600,21600e" filled="f">
-                <v:path arrowok="t" fillok="f" o:connecttype="none"/>
-                <o:lock v:ext="edit" shapetype="t"/>
-              </v:shapetype>
-              <v:shape id="Conector recto de flecha 6" o:spid="_x0000_s1026" type="#_x0000_t32" style="position:absolute;margin-left:11pt;margin-top:6pt;width:0;height:1pt;z-index:251658240;visibility:visible;mso-wrap-style:square;mso-wrap-distance-left:9pt;mso-wrap-distance-top:0;mso-wrap-distance-right:9pt;mso-wrap-distance-bottom:0;mso-position-horizontal:absolute;mso-position-horizontal-relative:text;mso-position-vertical:absolute;mso-position-vertical-relative:text" o:gfxdata="UEsDBBQABgAIAAAAIQC2gziS/gAAAOEBAAATAAAAW0NvbnRlbnRfVHlwZXNdLnhtbJSRQU7DMBBF 90jcwfIWJU67QAgl6YK0S0CoHGBkTxKLZGx5TGhvj5O2G0SRWNoz/78nu9wcxkFMGNg6quQqL6RA 0s5Y6ir5vt9lD1JwBDIwOMJKHpHlpr69KfdHjyxSmriSfYz+USnWPY7AufNIadK6MEJMx9ApD/oD OlTrorhX2lFEilmcO2RdNtjC5xDF9pCuTyYBB5bi6bQ4syoJ3g9WQ0ymaiLzg5KdCXlKLjvcW893 SUOqXwnz5DrgnHtJTxOsQfEKIT7DmDSUCaxw7Rqn8787ZsmRM9e2VmPeBN4uqYvTtW7jvijg9N/y JsXecLq0q+WD6m8AAAD//wMAUEsDBBQABgAIAAAAIQA4/SH/1gAAAJQBAAALAAAAX3JlbHMvLnJl bHOkkMFqwzAMhu+DvYPRfXGawxijTi+j0GvpHsDYimMaW0Yy2fr2M4PBMnrbUb/Q94l/f/hMi1qR JVI2sOt6UJgd+ZiDgffL8ekFlFSbvV0oo4EbChzGx4f9GRdb25HMsYhqlCwG5lrLq9biZkxWOiqY 22YiTra2kYMu1l1tQD30/bPm3wwYN0x18gb45AdQl1tp5j/sFB2T0FQ7R0nTNEV3j6o9feQzro1i OWA14Fm+Q8a1a8+Bvu/d/dMb2JY5uiPbhG/ktn4cqGU/er3pcvwCAAD//wMAUEsDBBQABgAIAAAA IQCm0FeoyQEAAIkDAAAOAAAAZHJzL2Uyb0RvYy54bWysU8luGzEMvRfoPwi61zO249QdeJyD3fRS tAHafoCsZUaANpCKx/77UnIadzkECKoDhxLJx8dlNncn79hRA9oYej6ftZzpIKOyYej5j+/379ac YRZBCReD7vlZI7/bvn2zmVKnF3GMTmlgBBKwm1LPx5xT1zQoR+0FzmLSgYwmgheZrjA0CsRE6N41 i7a9baYIKkGUGpFe9xcj31Z8Y7TMX41BnZnrOXHLVUKVhyKb7UZ0A4g0WvlEQ7yChRc2UNJnqL3I gj2C/QfKWwkRo8kzGX0TjbFS1xqomnn7VzXfRpF0rYWag+m5Tfj/YOWX4y48ALVhSthheoBSxcmA L1/ix049v2lvVuslTfLc8+X7dUvn0jh9ykySw+K2bZeLFWeSPKqtuYIkwPxJR8+K0nPMIOww5l0M gcYTYV4bJ46fMRMNCvwVUBiEeG+dq1NygU09/7CqeQTtinEiU0qfFKGGocJgdFaVkBKMMBx2DthR lOnXU3hTij/cSr69wPHiV02X8iA+BlVzj1qoj0GxfE60xIFWmRcy6DlzmhaflOqXhXUv+xEBF4jH teVFO0R1rpOo7zTvyvRpN8tC/X6v0dc/aPsTAAD//wMAUEsDBBQABgAIAAAAIQB4Abwu2AAAAAcB AAAPAAAAZHJzL2Rvd25yZXYueG1sTI/NTsQwDITvSLxDZCRubEoFCJWmKwSCCxKCBe7extsGGqfb pD+8PV4ucLLGY42/KdeL79REQ3SBDZyvMlDEdbCOGwPvbw9n16BiQrbYBSYD3xRhXR0flVjYMPMr TZvUKAnhWKCBNqW+0DrWLXmMq9ATi7cLg8ckcmi0HXCWcN/pPMuutEfH8qHFnu5aqr82ozfgXfMx 7t3z7vLzfn5MTy84zX5vzOnJcnsDKtGS/o7hgC/oUAnTNoxso+oM5LlUSbI/TPF/9Vb0RQa6KvV/ /uoHAAD//wMAUEsBAi0AFAAGAAgAAAAhALaDOJL+AAAA4QEAABMAAAAAAAAAAAAAAAAAAAAAAFtD b250ZW50X1R5cGVzXS54bWxQSwECLQAUAAYACAAAACEAOP0h/9YAAACUAQAACwAAAAAAAAAAAAAA AAAvAQAAX3JlbHMvLnJlbHNQSwECLQAUAAYACAAAACEAptBXqMkBAACJAwAADgAAAAAAAAAAAAAA AAAuAgAAZHJzL2Uyb0RvYy54bWxQSwECLQAUAAYACAAAACEAeAG8LtgAAAAHAQAADwAAAAAAAAAA AAAAAAAjBAAAZHJzL2Rvd25yZXYueG1sUEsFBgAAAAAEAAQA8wAAACgFAAAAAA== ">
-                <v:stroke startarrowwidth="narrow" startarrowlength="short" endarrowwidth="narrow" endarrowlength="short"/>
-              </v:shape>
-            </w:pict>
-          </mc:Fallback>
-        </mc:AlternateContent>
-      </w:r>
-      <w:r>
-        <w:rPr>
-          <w:noProof/>
-          <w:sz w:val="18"/>
-          <w:szCs w:val="18"/>
-        </w:rPr>
-        <mc:AlternateContent>
-          <mc:Choice Requires="wps">
-            <w:drawing>
-              <wp:anchor distT="0" distB="0" distL="114300" distR="114300" simplePos="0" relativeHeight="251658241" behindDoc="0" locked="0" layoutInCell="1" hidden="0" allowOverlap="1" wp14:anchorId="20A22526" wp14:editId="20A22527">
-                <wp:simplePos x="0" y="0"/>
-                <wp:positionH relativeFrom="column">
-                  <wp:posOffset>3035300</wp:posOffset>
-                </wp:positionH>
-                <wp:positionV relativeFrom="paragraph">
-                  <wp:posOffset>63500</wp:posOffset>
-                </wp:positionV>
-                <wp:extent cx="0" cy="12700"/>
-                <wp:effectExtent l="0" t="0" r="0" b="0"/>
-                <wp:wrapNone/>
-                <wp:docPr id="5" name="Conector recto de flecha 5"/>
-                <wp:cNvGraphicFramePr/>
-                <a:graphic xmlns:a="http://schemas.openxmlformats.org/drawingml/2006/main">
-                  <a:graphicData uri="http://schemas.microsoft.com/office/word/2010/wordprocessingShape">
-                    <wps:wsp>
-                      <wps:cNvCnPr/>
-                      <wps:spPr>
-                        <a:xfrm>
-                          <a:off x="3998213" y="3780000"/>
-                          <a:ext cx="2695575" cy="0"/>
-                        </a:xfrm>
-                        <a:prstGeom prst="straightConnector1">
-                          <a:avLst/>
-                        </a:prstGeom>
-                        <a:noFill/>
-                        <a:ln w="9525" cap="flat" cmpd="sng">
-                          <a:solidFill>
-                            <a:srgbClr val="000000"/>
-                          </a:solidFill>
-                          <a:prstDash val="solid"/>
-                          <a:round/>
-                          <a:headEnd type="none" w="sm" len="sm"/>
-                          <a:tailEnd type="none" w="sm" len="sm"/>
-                        </a:ln>
-                      </wps:spPr>
-                      <wps:bodyPr/>
-                    </wps:wsp>
-                  </a:graphicData>
-                </a:graphic>
-              </wp:anchor>
-            </w:drawing>
-          </mc:Choice>
-          <mc:Fallback>
-            <w:pict>
-              <v:shape w14:anchorId="6BC1C2BA" id="Conector recto de flecha 5" o:spid="_x0000_s1026" type="#_x0000_t32" style="position:absolute;margin-left:239pt;margin-top:5pt;width:0;height:1pt;z-index:251658241;visibility:visible;mso-wrap-style:square;mso-wrap-distance-left:9pt;mso-wrap-distance-top:0;mso-wrap-distance-right:9pt;mso-wrap-distance-bottom:0;mso-position-horizontal:absolute;mso-position-horizontal-relative:text;mso-position-vertical:absolute;mso-position-vertical-relative:text" o:gfxdata="UEsDBBQABgAIAAAAIQC2gziS/gAAAOEBAAATAAAAW0NvbnRlbnRfVHlwZXNdLnhtbJSRQU7DMBBF 90jcwfIWJU67QAgl6YK0S0CoHGBkTxKLZGx5TGhvj5O2G0SRWNoz/78nu9wcxkFMGNg6quQqL6RA 0s5Y6ir5vt9lD1JwBDIwOMJKHpHlpr69KfdHjyxSmriSfYz+USnWPY7AufNIadK6MEJMx9ApD/oD OlTrorhX2lFEilmcO2RdNtjC5xDF9pCuTyYBB5bi6bQ4syoJ3g9WQ0ymaiLzg5KdCXlKLjvcW893 SUOqXwnz5DrgnHtJTxOsQfEKIT7DmDSUCaxw7Rqn8787ZsmRM9e2VmPeBN4uqYvTtW7jvijg9N/y JsXecLq0q+WD6m8AAAD//wMAUEsDBBQABgAIAAAAIQA4/SH/1gAAAJQBAAALAAAAX3JlbHMvLnJl bHOkkMFqwzAMhu+DvYPRfXGawxijTi+j0GvpHsDYimMaW0Yy2fr2M4PBMnrbUb/Q94l/f/hMi1qR JVI2sOt6UJgd+ZiDgffL8ekFlFSbvV0oo4EbChzGx4f9GRdb25HMsYhqlCwG5lrLq9biZkxWOiqY 22YiTra2kYMu1l1tQD30/bPm3wwYN0x18gb45AdQl1tp5j/sFB2T0FQ7R0nTNEV3j6o9feQzro1i OWA14Fm+Q8a1a8+Bvu/d/dMb2JY5uiPbhG/ktn4cqGU/er3pcvwCAAD//wMAUEsDBBQABgAIAAAA IQCDHUlnygEAAIkDAAAOAAAAZHJzL2Uyb0RvYy54bWysU0tv2zAMvg/YfxB0X+y4SJsEcXpI1l2G rcC2H8DoYQvQC6IaJ/9+lNI13XYYMFQHmhLJjx8f3tyfnGVHldAE3/P5rOVMeRGk8UPPf3x/+LDk DDN4CTZ41fOzQn6/ff9uM8W16sIYrFSJEYjH9RR7PuYc102DYlQOcBai8mTUITnIdE1DIxNMhO5s 07XtbTOFJGMKQiHS6/5i5NuKr7US+avWqDKzPSduucpU5aHIZruB9ZAgjkY804D/YOHAeEr6ArWH DOwpmb+gnBEpYNB5JoJrgtZGqFoDVTNv/6jm2whR1VqoORhf2oRvByu+HHf+MVEbpohrjI+pVHHS yZUv8WOnnt+sVstufsPZmfS7ZUvn0jh1ykyQQ3e7WizuFpwJ8qi25goSE+ZPKjhWlJ5jTmCGMe+C 9zSekOa1cXD8jJloUOCvgMLAhwdjbZ2S9Wzq+WrRlTxAu6ItZFJdlITqhwqDwRpZQkowpuGws4kd oUy/nsKbUvzmVvLtAceLXzVdykvhycuae1QgP3rJ8jnSEntaZV7IoOPMKlp8UqpfBmP/7UcErCce 15YX7RDkuU6ivtO8K9Pn3SwL9fpeo69/0PYnAAAA//8DAFBLAwQUAAYACAAAACEAc4PyItoAAAAJ AQAADwAAAGRycy9kb3ducmV2LnhtbExPy07DMBC8I/EP1iJxozYVjyrEqRAILkiIFrhvk21iiNdp 7Dz4exZxgNNqHpqdydezb9VIfXSBLZwvDCjiMlSOawtvrw9nK1AxIVfYBiYLXxRhXRwf5ZhVYeIN jdtUKwnhmKGFJqUu0zqWDXmMi9ARi7YPvccksK911eMk4b7VS2OutEfH8qHBju4aKj+3g7fgXf0+ HNzz/vLjfnpMTy84Tv5g7enJfHsDKtGc/szwU1+qQyGddmHgKqrWwsX1SrYkEYxcMfwSOyGWBnSR 6/8Lim8AAAD//wMAUEsBAi0AFAAGAAgAAAAhALaDOJL+AAAA4QEAABMAAAAAAAAAAAAAAAAAAAAA AFtDb250ZW50X1R5cGVzXS54bWxQSwECLQAUAAYACAAAACEAOP0h/9YAAACUAQAACwAAAAAAAAAA AAAAAAAvAQAAX3JlbHMvLnJlbHNQSwECLQAUAAYACAAAACEAgx1JZ8oBAACJAwAADgAAAAAAAAAA AAAAAAAuAgAAZHJzL2Uyb0RvYy54bWxQSwECLQAUAAYACAAAACEAc4PyItoAAAAJAQAADwAAAAAA AAAAAAAAAAAkBAAAZHJzL2Rvd25yZXYueG1sUEsFBgAAAAAEAAQA8wAAACsFAAAAAA== ">
-                <v:stroke startarrowwidth="narrow" startarrowlength="short" endarrowwidth="narrow" endarrowlength="short"/>
-              </v:shape>
-            </w:pict>
-          </mc:Fallback>
-        </mc:AlternateContent>
-      </w:r>
-      <w:r>
-        <w:rPr>
-          <w:rFonts w:ascii="Arial Narrow" w:eastAsia="Arial Narrow" w:hAnsi="Arial Narrow" w:cs="Arial Narrow"/>
-          <w:b/>
-          <w:bCs/>
-        </w:rPr>
-        <w:t>EL CONTRATANTE</w:t>
-      </w:r>
-      <w:r>
-        <w:rPr>
-          <w:rFonts w:ascii="Arial Narrow" w:eastAsia="Arial Narrow" w:hAnsi="Arial Narrow" w:cs="Arial Narrow"/>
-          <w:b/>
-        </w:rPr>
-        <w:tab/>
-      </w:r>
-      <w:r>
-        <w:rPr>
-          <w:rFonts w:ascii="Arial Narrow" w:eastAsia="Arial Narrow" w:hAnsi="Arial Narrow" w:cs="Arial Narrow"/>
-          <w:b/>
-        </w:rPr>
-        <w:tab/>
-      </w:r>
-      <w:r>
-        <w:rPr>
-          <w:rFonts w:ascii="Arial Narrow" w:eastAsia="Arial Narrow" w:hAnsi="Arial Narrow" w:cs="Arial Narrow"/>
-          <w:b/>
-        </w:rPr>
-        <w:tab/>
-      </w:r>
-      <w:r>
-        <w:rPr>
-          <w:rFonts w:ascii="Arial Narrow" w:eastAsia="Arial Narrow" w:hAnsi="Arial Narrow" w:cs="Arial Narrow"/>
-          <w:b/>
-        </w:rPr>
-        <w:tab/>
-      </w:r>
-      <w:r>
-        <w:rPr>
-          <w:rFonts w:ascii="Arial Narrow" w:eastAsia="Arial Narrow" w:hAnsi="Arial Narrow" w:cs="Arial Narrow"/>
-          <w:b/>
-          <w:bCs/>
-        </w:rPr>
-        <w:t>EL CONTRATISTA</w:t>
-      </w:r>
-    </w:p>
+    <w:tbl>
+      <w:tblPr>
+        <w:tblStyle w:val="Tablaconcuadrcula"/>
+        <w:tblW w:w="5000" w:type="pct"/>
+        <w:jc w:val="center"/>
+        <w:tblLook w:val="04A0" w:firstRow="1" w:lastRow="0" w:firstColumn="1" w:lastColumn="0" w:noHBand="0" w:noVBand="1"/>
+      </w:tblPr>
+      <w:tblGrid>
+        <w:gridCol w:w="3830"/>
+        <w:gridCol w:w="1949"/>
+        <w:gridCol w:w="3859"/>
+      </w:tblGrid>
+      <w:tr>
+        <w:trPr>
+          <w:jc w:val="center"/>
+        </w:trPr>
+        <w:tc>
+          <w:tcPr>
+            <w:tcW w:w="1987" w:type="pct"/>
+            <w:tcBorders>
+              <w:top w:val="nil"/>
+              <w:left w:val="nil"/>
+              <w:bottom w:val="nil"/>
+              <w:right w:val="nil"/>
+            </w:tcBorders>
+          </w:tcPr>
+          <w:p>
+            <w:pPr>
+              <w:keepNext/>
+              <w:keepLines/>
+              <w:tabs>
+                <w:tab w:val="clear" w:pos="1440"/>
+              </w:tabs>
+              <w:ind w:left="0" w:firstLine="0"/>
+              <w:rPr>
+                <w:rFonts w:ascii="Arial Narrow" w:hAnsi="Arial Narrow"/>
+                <w:b/>
+                <w:sz w:val="22"/>
+                <w:szCs w:val="22"/>
+              </w:rPr>
+            </w:pPr>
+          </w:p>
+        </w:tc>
+        <w:tc>
+          <w:tcPr>
+            <w:tcW w:w="1011" w:type="pct"/>
+            <w:tcBorders>
+              <w:top w:val="nil"/>
+              <w:left w:val="nil"/>
+              <w:bottom w:val="nil"/>
+              <w:right w:val="nil"/>
+            </w:tcBorders>
+          </w:tcPr>
+          <w:p>
+            <w:pPr>
+              <w:keepNext/>
+              <w:keepLines/>
+              <w:tabs>
+                <w:tab w:val="clear" w:pos="1440"/>
+              </w:tabs>
+              <w:ind w:left="0" w:firstLine="0"/>
+              <w:rPr>
+                <w:rFonts w:ascii="Arial Narrow" w:hAnsi="Arial Narrow"/>
+                <w:b/>
+                <w:sz w:val="22"/>
+                <w:szCs w:val="22"/>
+              </w:rPr>
+            </w:pPr>
+          </w:p>
+        </w:tc>
+        <w:tc>
+          <w:tcPr>
+            <w:tcW w:w="2002" w:type="pct"/>
+            <w:tcBorders>
+              <w:top w:val="nil"/>
+              <w:left w:val="nil"/>
+              <w:bottom w:val="nil"/>
+              <w:right w:val="nil"/>
+            </w:tcBorders>
+          </w:tcPr>
+          <w:p>
+            <w:pPr>
+              <w:keepNext/>
+              <w:keepLines/>
+              <w:tabs>
+                <w:tab w:val="clear" w:pos="1440"/>
+              </w:tabs>
+              <w:ind w:left="0" w:firstLine="0"/>
+              <w:rPr>
+                <w:rFonts w:ascii="Arial Narrow" w:hAnsi="Arial Narrow"/>
+                <w:b/>
+                <w:sz w:val="22"/>
+                <w:szCs w:val="22"/>
+              </w:rPr>
+            </w:pPr>
+          </w:p>
+        </w:tc>
+      </w:tr>
+      <w:tr>
+        <w:trPr>
+          <w:jc w:val="center"/>
+        </w:trPr>
+        <w:tc>
+          <w:tcPr>
+            <w:tcW w:w="1987" w:type="pct"/>
+            <w:tcBorders>
+              <w:top w:val="nil"/>
+              <w:left w:val="nil"/>
+              <w:bottom w:val="nil"/>
+              <w:right w:val="nil"/>
+            </w:tcBorders>
+          </w:tcPr>
+          <w:p>
+            <w:pPr>
+              <w:keepNext/>
+              <w:keepLines/>
+              <w:tabs>
+                <w:tab w:val="clear" w:pos="1440"/>
+              </w:tabs>
+              <w:ind w:left="0" w:firstLine="0"/>
+              <w:rPr>
+                <w:rFonts w:ascii="Arial Narrow" w:hAnsi="Arial Narrow"/>
+                <w:b/>
+                <w:sz w:val="22"/>
+                <w:szCs w:val="22"/>
+              </w:rPr>
+            </w:pPr>
+          </w:p>
+        </w:tc>
+        <w:tc>
+          <w:tcPr>
+            <w:tcW w:w="1011" w:type="pct"/>
+            <w:tcBorders>
+              <w:top w:val="nil"/>
+              <w:left w:val="nil"/>
+              <w:bottom w:val="nil"/>
+              <w:right w:val="nil"/>
+            </w:tcBorders>
+          </w:tcPr>
+          <w:p>
+            <w:pPr>
+              <w:keepNext/>
+              <w:keepLines/>
+              <w:tabs>
+                <w:tab w:val="clear" w:pos="1440"/>
+              </w:tabs>
+              <w:ind w:left="0" w:firstLine="0"/>
+              <w:rPr>
+                <w:rFonts w:ascii="Arial Narrow" w:hAnsi="Arial Narrow"/>
+                <w:b/>
+                <w:sz w:val="22"/>
+                <w:szCs w:val="22"/>
+              </w:rPr>
+            </w:pPr>
+          </w:p>
+        </w:tc>
+        <w:tc>
+          <w:tcPr>
+            <w:tcW w:w="2002" w:type="pct"/>
+            <w:tcBorders>
+              <w:top w:val="nil"/>
+              <w:left w:val="nil"/>
+              <w:bottom w:val="nil"/>
+              <w:right w:val="nil"/>
+            </w:tcBorders>
+          </w:tcPr>
+          <w:p>
+            <w:pPr>
+              <w:keepNext/>
+              <w:keepLines/>
+              <w:tabs>
+                <w:tab w:val="clear" w:pos="1440"/>
+              </w:tabs>
+              <w:ind w:left="0" w:firstLine="0"/>
+              <w:rPr>
+                <w:rFonts w:ascii="Arial Narrow" w:hAnsi="Arial Narrow"/>
+                <w:b/>
+                <w:sz w:val="22"/>
+                <w:szCs w:val="22"/>
+              </w:rPr>
+            </w:pPr>
+          </w:p>
+        </w:tc>
+      </w:tr>
+      <w:tr>
+        <w:trPr>
+          <w:jc w:val="center"/>
+        </w:trPr>
+        <w:tc>
+          <w:tcPr>
+            <w:tcW w:w="1987" w:type="pct"/>
+            <w:tcBorders>
+              <w:top w:val="nil"/>
+              <w:left w:val="nil"/>
+              <w:bottom w:val="nil"/>
+              <w:right w:val="nil"/>
+            </w:tcBorders>
+          </w:tcPr>
+          <w:p>
+            <w:pPr>
+              <w:keepNext/>
+              <w:keepLines/>
+              <w:tabs>
+                <w:tab w:val="clear" w:pos="1440"/>
+              </w:tabs>
+              <w:ind w:left="0" w:firstLine="0"/>
+              <w:rPr>
+                <w:rFonts w:ascii="Arial Narrow" w:hAnsi="Arial Narrow"/>
+                <w:b/>
+                <w:sz w:val="22"/>
+                <w:szCs w:val="22"/>
+              </w:rPr>
+            </w:pPr>
+          </w:p>
+        </w:tc>
+        <w:tc>
+          <w:tcPr>
+            <w:tcW w:w="1011" w:type="pct"/>
+            <w:tcBorders>
+              <w:top w:val="nil"/>
+              <w:left w:val="nil"/>
+              <w:bottom w:val="nil"/>
+              <w:right w:val="nil"/>
+            </w:tcBorders>
+          </w:tcPr>
+          <w:p>
+            <w:pPr>
+              <w:keepNext/>
+              <w:keepLines/>
+              <w:tabs>
+                <w:tab w:val="clear" w:pos="1440"/>
+              </w:tabs>
+              <w:ind w:left="0" w:firstLine="0"/>
+              <w:rPr>
+                <w:rFonts w:ascii="Arial Narrow" w:hAnsi="Arial Narrow"/>
+                <w:b/>
+                <w:sz w:val="22"/>
+                <w:szCs w:val="22"/>
+              </w:rPr>
+            </w:pPr>
+          </w:p>
+        </w:tc>
+        <w:tc>
+          <w:tcPr>
+            <w:tcW w:w="2002" w:type="pct"/>
+            <w:tcBorders>
+              <w:top w:val="nil"/>
+              <w:left w:val="nil"/>
+              <w:bottom w:val="nil"/>
+              <w:right w:val="nil"/>
+            </w:tcBorders>
+          </w:tcPr>
+          <w:p>
+            <w:pPr>
+              <w:keepNext/>
+              <w:keepLines/>
+              <w:tabs>
+                <w:tab w:val="clear" w:pos="1440"/>
+              </w:tabs>
+              <w:ind w:left="0" w:firstLine="0"/>
+              <w:rPr>
+                <w:rFonts w:ascii="Arial Narrow" w:hAnsi="Arial Narrow"/>
+                <w:b/>
+                <w:sz w:val="22"/>
+                <w:szCs w:val="22"/>
+              </w:rPr>
+            </w:pPr>
+          </w:p>
+        </w:tc>
+      </w:tr>
+      <w:tr>
+        <w:trPr>
+          <w:jc w:val="center"/>
+        </w:trPr>
+        <w:tc>
+          <w:tcPr>
+            <w:tcW w:w="1987" w:type="pct"/>
+            <w:tcBorders>
+              <w:top w:val="nil"/>
+              <w:left w:val="nil"/>
+              <w:bottom w:val="nil"/>
+              <w:right w:val="nil"/>
+            </w:tcBorders>
+          </w:tcPr>
+          <w:p>
+            <w:pPr>
+              <w:keepNext/>
+              <w:keepLines/>
+              <w:tabs>
+                <w:tab w:val="clear" w:pos="1440"/>
+              </w:tabs>
+              <w:ind w:left="0" w:firstLine="0"/>
+              <w:rPr>
+                <w:rFonts w:ascii="Arial Narrow" w:hAnsi="Arial Narrow"/>
+                <w:b/>
+                <w:sz w:val="22"/>
+                <w:szCs w:val="22"/>
+              </w:rPr>
+            </w:pPr>
+          </w:p>
+        </w:tc>
+        <w:tc>
+          <w:tcPr>
+            <w:tcW w:w="1011" w:type="pct"/>
+            <w:tcBorders>
+              <w:top w:val="nil"/>
+              <w:left w:val="nil"/>
+              <w:bottom w:val="nil"/>
+              <w:right w:val="nil"/>
+            </w:tcBorders>
+          </w:tcPr>
+          <w:p>
+            <w:pPr>
+              <w:keepNext/>
+              <w:keepLines/>
+              <w:tabs>
+                <w:tab w:val="clear" w:pos="1440"/>
+              </w:tabs>
+              <w:ind w:left="0" w:firstLine="0"/>
+              <w:rPr>
+                <w:rFonts w:ascii="Arial Narrow" w:hAnsi="Arial Narrow"/>
+                <w:b/>
+                <w:sz w:val="22"/>
+                <w:szCs w:val="22"/>
+              </w:rPr>
+            </w:pPr>
+          </w:p>
+        </w:tc>
+        <w:tc>
+          <w:tcPr>
+            <w:tcW w:w="2002" w:type="pct"/>
+            <w:tcBorders>
+              <w:top w:val="nil"/>
+              <w:left w:val="nil"/>
+              <w:bottom w:val="nil"/>
+              <w:right w:val="nil"/>
+            </w:tcBorders>
+          </w:tcPr>
+          <w:p>
+            <w:pPr>
+              <w:keepNext/>
+              <w:keepLines/>
+              <w:tabs>
+                <w:tab w:val="clear" w:pos="1440"/>
+              </w:tabs>
+              <w:ind w:left="0" w:firstLine="0"/>
+              <w:rPr>
+                <w:rFonts w:ascii="Arial Narrow" w:hAnsi="Arial Narrow"/>
+                <w:b/>
+                <w:sz w:val="22"/>
+                <w:szCs w:val="22"/>
+              </w:rPr>
+            </w:pPr>
+          </w:p>
+        </w:tc>
+      </w:tr>
+      <w:tr>
+        <w:trPr>
+          <w:jc w:val="center"/>
+        </w:trPr>
+        <w:tc>
+          <w:tcPr>
+            <w:tcW w:w="1987" w:type="pct"/>
+            <w:tcBorders>
+              <w:top w:val="nil"/>
+              <w:left w:val="nil"/>
+              <w:bottom w:val="nil"/>
+              <w:right w:val="nil"/>
+            </w:tcBorders>
+          </w:tcPr>
+          <w:p>
+            <w:pPr>
+              <w:keepNext/>
+              <w:keepLines/>
+              <w:tabs>
+                <w:tab w:val="clear" w:pos="1440"/>
+              </w:tabs>
+              <w:ind w:left="0" w:firstLine="0"/>
+              <w:rPr>
+                <w:rFonts w:ascii="Arial Narrow" w:hAnsi="Arial Narrow"/>
+                <w:b/>
+                <w:sz w:val="22"/>
+                <w:szCs w:val="22"/>
+              </w:rPr>
+            </w:pPr>
+          </w:p>
+        </w:tc>
+        <w:tc>
+          <w:tcPr>
+            <w:tcW w:w="1011" w:type="pct"/>
+            <w:tcBorders>
+              <w:top w:val="nil"/>
+              <w:left w:val="nil"/>
+              <w:bottom w:val="nil"/>
+              <w:right w:val="nil"/>
+            </w:tcBorders>
+          </w:tcPr>
+          <w:p>
+            <w:pPr>
+              <w:keepNext/>
+              <w:keepLines/>
+              <w:tabs>
+                <w:tab w:val="clear" w:pos="1440"/>
+              </w:tabs>
+              <w:ind w:left="0" w:firstLine="0"/>
+              <w:rPr>
+                <w:rFonts w:ascii="Arial Narrow" w:hAnsi="Arial Narrow"/>
+                <w:b/>
+                <w:sz w:val="22"/>
+                <w:szCs w:val="22"/>
+              </w:rPr>
+            </w:pPr>
+          </w:p>
+        </w:tc>
+        <w:tc>
+          <w:tcPr>
+            <w:tcW w:w="2002" w:type="pct"/>
+            <w:tcBorders>
+              <w:top w:val="nil"/>
+              <w:left w:val="nil"/>
+              <w:bottom w:val="nil"/>
+              <w:right w:val="nil"/>
+            </w:tcBorders>
+          </w:tcPr>
+          <w:p>
+            <w:pPr>
+              <w:keepNext/>
+              <w:keepLines/>
+              <w:tabs>
+                <w:tab w:val="clear" w:pos="1440"/>
+              </w:tabs>
+              <w:ind w:left="0" w:firstLine="0"/>
+              <w:rPr>
+                <w:rFonts w:ascii="Arial Narrow" w:hAnsi="Arial Narrow"/>
+                <w:b/>
+                <w:sz w:val="22"/>
+                <w:szCs w:val="22"/>
+              </w:rPr>
+            </w:pPr>
+          </w:p>
+        </w:tc>
+      </w:tr>
+      <w:tr>
+        <w:trPr>
+          <w:jc w:val="center"/>
+        </w:trPr>
+        <w:tc>
+          <w:tcPr>
+            <w:tcW w:w="1987" w:type="pct"/>
+            <w:tcBorders>
+              <w:top w:val="nil"/>
+              <w:left w:val="nil"/>
+              <w:bottom w:val="nil"/>
+              <w:right w:val="nil"/>
+            </w:tcBorders>
+          </w:tcPr>
+          <w:p>
+            <w:pPr>
+              <w:keepNext/>
+              <w:keepLines/>
+              <w:tabs>
+                <w:tab w:val="clear" w:pos="1440"/>
+              </w:tabs>
+              <w:ind w:left="0" w:firstLine="0"/>
+              <w:rPr>
+                <w:rFonts w:ascii="Arial Narrow" w:hAnsi="Arial Narrow"/>
+                <w:b/>
+                <w:sz w:val="22"/>
+                <w:szCs w:val="22"/>
+              </w:rPr>
+            </w:pPr>
+          </w:p>
+        </w:tc>
+        <w:tc>
+          <w:tcPr>
+            <w:tcW w:w="1011" w:type="pct"/>
+            <w:tcBorders>
+              <w:top w:val="nil"/>
+              <w:left w:val="nil"/>
+              <w:bottom w:val="nil"/>
+              <w:right w:val="nil"/>
+            </w:tcBorders>
+          </w:tcPr>
+          <w:p>
+            <w:pPr>
+              <w:keepNext/>
+              <w:keepLines/>
+              <w:tabs>
+                <w:tab w:val="clear" w:pos="1440"/>
+              </w:tabs>
+              <w:ind w:left="0" w:firstLine="0"/>
+              <w:rPr>
+                <w:rFonts w:ascii="Arial Narrow" w:hAnsi="Arial Narrow"/>
+                <w:b/>
+                <w:sz w:val="22"/>
+                <w:szCs w:val="22"/>
+              </w:rPr>
+            </w:pPr>
+          </w:p>
+        </w:tc>
+        <w:tc>
+          <w:tcPr>
+            <w:tcW w:w="2002" w:type="pct"/>
+            <w:tcBorders>
+              <w:top w:val="nil"/>
+              <w:left w:val="nil"/>
+              <w:bottom w:val="nil"/>
+              <w:right w:val="nil"/>
+            </w:tcBorders>
+          </w:tcPr>
+          <w:p>
+            <w:pPr>
+              <w:keepNext/>
+              <w:keepLines/>
+              <w:tabs>
+                <w:tab w:val="clear" w:pos="1440"/>
+              </w:tabs>
+              <w:ind w:left="0" w:firstLine="0"/>
+              <w:rPr>
+                <w:rFonts w:ascii="Arial Narrow" w:hAnsi="Arial Narrow"/>
+                <w:b/>
+                <w:sz w:val="22"/>
+                <w:szCs w:val="22"/>
+              </w:rPr>
+            </w:pPr>
+          </w:p>
+        </w:tc>
+      </w:tr>
+      <w:tr>
+        <w:trPr>
+          <w:jc w:val="center"/>
+        </w:trPr>
+        <w:tc>
+          <w:tcPr>
+            <w:tcW w:w="1987" w:type="pct"/>
+            <w:tcBorders>
+              <w:top w:val="nil"/>
+              <w:left w:val="nil"/>
+              <w:bottom w:val="nil"/>
+              <w:right w:val="nil"/>
+            </w:tcBorders>
+          </w:tcPr>
+          <w:p>
+            <w:pPr>
+              <w:keepNext/>
+              <w:keepLines/>
+              <w:tabs>
+                <w:tab w:val="clear" w:pos="1440"/>
+              </w:tabs>
+              <w:ind w:left="0" w:firstLine="0"/>
+              <w:rPr>
+                <w:rFonts w:ascii="Arial Narrow" w:hAnsi="Arial Narrow"/>
+                <w:b/>
+                <w:sz w:val="22"/>
+                <w:szCs w:val="22"/>
+              </w:rPr>
+            </w:pPr>
+          </w:p>
+        </w:tc>
+        <w:tc>
+          <w:tcPr>
+            <w:tcW w:w="1011" w:type="pct"/>
+            <w:tcBorders>
+              <w:top w:val="nil"/>
+              <w:left w:val="nil"/>
+              <w:bottom w:val="nil"/>
+              <w:right w:val="nil"/>
+            </w:tcBorders>
+          </w:tcPr>
+          <w:p>
+            <w:pPr>
+              <w:keepNext/>
+              <w:keepLines/>
+              <w:tabs>
+                <w:tab w:val="clear" w:pos="1440"/>
+              </w:tabs>
+              <w:ind w:left="0" w:firstLine="0"/>
+              <w:rPr>
+                <w:rFonts w:ascii="Arial Narrow" w:hAnsi="Arial Narrow"/>
+                <w:b/>
+                <w:sz w:val="22"/>
+                <w:szCs w:val="22"/>
+              </w:rPr>
+            </w:pPr>
+          </w:p>
+        </w:tc>
+        <w:tc>
+          <w:tcPr>
+            <w:tcW w:w="2002" w:type="pct"/>
+            <w:tcBorders>
+              <w:top w:val="nil"/>
+              <w:left w:val="nil"/>
+              <w:bottom w:val="nil"/>
+              <w:right w:val="nil"/>
+            </w:tcBorders>
+          </w:tcPr>
+          <w:p>
+            <w:pPr>
+              <w:keepNext/>
+              <w:keepLines/>
+              <w:tabs>
+                <w:tab w:val="clear" w:pos="1440"/>
+              </w:tabs>
+              <w:ind w:left="0" w:firstLine="0"/>
+              <w:rPr>
+                <w:rFonts w:ascii="Arial Narrow" w:hAnsi="Arial Narrow"/>
+                <w:b/>
+                <w:sz w:val="22"/>
+                <w:szCs w:val="22"/>
+              </w:rPr>
+            </w:pPr>
+          </w:p>
+        </w:tc>
+      </w:tr>
+      <w:tr>
+        <w:trPr>
+          <w:jc w:val="center"/>
+        </w:trPr>
+        <w:tc>
+          <w:tcPr>
+            <w:tcW w:w="1987" w:type="pct"/>
+            <w:tcBorders>
+              <w:top w:val="nil"/>
+              <w:left w:val="nil"/>
+              <w:bottom w:val="nil"/>
+              <w:right w:val="nil"/>
+            </w:tcBorders>
+          </w:tcPr>
+          <w:p>
+            <w:pPr>
+              <w:keepNext/>
+              <w:keepLines/>
+              <w:tabs>
+                <w:tab w:val="clear" w:pos="1440"/>
+              </w:tabs>
+              <w:ind w:left="0" w:firstLine="0"/>
+              <w:rPr>
+                <w:rFonts w:ascii="Arial Narrow" w:hAnsi="Arial Narrow"/>
+                <w:b/>
+                <w:sz w:val="22"/>
+                <w:szCs w:val="22"/>
+              </w:rPr>
+            </w:pPr>
+          </w:p>
+        </w:tc>
+        <w:tc>
+          <w:tcPr>
+            <w:tcW w:w="1011" w:type="pct"/>
+            <w:tcBorders>
+              <w:top w:val="nil"/>
+              <w:left w:val="nil"/>
+              <w:bottom w:val="nil"/>
+              <w:right w:val="nil"/>
+            </w:tcBorders>
+          </w:tcPr>
+          <w:p>
+            <w:pPr>
+              <w:keepNext/>
+              <w:keepLines/>
+              <w:tabs>
+                <w:tab w:val="clear" w:pos="1440"/>
+              </w:tabs>
+              <w:ind w:left="0" w:firstLine="0"/>
+              <w:rPr>
+                <w:rFonts w:ascii="Arial Narrow" w:hAnsi="Arial Narrow"/>
+                <w:b/>
+                <w:sz w:val="22"/>
+                <w:szCs w:val="22"/>
+              </w:rPr>
+            </w:pPr>
+          </w:p>
+        </w:tc>
+        <w:tc>
+          <w:tcPr>
+            <w:tcW w:w="2002" w:type="pct"/>
+            <w:tcBorders>
+              <w:top w:val="nil"/>
+              <w:left w:val="nil"/>
+              <w:bottom w:val="nil"/>
+              <w:right w:val="nil"/>
+            </w:tcBorders>
+          </w:tcPr>
+          <w:p>
+            <w:pPr>
+              <w:keepNext/>
+              <w:keepLines/>
+              <w:tabs>
+                <w:tab w:val="clear" w:pos="1440"/>
+              </w:tabs>
+              <w:ind w:left="0" w:firstLine="0"/>
+              <w:rPr>
+                <w:rFonts w:ascii="Arial Narrow" w:hAnsi="Arial Narrow"/>
+                <w:b/>
+                <w:sz w:val="22"/>
+                <w:szCs w:val="22"/>
+              </w:rPr>
+            </w:pPr>
+          </w:p>
+        </w:tc>
+      </w:tr>
+      <w:tr>
+        <w:trPr>
+          <w:jc w:val="center"/>
+        </w:trPr>
+        <w:tc>
+          <w:tcPr>
+            <w:tcW w:w="1987" w:type="pct"/>
+            <w:tcBorders>
+              <w:top w:val="nil"/>
+              <w:left w:val="nil"/>
+              <w:bottom w:val="nil"/>
+              <w:right w:val="nil"/>
+            </w:tcBorders>
+          </w:tcPr>
+          <w:p>
+            <w:pPr>
+              <w:keepNext/>
+              <w:keepLines/>
+              <w:tabs>
+                <w:tab w:val="clear" w:pos="1440"/>
+              </w:tabs>
+              <w:ind w:left="0" w:firstLine="0"/>
+              <w:rPr>
+                <w:rFonts w:ascii="Arial Narrow" w:hAnsi="Arial Narrow"/>
+                <w:b/>
+                <w:sz w:val="22"/>
+                <w:szCs w:val="22"/>
+              </w:rPr>
+            </w:pPr>
+          </w:p>
+        </w:tc>
+        <w:tc>
+          <w:tcPr>
+            <w:tcW w:w="1011" w:type="pct"/>
+            <w:tcBorders>
+              <w:top w:val="nil"/>
+              <w:left w:val="nil"/>
+              <w:bottom w:val="nil"/>
+              <w:right w:val="nil"/>
+            </w:tcBorders>
+          </w:tcPr>
+          <w:p>
+            <w:pPr>
+              <w:keepNext/>
+              <w:keepLines/>
+              <w:tabs>
+                <w:tab w:val="clear" w:pos="1440"/>
+              </w:tabs>
+              <w:ind w:left="0" w:firstLine="0"/>
+              <w:rPr>
+                <w:rFonts w:ascii="Arial Narrow" w:hAnsi="Arial Narrow"/>
+                <w:b/>
+                <w:sz w:val="22"/>
+                <w:szCs w:val="22"/>
+              </w:rPr>
+            </w:pPr>
+          </w:p>
+        </w:tc>
+        <w:tc>
+          <w:tcPr>
+            <w:tcW w:w="2002" w:type="pct"/>
+            <w:tcBorders>
+              <w:top w:val="nil"/>
+              <w:left w:val="nil"/>
+              <w:bottom w:val="nil"/>
+              <w:right w:val="nil"/>
+            </w:tcBorders>
+          </w:tcPr>
+          <w:p>
+            <w:pPr>
+              <w:keepNext/>
+              <w:keepLines/>
+              <w:tabs>
+                <w:tab w:val="clear" w:pos="1440"/>
+              </w:tabs>
+              <w:ind w:left="0" w:firstLine="0"/>
+              <w:rPr>
+                <w:rFonts w:ascii="Arial Narrow" w:hAnsi="Arial Narrow"/>
+                <w:b/>
+                <w:sz w:val="22"/>
+                <w:szCs w:val="22"/>
+              </w:rPr>
+            </w:pPr>
+          </w:p>
+        </w:tc>
+      </w:tr>
+      <w:tr>
+        <w:trPr>
+          <w:jc w:val="center"/>
+        </w:trPr>
+        <w:tc>
+          <w:tcPr>
+            <w:tcW w:w="1987" w:type="pct"/>
+            <w:tcBorders>
+              <w:top w:val="nil"/>
+              <w:left w:val="nil"/>
+              <w:bottom w:val="single" w:sz="4" w:space="0" w:color="auto"/>
+              <w:right w:val="nil"/>
+            </w:tcBorders>
+          </w:tcPr>
+          <w:p>
+            <w:pPr>
+              <w:keepNext/>
+              <w:keepLines/>
+              <w:tabs>
+                <w:tab w:val="clear" w:pos="1440"/>
+              </w:tabs>
+              <w:ind w:left="0" w:firstLine="0"/>
+              <w:rPr>
+                <w:rFonts w:ascii="Arial Narrow" w:hAnsi="Arial Narrow"/>
+                <w:b/>
+                <w:sz w:val="22"/>
+                <w:szCs w:val="22"/>
+              </w:rPr>
+            </w:pPr>
+          </w:p>
+        </w:tc>
+        <w:tc>
+          <w:tcPr>
+            <w:tcW w:w="1011" w:type="pct"/>
+            <w:tcBorders>
+              <w:top w:val="nil"/>
+              <w:left w:val="nil"/>
+              <w:bottom w:val="nil"/>
+              <w:right w:val="nil"/>
+            </w:tcBorders>
+          </w:tcPr>
+          <w:p>
+            <w:pPr>
+              <w:keepNext/>
+              <w:keepLines/>
+              <w:tabs>
+                <w:tab w:val="clear" w:pos="1440"/>
+              </w:tabs>
+              <w:ind w:left="0" w:firstLine="0"/>
+              <w:rPr>
+                <w:rFonts w:ascii="Arial Narrow" w:hAnsi="Arial Narrow"/>
+                <w:b/>
+                <w:sz w:val="22"/>
+                <w:szCs w:val="22"/>
+              </w:rPr>
+            </w:pPr>
+          </w:p>
+        </w:tc>
+        <w:tc>
+          <w:tcPr>
+            <w:tcW w:w="2002" w:type="pct"/>
+            <w:tcBorders>
+              <w:top w:val="nil"/>
+              <w:left w:val="nil"/>
+              <w:bottom w:val="single" w:sz="4" w:space="0" w:color="auto"/>
+              <w:right w:val="nil"/>
+            </w:tcBorders>
+          </w:tcPr>
+          <w:p>
+            <w:pPr>
+              <w:keepNext/>
+              <w:keepLines/>
+              <w:tabs>
+                <w:tab w:val="clear" w:pos="1440"/>
+              </w:tabs>
+              <w:ind w:left="0" w:firstLine="0"/>
+              <w:rPr>
+                <w:rFonts w:ascii="Arial Narrow" w:hAnsi="Arial Narrow"/>
+                <w:b/>
+                <w:sz w:val="22"/>
+                <w:szCs w:val="22"/>
+              </w:rPr>
+            </w:pPr>
+          </w:p>
+        </w:tc>
+      </w:tr>
+      <w:tr>
+        <w:trPr>
+          <w:jc w:val="center"/>
+        </w:trPr>
+        <w:tc>
+          <w:tcPr>
+            <w:tcW w:w="1987" w:type="pct"/>
+            <w:tcBorders>
+              <w:top w:val="single" w:sz="4" w:space="0" w:color="auto"/>
+              <w:left w:val="nil"/>
+              <w:bottom w:val="nil"/>
+              <w:right w:val="nil"/>
+            </w:tcBorders>
+          </w:tcPr>
+          <w:p>
+            <w:pPr>
+              <w:keepNext/>
+              <w:keepLines/>
+              <w:tabs>
+                <w:tab w:val="clear" w:pos="1440"/>
+              </w:tabs>
+              <w:ind w:left="0" w:firstLine="0"/>
+              <w:jc w:val="center"/>
+              <w:rPr>
+                <w:rFonts w:ascii="Arial Narrow" w:hAnsi="Arial Narrow"/>
+                <w:b/>
+                <w:sz w:val="22"/>
+                <w:szCs w:val="22"/>
+              </w:rPr>
+            </w:pPr>
+            <w:r>
+              <w:rPr>
+                <w:rFonts w:ascii="Arial Narrow" w:hAnsi="Arial Narrow"/>
+                <w:b/>
+                <w:sz w:val="22"/>
+                <w:szCs w:val="22"/>
+              </w:rPr>
+              <w:t xml:space="preserve">EL </w:t>
+            </w:r>
+            <w:r>
+              <w:rPr>
+                <w:rFonts w:ascii="Arial Narrow" w:hAnsi="Arial Narrow"/>
+                <w:b/>
+                <w:sz w:val="22"/>
+                <w:szCs w:val="22"/>
+              </w:rPr>
+              <w:t>CONTRATANTE</w:t>
+            </w:r>
+          </w:p>
+        </w:tc>
+        <w:tc>
+          <w:tcPr>
+            <w:tcW w:w="1011" w:type="pct"/>
+            <w:tcBorders>
+              <w:top w:val="nil"/>
+              <w:left w:val="nil"/>
+              <w:bottom w:val="nil"/>
+              <w:right w:val="nil"/>
+            </w:tcBorders>
+          </w:tcPr>
+          <w:p>
+            <w:pPr>
+              <w:keepNext/>
+              <w:keepLines/>
+              <w:tabs>
+                <w:tab w:val="clear" w:pos="1440"/>
+              </w:tabs>
+              <w:ind w:left="0" w:firstLine="0"/>
+              <w:jc w:val="center"/>
+              <w:rPr>
+                <w:rFonts w:ascii="Arial Narrow" w:hAnsi="Arial Narrow"/>
+                <w:b/>
+                <w:sz w:val="22"/>
+                <w:szCs w:val="22"/>
+              </w:rPr>
+            </w:pPr>
+          </w:p>
+        </w:tc>
+        <w:tc>
+          <w:tcPr>
+            <w:tcW w:w="2002" w:type="pct"/>
+            <w:tcBorders>
+              <w:top w:val="single" w:sz="4" w:space="0" w:color="auto"/>
+              <w:left w:val="nil"/>
+              <w:bottom w:val="nil"/>
+              <w:right w:val="nil"/>
+            </w:tcBorders>
+          </w:tcPr>
+          <w:p>
+            <w:pPr>
+              <w:keepNext/>
+              <w:keepLines/>
+              <w:tabs>
+                <w:tab w:val="clear" w:pos="1440"/>
+              </w:tabs>
+              <w:ind w:left="0" w:firstLine="0"/>
+              <w:jc w:val="center"/>
+              <w:rPr>
+                <w:rFonts w:ascii="Arial Narrow" w:hAnsi="Arial Narrow"/>
+                <w:b/>
+                <w:sz w:val="22"/>
+                <w:szCs w:val="22"/>
+              </w:rPr>
+            </w:pPr>
+            <w:r>
+              <w:rPr>
+                <w:rFonts w:ascii="Arial Narrow" w:hAnsi="Arial Narrow"/>
+                <w:b/>
+                <w:sz w:val="22"/>
+                <w:szCs w:val="22"/>
+              </w:rPr>
+              <w:t xml:space="preserve">EL </w:t>
+            </w:r>
+            <w:r>
+              <w:rPr>
+                <w:rFonts w:ascii="Arial Narrow" w:hAnsi="Arial Narrow"/>
+                <w:b/>
+                <w:sz w:val="22"/>
+                <w:szCs w:val="22"/>
+              </w:rPr>
+              <w:t>CONTRATISTA</w:t>
+            </w:r>
+          </w:p>
+        </w:tc>
+      </w:tr>
+    </w:tbl>
     <w:p>
       <w:pPr>
         <w:tabs>

</xml_diff>

<commit_message>
add mejora a adjudicaciones
</commit_message>
<xml_diff>
--- a/Features/CostsModule/Features/AdjudicacionesFeature/Templates/plantilla_instalacion_con_placeholders.docx
+++ b/Features/CostsModule/Features/AdjudicacionesFeature/Templates/plantilla_instalacion_con_placeholders.docx
@@ -4237,7 +4237,27 @@
           <w:sz w:val="18"/>
           <w:szCs w:val="18"/>
         </w:rPr>
-        <w:t>monto que serán cancelados de la forma siguiente:</w:t>
+        <w:t>{{PAGO_A_CUENTA}}monto</w:t>
+      </w:r>
+      <w:r>
+        <w:rPr>
+          <w:rFonts w:ascii="Arial Narrow" w:eastAsia="Arial Narrow" w:hAnsi="Arial Narrow" w:cs="Arial Narrow"/>
+          <w:bCs/>
+          <w:color w:val="000000"/>
+          <w:sz w:val="18"/>
+          <w:szCs w:val="18"/>
+        </w:rPr>
+        <w:t xml:space="preserve"> </w:t>
+      </w:r>
+      <w:r>
+        <w:rPr>
+          <w:rFonts w:ascii="Arial Narrow" w:eastAsia="Arial Narrow" w:hAnsi="Arial Narrow" w:cs="Arial Narrow"/>
+          <w:bCs/>
+          <w:color w:val="000000"/>
+          <w:sz w:val="18"/>
+          <w:szCs w:val="18"/>
+        </w:rPr>
+        <w:t>que será cancelado de la forma siguiente:</w:t>
       </w:r>
       <w:r>
         <w:rPr>
@@ -51293,6 +51313,10 @@
 </file>
 
 <file path=customXml/item1.xml><?xml version="1.0" encoding="utf-8"?>
+<b:Sources xmlns:b="http://schemas.openxmlformats.org/officeDocument/2006/bibliography" xmlns="http://schemas.openxmlformats.org/officeDocument/2006/bibliography" SelectedStyle="\APASixthEditionOfficeOnline.xsl" StyleName="APA" Version="6"/>
+</file>
+
+<file path=customXml/item2.xml><?xml version="1.0" encoding="utf-8"?>
 <p:properties xmlns:p="http://schemas.microsoft.com/office/2006/metadata/properties" xmlns:xsi="http://www.w3.org/2001/XMLSchema-instance" xmlns:pc="http://schemas.microsoft.com/office/infopath/2007/PartnerControls">
   <documentManagement>
     <_activity xmlns="1c364c2e-a9e5-4d0d-8b0c-60f96943b919" xsi:nil="true"/>
@@ -51300,26 +51324,7 @@
 </p:properties>
 </file>
 
-<file path=customXml/item2.xml><?xml version="1.0" encoding="utf-8"?>
-<b:Sources xmlns:b="http://schemas.openxmlformats.org/officeDocument/2006/bibliography" xmlns="http://schemas.openxmlformats.org/officeDocument/2006/bibliography" SelectedStyle="\APASixthEditionOfficeOnline.xsl" StyleName="APA" Version="6"/>
-</file>
-
 <file path=customXml/item3.xml><?xml version="1.0" encoding="utf-8"?>
-<?mso-contentType ?>
-<FormTemplates xmlns="http://schemas.microsoft.com/sharepoint/v3/contenttype/forms">
-  <Display>DocumentLibraryForm</Display>
-  <Edit>DocumentLibraryForm</Edit>
-  <New>DocumentLibraryForm</New>
-</FormTemplates>
-</file>
-
-<file path=customXml/item4.xml><?xml version="1.0" encoding="utf-8"?>
-<go:gDocsCustomXmlDataStorage xmlns:go="http://customooxmlschemas.google.com/" xmlns:r="http://schemas.openxmlformats.org/officeDocument/2006/relationships" uri="GoogleDocsCustomDataVersion2">
-  <go:docsCustomData xmlns:go="http://customooxmlschemas.google.com/" roundtripDataSignature="AMtx7mi65SlRJfsAaB/f5FQ/QJjSa7JTRg==">CgMxLjAyCGguZ2pkZ3hzMgloLjMwajB6bGwyCWguMWZvYjl0ZTIJaC4zem55c2g3MgloLjJldDkycDAyCGgudHlqY3d0MgloLjNkeTZ2a20yCWguMXQzaDVzZjIJaC40ZDM0b2c4MgloLjJzOGV5bzEyCWguMTdkcDh2dTIJaC4zcmRjcmpuMgloLjI2aW4xcmcyCGgubG54Yno5MgloLjM1bmt1bjI4AHIhMVB3QlM0WUsxeVpEc0RYM1hkSnRydEtfT2RVVDZQNW5I</go:docsCustomData>
-</go:gDocsCustomXmlDataStorage>
-</file>
-
-<file path=customXml/item5.xml><?xml version="1.0" encoding="utf-8"?>
 <ct:contentTypeSchema xmlns:ct="http://schemas.microsoft.com/office/2006/metadata/contentType" xmlns:ma="http://schemas.microsoft.com/office/2006/metadata/properties/metaAttributes" ct:_="" ma:_="" ma:contentTypeName="Document" ma:contentTypeID="0x01010063B0DD29DB0EF346B1F1544CEBE0D2A7" ma:contentTypeVersion="18" ma:contentTypeDescription="Create a new document." ma:contentTypeScope="" ma:versionID="f944625a855169ca68f7a121b194bb92">
   <xsd:schema xmlns:xsd="http://www.w3.org/2001/XMLSchema" xmlns:xs="http://www.w3.org/2001/XMLSchema" xmlns:p="http://schemas.microsoft.com/office/2006/metadata/properties" xmlns:ns3="1c364c2e-a9e5-4d0d-8b0c-60f96943b919" xmlns:ns4="65ea09c1-7372-4828-95fe-f2a9534e8332" targetNamespace="http://schemas.microsoft.com/office/2006/metadata/properties" ma:root="true" ma:fieldsID="205ea4d9cf7dc04f23d4fe395e4eb5de" ns3:_="" ns4:_="">
     <xsd:import namespace="1c364c2e-a9e5-4d0d-8b0c-60f96943b919"/>
@@ -51572,7 +51577,30 @@
 </ct:contentTypeSchema>
 </file>
 
+<file path=customXml/item4.xml><?xml version="1.0" encoding="utf-8"?>
+<go:gDocsCustomXmlDataStorage xmlns:go="http://customooxmlschemas.google.com/" xmlns:r="http://schemas.openxmlformats.org/officeDocument/2006/relationships" uri="GoogleDocsCustomDataVersion2">
+  <go:docsCustomData xmlns:go="http://customooxmlschemas.google.com/" roundtripDataSignature="AMtx7mi65SlRJfsAaB/f5FQ/QJjSa7JTRg==">CgMxLjAyCGguZ2pkZ3hzMgloLjMwajB6bGwyCWguMWZvYjl0ZTIJaC4zem55c2g3MgloLjJldDkycDAyCGgudHlqY3d0MgloLjNkeTZ2a20yCWguMXQzaDVzZjIJaC40ZDM0b2c4MgloLjJzOGV5bzEyCWguMTdkcDh2dTIJaC4zcmRjcmpuMgloLjI2aW4xcmcyCGgubG54Yno5MgloLjM1bmt1bjI4AHIhMVB3QlM0WUsxeVpEc0RYM1hkSnRydEtfT2RVVDZQNW5I</go:docsCustomData>
+</go:gDocsCustomXmlDataStorage>
+</file>
+
+<file path=customXml/item5.xml><?xml version="1.0" encoding="utf-8"?>
+<?mso-contentType ?>
+<FormTemplates xmlns="http://schemas.microsoft.com/sharepoint/v3/contenttype/forms">
+  <Display>DocumentLibraryForm</Display>
+  <Edit>DocumentLibraryForm</Edit>
+  <New>DocumentLibraryForm</New>
+</FormTemplates>
+</file>
+
 <file path=customXml/itemProps1.xml><?xml version="1.0" encoding="utf-8"?>
+<ds:datastoreItem xmlns:ds="http://schemas.openxmlformats.org/officeDocument/2006/customXml" ds:itemID="{02C867CF-6023-4BBE-9EB8-8D3F09F43338}">
+  <ds:schemaRefs>
+    <ds:schemaRef ds:uri="http://schemas.openxmlformats.org/officeDocument/2006/bibliography"/>
+  </ds:schemaRefs>
+</ds:datastoreItem>
+</file>
+
+<file path=customXml/itemProps2.xml><?xml version="1.0" encoding="utf-8"?>
 <ds:datastoreItem xmlns:ds="http://schemas.openxmlformats.org/officeDocument/2006/customXml" ds:itemID="{D829E601-C5D7-4EB3-859E-E162E4261A98}">
   <ds:schemaRefs>
     <ds:schemaRef ds:uri="http://schemas.microsoft.com/office/2006/metadata/properties"/>
@@ -51582,32 +51610,7 @@
 </ds:datastoreItem>
 </file>
 
-<file path=customXml/itemProps2.xml><?xml version="1.0" encoding="utf-8"?>
-<ds:datastoreItem xmlns:ds="http://schemas.openxmlformats.org/officeDocument/2006/customXml" ds:itemID="{02C867CF-6023-4BBE-9EB8-8D3F09F43338}">
-  <ds:schemaRefs>
-    <ds:schemaRef ds:uri="http://schemas.openxmlformats.org/officeDocument/2006/bibliography"/>
-  </ds:schemaRefs>
-</ds:datastoreItem>
-</file>
-
 <file path=customXml/itemProps3.xml><?xml version="1.0" encoding="utf-8"?>
-<ds:datastoreItem xmlns:ds="http://schemas.openxmlformats.org/officeDocument/2006/customXml" ds:itemID="{DD1BD535-DABA-4752-B724-9FD5D9237B7F}">
-  <ds:schemaRefs>
-    <ds:schemaRef ds:uri="http://schemas.microsoft.com/sharepoint/v3/contenttype/forms"/>
-  </ds:schemaRefs>
-</ds:datastoreItem>
-</file>
-
-<file path=customXml/itemProps4.xml><?xml version="1.0" encoding="utf-8"?>
-<ds:datastoreItem xmlns:ds="http://schemas.openxmlformats.org/officeDocument/2006/customXml" ds:itemID="{11111111-1234-1234-1234-123412341234}">
-  <ds:schemaRefs>
-    <ds:schemaRef ds:uri="http://customooxmlschemas.google.com/"/>
-    <ds:schemaRef ds:uri="http://schemas.openxmlformats.org/officeDocument/2006/relationships"/>
-  </ds:schemaRefs>
-</ds:datastoreItem>
-</file>
-
-<file path=customXml/itemProps5.xml><?xml version="1.0" encoding="utf-8"?>
 <ds:datastoreItem xmlns:ds="http://schemas.openxmlformats.org/officeDocument/2006/customXml" ds:itemID="{F24A4505-FFC0-4551-A77A-5910F586F04D}">
   <ds:schemaRefs>
     <ds:schemaRef ds:uri="http://schemas.microsoft.com/office/2006/metadata/contentType"/>
@@ -51624,4 +51627,21 @@
     <ds:schemaRef ds:uri="http://schemas.microsoft.com/internal/obd"/>
   </ds:schemaRefs>
 </ds:datastoreItem>
+</file>
+
+<file path=customXml/itemProps4.xml><?xml version="1.0" encoding="utf-8"?>
+<ds:datastoreItem xmlns:ds="http://schemas.openxmlformats.org/officeDocument/2006/customXml" ds:itemID="{11111111-1234-1234-1234-123412341234}">
+  <ds:schemaRefs>
+    <ds:schemaRef ds:uri="http://customooxmlschemas.google.com/"/>
+    <ds:schemaRef ds:uri="http://schemas.openxmlformats.org/officeDocument/2006/relationships"/>
+  </ds:schemaRefs>
+</ds:datastoreItem>
+</file>
+
+<file path=customXml/itemProps5.xml><?xml version="1.0" encoding="utf-8"?>
+<ds:datastoreItem xmlns:ds="http://schemas.openxmlformats.org/officeDocument/2006/customXml" ds:itemID="{DD1BD535-DABA-4752-B724-9FD5D9237B7F}">
+  <ds:schemaRefs>
+    <ds:schemaRef ds:uri="http://schemas.microsoft.com/sharepoint/v3/contenttype/forms"/>
+  </ds:schemaRefs>
+</ds:datastoreItem>
 </file>
</xml_diff>

<commit_message>
add nuevas versiones de contrato
</commit_message>
<xml_diff>
--- a/Features/CostsModule/Features/AdjudicacionesFeature/Templates/plantilla_instalacion_con_placeholders.docx
+++ b/Features/CostsModule/Features/AdjudicacionesFeature/Templates/plantilla_instalacion_con_placeholders.docx
@@ -39810,16 +39810,12 @@
         <w:rPr>
           <w:rFonts w:ascii="Arial Narrow" w:hAnsi="Arial Narrow"/>
           <w:b/>
-          <w:sz w:val="18"/>
-          <w:szCs w:val="18"/>
-        </w:rPr>
-      </w:pPr>
-      <w:r>
-        <w:rPr>
-          <w:rFonts w:ascii="Arial Narrow" w:eastAsia="Arial Narrow" w:hAnsi="Arial Narrow" w:cs="Arial Narrow"/>
-          <w:b/>
-          <w:sz w:val="18"/>
-          <w:szCs w:val="18"/>
+        </w:rPr>
+      </w:pPr>
+      <w:r>
+        <w:rPr>
+          <w:rFonts w:ascii="Arial Narrow" w:eastAsia="Arial Narrow" w:hAnsi="Arial Narrow" w:cs="Arial Narrow"/>
+          <w:b/>
         </w:rPr>
         <w:lastRenderedPageBreak/>
         <w:t xml:space="preserve">ANEXO 6: </w:t>
@@ -39829,8 +39825,6 @@
           <w:rFonts w:ascii="Arial Narrow" w:hAnsi="Arial Narrow"/>
           <w:b/>
           <w:bCs/>
-          <w:sz w:val="18"/>
-          <w:szCs w:val="18"/>
           <w:lang w:val="es-ES"/>
         </w:rPr>
         <w:t>OBLIGACIONES EN EL CUMPLIMIENTO DEL SISTEMA DE GESTIÓN DE CALIDAD</w:t>
@@ -39838,21 +39832,12 @@
       <w:r>
         <w:rPr>
           <w:rFonts w:ascii="Arial Narrow" w:hAnsi="Arial Narrow"/>
-          <w:sz w:val="18"/>
-          <w:szCs w:val="18"/>
           <w:lang w:val="es-ES"/>
         </w:rPr>
         <w:t xml:space="preserve"> (Para el presente anexo EL CONTRATANTE también puede entenderse como Área de Calidad del Proyecto y/o residente de obra)</w:t>
       </w:r>
     </w:p>
-    <w:p>
-      <w:pPr>
-        <w:rPr>
-          <w:sz w:val="18"/>
-          <w:szCs w:val="18"/>
-        </w:rPr>
-      </w:pPr>
-    </w:p>
+    <w:p/>
     <w:p>
       <w:pPr>
         <w:pStyle w:val="Prrafodelista"/>
@@ -39869,16 +39854,12 @@
         <w:jc w:val="both"/>
         <w:rPr>
           <w:rFonts w:ascii="Arial Narrow" w:hAnsi="Arial Narrow"/>
-          <w:sz w:val="18"/>
-          <w:szCs w:val="18"/>
-          <w:lang w:val="es-ES"/>
-        </w:rPr>
-      </w:pPr>
-      <w:r>
-        <w:rPr>
-          <w:rFonts w:ascii="Arial Narrow" w:hAnsi="Arial Narrow"/>
-          <w:sz w:val="18"/>
-          <w:szCs w:val="18"/>
+          <w:lang w:val="es-ES"/>
+        </w:rPr>
+      </w:pPr>
+      <w:r>
+        <w:rPr>
+          <w:rFonts w:ascii="Arial Narrow" w:hAnsi="Arial Narrow"/>
           <w:lang w:val="es-ES"/>
         </w:rPr>
         <w:t xml:space="preserve">Mantener, durante la ejecución de </w:t>
@@ -39888,8 +39869,6 @@
           <w:rFonts w:ascii="Arial Narrow" w:hAnsi="Arial Narrow"/>
           <w:b/>
           <w:bCs/>
-          <w:sz w:val="18"/>
-          <w:szCs w:val="18"/>
           <w:lang w:val="es-ES"/>
         </w:rPr>
         <w:t>LA OBRA</w:t>
@@ -39897,8 +39876,6 @@
       <w:r>
         <w:rPr>
           <w:rFonts w:ascii="Arial Narrow" w:hAnsi="Arial Narrow"/>
-          <w:sz w:val="18"/>
-          <w:szCs w:val="18"/>
           <w:lang w:val="es-ES"/>
         </w:rPr>
         <w:t xml:space="preserve">, a un supervisor de control de calidad (no capataz) a tiempo completo con facultades suficientes para recibir y ejecutar, con plena responsabilidad, las órdenes e indicaciones que le haga </w:t>
@@ -39908,8 +39885,6 @@
           <w:rFonts w:ascii="Arial Narrow" w:hAnsi="Arial Narrow"/>
           <w:b/>
           <w:bCs/>
-          <w:sz w:val="18"/>
-          <w:szCs w:val="18"/>
           <w:lang w:val="es-ES"/>
         </w:rPr>
         <w:t>EL CONTRATANTE</w:t>
@@ -39917,8 +39892,6 @@
       <w:r>
         <w:rPr>
           <w:rFonts w:ascii="Arial Narrow" w:hAnsi="Arial Narrow"/>
-          <w:sz w:val="18"/>
-          <w:szCs w:val="18"/>
           <w:lang w:val="es-ES"/>
         </w:rPr>
         <w:t xml:space="preserve">, así como la totalidad del alcance de su trabajo. Este supervisor debe tener experiencia mínima de dos (2) años trabajando como responsable de su partida a cargo. Se deberá enviar la hoja de vida del supervisor y pasar entrevista con </w:t>
@@ -39928,8 +39901,6 @@
           <w:rFonts w:ascii="Arial Narrow" w:hAnsi="Arial Narrow"/>
           <w:b/>
           <w:bCs/>
-          <w:sz w:val="18"/>
-          <w:szCs w:val="18"/>
           <w:lang w:val="es-ES"/>
         </w:rPr>
         <w:t>EL CONTRATANTE</w:t>
@@ -39937,8 +39908,6 @@
       <w:r>
         <w:rPr>
           <w:rFonts w:ascii="Arial Narrow" w:hAnsi="Arial Narrow"/>
-          <w:sz w:val="18"/>
-          <w:szCs w:val="18"/>
           <w:lang w:val="es-ES"/>
         </w:rPr>
         <w:t xml:space="preserve"> para su aprobación. El supervisor deberá de ingresar una semana antes del inicio de su partida.  Este supervisor no podrá reemplazarse durante el desarrollo de los trabajos, sin la autorización previa de</w:t>
@@ -39948,8 +39917,6 @@
           <w:rFonts w:ascii="Arial Narrow" w:hAnsi="Arial Narrow"/>
           <w:b/>
           <w:bCs/>
-          <w:sz w:val="18"/>
-          <w:szCs w:val="18"/>
           <w:lang w:val="es-ES"/>
         </w:rPr>
         <w:t xml:space="preserve"> EL CONTRATANTE</w:t>
@@ -39957,8 +39924,6 @@
       <w:r>
         <w:rPr>
           <w:rFonts w:ascii="Arial Narrow" w:hAnsi="Arial Narrow"/>
-          <w:sz w:val="18"/>
-          <w:szCs w:val="18"/>
           <w:lang w:val="es-ES"/>
         </w:rPr>
         <w:t xml:space="preserve">. En caso </w:t>
@@ -39968,8 +39933,6 @@
           <w:rFonts w:ascii="Arial Narrow" w:hAnsi="Arial Narrow"/>
           <w:b/>
           <w:bCs/>
-          <w:sz w:val="18"/>
-          <w:szCs w:val="18"/>
           <w:lang w:val="es-ES"/>
         </w:rPr>
         <w:t>EL CONTRATANTE</w:t>
@@ -39977,8 +39940,6 @@
       <w:r>
         <w:rPr>
           <w:rFonts w:ascii="Arial Narrow" w:hAnsi="Arial Narrow"/>
-          <w:sz w:val="18"/>
-          <w:szCs w:val="18"/>
           <w:lang w:val="es-ES"/>
         </w:rPr>
         <w:t xml:space="preserve"> lo estime conveniente, podrá solicitar a </w:t>
@@ -39988,8 +39949,6 @@
           <w:rFonts w:ascii="Arial Narrow" w:hAnsi="Arial Narrow"/>
           <w:b/>
           <w:bCs/>
-          <w:sz w:val="18"/>
-          <w:szCs w:val="18"/>
           <w:lang w:val="es-ES"/>
         </w:rPr>
         <w:t>EL CONTRATISTA</w:t>
@@ -39997,8 +39956,6 @@
       <w:r>
         <w:rPr>
           <w:rFonts w:ascii="Arial Narrow" w:hAnsi="Arial Narrow"/>
-          <w:sz w:val="18"/>
-          <w:szCs w:val="18"/>
           <w:lang w:val="es-ES"/>
         </w:rPr>
         <w:t xml:space="preserve"> el cambio de supervisor, lo cual deberá ser acatado dentro de 5 (cinco) días hábiles de notificado.</w:t>
@@ -40017,8 +39974,6 @@
         <w:jc w:val="both"/>
         <w:rPr>
           <w:rFonts w:ascii="Arial Narrow" w:hAnsi="Arial Narrow"/>
-          <w:sz w:val="18"/>
-          <w:szCs w:val="18"/>
           <w:lang w:val="es-ES"/>
         </w:rPr>
       </w:pPr>
@@ -40039,8 +39994,6 @@
         <w:jc w:val="both"/>
         <w:rPr>
           <w:rFonts w:ascii="Arial Narrow" w:hAnsi="Arial Narrow"/>
-          <w:sz w:val="18"/>
-          <w:szCs w:val="18"/>
           <w:lang w:val="es-ES"/>
         </w:rPr>
       </w:pPr>
@@ -40049,8 +40002,6 @@
           <w:rFonts w:ascii="Arial Narrow" w:hAnsi="Arial Narrow"/>
           <w:b/>
           <w:bCs/>
-          <w:sz w:val="18"/>
-          <w:szCs w:val="18"/>
           <w:lang w:val="es-ES"/>
         </w:rPr>
         <w:t>EL CONTRATISTA</w:t>
@@ -40058,8 +40009,6 @@
       <w:r>
         <w:rPr>
           <w:rFonts w:ascii="Arial Narrow" w:hAnsi="Arial Narrow"/>
-          <w:sz w:val="18"/>
-          <w:szCs w:val="18"/>
           <w:lang w:val="es-ES"/>
         </w:rPr>
         <w:t xml:space="preserve"> debe presentar los procedimientos de trabajo antes del inicio de sus actividades (mínimo 1 semana antes) para aprobación, y sus protocolos de control. Los procedimientos deben de incluir todos los trabajos a realizar en la obra considerando los requerimientos del instructivo de calidad de </w:t>
@@ -40069,8 +40018,6 @@
           <w:rFonts w:ascii="Arial Narrow" w:hAnsi="Arial Narrow"/>
           <w:b/>
           <w:bCs/>
-          <w:sz w:val="18"/>
-          <w:szCs w:val="18"/>
           <w:lang w:val="es-ES"/>
         </w:rPr>
         <w:t>EL CONTRATANTE</w:t>
@@ -40078,8 +40025,6 @@
       <w:r>
         <w:rPr>
           <w:rFonts w:ascii="Arial Narrow" w:hAnsi="Arial Narrow"/>
-          <w:sz w:val="18"/>
-          <w:szCs w:val="18"/>
           <w:lang w:val="es-ES"/>
         </w:rPr>
         <w:t>.</w:t>
@@ -40098,8 +40043,6 @@
         <w:jc w:val="both"/>
         <w:rPr>
           <w:rFonts w:ascii="Arial Narrow" w:hAnsi="Arial Narrow"/>
-          <w:sz w:val="18"/>
-          <w:szCs w:val="18"/>
           <w:lang w:val="es-ES"/>
         </w:rPr>
       </w:pPr>
@@ -40120,8 +40063,6 @@
         <w:jc w:val="both"/>
         <w:rPr>
           <w:rFonts w:ascii="Arial Narrow" w:hAnsi="Arial Narrow"/>
-          <w:sz w:val="18"/>
-          <w:szCs w:val="18"/>
           <w:lang w:val="es-ES"/>
         </w:rPr>
       </w:pPr>
@@ -40130,8 +40071,6 @@
           <w:rFonts w:ascii="Arial Narrow" w:hAnsi="Arial Narrow"/>
           <w:b/>
           <w:bCs/>
-          <w:sz w:val="18"/>
-          <w:szCs w:val="18"/>
           <w:lang w:val="es-ES"/>
         </w:rPr>
         <w:t>EL CONTRATISTA</w:t>
@@ -40139,8 +40078,6 @@
       <w:r>
         <w:rPr>
           <w:rFonts w:ascii="Arial Narrow" w:hAnsi="Arial Narrow"/>
-          <w:sz w:val="18"/>
-          <w:szCs w:val="18"/>
           <w:lang w:val="es-ES"/>
         </w:rPr>
         <w:t xml:space="preserve"> debe cumplir con los requisitos del proyecto, así como también con los procedimientos de trabajo aprobados para sus partidas.</w:t>
@@ -40159,8 +40096,6 @@
         <w:jc w:val="both"/>
         <w:rPr>
           <w:rFonts w:ascii="Arial Narrow" w:hAnsi="Arial Narrow"/>
-          <w:sz w:val="18"/>
-          <w:szCs w:val="18"/>
           <w:lang w:val="es-ES"/>
         </w:rPr>
       </w:pPr>
@@ -40181,8 +40116,6 @@
         <w:jc w:val="both"/>
         <w:rPr>
           <w:rFonts w:ascii="Arial Narrow" w:hAnsi="Arial Narrow"/>
-          <w:sz w:val="18"/>
-          <w:szCs w:val="18"/>
           <w:lang w:val="es-ES"/>
         </w:rPr>
       </w:pPr>
@@ -40191,8 +40124,6 @@
           <w:rFonts w:ascii="Arial Narrow" w:hAnsi="Arial Narrow"/>
           <w:b/>
           <w:bCs/>
-          <w:sz w:val="18"/>
-          <w:szCs w:val="18"/>
           <w:lang w:val="es-ES"/>
         </w:rPr>
         <w:t>EL CONTRATISTA</w:t>
@@ -40200,8 +40131,6 @@
       <w:r>
         <w:rPr>
           <w:rFonts w:ascii="Arial Narrow" w:hAnsi="Arial Narrow"/>
-          <w:sz w:val="18"/>
-          <w:szCs w:val="18"/>
           <w:lang w:val="es-ES"/>
         </w:rPr>
         <w:t xml:space="preserve"> debe asistir a las reuniones circunstanciales y ocasionales de coordinación y/o capacitaciones pactadas por </w:t>
@@ -40211,8 +40140,6 @@
           <w:rFonts w:ascii="Arial Narrow" w:hAnsi="Arial Narrow"/>
           <w:b/>
           <w:bCs/>
-          <w:sz w:val="18"/>
-          <w:szCs w:val="18"/>
           <w:lang w:val="es-ES"/>
         </w:rPr>
         <w:t xml:space="preserve">EL CONTRATANTE. </w:t>
@@ -40231,8 +40158,6 @@
         <w:jc w:val="both"/>
         <w:rPr>
           <w:rFonts w:ascii="Arial Narrow" w:hAnsi="Arial Narrow"/>
-          <w:sz w:val="18"/>
-          <w:szCs w:val="18"/>
           <w:lang w:val="es-ES"/>
         </w:rPr>
       </w:pPr>
@@ -40253,8 +40178,6 @@
         <w:jc w:val="both"/>
         <w:rPr>
           <w:rFonts w:ascii="Arial Narrow" w:hAnsi="Arial Narrow"/>
-          <w:sz w:val="18"/>
-          <w:szCs w:val="18"/>
           <w:lang w:val="es-ES"/>
         </w:rPr>
       </w:pPr>
@@ -40263,8 +40186,6 @@
           <w:rFonts w:ascii="Arial Narrow" w:hAnsi="Arial Narrow"/>
           <w:b/>
           <w:bCs/>
-          <w:sz w:val="18"/>
-          <w:szCs w:val="18"/>
           <w:lang w:val="es-ES"/>
         </w:rPr>
         <w:t>EL CONTRATISTA</w:t>
@@ -40272,8 +40193,6 @@
       <w:r>
         <w:rPr>
           <w:rFonts w:ascii="Arial Narrow" w:hAnsi="Arial Narrow"/>
-          <w:sz w:val="18"/>
-          <w:szCs w:val="18"/>
           <w:lang w:val="es-ES"/>
         </w:rPr>
         <w:t xml:space="preserve"> deberá capacitar a todo su personal en temas del control de la calidad antes del inicio de su partida y evidenciar la capacitación del personal obrero sobre el procedimiento de trabajo y los alcances a cumplir. </w:t>
@@ -40283,8 +40202,6 @@
           <w:rFonts w:ascii="Arial Narrow" w:hAnsi="Arial Narrow"/>
           <w:b/>
           <w:bCs/>
-          <w:sz w:val="18"/>
-          <w:szCs w:val="18"/>
           <w:lang w:val="es-ES"/>
         </w:rPr>
         <w:t>EL CONTRATISTA</w:t>
@@ -40292,8 +40209,6 @@
       <w:r>
         <w:rPr>
           <w:rFonts w:ascii="Arial Narrow" w:hAnsi="Arial Narrow"/>
-          <w:sz w:val="18"/>
-          <w:szCs w:val="18"/>
           <w:lang w:val="es-ES"/>
         </w:rPr>
         <w:t xml:space="preserve"> deberá de entregar a su personal, los planos y toda la información relevante a su partida. </w:t>
@@ -40312,8 +40227,6 @@
         <w:jc w:val="both"/>
         <w:rPr>
           <w:rFonts w:ascii="Arial Narrow" w:hAnsi="Arial Narrow"/>
-          <w:sz w:val="18"/>
-          <w:szCs w:val="18"/>
           <w:lang w:val="es-ES"/>
         </w:rPr>
       </w:pPr>
@@ -40334,8 +40247,6 @@
         <w:jc w:val="both"/>
         <w:rPr>
           <w:rFonts w:ascii="Arial Narrow" w:hAnsi="Arial Narrow"/>
-          <w:sz w:val="18"/>
-          <w:szCs w:val="18"/>
           <w:lang w:val="es-ES"/>
         </w:rPr>
       </w:pPr>
@@ -40344,8 +40255,6 @@
           <w:rFonts w:ascii="Arial Narrow" w:hAnsi="Arial Narrow"/>
           <w:b/>
           <w:bCs/>
-          <w:sz w:val="18"/>
-          <w:szCs w:val="18"/>
           <w:lang w:val="es-ES"/>
         </w:rPr>
         <w:t>EL CONTRATISTA</w:t>
@@ -40353,8 +40262,6 @@
       <w:r>
         <w:rPr>
           <w:rFonts w:ascii="Arial Narrow" w:hAnsi="Arial Narrow"/>
-          <w:sz w:val="18"/>
-          <w:szCs w:val="18"/>
           <w:lang w:val="es-ES"/>
         </w:rPr>
         <w:t xml:space="preserve"> deberá de participar en las reuniones semanales de aseguramiento de calidad, asimismo deberá cumplir con los acuerdos, disposiciones y nuevas consideraciones pactadas en cada reunión. La cantidad mínima de asistencia requerida será de una vez cada quince (15) días.</w:t>
@@ -40373,8 +40280,6 @@
         <w:jc w:val="both"/>
         <w:rPr>
           <w:rFonts w:ascii="Arial Narrow" w:hAnsi="Arial Narrow"/>
-          <w:sz w:val="18"/>
-          <w:szCs w:val="18"/>
           <w:lang w:val="es-ES"/>
         </w:rPr>
       </w:pPr>
@@ -40395,16 +40300,12 @@
         <w:jc w:val="both"/>
         <w:rPr>
           <w:rFonts w:ascii="Arial Narrow" w:hAnsi="Arial Narrow"/>
-          <w:sz w:val="18"/>
-          <w:szCs w:val="18"/>
-          <w:lang w:val="es-ES"/>
-        </w:rPr>
-      </w:pPr>
-      <w:r>
-        <w:rPr>
-          <w:rFonts w:ascii="Arial Narrow" w:hAnsi="Arial Narrow"/>
-          <w:sz w:val="18"/>
-          <w:szCs w:val="18"/>
+          <w:lang w:val="es-ES"/>
+        </w:rPr>
+      </w:pPr>
+      <w:r>
+        <w:rPr>
+          <w:rFonts w:ascii="Arial Narrow" w:hAnsi="Arial Narrow"/>
           <w:lang w:val="es-ES"/>
         </w:rPr>
         <w:t xml:space="preserve">El supervisor de </w:t>
@@ -40414,8 +40315,6 @@
           <w:rFonts w:ascii="Arial Narrow" w:hAnsi="Arial Narrow"/>
           <w:b/>
           <w:bCs/>
-          <w:sz w:val="18"/>
-          <w:szCs w:val="18"/>
           <w:lang w:val="es-ES"/>
         </w:rPr>
         <w:t>EL CONTRATISTA</w:t>
@@ -40423,8 +40322,6 @@
       <w:r>
         <w:rPr>
           <w:rFonts w:ascii="Arial Narrow" w:hAnsi="Arial Narrow"/>
-          <w:sz w:val="18"/>
-          <w:szCs w:val="18"/>
           <w:lang w:val="es-ES"/>
         </w:rPr>
         <w:t xml:space="preserve"> deberá de participar en las reuniones semanales de aseguramiento de calidad, asimismo deberá cumplir con los acuerdos, disposiciones y nuevas consideraciones pactadas en cada reunión. El supervisor se compromete a trasladar de manera efectiva a sus trabajadores todos los acuerdos y observaciones registrados durante las reuniones semanales. El supervisor deberá evidenciar el cumplimiento de esta tarea mediante la realización de una charla a operarios cada semana. Esta evidencia de cumplimiento deberá ser documentada por el supervisor y enviada a </w:t>
@@ -40434,8 +40331,6 @@
           <w:rFonts w:ascii="Arial Narrow" w:hAnsi="Arial Narrow"/>
           <w:b/>
           <w:bCs/>
-          <w:sz w:val="18"/>
-          <w:szCs w:val="18"/>
           <w:lang w:val="es-ES"/>
         </w:rPr>
         <w:t>EL CONTRATANTE</w:t>
@@ -40443,8 +40338,6 @@
       <w:r>
         <w:rPr>
           <w:rFonts w:ascii="Arial Narrow" w:hAnsi="Arial Narrow"/>
-          <w:sz w:val="18"/>
-          <w:szCs w:val="18"/>
           <w:lang w:val="es-ES"/>
         </w:rPr>
         <w:t xml:space="preserve"> de acuerdo con la modalidad que este último determine. El supervisor enviará dicha evidencia de forma semanal, dentro de los plazos establecidos.</w:t>
@@ -40463,8 +40356,6 @@
         <w:jc w:val="both"/>
         <w:rPr>
           <w:rFonts w:ascii="Arial Narrow" w:hAnsi="Arial Narrow"/>
-          <w:sz w:val="18"/>
-          <w:szCs w:val="18"/>
           <w:lang w:val="es-ES"/>
         </w:rPr>
       </w:pPr>
@@ -40485,8 +40376,6 @@
         <w:jc w:val="both"/>
         <w:rPr>
           <w:rFonts w:ascii="Arial Narrow" w:hAnsi="Arial Narrow"/>
-          <w:sz w:val="18"/>
-          <w:szCs w:val="18"/>
           <w:lang w:val="es-ES"/>
         </w:rPr>
       </w:pPr>
@@ -40495,8 +40384,6 @@
           <w:rFonts w:ascii="Arial Narrow" w:hAnsi="Arial Narrow"/>
           <w:b/>
           <w:bCs/>
-          <w:sz w:val="18"/>
-          <w:szCs w:val="18"/>
           <w:lang w:val="es-ES"/>
         </w:rPr>
         <w:t>El CONTRATISTA</w:t>
@@ -40504,8 +40391,6 @@
       <w:r>
         <w:rPr>
           <w:rFonts w:ascii="Arial Narrow" w:hAnsi="Arial Narrow"/>
-          <w:sz w:val="18"/>
-          <w:szCs w:val="18"/>
           <w:lang w:val="es-ES"/>
         </w:rPr>
         <w:t xml:space="preserve"> deberá de entregar y coordinar la liberación de su partida. </w:t>
@@ -40516,8 +40401,6 @@
           <w:b/>
           <w:bCs/>
           <w:color w:val="000000" w:themeColor="text1"/>
-          <w:sz w:val="18"/>
-          <w:szCs w:val="18"/>
           <w:lang w:val="es-ES"/>
         </w:rPr>
         <w:t>EL CONTRATISTA</w:t>
@@ -40526,8 +40409,6 @@
         <w:rPr>
           <w:rFonts w:ascii="Arial Narrow" w:hAnsi="Arial Narrow"/>
           <w:color w:val="000000" w:themeColor="text1"/>
-          <w:sz w:val="18"/>
-          <w:szCs w:val="18"/>
           <w:lang w:val="es-ES"/>
         </w:rPr>
         <w:t xml:space="preserve">, se compromete a cumplir la programación semanal de las liberaciones. </w:t>
@@ -40535,8 +40416,6 @@
       <w:r>
         <w:rPr>
           <w:rFonts w:ascii="Arial Narrow" w:hAnsi="Arial Narrow"/>
-          <w:sz w:val="18"/>
-          <w:szCs w:val="18"/>
           <w:lang w:val="es-ES"/>
         </w:rPr>
         <w:t xml:space="preserve">El supervisor de </w:t>
@@ -40546,8 +40425,6 @@
           <w:rFonts w:ascii="Arial Narrow" w:hAnsi="Arial Narrow"/>
           <w:b/>
           <w:bCs/>
-          <w:sz w:val="18"/>
-          <w:szCs w:val="18"/>
           <w:lang w:val="es-ES"/>
         </w:rPr>
         <w:t>EL CONTRATISTA</w:t>
@@ -40555,8 +40432,6 @@
       <w:r>
         <w:rPr>
           <w:rFonts w:ascii="Arial Narrow" w:hAnsi="Arial Narrow"/>
-          <w:sz w:val="18"/>
-          <w:szCs w:val="18"/>
           <w:lang w:val="es-ES"/>
         </w:rPr>
         <w:t xml:space="preserve"> deberá de </w:t>
@@ -40565,8 +40440,6 @@
         <w:rPr>
           <w:rFonts w:ascii="Arial Narrow" w:hAnsi="Arial Narrow"/>
           <w:color w:val="000000" w:themeColor="text1"/>
-          <w:sz w:val="18"/>
-          <w:szCs w:val="18"/>
           <w:lang w:val="es-ES"/>
         </w:rPr>
         <w:t>preparar</w:t>
@@ -40574,8 +40447,6 @@
       <w:r>
         <w:rPr>
           <w:rFonts w:ascii="Arial Narrow" w:hAnsi="Arial Narrow"/>
-          <w:sz w:val="18"/>
-          <w:szCs w:val="18"/>
           <w:lang w:val="es-ES"/>
         </w:rPr>
         <w:t xml:space="preserve"> todo lo relacionado a la liberación de su partida incluido la limpieza a la zona a liberar. </w:t>
@@ -40586,8 +40457,6 @@
           <w:b/>
           <w:bCs/>
           <w:color w:val="000000" w:themeColor="text1"/>
-          <w:sz w:val="18"/>
-          <w:szCs w:val="18"/>
           <w:lang w:val="es-ES"/>
         </w:rPr>
         <w:t>EL CONTRATISTA</w:t>
@@ -40596,8 +40465,6 @@
         <w:rPr>
           <w:rFonts w:ascii="Arial Narrow" w:hAnsi="Arial Narrow"/>
           <w:color w:val="000000" w:themeColor="text1"/>
-          <w:sz w:val="18"/>
-          <w:szCs w:val="18"/>
           <w:lang w:val="es-ES"/>
         </w:rPr>
         <w:t xml:space="preserve"> no deberá dejar ningún pendiente por liberar. No se considerará el piso liberado, si no se ha liberado el 100% de los ambientes. </w:t>
@@ -40608,8 +40475,6 @@
           <w:b/>
           <w:bCs/>
           <w:color w:val="000000" w:themeColor="text1"/>
-          <w:sz w:val="18"/>
-          <w:szCs w:val="18"/>
           <w:lang w:val="es-ES"/>
         </w:rPr>
         <w:t>EL CONTRATISTA</w:t>
@@ -40618,8 +40483,6 @@
         <w:rPr>
           <w:rFonts w:ascii="Arial Narrow" w:hAnsi="Arial Narrow"/>
           <w:color w:val="000000" w:themeColor="text1"/>
-          <w:sz w:val="18"/>
-          <w:szCs w:val="18"/>
           <w:lang w:val="es-ES"/>
         </w:rPr>
         <w:t xml:space="preserve"> se compromete a nivelarse con la programación de la liberación de partidas de existir algún atraso. </w:t>
@@ -40630,8 +40493,6 @@
           <w:b/>
           <w:bCs/>
           <w:color w:val="000000" w:themeColor="text1"/>
-          <w:sz w:val="18"/>
-          <w:szCs w:val="18"/>
           <w:lang w:val="es-ES"/>
         </w:rPr>
         <w:t xml:space="preserve">EL CONTRATISTA </w:t>
@@ -40640,8 +40501,6 @@
         <w:rPr>
           <w:rFonts w:ascii="Arial Narrow" w:hAnsi="Arial Narrow"/>
           <w:color w:val="000000" w:themeColor="text1"/>
-          <w:sz w:val="18"/>
-          <w:szCs w:val="18"/>
           <w:lang w:val="es-ES"/>
         </w:rPr>
         <w:t xml:space="preserve">deberá de designar la cantidad suficiente de personal y materiales para levantar las observaciones y nivelarse con la liberación de las partidas. </w:t>
@@ -40649,8 +40508,6 @@
       <w:r>
         <w:rPr>
           <w:rFonts w:ascii="Arial Narrow" w:hAnsi="Arial Narrow"/>
-          <w:sz w:val="18"/>
-          <w:szCs w:val="18"/>
           <w:lang w:val="es-ES"/>
         </w:rPr>
         <w:t>El desfase en pisos máximo permitido entre trabajo terminado y liberado (sin observaciones) será de dos (2) pisos.</w:t>
@@ -40669,8 +40526,6 @@
         <w:jc w:val="both"/>
         <w:rPr>
           <w:rFonts w:ascii="Arial Narrow" w:hAnsi="Arial Narrow"/>
-          <w:sz w:val="18"/>
-          <w:szCs w:val="18"/>
           <w:lang w:val="es-ES"/>
         </w:rPr>
       </w:pPr>
@@ -40691,8 +40546,6 @@
         <w:jc w:val="both"/>
         <w:rPr>
           <w:rFonts w:ascii="Arial Narrow" w:hAnsi="Arial Narrow"/>
-          <w:sz w:val="18"/>
-          <w:szCs w:val="18"/>
           <w:lang w:val="es-ES"/>
         </w:rPr>
       </w:pPr>
@@ -40701,8 +40554,6 @@
           <w:rFonts w:ascii="Arial Narrow" w:hAnsi="Arial Narrow"/>
           <w:b/>
           <w:bCs/>
-          <w:sz w:val="18"/>
-          <w:szCs w:val="18"/>
           <w:lang w:val="es-ES"/>
         </w:rPr>
         <w:t>El CONTRATISTA</w:t>
@@ -40710,8 +40561,6 @@
       <w:r>
         <w:rPr>
           <w:rFonts w:ascii="Arial Narrow" w:hAnsi="Arial Narrow"/>
-          <w:sz w:val="18"/>
-          <w:szCs w:val="18"/>
           <w:lang w:val="es-ES"/>
         </w:rPr>
         <w:t xml:space="preserve"> deberá de asumir todos los gastos relacionados al retraso del inicio de otra partida, todo esto relacionado a la no liberación de su partida. </w:t>
@@ -40730,8 +40579,6 @@
         <w:jc w:val="both"/>
         <w:rPr>
           <w:rFonts w:ascii="Arial Narrow" w:hAnsi="Arial Narrow"/>
-          <w:sz w:val="18"/>
-          <w:szCs w:val="18"/>
           <w:lang w:val="es-ES"/>
         </w:rPr>
       </w:pPr>
@@ -40752,8 +40599,6 @@
         <w:jc w:val="both"/>
         <w:rPr>
           <w:rFonts w:ascii="Arial Narrow" w:hAnsi="Arial Narrow"/>
-          <w:sz w:val="18"/>
-          <w:szCs w:val="18"/>
           <w:lang w:val="es-ES"/>
         </w:rPr>
       </w:pPr>
@@ -40762,8 +40607,6 @@
           <w:rFonts w:ascii="Arial Narrow" w:hAnsi="Arial Narrow"/>
           <w:b/>
           <w:bCs/>
-          <w:sz w:val="18"/>
-          <w:szCs w:val="18"/>
           <w:lang w:val="es-ES"/>
         </w:rPr>
         <w:t>EL CONTRATISTA</w:t>
@@ -40771,8 +40614,6 @@
       <w:r>
         <w:rPr>
           <w:rFonts w:ascii="Arial Narrow" w:hAnsi="Arial Narrow"/>
-          <w:sz w:val="18"/>
-          <w:szCs w:val="18"/>
           <w:lang w:val="es-ES"/>
         </w:rPr>
         <w:t xml:space="preserve"> está obligado a proteger los trabajos realizados por su partida en base lo indicado en el instructivo de calidad de </w:t>
@@ -40782,8 +40623,6 @@
           <w:rFonts w:ascii="Arial Narrow" w:hAnsi="Arial Narrow"/>
           <w:b/>
           <w:bCs/>
-          <w:sz w:val="18"/>
-          <w:szCs w:val="18"/>
           <w:lang w:val="es-ES"/>
         </w:rPr>
         <w:t>EL CONTRATANTE</w:t>
@@ -40791,8 +40630,6 @@
       <w:r>
         <w:rPr>
           <w:rFonts w:ascii="Arial Narrow" w:hAnsi="Arial Narrow"/>
-          <w:sz w:val="18"/>
-          <w:szCs w:val="18"/>
           <w:lang w:val="es-ES"/>
         </w:rPr>
         <w:t xml:space="preserve">. </w:t>
@@ -40802,8 +40639,6 @@
           <w:rFonts w:ascii="Arial Narrow" w:hAnsi="Arial Narrow"/>
           <w:b/>
           <w:bCs/>
-          <w:sz w:val="18"/>
-          <w:szCs w:val="18"/>
           <w:lang w:val="es-ES"/>
         </w:rPr>
         <w:t>EL CONTRATISTA</w:t>
@@ -40811,8 +40646,6 @@
       <w:r>
         <w:rPr>
           <w:rFonts w:ascii="Arial Narrow" w:hAnsi="Arial Narrow"/>
-          <w:sz w:val="18"/>
-          <w:szCs w:val="18"/>
           <w:lang w:val="es-ES"/>
         </w:rPr>
         <w:t xml:space="preserve"> deberá de realizar seguimiento a la protección de su partida a lo largo de toda la obra y coordinar cualquier observación.</w:t>
@@ -40831,8 +40664,6 @@
         <w:jc w:val="both"/>
         <w:rPr>
           <w:rFonts w:ascii="Arial Narrow" w:hAnsi="Arial Narrow"/>
-          <w:sz w:val="18"/>
-          <w:szCs w:val="18"/>
           <w:lang w:val="es-ES"/>
         </w:rPr>
       </w:pPr>
@@ -40853,8 +40684,6 @@
         <w:jc w:val="both"/>
         <w:rPr>
           <w:rFonts w:ascii="Arial Narrow" w:hAnsi="Arial Narrow"/>
-          <w:sz w:val="18"/>
-          <w:szCs w:val="18"/>
           <w:lang w:val="es-ES"/>
         </w:rPr>
       </w:pPr>
@@ -40863,8 +40692,6 @@
           <w:rFonts w:ascii="Arial Narrow" w:hAnsi="Arial Narrow"/>
           <w:b/>
           <w:bCs/>
-          <w:sz w:val="18"/>
-          <w:szCs w:val="18"/>
           <w:lang w:val="es-ES"/>
         </w:rPr>
         <w:t>EL CONTRATISTA</w:t>
@@ -40872,8 +40699,6 @@
       <w:r>
         <w:rPr>
           <w:rFonts w:ascii="Arial Narrow" w:hAnsi="Arial Narrow"/>
-          <w:sz w:val="18"/>
-          <w:szCs w:val="18"/>
           <w:lang w:val="es-ES"/>
         </w:rPr>
         <w:t xml:space="preserve"> debe cumplir con las pruebas y/o ensayos considerados para el control de calidad según lo requerido por el ingeniero o arquitecto de calidad de la obra y estipulado en el instructivo de calidad de la partida.</w:t>
@@ -40892,8 +40717,6 @@
         <w:jc w:val="both"/>
         <w:rPr>
           <w:rFonts w:ascii="Arial Narrow" w:hAnsi="Arial Narrow"/>
-          <w:sz w:val="18"/>
-          <w:szCs w:val="18"/>
           <w:lang w:val="es-ES"/>
         </w:rPr>
       </w:pPr>
@@ -40915,8 +40738,6 @@
         <w:rPr>
           <w:rFonts w:ascii="Arial Narrow" w:hAnsi="Arial Narrow"/>
           <w:color w:val="000000" w:themeColor="text1"/>
-          <w:sz w:val="18"/>
-          <w:szCs w:val="18"/>
           <w:lang w:val="es-ES"/>
         </w:rPr>
       </w:pPr>
@@ -40925,8 +40746,6 @@
           <w:rFonts w:ascii="Arial Narrow" w:hAnsi="Arial Narrow"/>
           <w:b/>
           <w:bCs/>
-          <w:sz w:val="18"/>
-          <w:szCs w:val="18"/>
           <w:lang w:val="es-ES"/>
         </w:rPr>
         <w:t>EL CONTRATISTA</w:t>
@@ -40934,8 +40753,6 @@
       <w:r>
         <w:rPr>
           <w:rFonts w:ascii="Arial Narrow" w:hAnsi="Arial Narrow"/>
-          <w:sz w:val="18"/>
-          <w:szCs w:val="18"/>
           <w:lang w:val="es-ES"/>
         </w:rPr>
         <w:t xml:space="preserve"> deberá señalar un miembro de su personal, quien será el único autorizado para realizar el llenado de los protocolos y quien deberá estar correctamente instruido para dichos efectos.</w:t>
@@ -40944,8 +40761,6 @@
         <w:rPr>
           <w:rFonts w:ascii="Arial Narrow" w:hAnsi="Arial Narrow"/>
           <w:color w:val="000000" w:themeColor="text1"/>
-          <w:sz w:val="18"/>
-          <w:szCs w:val="18"/>
           <w:lang w:val="es-ES"/>
         </w:rPr>
         <w:t xml:space="preserve">  El llenado de </w:t>
@@ -40953,8 +40768,6 @@
       <w:r>
         <w:rPr>
           <w:rFonts w:ascii="Arial Narrow" w:hAnsi="Arial Narrow"/>
-          <w:sz w:val="18"/>
-          <w:szCs w:val="18"/>
           <w:lang w:val="es-ES"/>
         </w:rPr>
         <w:t>protocolos</w:t>
@@ -40963,8 +40776,6 @@
         <w:rPr>
           <w:rFonts w:ascii="Arial Narrow" w:hAnsi="Arial Narrow"/>
           <w:color w:val="000000" w:themeColor="text1"/>
-          <w:sz w:val="18"/>
-          <w:szCs w:val="18"/>
           <w:lang w:val="es-ES"/>
         </w:rPr>
         <w:t xml:space="preserve"> se realizará con el uso de software CALIDAD CLOUD. </w:t>
@@ -40975,8 +40786,6 @@
           <w:b/>
           <w:bCs/>
           <w:color w:val="000000" w:themeColor="text1"/>
-          <w:sz w:val="18"/>
-          <w:szCs w:val="18"/>
           <w:lang w:val="es-ES"/>
         </w:rPr>
         <w:t>EL CONTRATISTA</w:t>
@@ -40985,8 +40794,6 @@
         <w:rPr>
           <w:rFonts w:ascii="Arial Narrow" w:hAnsi="Arial Narrow"/>
           <w:color w:val="000000" w:themeColor="text1"/>
-          <w:sz w:val="18"/>
-          <w:szCs w:val="18"/>
           <w:lang w:val="es-ES"/>
         </w:rPr>
         <w:t xml:space="preserve"> deberá tener actualizado todos sus protocolos a lo largo de toda la obra. </w:t>
@@ -40997,21 +40804,9 @@
           <w:b/>
           <w:bCs/>
           <w:color w:val="000000" w:themeColor="text1"/>
-          <w:sz w:val="18"/>
-          <w:szCs w:val="18"/>
-          <w:lang w:val="es-ES"/>
-        </w:rPr>
-        <w:t>El CONTRATANTE</w:t>
-      </w:r>
-      <w:r>
-        <w:rPr>
-          <w:rFonts w:ascii="Arial Narrow" w:hAnsi="Arial Narrow"/>
-          <w:color w:val="000000" w:themeColor="text1"/>
-          <w:sz w:val="18"/>
-          <w:szCs w:val="18"/>
-          <w:lang w:val="es-ES"/>
-        </w:rPr>
-        <w:t xml:space="preserve"> le asignará un número de usuario y contraseña para el uso del programa. </w:t>
+          <w:lang w:val="es-ES"/>
+        </w:rPr>
+        <w:t xml:space="preserve">El </w:t>
       </w:r>
       <w:r>
         <w:rPr>
@@ -41019,8 +40814,25 @@
           <w:b/>
           <w:bCs/>
           <w:color w:val="000000" w:themeColor="text1"/>
-          <w:sz w:val="18"/>
-          <w:szCs w:val="18"/>
+          <w:lang w:val="es-ES"/>
+        </w:rPr>
+        <w:lastRenderedPageBreak/>
+        <w:t>CONTRATANTE</w:t>
+      </w:r>
+      <w:r>
+        <w:rPr>
+          <w:rFonts w:ascii="Arial Narrow" w:hAnsi="Arial Narrow"/>
+          <w:color w:val="000000" w:themeColor="text1"/>
+          <w:lang w:val="es-ES"/>
+        </w:rPr>
+        <w:t xml:space="preserve"> le asignará un número de usuario y contraseña para el uso del programa. </w:t>
+      </w:r>
+      <w:r>
+        <w:rPr>
+          <w:rFonts w:ascii="Arial Narrow" w:hAnsi="Arial Narrow"/>
+          <w:b/>
+          <w:bCs/>
+          <w:color w:val="000000" w:themeColor="text1"/>
           <w:lang w:val="es-ES"/>
         </w:rPr>
         <w:t>El CONTRATANTE</w:t>
@@ -41029,8 +40841,6 @@
         <w:rPr>
           <w:rFonts w:ascii="Arial Narrow" w:hAnsi="Arial Narrow"/>
           <w:color w:val="000000" w:themeColor="text1"/>
-          <w:sz w:val="18"/>
-          <w:szCs w:val="18"/>
           <w:lang w:val="es-ES"/>
         </w:rPr>
         <w:t xml:space="preserve"> determinará los protocolos y la lista de ítems a revisar dentro de las liberaciones.</w:t>
@@ -41049,8 +40859,6 @@
         <w:jc w:val="both"/>
         <w:rPr>
           <w:rFonts w:ascii="Arial Narrow" w:hAnsi="Arial Narrow"/>
-          <w:sz w:val="18"/>
-          <w:szCs w:val="18"/>
           <w:lang w:val="es-ES"/>
         </w:rPr>
       </w:pPr>
@@ -41071,8 +40879,6 @@
         <w:jc w:val="both"/>
         <w:rPr>
           <w:rFonts w:ascii="Arial Narrow" w:hAnsi="Arial Narrow"/>
-          <w:sz w:val="18"/>
-          <w:szCs w:val="18"/>
           <w:lang w:val="es-ES"/>
         </w:rPr>
       </w:pPr>
@@ -41081,8 +40887,6 @@
           <w:rFonts w:ascii="Arial Narrow" w:hAnsi="Arial Narrow"/>
           <w:b/>
           <w:bCs/>
-          <w:sz w:val="18"/>
-          <w:szCs w:val="18"/>
           <w:lang w:val="es-ES"/>
         </w:rPr>
         <w:t xml:space="preserve">EL CONTRATISTA </w:t>
@@ -41090,8 +40894,6 @@
       <w:r>
         <w:rPr>
           <w:rFonts w:ascii="Arial Narrow" w:hAnsi="Arial Narrow"/>
-          <w:sz w:val="18"/>
-          <w:szCs w:val="18"/>
           <w:lang w:val="es-ES"/>
         </w:rPr>
         <w:t xml:space="preserve">debe de levantar las observaciones detectadas al momento de la revisión. El levantamiento de observación no deberá exceder un plazo de tres (3) días hábiles. Cualquier desviación de los plazos deberá ser previamente aprobada por </w:t>
@@ -41101,8 +40903,6 @@
           <w:rFonts w:ascii="Arial Narrow" w:hAnsi="Arial Narrow"/>
           <w:b/>
           <w:bCs/>
-          <w:sz w:val="18"/>
-          <w:szCs w:val="18"/>
           <w:lang w:val="es-ES"/>
         </w:rPr>
         <w:t>EL CONTRATANTE</w:t>
@@ -41110,8 +40910,6 @@
       <w:r>
         <w:rPr>
           <w:rFonts w:ascii="Arial Narrow" w:hAnsi="Arial Narrow"/>
-          <w:sz w:val="18"/>
-          <w:szCs w:val="18"/>
           <w:lang w:val="es-ES"/>
         </w:rPr>
         <w:t xml:space="preserve">.  </w:t>
@@ -41120,18 +40918,8 @@
     <w:p>
       <w:pPr>
         <w:pStyle w:val="Prrafodelista"/>
-        <w:tabs>
-          <w:tab w:val="clear" w:pos="1440"/>
-          <w:tab w:val="left" w:pos="708"/>
-        </w:tabs>
-        <w:spacing w:after="160" w:line="252" w:lineRule="auto"/>
-        <w:ind w:left="284" w:firstLine="0"/>
-        <w:contextualSpacing/>
-        <w:jc w:val="both"/>
-        <w:rPr>
-          <w:rFonts w:ascii="Arial Narrow" w:hAnsi="Arial Narrow"/>
-          <w:sz w:val="18"/>
-          <w:szCs w:val="18"/>
+        <w:rPr>
+          <w:rFonts w:ascii="Arial Narrow" w:hAnsi="Arial Narrow"/>
           <w:lang w:val="es-ES"/>
         </w:rPr>
       </w:pPr>
@@ -41152,30 +40940,14 @@
         <w:jc w:val="both"/>
         <w:rPr>
           <w:rFonts w:ascii="Arial Narrow" w:hAnsi="Arial Narrow"/>
-          <w:color w:val="000000" w:themeColor="text1"/>
-          <w:sz w:val="18"/>
-          <w:szCs w:val="18"/>
-          <w:lang w:val="es-ES"/>
-        </w:rPr>
-      </w:pPr>
-      <w:r>
-        <w:rPr>
-          <w:rFonts w:ascii="Arial Narrow" w:hAnsi="Arial Narrow"/>
-          <w:color w:val="000000" w:themeColor="text1"/>
-          <w:sz w:val="18"/>
-          <w:szCs w:val="18"/>
-          <w:lang w:val="es-ES"/>
-        </w:rPr>
-        <w:t xml:space="preserve">Cuando aplique, </w:t>
-      </w:r>
+          <w:lang w:val="es-ES"/>
+        </w:rPr>
+      </w:pPr>
       <w:r>
         <w:rPr>
           <w:rFonts w:ascii="Arial Narrow" w:hAnsi="Arial Narrow"/>
           <w:b/>
           <w:bCs/>
-          <w:color w:val="000000" w:themeColor="text1"/>
-          <w:sz w:val="18"/>
-          <w:szCs w:val="18"/>
           <w:lang w:val="es-ES"/>
         </w:rPr>
         <w:t>EL CONTRATANTE</w:t>
@@ -41183,56 +40955,41 @@
       <w:r>
         <w:rPr>
           <w:rFonts w:ascii="Arial Narrow" w:hAnsi="Arial Narrow"/>
-          <w:color w:val="000000" w:themeColor="text1"/>
-          <w:sz w:val="18"/>
-          <w:szCs w:val="18"/>
-          <w:lang w:val="es-ES"/>
-        </w:rPr>
-        <w:t xml:space="preserve"> coordinará una visita a sus instalaciones y/o fábrica de </w:t>
+          <w:lang w:val="es-ES"/>
+        </w:rPr>
+        <w:t xml:space="preserve"> elaborará el registro de REPORTE DE DAÑOS ante cada daño detectado que haya sido ocasionado por </w:t>
       </w:r>
       <w:r>
         <w:rPr>
           <w:rFonts w:ascii="Arial Narrow" w:hAnsi="Arial Narrow"/>
           <w:b/>
           <w:bCs/>
-          <w:color w:val="000000" w:themeColor="text1"/>
-          <w:sz w:val="18"/>
-          <w:szCs w:val="18"/>
-          <w:lang w:val="es-ES"/>
-        </w:rPr>
-        <w:t xml:space="preserve">EL CONTRATISTA </w:t>
-      </w:r>
-      <w:r>
-        <w:rPr>
-          <w:rFonts w:ascii="Arial Narrow" w:hAnsi="Arial Narrow"/>
-          <w:color w:val="000000" w:themeColor="text1"/>
-          <w:sz w:val="18"/>
-          <w:szCs w:val="18"/>
-          <w:lang w:val="es-ES"/>
-        </w:rPr>
-        <w:t>para verificar que se están cumpliendo con los requisitos del proyecto. Esta visita al taller y/o lugar de trabajo se podrá dar en cualquier momento dentro del desarrollo de la obra. La visita debe de contar con la presencia del representante legal y supervisor de</w:t>
+          <w:lang w:val="es-ES"/>
+        </w:rPr>
+        <w:t>EL CONTRATISTA</w:t>
+      </w:r>
+      <w:r>
+        <w:rPr>
+          <w:rFonts w:ascii="Arial Narrow" w:hAnsi="Arial Narrow"/>
+          <w:lang w:val="es-ES"/>
+        </w:rPr>
+        <w:t xml:space="preserve">. Asimismo, será obligación de </w:t>
       </w:r>
       <w:r>
         <w:rPr>
           <w:rFonts w:ascii="Arial Narrow" w:hAnsi="Arial Narrow"/>
           <w:b/>
           <w:bCs/>
-          <w:color w:val="000000" w:themeColor="text1"/>
-          <w:sz w:val="18"/>
-          <w:szCs w:val="18"/>
-          <w:lang w:val="es-ES"/>
-        </w:rPr>
-        <w:t xml:space="preserve"> EL CONTRATISTA</w:t>
-      </w:r>
-      <w:r>
-        <w:rPr>
-          <w:rFonts w:ascii="Arial Narrow" w:hAnsi="Arial Narrow"/>
-          <w:color w:val="000000" w:themeColor="text1"/>
-          <w:sz w:val="18"/>
-          <w:szCs w:val="18"/>
-          <w:lang w:val="es-ES"/>
-        </w:rPr>
-        <w:t>.</w:t>
+          <w:lang w:val="es-ES"/>
+        </w:rPr>
+        <w:t>EL CONTRATISTA</w:t>
+      </w:r>
+      <w:r>
+        <w:rPr>
+          <w:rFonts w:ascii="Arial Narrow" w:hAnsi="Arial Narrow"/>
+          <w:lang w:val="es-ES"/>
+        </w:rPr>
+        <w:t xml:space="preserve"> firmar dicho reporte como constancia de recepción.</w:t>
       </w:r>
     </w:p>
     <w:p>
@@ -41248,8 +41005,6 @@
         <w:jc w:val="both"/>
         <w:rPr>
           <w:rFonts w:ascii="Arial Narrow" w:hAnsi="Arial Narrow"/>
-          <w:sz w:val="18"/>
-          <w:szCs w:val="18"/>
           <w:lang w:val="es-ES"/>
         </w:rPr>
       </w:pPr>
@@ -41270,27 +41025,24 @@
         <w:jc w:val="both"/>
         <w:rPr>
           <w:rFonts w:ascii="Arial Narrow" w:hAnsi="Arial Narrow"/>
-          <w:sz w:val="18"/>
-          <w:szCs w:val="18"/>
-          <w:lang w:val="es-ES"/>
-        </w:rPr>
-      </w:pPr>
-      <w:r>
-        <w:rPr>
-          <w:rFonts w:ascii="Arial Narrow" w:hAnsi="Arial Narrow"/>
-          <w:sz w:val="18"/>
-          <w:szCs w:val="18"/>
-          <w:lang w:val="es-ES"/>
-        </w:rPr>
-        <w:t xml:space="preserve">EL CONTRATISTA debe trabajar con planos aprobados por </w:t>
+          <w:color w:val="000000" w:themeColor="text1"/>
+          <w:lang w:val="es-ES"/>
+        </w:rPr>
+      </w:pPr>
+      <w:r>
+        <w:rPr>
+          <w:rFonts w:ascii="Arial Narrow" w:hAnsi="Arial Narrow"/>
+          <w:color w:val="000000" w:themeColor="text1"/>
+          <w:lang w:val="es-ES"/>
+        </w:rPr>
+        <w:t xml:space="preserve">Cuando aplique, </w:t>
       </w:r>
       <w:r>
         <w:rPr>
           <w:rFonts w:ascii="Arial Narrow" w:hAnsi="Arial Narrow"/>
           <w:b/>
           <w:bCs/>
-          <w:sz w:val="18"/>
-          <w:szCs w:val="18"/>
+          <w:color w:val="000000" w:themeColor="text1"/>
           <w:lang w:val="es-ES"/>
         </w:rPr>
         <w:t>EL CONTRATANTE</w:t>
@@ -41298,79 +41050,46 @@
       <w:r>
         <w:rPr>
           <w:rFonts w:ascii="Arial Narrow" w:hAnsi="Arial Narrow"/>
-          <w:sz w:val="18"/>
-          <w:szCs w:val="18"/>
-          <w:lang w:val="es-ES"/>
-        </w:rPr>
-        <w:t xml:space="preserve">, y tenerlos en los puntos de trabajo, esto será </w:t>
-      </w:r>
-      <w:r>
-        <w:rPr>
-          <w:rFonts w:ascii="Arial Narrow" w:hAnsi="Arial Narrow"/>
           <w:color w:val="000000" w:themeColor="text1"/>
-          <w:sz w:val="18"/>
-          <w:szCs w:val="18"/>
-          <w:lang w:val="es-ES"/>
-        </w:rPr>
-        <w:t>verificado</w:t>
-      </w:r>
-      <w:r>
-        <w:rPr>
-          <w:rFonts w:ascii="Arial Narrow" w:hAnsi="Arial Narrow"/>
-          <w:sz w:val="18"/>
-          <w:szCs w:val="18"/>
-          <w:lang w:val="es-ES"/>
-        </w:rPr>
-        <w:t xml:space="preserve"> por </w:t>
+          <w:lang w:val="es-ES"/>
+        </w:rPr>
+        <w:t xml:space="preserve"> coordinará una visita a sus instalaciones y/o fábrica de </w:t>
       </w:r>
       <w:r>
         <w:rPr>
           <w:rFonts w:ascii="Arial Narrow" w:hAnsi="Arial Narrow"/>
           <w:b/>
           <w:bCs/>
-          <w:sz w:val="18"/>
-          <w:szCs w:val="18"/>
-          <w:lang w:val="es-ES"/>
-        </w:rPr>
-        <w:t>EL CONTRATANTE</w:t>
-      </w:r>
-      <w:r>
-        <w:rPr>
-          <w:rFonts w:ascii="Arial Narrow" w:hAnsi="Arial Narrow"/>
-          <w:sz w:val="18"/>
-          <w:szCs w:val="18"/>
+          <w:color w:val="000000" w:themeColor="text1"/>
+          <w:lang w:val="es-ES"/>
+        </w:rPr>
+        <w:t xml:space="preserve">EL CONTRATISTA </w:t>
+      </w:r>
+      <w:r>
+        <w:rPr>
+          <w:rFonts w:ascii="Arial Narrow" w:hAnsi="Arial Narrow"/>
+          <w:color w:val="000000" w:themeColor="text1"/>
+          <w:lang w:val="es-ES"/>
+        </w:rPr>
+        <w:t>para verificar que se están cumpliendo con los requisitos del proyecto. Esta visita al taller y/o lugar de trabajo se podrá dar en cualquier momento dentro del desarrollo de la obra. La visita debe de contar con la presencia del representante legal y supervisor de</w:t>
+      </w:r>
+      <w:r>
+        <w:rPr>
+          <w:rFonts w:ascii="Arial Narrow" w:hAnsi="Arial Narrow"/>
+          <w:b/>
+          <w:bCs/>
+          <w:color w:val="000000" w:themeColor="text1"/>
+          <w:lang w:val="es-ES"/>
+        </w:rPr>
+        <w:t xml:space="preserve"> EL CONTRATISTA</w:t>
+      </w:r>
+      <w:r>
+        <w:rPr>
+          <w:rFonts w:ascii="Arial Narrow" w:hAnsi="Arial Narrow"/>
+          <w:color w:val="000000" w:themeColor="text1"/>
           <w:lang w:val="es-ES"/>
         </w:rPr>
         <w:t>.</w:t>
-      </w:r>
-      <w:r>
-        <w:rPr>
-          <w:rFonts w:ascii="Arial Narrow" w:hAnsi="Arial Narrow"/>
-          <w:color w:val="000000" w:themeColor="text1"/>
-          <w:sz w:val="18"/>
-          <w:szCs w:val="18"/>
-          <w:lang w:val="es-ES"/>
-        </w:rPr>
-        <w:t xml:space="preserve"> </w:t>
-      </w:r>
-      <w:r>
-        <w:rPr>
-          <w:rFonts w:ascii="Arial Narrow" w:hAnsi="Arial Narrow"/>
-          <w:sz w:val="18"/>
-          <w:szCs w:val="18"/>
-          <w:lang w:val="es-ES"/>
-        </w:rPr>
-        <w:t xml:space="preserve"> </w:t>
-      </w:r>
-      <w:r>
-        <w:rPr>
-          <w:rFonts w:ascii="Arial Narrow" w:hAnsi="Arial Narrow"/>
-          <w:color w:val="000000" w:themeColor="text1"/>
-          <w:sz w:val="18"/>
-          <w:szCs w:val="18"/>
-          <w:lang w:val="es-ES"/>
-        </w:rPr>
-        <w:t xml:space="preserve"> </w:t>
       </w:r>
     </w:p>
     <w:p>
@@ -41386,8 +41105,6 @@
         <w:jc w:val="both"/>
         <w:rPr>
           <w:rFonts w:ascii="Arial Narrow" w:hAnsi="Arial Narrow"/>
-          <w:sz w:val="18"/>
-          <w:szCs w:val="18"/>
           <w:lang w:val="es-ES"/>
         </w:rPr>
       </w:pPr>
@@ -41408,97 +41125,100 @@
         <w:jc w:val="both"/>
         <w:rPr>
           <w:rFonts w:ascii="Arial Narrow" w:hAnsi="Arial Narrow"/>
+          <w:lang w:val="es-ES"/>
+        </w:rPr>
+      </w:pPr>
+      <w:r>
+        <w:rPr>
+          <w:rFonts w:ascii="Arial Narrow" w:hAnsi="Arial Narrow"/>
+          <w:lang w:val="es-ES"/>
+        </w:rPr>
+        <w:t xml:space="preserve">EL CONTRATISTA debe trabajar con planos aprobados por </w:t>
+      </w:r>
+      <w:r>
+        <w:rPr>
+          <w:rFonts w:ascii="Arial Narrow" w:hAnsi="Arial Narrow"/>
+          <w:b/>
+          <w:bCs/>
+          <w:lang w:val="es-ES"/>
+        </w:rPr>
+        <w:t>EL CONTRATANTE</w:t>
+      </w:r>
+      <w:r>
+        <w:rPr>
+          <w:rFonts w:ascii="Arial Narrow" w:hAnsi="Arial Narrow"/>
+          <w:lang w:val="es-ES"/>
+        </w:rPr>
+        <w:t xml:space="preserve">, y tenerlos en los puntos de trabajo, esto será </w:t>
+      </w:r>
+      <w:r>
+        <w:rPr>
+          <w:rFonts w:ascii="Arial Narrow" w:hAnsi="Arial Narrow"/>
           <w:color w:val="000000" w:themeColor="text1"/>
-          <w:sz w:val="18"/>
-          <w:szCs w:val="18"/>
-          <w:lang w:val="es-ES"/>
-        </w:rPr>
-      </w:pPr>
+          <w:lang w:val="es-ES"/>
+        </w:rPr>
+        <w:t>verificado</w:t>
+      </w:r>
+      <w:r>
+        <w:rPr>
+          <w:rFonts w:ascii="Arial Narrow" w:hAnsi="Arial Narrow"/>
+          <w:lang w:val="es-ES"/>
+        </w:rPr>
+        <w:t xml:space="preserve"> por </w:t>
+      </w:r>
+      <w:r>
+        <w:rPr>
+          <w:rFonts w:ascii="Arial Narrow" w:hAnsi="Arial Narrow"/>
+          <w:b/>
+          <w:bCs/>
+          <w:lang w:val="es-ES"/>
+        </w:rPr>
+        <w:t>EL CONTRATANTE</w:t>
+      </w:r>
+      <w:r>
+        <w:rPr>
+          <w:rFonts w:ascii="Arial Narrow" w:hAnsi="Arial Narrow"/>
+          <w:lang w:val="es-ES"/>
+        </w:rPr>
+        <w:t>.</w:t>
+      </w:r>
       <w:r>
         <w:rPr>
           <w:rFonts w:ascii="Arial Narrow" w:hAnsi="Arial Narrow"/>
           <w:color w:val="000000" w:themeColor="text1"/>
-          <w:sz w:val="18"/>
-          <w:szCs w:val="18"/>
-          <w:lang w:val="es-ES"/>
-        </w:rPr>
-        <w:t xml:space="preserve">Trabajos de instalaciones de especialidades: </w:t>
-      </w:r>
-      <w:r>
-        <w:rPr>
-          <w:rFonts w:ascii="Arial Narrow" w:hAnsi="Arial Narrow"/>
-          <w:b/>
-          <w:bCs/>
+          <w:lang w:val="es-ES"/>
+        </w:rPr>
+        <w:t xml:space="preserve"> </w:t>
+      </w:r>
+      <w:r>
+        <w:rPr>
+          <w:rFonts w:ascii="Arial Narrow" w:hAnsi="Arial Narrow"/>
+          <w:lang w:val="es-ES"/>
+        </w:rPr>
+        <w:t xml:space="preserve"> </w:t>
+      </w:r>
+      <w:r>
+        <w:rPr>
+          <w:rFonts w:ascii="Arial Narrow" w:hAnsi="Arial Narrow"/>
           <w:color w:val="000000" w:themeColor="text1"/>
-          <w:sz w:val="18"/>
-          <w:szCs w:val="18"/>
-          <w:lang w:val="es-ES"/>
-        </w:rPr>
-        <w:t>EL CONTRATISTA</w:t>
-      </w:r>
-      <w:r>
-        <w:rPr>
-          <w:rFonts w:ascii="Arial Narrow" w:hAnsi="Arial Narrow"/>
-          <w:color w:val="000000" w:themeColor="text1"/>
-          <w:sz w:val="18"/>
-          <w:szCs w:val="18"/>
-          <w:lang w:val="es-ES"/>
-        </w:rPr>
-        <w:t xml:space="preserve"> deberá enviar la actualización de planos As-Built y memoria descriptiva previo a cada valorización. Al finalizar el proyecto, y en la fecha indicada por </w:t>
-      </w:r>
-      <w:r>
-        <w:rPr>
-          <w:rFonts w:ascii="Arial Narrow" w:hAnsi="Arial Narrow"/>
-          <w:b/>
-          <w:bCs/>
-          <w:color w:val="000000" w:themeColor="text1"/>
-          <w:sz w:val="18"/>
-          <w:szCs w:val="18"/>
-          <w:lang w:val="es-ES"/>
-        </w:rPr>
-        <w:t>EL CONTRATANTE</w:t>
-      </w:r>
-      <w:r>
-        <w:rPr>
-          <w:rFonts w:ascii="Arial Narrow" w:hAnsi="Arial Narrow"/>
-          <w:color w:val="000000" w:themeColor="text1"/>
-          <w:sz w:val="18"/>
-          <w:szCs w:val="18"/>
-          <w:lang w:val="es-ES"/>
-        </w:rPr>
-        <w:t xml:space="preserve">, </w:t>
-      </w:r>
-      <w:r>
-        <w:rPr>
-          <w:rFonts w:ascii="Arial Narrow" w:hAnsi="Arial Narrow"/>
-          <w:b/>
-          <w:bCs/>
-          <w:color w:val="000000" w:themeColor="text1"/>
-          <w:sz w:val="18"/>
-          <w:szCs w:val="18"/>
-          <w:lang w:val="es-ES"/>
-        </w:rPr>
-        <w:t>EL CONTRATISTA</w:t>
-      </w:r>
-      <w:r>
-        <w:rPr>
-          <w:rFonts w:ascii="Arial Narrow" w:hAnsi="Arial Narrow"/>
-          <w:color w:val="000000" w:themeColor="text1"/>
-          <w:sz w:val="18"/>
-          <w:szCs w:val="18"/>
-          <w:lang w:val="es-ES"/>
-        </w:rPr>
-        <w:t xml:space="preserve"> deberá entregar los planos As-Built y memoria descriptiva finales de la obra, asegurándose de que estos sean consistentes y compatibles con lo efectivamente ejecutado.</w:t>
+          <w:lang w:val="es-ES"/>
+        </w:rPr>
+        <w:t xml:space="preserve"> </w:t>
       </w:r>
     </w:p>
     <w:p>
       <w:pPr>
         <w:pStyle w:val="Prrafodelista"/>
-        <w:rPr>
-          <w:rFonts w:ascii="Arial Narrow" w:hAnsi="Arial Narrow"/>
-          <w:color w:val="000000" w:themeColor="text1"/>
-          <w:sz w:val="18"/>
-          <w:szCs w:val="18"/>
+        <w:tabs>
+          <w:tab w:val="clear" w:pos="1440"/>
+          <w:tab w:val="left" w:pos="708"/>
+        </w:tabs>
+        <w:spacing w:after="160" w:line="252" w:lineRule="auto"/>
+        <w:ind w:left="284" w:firstLine="0"/>
+        <w:contextualSpacing/>
+        <w:jc w:val="both"/>
+        <w:rPr>
+          <w:rFonts w:ascii="Arial Narrow" w:hAnsi="Arial Narrow"/>
           <w:lang w:val="es-ES"/>
         </w:rPr>
       </w:pPr>
@@ -41519,27 +41239,24 @@
         <w:jc w:val="both"/>
         <w:rPr>
           <w:rFonts w:ascii="Arial Narrow" w:hAnsi="Arial Narrow"/>
-          <w:sz w:val="18"/>
-          <w:szCs w:val="18"/>
-          <w:lang w:val="es-ES"/>
-        </w:rPr>
-      </w:pPr>
-      <w:r>
-        <w:rPr>
-          <w:rFonts w:ascii="Arial Narrow" w:hAnsi="Arial Narrow"/>
-          <w:sz w:val="18"/>
-          <w:szCs w:val="18"/>
-          <w:lang w:val="es-ES"/>
-        </w:rPr>
-        <w:t xml:space="preserve">En caso de que </w:t>
+          <w:color w:val="000000" w:themeColor="text1"/>
+          <w:lang w:val="es-ES"/>
+        </w:rPr>
+      </w:pPr>
+      <w:r>
+        <w:rPr>
+          <w:rFonts w:ascii="Arial Narrow" w:hAnsi="Arial Narrow"/>
+          <w:color w:val="000000" w:themeColor="text1"/>
+          <w:lang w:val="es-ES"/>
+        </w:rPr>
+        <w:t xml:space="preserve">Trabajos de instalaciones de especialidades: </w:t>
       </w:r>
       <w:r>
         <w:rPr>
           <w:rFonts w:ascii="Arial Narrow" w:hAnsi="Arial Narrow"/>
           <w:b/>
           <w:bCs/>
-          <w:sz w:val="18"/>
-          <w:szCs w:val="18"/>
+          <w:color w:val="000000" w:themeColor="text1"/>
           <w:lang w:val="es-ES"/>
         </w:rPr>
         <w:t>EL CONTRATISTA</w:t>
@@ -41547,31 +41264,82 @@
       <w:r>
         <w:rPr>
           <w:rFonts w:ascii="Arial Narrow" w:hAnsi="Arial Narrow"/>
-          <w:sz w:val="18"/>
-          <w:szCs w:val="18"/>
-          <w:lang w:val="es-ES"/>
-        </w:rPr>
-        <w:t xml:space="preserve"> incurra en errores, omisiones o inconsistencias en la información proporcionada en los planos asbuilt, memorias descriptivas actualizadas, cartas de garantía o cualquier otra documentación contractual o técnica, y dichos errores sean detectados por los propietarios, el </w:t>
+          <w:color w:val="000000" w:themeColor="text1"/>
+          <w:lang w:val="es-ES"/>
+        </w:rPr>
+        <w:t xml:space="preserve"> deberá enviar la actualización de planos As-</w:t>
+      </w:r>
+      <w:proofErr w:type="spellStart"/>
+      <w:r>
+        <w:rPr>
+          <w:rFonts w:ascii="Arial Narrow" w:hAnsi="Arial Narrow"/>
+          <w:color w:val="000000" w:themeColor="text1"/>
+          <w:lang w:val="es-ES"/>
+        </w:rPr>
+        <w:t>Built</w:t>
+      </w:r>
+      <w:proofErr w:type="spellEnd"/>
+      <w:r>
+        <w:rPr>
+          <w:rFonts w:ascii="Arial Narrow" w:hAnsi="Arial Narrow"/>
+          <w:color w:val="000000" w:themeColor="text1"/>
+          <w:lang w:val="es-ES"/>
+        </w:rPr>
+        <w:t xml:space="preserve"> y memoria descriptiva previo a cada valorización. Al finalizar el proyecto, y en la fecha indicada por </w:t>
       </w:r>
       <w:r>
         <w:rPr>
           <w:rFonts w:ascii="Arial Narrow" w:hAnsi="Arial Narrow"/>
           <w:b/>
           <w:bCs/>
-          <w:sz w:val="18"/>
-          <w:szCs w:val="18"/>
-          <w:lang w:val="es-ES"/>
-        </w:rPr>
-        <w:t>CONTRATISTA</w:t>
-      </w:r>
-      <w:r>
-        <w:rPr>
-          <w:rFonts w:ascii="Arial Narrow" w:hAnsi="Arial Narrow"/>
-          <w:sz w:val="18"/>
-          <w:szCs w:val="18"/>
-          <w:lang w:val="es-ES"/>
-        </w:rPr>
-        <w:t xml:space="preserve"> deberá asumir los costos asociados a las implementaciones adicionales, correcciones, reprocesos o requerimientos solicitados por los clientes que resulten necesarios como consecuencia de tales errores.</w:t>
+          <w:color w:val="000000" w:themeColor="text1"/>
+          <w:lang w:val="es-ES"/>
+        </w:rPr>
+        <w:t>EL CONTRATANTE</w:t>
+      </w:r>
+      <w:r>
+        <w:rPr>
+          <w:rFonts w:ascii="Arial Narrow" w:hAnsi="Arial Narrow"/>
+          <w:color w:val="000000" w:themeColor="text1"/>
+          <w:lang w:val="es-ES"/>
+        </w:rPr>
+        <w:t xml:space="preserve">, </w:t>
+      </w:r>
+      <w:r>
+        <w:rPr>
+          <w:rFonts w:ascii="Arial Narrow" w:hAnsi="Arial Narrow"/>
+          <w:b/>
+          <w:bCs/>
+          <w:color w:val="000000" w:themeColor="text1"/>
+          <w:lang w:val="es-ES"/>
+        </w:rPr>
+        <w:t>EL CONTRATISTA</w:t>
+      </w:r>
+      <w:r>
+        <w:rPr>
+          <w:rFonts w:ascii="Arial Narrow" w:hAnsi="Arial Narrow"/>
+          <w:color w:val="000000" w:themeColor="text1"/>
+          <w:lang w:val="es-ES"/>
+        </w:rPr>
+        <w:t xml:space="preserve"> deberá entregar los planos As-</w:t>
+      </w:r>
+      <w:proofErr w:type="spellStart"/>
+      <w:r>
+        <w:rPr>
+          <w:rFonts w:ascii="Arial Narrow" w:hAnsi="Arial Narrow"/>
+          <w:color w:val="000000" w:themeColor="text1"/>
+          <w:lang w:val="es-ES"/>
+        </w:rPr>
+        <w:t>Built</w:t>
+      </w:r>
+      <w:proofErr w:type="spellEnd"/>
+      <w:r>
+        <w:rPr>
+          <w:rFonts w:ascii="Arial Narrow" w:hAnsi="Arial Narrow"/>
+          <w:color w:val="000000" w:themeColor="text1"/>
+          <w:lang w:val="es-ES"/>
+        </w:rPr>
+        <w:t xml:space="preserve"> y memoria descriptiva finales de la obra, asegurándose de que estos sean consistentes y compatibles con lo efectivamente ejecutado.</w:t>
       </w:r>
     </w:p>
     <w:p>
@@ -41580,8 +41348,6 @@
         <w:rPr>
           <w:rFonts w:ascii="Arial Narrow" w:hAnsi="Arial Narrow"/>
           <w:color w:val="000000" w:themeColor="text1"/>
-          <w:sz w:val="18"/>
-          <w:szCs w:val="18"/>
           <w:lang w:val="es-ES"/>
         </w:rPr>
       </w:pPr>
@@ -41602,51 +41368,71 @@
         <w:jc w:val="both"/>
         <w:rPr>
           <w:rFonts w:ascii="Arial Narrow" w:hAnsi="Arial Narrow"/>
+          <w:lang w:val="es-ES"/>
+        </w:rPr>
+      </w:pPr>
+      <w:r>
+        <w:rPr>
+          <w:rFonts w:ascii="Arial Narrow" w:hAnsi="Arial Narrow"/>
+          <w:lang w:val="es-ES"/>
+        </w:rPr>
+        <w:t xml:space="preserve">En caso de que </w:t>
+      </w:r>
+      <w:r>
+        <w:rPr>
+          <w:rFonts w:ascii="Arial Narrow" w:hAnsi="Arial Narrow"/>
+          <w:b/>
+          <w:bCs/>
+          <w:lang w:val="es-ES"/>
+        </w:rPr>
+        <w:t>EL CONTRATISTA</w:t>
+      </w:r>
+      <w:r>
+        <w:rPr>
+          <w:rFonts w:ascii="Arial Narrow" w:hAnsi="Arial Narrow"/>
+          <w:lang w:val="es-ES"/>
+        </w:rPr>
+        <w:t xml:space="preserve"> incurra en errores, omisiones o inconsistencias en la información proporcionada en los planos </w:t>
+      </w:r>
+      <w:proofErr w:type="spellStart"/>
+      <w:r>
+        <w:rPr>
+          <w:rFonts w:ascii="Arial Narrow" w:hAnsi="Arial Narrow"/>
+          <w:lang w:val="es-ES"/>
+        </w:rPr>
+        <w:t>asbuilt</w:t>
+      </w:r>
+      <w:proofErr w:type="spellEnd"/>
+      <w:r>
+        <w:rPr>
+          <w:rFonts w:ascii="Arial Narrow" w:hAnsi="Arial Narrow"/>
+          <w:lang w:val="es-ES"/>
+        </w:rPr>
+        <w:t xml:space="preserve">, memorias descriptivas actualizadas, cartas de garantía o cualquier otra documentación contractual o técnica, y dichos errores sean detectados por los propietarios, el </w:t>
+      </w:r>
+      <w:r>
+        <w:rPr>
+          <w:rFonts w:ascii="Arial Narrow" w:hAnsi="Arial Narrow"/>
+          <w:b/>
+          <w:bCs/>
+          <w:lang w:val="es-ES"/>
+        </w:rPr>
+        <w:t>CONTRATISTA</w:t>
+      </w:r>
+      <w:r>
+        <w:rPr>
+          <w:rFonts w:ascii="Arial Narrow" w:hAnsi="Arial Narrow"/>
+          <w:lang w:val="es-ES"/>
+        </w:rPr>
+        <w:t xml:space="preserve"> deberá asumir los costos asociados a las implementaciones adicionales, correcciones, reprocesos o requerimientos solicitados por los clientes que resulten necesarios como consecuencia de tales errores.</w:t>
+      </w:r>
+    </w:p>
+    <w:p>
+      <w:pPr>
+        <w:pStyle w:val="Prrafodelista"/>
+        <w:rPr>
+          <w:rFonts w:ascii="Arial Narrow" w:hAnsi="Arial Narrow"/>
           <w:color w:val="000000" w:themeColor="text1"/>
-          <w:sz w:val="18"/>
-          <w:szCs w:val="18"/>
-          <w:lang w:val="es-ES"/>
-        </w:rPr>
-      </w:pPr>
-      <w:r>
-        <w:rPr>
-          <w:rFonts w:ascii="Arial Narrow" w:hAnsi="Arial Narrow"/>
-          <w:b/>
-          <w:bCs/>
-          <w:color w:val="000000" w:themeColor="text1"/>
-          <w:sz w:val="18"/>
-          <w:szCs w:val="18"/>
-          <w:lang w:val="es-ES"/>
-        </w:rPr>
-        <w:t>EL CONTRATISTA</w:t>
-      </w:r>
-      <w:r>
-        <w:rPr>
-          <w:rFonts w:ascii="Arial Narrow" w:hAnsi="Arial Narrow"/>
-          <w:color w:val="000000" w:themeColor="text1"/>
-          <w:sz w:val="18"/>
-          <w:szCs w:val="18"/>
-          <w:lang w:val="es-ES"/>
-        </w:rPr>
-        <w:t xml:space="preserve"> deberá utilizar materiales de calidad aprobadas para el proyecto y de acuerdo con lo estipulado en el instructivo de calidad.</w:t>
-      </w:r>
-    </w:p>
-    <w:p>
-      <w:pPr>
-        <w:pStyle w:val="Prrafodelista"/>
-        <w:tabs>
-          <w:tab w:val="clear" w:pos="1440"/>
-          <w:tab w:val="left" w:pos="708"/>
-        </w:tabs>
-        <w:spacing w:after="160" w:line="252" w:lineRule="auto"/>
-        <w:ind w:left="284" w:firstLine="0"/>
-        <w:contextualSpacing/>
-        <w:jc w:val="both"/>
-        <w:rPr>
-          <w:rFonts w:ascii="Arial Narrow" w:hAnsi="Arial Narrow"/>
-          <w:color w:val="000000" w:themeColor="text1"/>
-          <w:sz w:val="18"/>
-          <w:szCs w:val="18"/>
           <w:lang w:val="es-ES"/>
         </w:rPr>
       </w:pPr>
@@ -41667,59 +41453,27 @@
         <w:jc w:val="both"/>
         <w:rPr>
           <w:rFonts w:ascii="Arial Narrow" w:hAnsi="Arial Narrow"/>
-          <w:sz w:val="18"/>
-          <w:szCs w:val="18"/>
-          <w:lang w:val="es-ES"/>
-        </w:rPr>
-      </w:pPr>
-      <w:r>
-        <w:rPr>
-          <w:rFonts w:ascii="Arial Narrow" w:hAnsi="Arial Narrow"/>
-          <w:sz w:val="18"/>
-          <w:szCs w:val="18"/>
-          <w:lang w:val="es-ES"/>
-        </w:rPr>
-        <w:t xml:space="preserve">El contratista debe presentar las calibraciones y certificados de calidad de los equipos, herramientas e instrumentos que serán utilizados en la obra. El listado, el detalle de los certificados y su emisión deberá ser solicitado a </w:t>
-      </w:r>
+          <w:color w:val="000000" w:themeColor="text1"/>
+          <w:lang w:val="es-ES"/>
+        </w:rPr>
+      </w:pPr>
       <w:r>
         <w:rPr>
           <w:rFonts w:ascii="Arial Narrow" w:hAnsi="Arial Narrow"/>
           <w:b/>
           <w:bCs/>
-          <w:sz w:val="18"/>
-          <w:szCs w:val="18"/>
-          <w:lang w:val="es-ES"/>
-        </w:rPr>
-        <w:t>EL CONTRATANTE</w:t>
-      </w:r>
-      <w:r>
-        <w:rPr>
-          <w:rFonts w:ascii="Arial Narrow" w:hAnsi="Arial Narrow"/>
-          <w:sz w:val="18"/>
-          <w:szCs w:val="18"/>
-          <w:lang w:val="es-ES"/>
-        </w:rPr>
-        <w:t xml:space="preserve"> al ingreso de obra pudiendo variar en el transcurso del proyecto</w:t>
-      </w:r>
-      <w:r>
-        <w:rPr>
-          <w:rFonts w:ascii="Arial Narrow" w:hAnsi="Arial Narrow"/>
-          <w:b/>
-          <w:bCs/>
-          <w:sz w:val="18"/>
-          <w:szCs w:val="18"/>
-          <w:lang w:val="es-ES"/>
-        </w:rPr>
-        <w:t>. EL CONTRATISTA</w:t>
-      </w:r>
-      <w:r>
-        <w:rPr>
-          <w:rFonts w:ascii="Arial Narrow" w:hAnsi="Arial Narrow"/>
-          <w:sz w:val="18"/>
-          <w:szCs w:val="18"/>
-          <w:lang w:val="es-ES"/>
-        </w:rPr>
-        <w:t xml:space="preserve"> deberá mantener en obra la cantidad suficiente de herramientas y/o equipos para poder realizar sus trabajos.</w:t>
+          <w:color w:val="000000" w:themeColor="text1"/>
+          <w:lang w:val="es-ES"/>
+        </w:rPr>
+        <w:t>EL CONTRATISTA</w:t>
+      </w:r>
+      <w:r>
+        <w:rPr>
+          <w:rFonts w:ascii="Arial Narrow" w:hAnsi="Arial Narrow"/>
+          <w:color w:val="000000" w:themeColor="text1"/>
+          <w:lang w:val="es-ES"/>
+        </w:rPr>
+        <w:t xml:space="preserve"> deberá utilizar materiales de calidad aprobadas para el proyecto y de acuerdo con lo estipulado en el instructivo de calidad.</w:t>
       </w:r>
     </w:p>
     <w:p>
@@ -41736,8 +41490,6 @@
         <w:rPr>
           <w:rFonts w:ascii="Arial Narrow" w:hAnsi="Arial Narrow"/>
           <w:color w:val="000000" w:themeColor="text1"/>
-          <w:sz w:val="18"/>
-          <w:szCs w:val="18"/>
           <w:lang w:val="es-ES"/>
         </w:rPr>
       </w:pPr>
@@ -41758,70 +41510,47 @@
         <w:jc w:val="both"/>
         <w:rPr>
           <w:rFonts w:ascii="Arial Narrow" w:hAnsi="Arial Narrow"/>
-          <w:sz w:val="18"/>
-          <w:szCs w:val="18"/>
-          <w:lang w:val="es-ES"/>
-        </w:rPr>
-      </w:pPr>
+          <w:lang w:val="es-ES"/>
+        </w:rPr>
+      </w:pPr>
+      <w:r>
+        <w:rPr>
+          <w:rFonts w:ascii="Arial Narrow" w:hAnsi="Arial Narrow"/>
+          <w:lang w:val="es-ES"/>
+        </w:rPr>
+        <w:t xml:space="preserve">El contratista debe presentar las calibraciones y certificados de calidad de los equipos, herramientas e instrumentos que serán utilizados en la obra. El listado, el detalle de los certificados y su emisión deberá ser solicitado a </w:t>
+      </w:r>
       <w:r>
         <w:rPr>
           <w:rFonts w:ascii="Arial Narrow" w:hAnsi="Arial Narrow"/>
           <w:b/>
           <w:bCs/>
-          <w:sz w:val="18"/>
-          <w:szCs w:val="18"/>
-          <w:lang w:val="es-ES"/>
-        </w:rPr>
-        <w:t>EL CONTRATISTA</w:t>
-      </w:r>
-      <w:r>
-        <w:rPr>
-          <w:rFonts w:ascii="Arial Narrow" w:hAnsi="Arial Narrow"/>
-          <w:sz w:val="18"/>
-          <w:szCs w:val="18"/>
-          <w:lang w:val="es-ES"/>
-        </w:rPr>
-        <w:t xml:space="preserve"> debe cumplir con el levantamiento de las Salidas No Conformes y/o No Conformidades detectadas en la obra y levantar estos reportes identificados por </w:t>
+          <w:lang w:val="es-ES"/>
+        </w:rPr>
+        <w:t>EL CONTRATANTE</w:t>
+      </w:r>
+      <w:r>
+        <w:rPr>
+          <w:rFonts w:ascii="Arial Narrow" w:hAnsi="Arial Narrow"/>
+          <w:lang w:val="es-ES"/>
+        </w:rPr>
+        <w:t xml:space="preserve"> al ingreso de obra pudiendo variar en el transcurso del proyecto</w:t>
       </w:r>
       <w:r>
         <w:rPr>
           <w:rFonts w:ascii="Arial Narrow" w:hAnsi="Arial Narrow"/>
           <w:b/>
           <w:bCs/>
-          <w:sz w:val="18"/>
-          <w:szCs w:val="18"/>
-          <w:lang w:val="es-ES"/>
-        </w:rPr>
-        <w:t xml:space="preserve">EL CONTRATANTE </w:t>
-      </w:r>
-      <w:r>
-        <w:rPr>
-          <w:rFonts w:ascii="Arial Narrow" w:hAnsi="Arial Narrow"/>
-          <w:sz w:val="18"/>
-          <w:szCs w:val="18"/>
-          <w:lang w:val="es-ES"/>
-        </w:rPr>
-        <w:t xml:space="preserve">en plazo máximo de tres (3) días hábiles. De existir alguna observación al tiempo del levantamiento de la Salida No Conforme, esta deberá ser sustentada hacia </w:t>
-      </w:r>
-      <w:r>
-        <w:rPr>
-          <w:rFonts w:ascii="Arial Narrow" w:hAnsi="Arial Narrow"/>
-          <w:b/>
-          <w:bCs/>
-          <w:sz w:val="18"/>
-          <w:szCs w:val="18"/>
-          <w:lang w:val="es-ES"/>
-        </w:rPr>
-        <w:t>EL CONTRATANTE</w:t>
-      </w:r>
-      <w:r>
-        <w:rPr>
-          <w:rFonts w:ascii="Arial Narrow" w:hAnsi="Arial Narrow"/>
-          <w:sz w:val="18"/>
-          <w:szCs w:val="18"/>
-          <w:lang w:val="es-ES"/>
-        </w:rPr>
-        <w:t xml:space="preserve">, caso contrario se considerará “no respondido” el reporte. </w:t>
+          <w:lang w:val="es-ES"/>
+        </w:rPr>
+        <w:t>. EL CONTRATISTA</w:t>
+      </w:r>
+      <w:r>
+        <w:rPr>
+          <w:rFonts w:ascii="Arial Narrow" w:hAnsi="Arial Narrow"/>
+          <w:lang w:val="es-ES"/>
+        </w:rPr>
+        <w:t xml:space="preserve"> deberá mantener en obra la cantidad suficiente de herramientas y/o equipos para poder realizar sus trabajos.</w:t>
       </w:r>
     </w:p>
     <w:p>
@@ -41831,14 +41560,13 @@
           <w:tab w:val="clear" w:pos="1440"/>
           <w:tab w:val="left" w:pos="708"/>
         </w:tabs>
-        <w:spacing w:line="252" w:lineRule="auto"/>
+        <w:spacing w:after="160" w:line="252" w:lineRule="auto"/>
         <w:ind w:left="284" w:firstLine="0"/>
         <w:contextualSpacing/>
         <w:jc w:val="both"/>
         <w:rPr>
           <w:rFonts w:ascii="Arial Narrow" w:hAnsi="Arial Narrow"/>
-          <w:sz w:val="18"/>
-          <w:szCs w:val="18"/>
+          <w:color w:val="000000" w:themeColor="text1"/>
           <w:lang w:val="es-ES"/>
         </w:rPr>
       </w:pPr>
@@ -41859,8 +41587,6 @@
         <w:jc w:val="both"/>
         <w:rPr>
           <w:rFonts w:ascii="Arial Narrow" w:hAnsi="Arial Narrow"/>
-          <w:sz w:val="18"/>
-          <w:szCs w:val="18"/>
           <w:lang w:val="es-ES"/>
         </w:rPr>
       </w:pPr>
@@ -41869,8 +41595,6 @@
           <w:rFonts w:ascii="Arial Narrow" w:hAnsi="Arial Narrow"/>
           <w:b/>
           <w:bCs/>
-          <w:sz w:val="18"/>
-          <w:szCs w:val="18"/>
           <w:lang w:val="es-ES"/>
         </w:rPr>
         <w:t>EL CONTRATISTA</w:t>
@@ -41878,31 +41602,41 @@
       <w:r>
         <w:rPr>
           <w:rFonts w:ascii="Arial Narrow" w:hAnsi="Arial Narrow"/>
-          <w:sz w:val="18"/>
-          <w:szCs w:val="18"/>
-          <w:lang w:val="es-ES"/>
-        </w:rPr>
-        <w:t xml:space="preserve"> deberá asumir el costo de las reparaciones originadas por sus Salidas No Conformes. Este monto será fijado por </w:t>
+          <w:lang w:val="es-ES"/>
+        </w:rPr>
+        <w:t xml:space="preserve"> debe cumplir con el levantamiento de las Salidas No Conformes y/o No Conformidades detectadas en la obra y levantar estos reportes identificados por </w:t>
       </w:r>
       <w:r>
         <w:rPr>
           <w:rFonts w:ascii="Arial Narrow" w:hAnsi="Arial Narrow"/>
           <w:b/>
           <w:bCs/>
-          <w:sz w:val="18"/>
-          <w:szCs w:val="18"/>
-          <w:lang w:val="es-ES"/>
-        </w:rPr>
-        <w:t>EL CONTRATANTE.</w:t>
-      </w:r>
-      <w:r>
-        <w:rPr>
-          <w:rFonts w:ascii="Arial Narrow" w:hAnsi="Arial Narrow"/>
-          <w:sz w:val="18"/>
-          <w:szCs w:val="18"/>
-          <w:lang w:val="es-ES"/>
-        </w:rPr>
-        <w:t xml:space="preserve">  </w:t>
+          <w:lang w:val="es-ES"/>
+        </w:rPr>
+        <w:t xml:space="preserve">EL CONTRATANTE </w:t>
+      </w:r>
+      <w:r>
+        <w:rPr>
+          <w:rFonts w:ascii="Arial Narrow" w:hAnsi="Arial Narrow"/>
+          <w:lang w:val="es-ES"/>
+        </w:rPr>
+        <w:t xml:space="preserve">en plazo máximo de tres (3) días hábiles. De existir alguna observación al tiempo del levantamiento de la Salida No Conforme, esta deberá ser sustentada hacia </w:t>
+      </w:r>
+      <w:r>
+        <w:rPr>
+          <w:rFonts w:ascii="Arial Narrow" w:hAnsi="Arial Narrow"/>
+          <w:b/>
+          <w:bCs/>
+          <w:lang w:val="es-ES"/>
+        </w:rPr>
+        <w:t>EL CONTRATANTE</w:t>
+      </w:r>
+      <w:r>
+        <w:rPr>
+          <w:rFonts w:ascii="Arial Narrow" w:hAnsi="Arial Narrow"/>
+          <w:lang w:val="es-ES"/>
+        </w:rPr>
+        <w:t xml:space="preserve">, caso contrario se considerará “no respondido” el reporte. </w:t>
       </w:r>
     </w:p>
     <w:p>
@@ -41912,15 +41646,12 @@
           <w:tab w:val="clear" w:pos="1440"/>
           <w:tab w:val="left" w:pos="708"/>
         </w:tabs>
-        <w:spacing w:after="160" w:line="252" w:lineRule="auto"/>
+        <w:spacing w:line="252" w:lineRule="auto"/>
         <w:ind w:left="284" w:firstLine="0"/>
         <w:contextualSpacing/>
         <w:jc w:val="both"/>
         <w:rPr>
           <w:rFonts w:ascii="Arial Narrow" w:hAnsi="Arial Narrow"/>
-          <w:color w:val="000000" w:themeColor="text1"/>
-          <w:sz w:val="18"/>
-          <w:szCs w:val="18"/>
           <w:lang w:val="es-ES"/>
         </w:rPr>
       </w:pPr>
@@ -41941,9 +41672,6 @@
         <w:jc w:val="both"/>
         <w:rPr>
           <w:rFonts w:ascii="Arial Narrow" w:hAnsi="Arial Narrow"/>
-          <w:color w:val="000000" w:themeColor="text1"/>
-          <w:sz w:val="18"/>
-          <w:szCs w:val="18"/>
           <w:lang w:val="es-ES"/>
         </w:rPr>
       </w:pPr>
@@ -41952,9 +41680,6 @@
           <w:rFonts w:ascii="Arial Narrow" w:hAnsi="Arial Narrow"/>
           <w:b/>
           <w:bCs/>
-          <w:color w:val="000000" w:themeColor="text1"/>
-          <w:sz w:val="18"/>
-          <w:szCs w:val="18"/>
           <w:lang w:val="es-ES"/>
         </w:rPr>
         <w:t>EL CONTRATISTA</w:t>
@@ -41962,144 +41687,25 @@
       <w:r>
         <w:rPr>
           <w:rFonts w:ascii="Arial Narrow" w:hAnsi="Arial Narrow"/>
-          <w:color w:val="000000" w:themeColor="text1"/>
-          <w:sz w:val="18"/>
-          <w:szCs w:val="18"/>
-          <w:lang w:val="es-ES"/>
-        </w:rPr>
-        <w:t xml:space="preserve"> deberá de entregar un dossier de calidad del servicio realizado. El listado y el detalle de la emisión del dossier de calidad será entregado por </w:t>
+          <w:lang w:val="es-ES"/>
+        </w:rPr>
+        <w:t xml:space="preserve"> deberá asumir el costo de las reparaciones originadas por sus Salidas No Conformes. Este monto será fijado por </w:t>
       </w:r>
       <w:r>
         <w:rPr>
           <w:rFonts w:ascii="Arial Narrow" w:hAnsi="Arial Narrow"/>
           <w:b/>
           <w:bCs/>
-          <w:color w:val="000000" w:themeColor="text1"/>
-          <w:sz w:val="18"/>
-          <w:szCs w:val="18"/>
-          <w:lang w:val="es-ES"/>
-        </w:rPr>
-        <w:t>EL CONTRATANTE</w:t>
-      </w:r>
-      <w:r>
-        <w:rPr>
-          <w:rFonts w:ascii="Arial Narrow" w:hAnsi="Arial Narrow"/>
-          <w:color w:val="000000" w:themeColor="text1"/>
-          <w:sz w:val="18"/>
-          <w:szCs w:val="18"/>
-          <w:lang w:val="es-ES"/>
-        </w:rPr>
-        <w:t xml:space="preserve">. </w:t>
-      </w:r>
-      <w:r>
-        <w:rPr>
-          <w:rFonts w:ascii="Arial Narrow" w:hAnsi="Arial Narrow"/>
-          <w:b/>
-          <w:bCs/>
-          <w:color w:val="000000" w:themeColor="text1"/>
-          <w:sz w:val="18"/>
-          <w:szCs w:val="18"/>
-          <w:lang w:val="es-ES"/>
-        </w:rPr>
-        <w:t xml:space="preserve">EL CONTRATISTA </w:t>
-      </w:r>
-      <w:r>
-        <w:rPr>
-          <w:rFonts w:ascii="Arial Narrow" w:hAnsi="Arial Narrow"/>
-          <w:color w:val="000000" w:themeColor="text1"/>
-          <w:sz w:val="18"/>
-          <w:szCs w:val="18"/>
-          <w:lang w:val="es-ES"/>
-        </w:rPr>
-        <w:t xml:space="preserve">deberá de emitir una carta de garantía de los trabajos realizados en la obra en base al formato establecido por </w:t>
-      </w:r>
-      <w:r>
-        <w:rPr>
-          <w:rFonts w:ascii="Arial Narrow" w:hAnsi="Arial Narrow"/>
-          <w:b/>
-          <w:bCs/>
-          <w:color w:val="000000" w:themeColor="text1"/>
-          <w:sz w:val="18"/>
-          <w:szCs w:val="18"/>
-          <w:lang w:val="es-ES"/>
-        </w:rPr>
-        <w:t>EL CONTRATANTE</w:t>
-      </w:r>
-      <w:r>
-        <w:rPr>
-          <w:rFonts w:ascii="Arial Narrow" w:hAnsi="Arial Narrow"/>
-          <w:color w:val="000000" w:themeColor="text1"/>
-          <w:sz w:val="18"/>
-          <w:szCs w:val="18"/>
-          <w:lang w:val="es-ES"/>
-        </w:rPr>
-        <w:t xml:space="preserve">. </w:t>
-      </w:r>
-      <w:r>
-        <w:rPr>
-          <w:rFonts w:ascii="Arial Narrow" w:hAnsi="Arial Narrow"/>
-          <w:b/>
-          <w:bCs/>
-          <w:color w:val="000000" w:themeColor="text1"/>
-          <w:sz w:val="18"/>
-          <w:szCs w:val="18"/>
-          <w:lang w:val="es-ES"/>
-        </w:rPr>
-        <w:t>EL CONTRATISTA</w:t>
-      </w:r>
-      <w:r>
-        <w:rPr>
-          <w:rFonts w:ascii="Arial Narrow" w:hAnsi="Arial Narrow"/>
-          <w:color w:val="000000" w:themeColor="text1"/>
-          <w:sz w:val="18"/>
-          <w:szCs w:val="18"/>
-          <w:lang w:val="es-ES"/>
-        </w:rPr>
-        <w:t xml:space="preserve"> deberá de emitir un certificado de calidad o carta de garantía de todos los materiales utilizados en la obra, además de adjuntar su ficha técnica. </w:t>
-      </w:r>
-      <w:r>
-        <w:rPr>
-          <w:rFonts w:ascii="Arial Narrow" w:hAnsi="Arial Narrow"/>
-          <w:b/>
-          <w:bCs/>
-          <w:color w:val="000000" w:themeColor="text1"/>
-          <w:sz w:val="18"/>
-          <w:szCs w:val="18"/>
-          <w:lang w:val="es-ES"/>
-        </w:rPr>
-        <w:t>EL CONTRATISTA</w:t>
-      </w:r>
-      <w:r>
-        <w:rPr>
-          <w:rFonts w:ascii="Arial Narrow" w:hAnsi="Arial Narrow"/>
-          <w:color w:val="000000" w:themeColor="text1"/>
-          <w:sz w:val="18"/>
-          <w:szCs w:val="18"/>
-          <w:lang w:val="es-ES"/>
-        </w:rPr>
-        <w:t xml:space="preserve"> deberá entregar los protocolos con todas las firmas de cierre. El protocolo debe estar libre de enmendaduras y todas las anotaciones deben de encontrarse de manera legible. </w:t>
-      </w:r>
-      <w:r>
-        <w:rPr>
-          <w:rFonts w:ascii="Arial Narrow" w:hAnsi="Arial Narrow"/>
-          <w:b/>
-          <w:bCs/>
-          <w:color w:val="000000" w:themeColor="text1"/>
-          <w:sz w:val="18"/>
-          <w:szCs w:val="18"/>
-          <w:lang w:val="es-ES"/>
-        </w:rPr>
-        <w:t>EL CONTRATISTA</w:t>
-      </w:r>
-      <w:r>
-        <w:rPr>
-          <w:rFonts w:ascii="Arial Narrow" w:hAnsi="Arial Narrow"/>
-          <w:color w:val="000000" w:themeColor="text1"/>
-          <w:sz w:val="18"/>
-          <w:szCs w:val="18"/>
-          <w:lang w:val="es-ES"/>
-        </w:rPr>
-        <w:t xml:space="preserve"> deberá entregar toda la documentación del dossier de calidad en idioma español (Certificados, manuales, fichas técnicas, etc.). </w:t>
+          <w:lang w:val="es-ES"/>
+        </w:rPr>
+        <w:t>EL CONTRATANTE.</w:t>
+      </w:r>
+      <w:r>
+        <w:rPr>
+          <w:rFonts w:ascii="Arial Narrow" w:hAnsi="Arial Narrow"/>
+          <w:lang w:val="es-ES"/>
+        </w:rPr>
+        <w:t xml:space="preserve">  </w:t>
       </w:r>
     </w:p>
     <w:p>
@@ -42116,8 +41722,6 @@
         <w:rPr>
           <w:rFonts w:ascii="Arial Narrow" w:hAnsi="Arial Narrow"/>
           <w:color w:val="000000" w:themeColor="text1"/>
-          <w:sz w:val="18"/>
-          <w:szCs w:val="18"/>
           <w:lang w:val="es-ES"/>
         </w:rPr>
       </w:pPr>
@@ -42138,8 +41742,7 @@
         <w:jc w:val="both"/>
         <w:rPr>
           <w:rFonts w:ascii="Arial Narrow" w:hAnsi="Arial Narrow"/>
-          <w:sz w:val="18"/>
-          <w:szCs w:val="18"/>
+          <w:color w:val="000000" w:themeColor="text1"/>
           <w:lang w:val="es-ES"/>
         </w:rPr>
       </w:pPr>
@@ -42148,8 +41751,7 @@
           <w:rFonts w:ascii="Arial Narrow" w:hAnsi="Arial Narrow"/>
           <w:b/>
           <w:bCs/>
-          <w:sz w:val="18"/>
-          <w:szCs w:val="18"/>
+          <w:color w:val="000000" w:themeColor="text1"/>
           <w:lang w:val="es-ES"/>
         </w:rPr>
         <w:t>EL CONTRATISTA</w:t>
@@ -42157,19 +41759,71 @@
       <w:r>
         <w:rPr>
           <w:rFonts w:ascii="Arial Narrow" w:hAnsi="Arial Narrow"/>
-          <w:sz w:val="18"/>
-          <w:szCs w:val="18"/>
-          <w:lang w:val="es-ES"/>
-        </w:rPr>
-        <w:t xml:space="preserve">, está obligado a levantar las observaciones del Área de Post Venta previa a la entrega de los departamentos a los propietarios. </w:t>
+          <w:color w:val="000000" w:themeColor="text1"/>
+          <w:lang w:val="es-ES"/>
+        </w:rPr>
+        <w:t xml:space="preserve"> deberá de entregar un dossier de calidad del servicio realizado. El listado y el detalle de la emisión del dossier de calidad será entregado por </w:t>
       </w:r>
       <w:r>
         <w:rPr>
           <w:rFonts w:ascii="Arial Narrow" w:hAnsi="Arial Narrow"/>
           <w:b/>
           <w:bCs/>
-          <w:sz w:val="18"/>
-          <w:szCs w:val="18"/>
+          <w:color w:val="000000" w:themeColor="text1"/>
+          <w:lang w:val="es-ES"/>
+        </w:rPr>
+        <w:t>EL CONTRATANTE</w:t>
+      </w:r>
+      <w:r>
+        <w:rPr>
+          <w:rFonts w:ascii="Arial Narrow" w:hAnsi="Arial Narrow"/>
+          <w:color w:val="000000" w:themeColor="text1"/>
+          <w:lang w:val="es-ES"/>
+        </w:rPr>
+        <w:t xml:space="preserve">. </w:t>
+      </w:r>
+      <w:r>
+        <w:rPr>
+          <w:rFonts w:ascii="Arial Narrow" w:hAnsi="Arial Narrow"/>
+          <w:b/>
+          <w:bCs/>
+          <w:color w:val="000000" w:themeColor="text1"/>
+          <w:lang w:val="es-ES"/>
+        </w:rPr>
+        <w:t xml:space="preserve">EL CONTRATISTA </w:t>
+      </w:r>
+      <w:r>
+        <w:rPr>
+          <w:rFonts w:ascii="Arial Narrow" w:hAnsi="Arial Narrow"/>
+          <w:color w:val="000000" w:themeColor="text1"/>
+          <w:lang w:val="es-ES"/>
+        </w:rPr>
+        <w:t xml:space="preserve">deberá de emitir una carta de garantía de los trabajos realizados en la obra en base al formato establecido por </w:t>
+      </w:r>
+      <w:r>
+        <w:rPr>
+          <w:rFonts w:ascii="Arial Narrow" w:hAnsi="Arial Narrow"/>
+          <w:b/>
+          <w:bCs/>
+          <w:color w:val="000000" w:themeColor="text1"/>
+          <w:lang w:val="es-ES"/>
+        </w:rPr>
+        <w:t>EL CONTRATANTE</w:t>
+      </w:r>
+      <w:r>
+        <w:rPr>
+          <w:rFonts w:ascii="Arial Narrow" w:hAnsi="Arial Narrow"/>
+          <w:color w:val="000000" w:themeColor="text1"/>
+          <w:lang w:val="es-ES"/>
+        </w:rPr>
+        <w:t xml:space="preserve">. </w:t>
+      </w:r>
+      <w:r>
+        <w:rPr>
+          <w:rFonts w:ascii="Arial Narrow" w:hAnsi="Arial Narrow"/>
+          <w:b/>
+          <w:bCs/>
+          <w:color w:val="000000" w:themeColor="text1"/>
           <w:lang w:val="es-ES"/>
         </w:rPr>
         <w:t>EL CONTRATISTA</w:t>
@@ -42177,31 +41831,46 @@
       <w:r>
         <w:rPr>
           <w:rFonts w:ascii="Arial Narrow" w:hAnsi="Arial Narrow"/>
-          <w:sz w:val="18"/>
-          <w:szCs w:val="18"/>
-          <w:lang w:val="es-ES"/>
-        </w:rPr>
-        <w:t xml:space="preserve"> deberá de cumplir la programación estipulada por </w:t>
+          <w:color w:val="000000" w:themeColor="text1"/>
+          <w:lang w:val="es-ES"/>
+        </w:rPr>
+        <w:t xml:space="preserve"> deberá de emitir un certificado de calidad o carta de garantía de todos los materiales utilizados en la obra, además de adjuntar su ficha técnica. </w:t>
       </w:r>
       <w:r>
         <w:rPr>
           <w:rFonts w:ascii="Arial Narrow" w:hAnsi="Arial Narrow"/>
           <w:b/>
           <w:bCs/>
-          <w:sz w:val="18"/>
-          <w:szCs w:val="18"/>
-          <w:lang w:val="es-ES"/>
-        </w:rPr>
-        <w:t>EL CONTRATANTE</w:t>
-      </w:r>
-      <w:r>
-        <w:rPr>
-          <w:rFonts w:ascii="Arial Narrow" w:hAnsi="Arial Narrow"/>
-          <w:sz w:val="18"/>
-          <w:szCs w:val="18"/>
-          <w:lang w:val="es-ES"/>
-        </w:rPr>
-        <w:t>. Todos los trabajos deben ser realizados evitando hacer daños a otras partidas.</w:t>
+          <w:color w:val="000000" w:themeColor="text1"/>
+          <w:lang w:val="es-ES"/>
+        </w:rPr>
+        <w:t>EL CONTRATISTA</w:t>
+      </w:r>
+      <w:r>
+        <w:rPr>
+          <w:rFonts w:ascii="Arial Narrow" w:hAnsi="Arial Narrow"/>
+          <w:color w:val="000000" w:themeColor="text1"/>
+          <w:lang w:val="es-ES"/>
+        </w:rPr>
+        <w:t xml:space="preserve"> deberá entregar los protocolos con todas las firmas de cierre. El protocolo debe estar libre de enmendaduras y todas las anotaciones deben de encontrarse de manera legible. </w:t>
+      </w:r>
+      <w:r>
+        <w:rPr>
+          <w:rFonts w:ascii="Arial Narrow" w:hAnsi="Arial Narrow"/>
+          <w:b/>
+          <w:bCs/>
+          <w:color w:val="000000" w:themeColor="text1"/>
+          <w:lang w:val="es-ES"/>
+        </w:rPr>
+        <w:t>EL CONTRATISTA</w:t>
+      </w:r>
+      <w:r>
+        <w:rPr>
+          <w:rFonts w:ascii="Arial Narrow" w:hAnsi="Arial Narrow"/>
+          <w:color w:val="000000" w:themeColor="text1"/>
+          <w:lang w:val="es-ES"/>
+        </w:rPr>
+        <w:t xml:space="preserve"> deberá entregar toda la documentación del dossier de calidad en idioma español (Certificados, manuales, fichas técnicas, etc.). </w:t>
       </w:r>
     </w:p>
     <w:p>
@@ -42217,8 +41886,7 @@
         <w:jc w:val="both"/>
         <w:rPr>
           <w:rFonts w:ascii="Arial Narrow" w:hAnsi="Arial Narrow"/>
-          <w:sz w:val="18"/>
-          <w:szCs w:val="18"/>
+          <w:color w:val="000000" w:themeColor="text1"/>
           <w:lang w:val="es-ES"/>
         </w:rPr>
       </w:pPr>
@@ -42239,8 +41907,6 @@
         <w:jc w:val="both"/>
         <w:rPr>
           <w:rFonts w:ascii="Arial Narrow" w:hAnsi="Arial Narrow"/>
-          <w:sz w:val="18"/>
-          <w:szCs w:val="18"/>
           <w:lang w:val="es-ES"/>
         </w:rPr>
       </w:pPr>
@@ -42249,8 +41915,6 @@
           <w:rFonts w:ascii="Arial Narrow" w:hAnsi="Arial Narrow"/>
           <w:b/>
           <w:bCs/>
-          <w:sz w:val="18"/>
-          <w:szCs w:val="18"/>
           <w:lang w:val="es-ES"/>
         </w:rPr>
         <w:t>EL CONTRATISTA</w:t>
@@ -42258,19 +41922,31 @@
       <w:r>
         <w:rPr>
           <w:rFonts w:ascii="Arial Narrow" w:hAnsi="Arial Narrow"/>
-          <w:sz w:val="18"/>
-          <w:szCs w:val="18"/>
-          <w:lang w:val="es-ES"/>
-        </w:rPr>
-        <w:t xml:space="preserve"> está obligado a enviar un personal debidamente uniformado y con todos las herramientas, equipos y materiales necesarios para levantar observaciones durante los días de la entrega masiva de los departamentos a los propietarios. </w:t>
+          <w:lang w:val="es-ES"/>
+        </w:rPr>
+        <w:t xml:space="preserve">, está obligado a levantar las observaciones del Área de Post Venta previa a la entrega de los departamentos a los propietarios. </w:t>
       </w:r>
       <w:r>
         <w:rPr>
           <w:rFonts w:ascii="Arial Narrow" w:hAnsi="Arial Narrow"/>
           <w:b/>
           <w:bCs/>
-          <w:sz w:val="18"/>
-          <w:szCs w:val="18"/>
+          <w:lang w:val="es-ES"/>
+        </w:rPr>
+        <w:t>EL CONTRATISTA</w:t>
+      </w:r>
+      <w:r>
+        <w:rPr>
+          <w:rFonts w:ascii="Arial Narrow" w:hAnsi="Arial Narrow"/>
+          <w:lang w:val="es-ES"/>
+        </w:rPr>
+        <w:t xml:space="preserve"> deberá de cumplir la programación estipulada por </w:t>
+      </w:r>
+      <w:r>
+        <w:rPr>
+          <w:rFonts w:ascii="Arial Narrow" w:hAnsi="Arial Narrow"/>
+          <w:b/>
+          <w:bCs/>
           <w:lang w:val="es-ES"/>
         </w:rPr>
         <w:t>EL CONTRATANTE</w:t>
@@ -42278,20 +41954,24 @@
       <w:r>
         <w:rPr>
           <w:rFonts w:ascii="Arial Narrow" w:hAnsi="Arial Narrow"/>
-          <w:sz w:val="18"/>
-          <w:szCs w:val="18"/>
-          <w:lang w:val="es-ES"/>
-        </w:rPr>
-        <w:t xml:space="preserve"> informara el día y la hora de la entrega de los departamentos. </w:t>
+          <w:lang w:val="es-ES"/>
+        </w:rPr>
+        <w:t>. Todos los trabajos deben ser realizados evitando hacer daños a otras partidas.</w:t>
       </w:r>
     </w:p>
     <w:p>
       <w:pPr>
         <w:pStyle w:val="Prrafodelista"/>
-        <w:rPr>
-          <w:rFonts w:ascii="Arial Narrow" w:hAnsi="Arial Narrow"/>
-          <w:sz w:val="18"/>
-          <w:szCs w:val="18"/>
+        <w:tabs>
+          <w:tab w:val="clear" w:pos="1440"/>
+          <w:tab w:val="left" w:pos="708"/>
+        </w:tabs>
+        <w:spacing w:after="160" w:line="252" w:lineRule="auto"/>
+        <w:ind w:left="284" w:firstLine="0"/>
+        <w:contextualSpacing/>
+        <w:jc w:val="both"/>
+        <w:rPr>
+          <w:rFonts w:ascii="Arial Narrow" w:hAnsi="Arial Narrow"/>
           <w:lang w:val="es-ES"/>
         </w:rPr>
       </w:pPr>
@@ -42312,8 +41992,6 @@
         <w:jc w:val="both"/>
         <w:rPr>
           <w:rFonts w:ascii="Arial Narrow" w:hAnsi="Arial Narrow"/>
-          <w:sz w:val="18"/>
-          <w:szCs w:val="18"/>
           <w:lang w:val="es-ES"/>
         </w:rPr>
       </w:pPr>
@@ -42322,57 +42000,40 @@
           <w:rFonts w:ascii="Arial Narrow" w:hAnsi="Arial Narrow"/>
           <w:b/>
           <w:bCs/>
-          <w:sz w:val="18"/>
-          <w:szCs w:val="18"/>
-          <w:lang w:val="es-ES"/>
-        </w:rPr>
+          <w:lang w:val="es-ES"/>
+        </w:rPr>
+        <w:lastRenderedPageBreak/>
         <w:t>EL CONTRATISTA</w:t>
       </w:r>
       <w:r>
         <w:rPr>
           <w:rFonts w:ascii="Arial Narrow" w:hAnsi="Arial Narrow"/>
-          <w:sz w:val="18"/>
-          <w:szCs w:val="18"/>
-          <w:lang w:val="es-ES"/>
-        </w:rPr>
-        <w:t xml:space="preserve"> está obligado a enviar un personal debidamente uniformado y con todas las herramientas, equipos y materiales necesarios para levantar las observaciones derivadas de los requerimientos de postventa durante la primera semana posterior a la entrega de departamentos. En el caso de las contratas de especialidades, </w:t>
+          <w:lang w:val="es-ES"/>
+        </w:rPr>
+        <w:t xml:space="preserve"> está obligado a enviar un personal debidamente uniformado y con todos las herramientas, equipos y materiales necesarios para levantar observaciones durante los días de la entrega masiva de los departamentos a los propietarios. </w:t>
       </w:r>
       <w:r>
         <w:rPr>
           <w:rFonts w:ascii="Arial Narrow" w:hAnsi="Arial Narrow"/>
           <w:b/>
           <w:bCs/>
-          <w:sz w:val="18"/>
-          <w:szCs w:val="18"/>
-          <w:lang w:val="es-ES"/>
-        </w:rPr>
-        <w:t>EL CONTRATISTA</w:t>
-      </w:r>
-      <w:r>
-        <w:rPr>
-          <w:rFonts w:ascii="Arial Narrow" w:hAnsi="Arial Narrow"/>
-          <w:sz w:val="18"/>
-          <w:szCs w:val="18"/>
-          <w:lang w:val="es-ES"/>
-        </w:rPr>
-        <w:t xml:space="preserve"> deberá enviar personal para realizar el levantamiento de observaciones durante un periodo de dos (2) semanas, contadas a partir del último día de entrega masiva de departamentos a propietarios. </w:t>
+          <w:lang w:val="es-ES"/>
+        </w:rPr>
+        <w:t>EL CONTRATANTE</w:t>
+      </w:r>
+      <w:r>
+        <w:rPr>
+          <w:rFonts w:ascii="Arial Narrow" w:hAnsi="Arial Narrow"/>
+          <w:lang w:val="es-ES"/>
+        </w:rPr>
+        <w:t xml:space="preserve"> informara el día y la hora de la entrega de los departamentos. </w:t>
       </w:r>
     </w:p>
     <w:p>
       <w:pPr>
         <w:pStyle w:val="Prrafodelista"/>
-        <w:tabs>
-          <w:tab w:val="clear" w:pos="1440"/>
-          <w:tab w:val="left" w:pos="708"/>
-        </w:tabs>
-        <w:spacing w:after="160" w:line="252" w:lineRule="auto"/>
-        <w:ind w:left="284" w:firstLine="0"/>
-        <w:contextualSpacing/>
-        <w:jc w:val="both"/>
-        <w:rPr>
-          <w:rFonts w:ascii="Arial Narrow" w:hAnsi="Arial Narrow"/>
-          <w:sz w:val="18"/>
-          <w:szCs w:val="18"/>
+        <w:rPr>
+          <w:rFonts w:ascii="Arial Narrow" w:hAnsi="Arial Narrow"/>
           <w:lang w:val="es-ES"/>
         </w:rPr>
       </w:pPr>
@@ -42393,27 +42054,14 @@
         <w:jc w:val="both"/>
         <w:rPr>
           <w:rFonts w:ascii="Arial Narrow" w:hAnsi="Arial Narrow"/>
-          <w:sz w:val="18"/>
-          <w:szCs w:val="18"/>
-          <w:lang w:val="es-ES"/>
-        </w:rPr>
-      </w:pPr>
-      <w:r>
-        <w:rPr>
-          <w:rFonts w:ascii="Arial Narrow" w:hAnsi="Arial Narrow"/>
-          <w:sz w:val="18"/>
-          <w:szCs w:val="18"/>
-          <w:lang w:val="es-ES"/>
-        </w:rPr>
-        <w:t xml:space="preserve">En caso de que </w:t>
-      </w:r>
+          <w:lang w:val="es-ES"/>
+        </w:rPr>
+      </w:pPr>
       <w:r>
         <w:rPr>
           <w:rFonts w:ascii="Arial Narrow" w:hAnsi="Arial Narrow"/>
           <w:b/>
           <w:bCs/>
-          <w:sz w:val="18"/>
-          <w:szCs w:val="18"/>
           <w:lang w:val="es-ES"/>
         </w:rPr>
         <w:t>EL CONTRATISTA</w:t>
@@ -42421,47 +42069,40 @@
       <w:r>
         <w:rPr>
           <w:rFonts w:ascii="Arial Narrow" w:hAnsi="Arial Narrow"/>
-          <w:sz w:val="18"/>
-          <w:szCs w:val="18"/>
-          <w:lang w:val="es-ES"/>
-        </w:rPr>
-        <w:t xml:space="preserve"> incumpla con algún requisito del Sistema de Gestión de Calidad indicado anteriormente, se le aplicará una penalidad de S/. 250.00 (Doscientos cincuenta y 00/100 soles) por documento o requisito incumplido. Esta penalidad es por cada requerimiento no cumplido dentro de cada ítem, la cantidad de veces es ilimitada. Las sanciones serán impuestas por el Área de calidad y/o el Residente de la Obra. Representantes en obra de </w:t>
+          <w:lang w:val="es-ES"/>
+        </w:rPr>
+        <w:t xml:space="preserve"> está obligado a enviar un personal debidamente uniformado y con todas las herramientas, equipos y materiales necesarios para levantar las observaciones derivadas de los requerimientos de postventa durante la primera semana posterior a la entrega de departamentos. En el caso de las contratas de especialidades, </w:t>
       </w:r>
       <w:r>
         <w:rPr>
           <w:rFonts w:ascii="Arial Narrow" w:hAnsi="Arial Narrow"/>
           <w:b/>
           <w:bCs/>
-          <w:sz w:val="18"/>
-          <w:szCs w:val="18"/>
-          <w:lang w:val="es-ES"/>
-        </w:rPr>
-        <w:t>EL CONTRATANTE</w:t>
-      </w:r>
-      <w:r>
-        <w:rPr>
-          <w:rFonts w:ascii="Arial Narrow" w:hAnsi="Arial Narrow"/>
-          <w:sz w:val="18"/>
-          <w:szCs w:val="18"/>
-          <w:lang w:val="es-ES"/>
-        </w:rPr>
-        <w:t>.</w:t>
-      </w:r>
-    </w:p>
-    <w:p>
-      <w:pPr>
+          <w:lang w:val="es-ES"/>
+        </w:rPr>
+        <w:t>EL CONTRATISTA</w:t>
+      </w:r>
+      <w:r>
+        <w:rPr>
+          <w:rFonts w:ascii="Arial Narrow" w:hAnsi="Arial Narrow"/>
+          <w:lang w:val="es-ES"/>
+        </w:rPr>
+        <w:t xml:space="preserve"> deberá enviar personal para realizar el levantamiento de observaciones durante un periodo de dos (2) semanas, contadas a partir del último día de entrega masiva de departamentos a propietarios. </w:t>
+      </w:r>
+    </w:p>
+    <w:p>
+      <w:pPr>
+        <w:pStyle w:val="Prrafodelista"/>
         <w:tabs>
           <w:tab w:val="clear" w:pos="1440"/>
           <w:tab w:val="left" w:pos="708"/>
         </w:tabs>
-        <w:spacing w:line="252" w:lineRule="auto"/>
-        <w:ind w:left="0" w:firstLine="0"/>
+        <w:spacing w:after="160" w:line="252" w:lineRule="auto"/>
+        <w:ind w:left="284" w:firstLine="0"/>
         <w:contextualSpacing/>
         <w:jc w:val="both"/>
         <w:rPr>
           <w:rFonts w:ascii="Arial Narrow" w:hAnsi="Arial Narrow"/>
-          <w:sz w:val="18"/>
-          <w:szCs w:val="18"/>
           <w:lang w:val="es-ES"/>
         </w:rPr>
       </w:pPr>
@@ -42482,34 +42123,61 @@
         <w:jc w:val="both"/>
         <w:rPr>
           <w:rFonts w:ascii="Arial Narrow" w:hAnsi="Arial Narrow"/>
+          <w:lang w:val="es-ES"/>
+        </w:rPr>
+      </w:pPr>
+      <w:r>
+        <w:rPr>
+          <w:rFonts w:ascii="Arial Narrow" w:hAnsi="Arial Narrow"/>
+          <w:lang w:val="es-ES"/>
+        </w:rPr>
+        <w:t xml:space="preserve">En caso de que </w:t>
+      </w:r>
+      <w:r>
+        <w:rPr>
+          <w:rFonts w:ascii="Arial Narrow" w:hAnsi="Arial Narrow"/>
           <w:b/>
           <w:bCs/>
-          <w:sz w:val="18"/>
-          <w:szCs w:val="18"/>
-          <w:lang w:val="es-ES"/>
-        </w:rPr>
-      </w:pPr>
+          <w:lang w:val="es-ES"/>
+        </w:rPr>
+        <w:t>EL CONTRATISTA</w:t>
+      </w:r>
+      <w:r>
+        <w:rPr>
+          <w:rFonts w:ascii="Arial Narrow" w:hAnsi="Arial Narrow"/>
+          <w:lang w:val="es-ES"/>
+        </w:rPr>
+        <w:t xml:space="preserve"> incumpla con algún requisito del Sistema de Gestión de Calidad indicado anteriormente, se le aplicará una penalidad de S/. 250.00 (Doscientos cincuenta y 00/100 soles) por documento o requisito incumplido. Esta penalidad es por cada requerimiento no cumplido dentro de cada ítem, la cantidad de veces es ilimitada. Las sanciones serán impuestas por el Área de calidad y/o el Residente de la Obra. Representantes en obra de </w:t>
+      </w:r>
       <w:r>
         <w:rPr>
           <w:rFonts w:ascii="Arial Narrow" w:hAnsi="Arial Narrow"/>
           <w:b/>
           <w:bCs/>
-          <w:sz w:val="18"/>
-          <w:szCs w:val="18"/>
-          <w:lang w:val="es-ES"/>
-        </w:rPr>
-        <w:t>Penalidad por Salida No Conforme:</w:t>
-      </w:r>
-    </w:p>
-    <w:p>
-      <w:pPr>
-        <w:pStyle w:val="Prrafodelista"/>
-        <w:rPr>
-          <w:rFonts w:ascii="Arial Narrow" w:hAnsi="Arial Narrow"/>
-          <w:b/>
-          <w:bCs/>
-          <w:sz w:val="18"/>
-          <w:szCs w:val="18"/>
+          <w:lang w:val="es-ES"/>
+        </w:rPr>
+        <w:t>EL CONTRATANTE</w:t>
+      </w:r>
+      <w:r>
+        <w:rPr>
+          <w:rFonts w:ascii="Arial Narrow" w:hAnsi="Arial Narrow"/>
+          <w:lang w:val="es-ES"/>
+        </w:rPr>
+        <w:t>.</w:t>
+      </w:r>
+    </w:p>
+    <w:p>
+      <w:pPr>
+        <w:tabs>
+          <w:tab w:val="clear" w:pos="1440"/>
+          <w:tab w:val="left" w:pos="708"/>
+        </w:tabs>
+        <w:spacing w:line="252" w:lineRule="auto"/>
+        <w:ind w:left="0" w:firstLine="0"/>
+        <w:contextualSpacing/>
+        <w:jc w:val="both"/>
+        <w:rPr>
+          <w:rFonts w:ascii="Arial Narrow" w:hAnsi="Arial Narrow"/>
           <w:lang w:val="es-ES"/>
         </w:rPr>
       </w:pPr>
@@ -42518,29 +42186,73 @@
       <w:pPr>
         <w:pStyle w:val="Prrafodelista"/>
         <w:numPr>
-          <w:ilvl w:val="1"/>
+          <w:ilvl w:val="0"/>
           <w:numId w:val="41"/>
         </w:numPr>
         <w:tabs>
           <w:tab w:val="left" w:pos="708"/>
         </w:tabs>
         <w:spacing w:line="252" w:lineRule="auto"/>
+        <w:ind w:left="284" w:hanging="284"/>
         <w:contextualSpacing/>
         <w:jc w:val="both"/>
         <w:rPr>
           <w:rFonts w:ascii="Arial Narrow" w:hAnsi="Arial Narrow"/>
-          <w:sz w:val="18"/>
-          <w:szCs w:val="18"/>
-          <w:lang w:val="es-ES"/>
-        </w:rPr>
-      </w:pPr>
-      <w:r>
-        <w:rPr>
-          <w:rFonts w:ascii="Arial Narrow" w:hAnsi="Arial Narrow"/>
           <w:b/>
           <w:bCs/>
-          <w:sz w:val="18"/>
-          <w:szCs w:val="18"/>
+          <w:lang w:val="es-ES"/>
+        </w:rPr>
+      </w:pPr>
+      <w:r>
+        <w:rPr>
+          <w:rFonts w:ascii="Arial Narrow" w:hAnsi="Arial Narrow"/>
+          <w:b/>
+          <w:bCs/>
+          <w:lang w:val="es-ES"/>
+        </w:rPr>
+        <w:t>Penalidad por Salida No Conforme:</w:t>
+      </w:r>
+    </w:p>
+    <w:p>
+      <w:pPr>
+        <w:pStyle w:val="Prrafodelista"/>
+        <w:rPr>
+          <w:rFonts w:ascii="Arial Narrow" w:hAnsi="Arial Narrow"/>
+          <w:b/>
+          <w:bCs/>
+          <w:lang w:val="es-ES"/>
+        </w:rPr>
+      </w:pPr>
+    </w:p>
+    <w:p>
+      <w:pPr>
+        <w:tabs>
+          <w:tab w:val="clear" w:pos="1440"/>
+          <w:tab w:val="left" w:pos="708"/>
+        </w:tabs>
+        <w:spacing w:line="252" w:lineRule="auto"/>
+        <w:ind w:left="284" w:firstLine="0"/>
+        <w:contextualSpacing/>
+        <w:jc w:val="both"/>
+        <w:rPr>
+          <w:rFonts w:ascii="Arial Narrow" w:hAnsi="Arial Narrow"/>
+          <w:lang w:val="es-ES"/>
+        </w:rPr>
+      </w:pPr>
+      <w:r>
+        <w:rPr>
+          <w:rFonts w:ascii="Arial Narrow" w:hAnsi="Arial Narrow"/>
+          <w:b/>
+          <w:bCs/>
+          <w:lang w:val="es-ES"/>
+        </w:rPr>
+        <w:t xml:space="preserve">28.1. </w:t>
+      </w:r>
+      <w:r>
+        <w:rPr>
+          <w:rFonts w:ascii="Arial Narrow" w:hAnsi="Arial Narrow"/>
+          <w:b/>
+          <w:bCs/>
           <w:lang w:val="es-ES"/>
         </w:rPr>
         <w:t>EL CONTRATISTA</w:t>
@@ -42548,8 +42260,6 @@
       <w:r>
         <w:rPr>
           <w:rFonts w:ascii="Arial Narrow" w:hAnsi="Arial Narrow"/>
-          <w:sz w:val="18"/>
-          <w:szCs w:val="18"/>
           <w:lang w:val="es-ES"/>
         </w:rPr>
         <w:t xml:space="preserve"> que reciba una SALIDA NO CONFORME, basada en el documento de causas de salidas no conforme, se aplicará una penalidad de S/.250.00 (Doscientos cincuenta y 00/100 soles), la cual será deducida de su próxima valorización. </w:t>
@@ -42562,98 +42272,296 @@
           <w:tab w:val="clear" w:pos="1440"/>
           <w:tab w:val="left" w:pos="708"/>
         </w:tabs>
-        <w:spacing w:after="160" w:line="252" w:lineRule="auto"/>
-        <w:ind w:left="284" w:firstLine="0"/>
+        <w:spacing w:line="252" w:lineRule="auto"/>
+        <w:ind w:left="668" w:firstLine="0"/>
         <w:contextualSpacing/>
         <w:jc w:val="both"/>
         <w:rPr>
           <w:rFonts w:ascii="Arial Narrow" w:hAnsi="Arial Narrow"/>
-          <w:sz w:val="18"/>
-          <w:szCs w:val="18"/>
-          <w:lang w:val="es-ES"/>
-        </w:rPr>
-      </w:pPr>
-    </w:p>
-    <w:p>
-      <w:pPr>
-        <w:pStyle w:val="Prrafodelista"/>
-        <w:numPr>
-          <w:ilvl w:val="1"/>
-          <w:numId w:val="41"/>
-        </w:numPr>
+          <w:lang w:val="es-ES"/>
+        </w:rPr>
+      </w:pPr>
+    </w:p>
+    <w:p>
+      <w:pPr>
         <w:tabs>
+          <w:tab w:val="clear" w:pos="1440"/>
           <w:tab w:val="left" w:pos="708"/>
         </w:tabs>
         <w:spacing w:line="252" w:lineRule="auto"/>
+        <w:ind w:left="284" w:firstLine="0"/>
         <w:contextualSpacing/>
         <w:jc w:val="both"/>
         <w:rPr>
           <w:rFonts w:ascii="Arial Narrow" w:hAnsi="Arial Narrow"/>
-          <w:sz w:val="18"/>
-          <w:szCs w:val="18"/>
-          <w:lang w:val="es-ES"/>
-        </w:rPr>
-      </w:pPr>
-      <w:r>
-        <w:rPr>
-          <w:rFonts w:ascii="Arial Narrow" w:hAnsi="Arial Narrow"/>
-          <w:sz w:val="18"/>
-          <w:szCs w:val="18"/>
-          <w:lang w:val="es-ES"/>
-        </w:rPr>
-        <w:t>En caso de que transcurra el plazo máximo de tres (3) días hábiles para el levantamiento de la SALIDA NO CONFORME, se aplicará una penalidad adicional de S/.250.00 (Doscientos cincuenta y 00/100 soles) por cada día adicional que se tarde en resolver la situación. Se considera salida no conforme levantada cuando se ha corregido la observación en obra y se ha respondido el documento en el formato enviado, incluyendo evidencia fotográfica.</w:t>
+          <w:lang w:val="es-ES"/>
+        </w:rPr>
+      </w:pPr>
+      <w:r>
+        <w:rPr>
+          <w:rFonts w:ascii="Arial Narrow" w:hAnsi="Arial Narrow"/>
+          <w:b/>
+          <w:bCs/>
+          <w:lang w:val="es-ES"/>
+        </w:rPr>
+        <w:t xml:space="preserve">28.2. </w:t>
+      </w:r>
+      <w:r>
+        <w:rPr>
+          <w:rFonts w:ascii="Arial Narrow" w:hAnsi="Arial Narrow"/>
+          <w:b/>
+          <w:bCs/>
+          <w:lang w:val="es-ES"/>
+        </w:rPr>
+        <w:t>EL CONTRATANTE</w:t>
+      </w:r>
+      <w:r>
+        <w:rPr>
+          <w:rFonts w:ascii="Arial Narrow" w:hAnsi="Arial Narrow"/>
+          <w:lang w:val="es-ES"/>
+        </w:rPr>
+        <w:t xml:space="preserve"> podrá emitir una SALIDA NO CONFORME a </w:t>
+      </w:r>
+      <w:r>
+        <w:rPr>
+          <w:rFonts w:ascii="Arial Narrow" w:hAnsi="Arial Narrow"/>
+          <w:b/>
+          <w:bCs/>
+          <w:lang w:val="es-ES"/>
+        </w:rPr>
+        <w:t>EL CONTRATISTA</w:t>
+      </w:r>
+      <w:r>
+        <w:rPr>
+          <w:rFonts w:ascii="Arial Narrow" w:hAnsi="Arial Narrow"/>
+          <w:lang w:val="es-ES"/>
+        </w:rPr>
+        <w:t xml:space="preserve"> en caso de incumplimiento por un desface mayor a dos (2) pisos entre la revisión y la liberación de una partida con levantamiento de observaciones. Asimismo, la emisión de dicho reporte conllevará la aplicación de una penalidad de S/.250.00 (Doscientos cincuenta y 00/100 soles), la cual será deducida de su próxima valorización. </w:t>
       </w:r>
     </w:p>
     <w:p>
       <w:pPr>
         <w:pStyle w:val="Prrafodelista"/>
+        <w:rPr>
+          <w:rFonts w:ascii="Arial Narrow" w:hAnsi="Arial Narrow"/>
+          <w:lang w:val="es-ES"/>
+        </w:rPr>
+      </w:pPr>
+    </w:p>
+    <w:p>
+      <w:pPr>
+        <w:tabs>
+          <w:tab w:val="clear" w:pos="1440"/>
+          <w:tab w:val="left" w:pos="708"/>
+        </w:tabs>
+        <w:spacing w:line="252" w:lineRule="auto"/>
+        <w:ind w:left="284" w:firstLine="0"/>
+        <w:contextualSpacing/>
+        <w:jc w:val="both"/>
+        <w:rPr>
+          <w:rFonts w:ascii="Arial Narrow" w:hAnsi="Arial Narrow"/>
+          <w:lang w:val="es-ES"/>
+        </w:rPr>
+      </w:pPr>
+      <w:r>
+        <w:rPr>
+          <w:rFonts w:ascii="Arial Narrow" w:hAnsi="Arial Narrow"/>
+          <w:b/>
+          <w:bCs/>
+          <w:lang w:val="es-ES"/>
+        </w:rPr>
+        <w:t xml:space="preserve">28.3. </w:t>
+      </w:r>
+      <w:r>
+        <w:rPr>
+          <w:rFonts w:ascii="Arial Narrow" w:hAnsi="Arial Narrow"/>
+          <w:b/>
+          <w:bCs/>
+          <w:lang w:val="es-ES"/>
+        </w:rPr>
+        <w:t>El CONTRATANTE</w:t>
+      </w:r>
+      <w:r>
+        <w:rPr>
+          <w:rFonts w:ascii="Arial Narrow" w:hAnsi="Arial Narrow"/>
+          <w:lang w:val="es-ES"/>
+        </w:rPr>
+        <w:t xml:space="preserve"> podrá emitir una SALIDA NO CONFORME a </w:t>
+      </w:r>
+      <w:r>
+        <w:rPr>
+          <w:rFonts w:ascii="Arial Narrow" w:hAnsi="Arial Narrow"/>
+          <w:b/>
+          <w:bCs/>
+          <w:lang w:val="es-ES"/>
+        </w:rPr>
+        <w:t>EL CONTRATISTA</w:t>
+      </w:r>
+      <w:r>
+        <w:rPr>
+          <w:rFonts w:ascii="Arial Narrow" w:hAnsi="Arial Narrow"/>
+          <w:lang w:val="es-ES"/>
+        </w:rPr>
+        <w:t xml:space="preserve"> en caso de reincidencia, por segunda vez, en el incumplimiento de la programación del horario de liberación. Asimismo, la emisión de dicho reporte conllevará la aplicación de una penalidad de S/.250.00 (Doscientos cincuenta y 00/100 soles), la cual será deducida de su próxima valorización. </w:t>
+      </w:r>
+    </w:p>
+    <w:p>
+      <w:pPr>
         <w:tabs>
           <w:tab w:val="clear" w:pos="1440"/>
           <w:tab w:val="left" w:pos="708"/>
         </w:tabs>
         <w:spacing w:after="160" w:line="252" w:lineRule="auto"/>
-        <w:ind w:left="284" w:firstLine="0"/>
+        <w:ind w:hanging="708"/>
         <w:contextualSpacing/>
         <w:jc w:val="both"/>
         <w:rPr>
           <w:rFonts w:ascii="Arial Narrow" w:hAnsi="Arial Narrow"/>
-          <w:sz w:val="18"/>
-          <w:szCs w:val="18"/>
-          <w:lang w:val="es-ES"/>
-        </w:rPr>
-      </w:pPr>
-    </w:p>
-    <w:p>
-      <w:pPr>
-        <w:pStyle w:val="Prrafodelista"/>
-        <w:numPr>
-          <w:ilvl w:val="1"/>
-          <w:numId w:val="41"/>
-        </w:numPr>
+          <w:lang w:val="es-ES"/>
+        </w:rPr>
+      </w:pPr>
+    </w:p>
+    <w:p>
+      <w:pPr>
         <w:tabs>
+          <w:tab w:val="clear" w:pos="1440"/>
           <w:tab w:val="left" w:pos="708"/>
         </w:tabs>
         <w:spacing w:line="252" w:lineRule="auto"/>
+        <w:ind w:left="284" w:firstLine="0"/>
         <w:contextualSpacing/>
         <w:jc w:val="both"/>
         <w:rPr>
           <w:rFonts w:ascii="Arial Narrow" w:hAnsi="Arial Narrow"/>
-          <w:sz w:val="18"/>
-          <w:szCs w:val="18"/>
-          <w:lang w:val="es-ES"/>
-        </w:rPr>
-      </w:pPr>
-      <w:r>
-        <w:rPr>
-          <w:rFonts w:ascii="Arial Narrow" w:hAnsi="Arial Narrow"/>
-          <w:sz w:val="18"/>
-          <w:szCs w:val="18"/>
-          <w:lang w:val="es-ES"/>
-        </w:rPr>
-        <w:t>El monto de penalidad no incluye los gastos adicionales por reparaciones de daños a otras partidas que hayan podido ser ocasionadas durante el incumplimiento descrito en la SALIDA NO CONFORME.</w:t>
-      </w:r>
-      <w:bookmarkStart w:id="12" w:name="_heading=h.lnxbz9" w:colFirst="0" w:colLast="0"/>
-      <w:bookmarkEnd w:id="12"/>
+          <w:lang w:val="es-ES"/>
+        </w:rPr>
+      </w:pPr>
+      <w:r>
+        <w:rPr>
+          <w:rFonts w:ascii="Arial Narrow" w:hAnsi="Arial Narrow"/>
+          <w:b/>
+          <w:bCs/>
+          <w:lang w:val="es-ES"/>
+        </w:rPr>
+        <w:t>2</w:t>
+      </w:r>
+      <w:r>
+        <w:rPr>
+          <w:rFonts w:ascii="Arial Narrow" w:hAnsi="Arial Narrow"/>
+          <w:b/>
+          <w:bCs/>
+          <w:lang w:val="es-ES"/>
+        </w:rPr>
+        <w:t>8</w:t>
+      </w:r>
+      <w:r>
+        <w:rPr>
+          <w:rFonts w:ascii="Arial Narrow" w:hAnsi="Arial Narrow"/>
+          <w:b/>
+          <w:bCs/>
+          <w:lang w:val="es-ES"/>
+        </w:rPr>
+        <w:t>.4</w:t>
+      </w:r>
+      <w:r>
+        <w:rPr>
+          <w:rFonts w:ascii="Arial Narrow" w:hAnsi="Arial Narrow"/>
+          <w:lang w:val="es-ES"/>
+        </w:rPr>
+        <w:t xml:space="preserve">. </w:t>
+      </w:r>
+      <w:r>
+        <w:rPr>
+          <w:rFonts w:ascii="Arial Narrow" w:hAnsi="Arial Narrow"/>
+          <w:lang w:val="es-ES"/>
+        </w:rPr>
+        <w:t>En caso de que transcurra el plazo máximo de tres (3) días hábiles para el levantamiento de la SALIDA NO CONFORME, se aplicará una penalidad adicional de S/.250.00 (Doscientos cincuenta y 00/100 soles) por cada día adicional que se tarde en resolver la situación. Se considera salida no conforme levantada cuando se ha corregido la observación en obra y se ha respondido el documento en el formato enviado, incluyendo evidencia fotográfica.</w:t>
+      </w:r>
+    </w:p>
+    <w:p>
+      <w:pPr>
+        <w:tabs>
+          <w:tab w:val="clear" w:pos="1440"/>
+          <w:tab w:val="left" w:pos="708"/>
+        </w:tabs>
+        <w:spacing w:after="160" w:line="252" w:lineRule="auto"/>
+        <w:ind w:hanging="708"/>
+        <w:contextualSpacing/>
+        <w:jc w:val="both"/>
+        <w:rPr>
+          <w:rFonts w:ascii="Arial Narrow" w:hAnsi="Arial Narrow"/>
+          <w:lang w:val="es-ES"/>
+        </w:rPr>
+      </w:pPr>
+    </w:p>
+    <w:p>
+      <w:pPr>
+        <w:tabs>
+          <w:tab w:val="clear" w:pos="1440"/>
+          <w:tab w:val="left" w:pos="708"/>
+        </w:tabs>
+        <w:spacing w:line="252" w:lineRule="auto"/>
+        <w:ind w:left="284" w:firstLine="0"/>
+        <w:contextualSpacing/>
+        <w:jc w:val="both"/>
+        <w:rPr>
+          <w:rFonts w:ascii="Arial Narrow" w:hAnsi="Arial Narrow"/>
+          <w:lang w:val="es-ES"/>
+        </w:rPr>
+      </w:pPr>
+      <w:r>
+        <w:rPr>
+          <w:rFonts w:ascii="Arial Narrow" w:hAnsi="Arial Narrow"/>
+          <w:b/>
+          <w:bCs/>
+          <w:lang w:val="es-ES"/>
+        </w:rPr>
+        <w:t>2</w:t>
+      </w:r>
+      <w:r>
+        <w:rPr>
+          <w:rFonts w:ascii="Arial Narrow" w:hAnsi="Arial Narrow"/>
+          <w:b/>
+          <w:bCs/>
+          <w:lang w:val="es-ES"/>
+        </w:rPr>
+        <w:t>8</w:t>
+      </w:r>
+      <w:r>
+        <w:rPr>
+          <w:rFonts w:ascii="Arial Narrow" w:hAnsi="Arial Narrow"/>
+          <w:b/>
+          <w:bCs/>
+          <w:lang w:val="es-ES"/>
+        </w:rPr>
+        <w:t>.5.</w:t>
+      </w:r>
+      <w:r>
+        <w:rPr>
+          <w:rFonts w:ascii="Arial Narrow" w:hAnsi="Arial Narrow"/>
+          <w:lang w:val="es-ES"/>
+        </w:rPr>
+        <w:t xml:space="preserve"> El monto de penalidad no incluye los gastos adicionales por reparaciones de daños a otras partidas que hayan podido ser ocasionadas durante el incumplimiento descrito en la SALIDA NO CONFORME.</w:t>
+      </w:r>
+    </w:p>
+    <w:p>
+      <w:pPr>
+        <w:tabs>
+          <w:tab w:val="clear" w:pos="1440"/>
+        </w:tabs>
+        <w:ind w:firstLine="0"/>
+        <w:rPr>
+          <w:rFonts w:ascii="Arial Narrow" w:hAnsi="Arial Narrow"/>
+          <w:lang w:val="es-ES"/>
+        </w:rPr>
+      </w:pPr>
+      <w:r>
+        <w:rPr>
+          <w:rFonts w:ascii="Arial Narrow" w:hAnsi="Arial Narrow"/>
+          <w:lang w:val="es-ES"/>
+        </w:rPr>
+        <w:br w:type="page"/>
+      </w:r>
     </w:p>
     <w:p>
       <w:pPr>
@@ -42802,8 +42710,8 @@
           <w:lang w:val="es-ES"/>
         </w:rPr>
       </w:pPr>
-      <w:bookmarkStart w:id="13" w:name="_heading=h.35nkun2" w:colFirst="0" w:colLast="0"/>
-      <w:bookmarkEnd w:id="13"/>
+      <w:bookmarkStart w:id="12" w:name="_heading=h.35nkun2" w:colFirst="0" w:colLast="0"/>
+      <w:bookmarkEnd w:id="12"/>
       <w:r>
         <w:rPr>
           <w:rFonts w:ascii="Arial Narrow" w:eastAsia="Arial Narrow" w:hAnsi="Arial Narrow" w:cs="Arial Narrow"/>
@@ -51339,9 +51247,11 @@
 </file>
 
 <file path=customXml/item1.xml><?xml version="1.0" encoding="utf-8"?>
-<go:gDocsCustomXmlDataStorage xmlns:go="http://customooxmlschemas.google.com/" xmlns:r="http://schemas.openxmlformats.org/officeDocument/2006/relationships" uri="GoogleDocsCustomDataVersion2">
-  <go:docsCustomData xmlns:go="http://customooxmlschemas.google.com/" roundtripDataSignature="AMtx7mi65SlRJfsAaB/f5FQ/QJjSa7JTRg==">CgMxLjAyCGguZ2pkZ3hzMgloLjMwajB6bGwyCWguMWZvYjl0ZTIJaC4zem55c2g3MgloLjJldDkycDAyCGgudHlqY3d0MgloLjNkeTZ2a20yCWguMXQzaDVzZjIJaC40ZDM0b2c4MgloLjJzOGV5bzEyCWguMTdkcDh2dTIJaC4zcmRjcmpuMgloLjI2aW4xcmcyCGgubG54Yno5MgloLjM1bmt1bjI4AHIhMVB3QlM0WUsxeVpEc0RYM1hkSnRydEtfT2RVVDZQNW5I</go:docsCustomData>
-</go:gDocsCustomXmlDataStorage>
+<p:properties xmlns:p="http://schemas.microsoft.com/office/2006/metadata/properties" xmlns:xsi="http://www.w3.org/2001/XMLSchema-instance" xmlns:pc="http://schemas.microsoft.com/office/infopath/2007/PartnerControls">
+  <documentManagement>
+    <_activity xmlns="1c364c2e-a9e5-4d0d-8b0c-60f96943b919" xsi:nil="true"/>
+  </documentManagement>
+</p:properties>
 </file>
 
 <file path=customXml/item2.xml><?xml version="1.0" encoding="utf-8"?>
@@ -51598,18 +51508,12 @@
 </file>
 
 <file path=customXml/item3.xml><?xml version="1.0" encoding="utf-8"?>
-<p:properties xmlns:p="http://schemas.microsoft.com/office/2006/metadata/properties" xmlns:xsi="http://www.w3.org/2001/XMLSchema-instance" xmlns:pc="http://schemas.microsoft.com/office/infopath/2007/PartnerControls">
-  <documentManagement>
-    <_activity xmlns="1c364c2e-a9e5-4d0d-8b0c-60f96943b919" xsi:nil="true"/>
-  </documentManagement>
-</p:properties>
+<go:gDocsCustomXmlDataStorage xmlns:go="http://customooxmlschemas.google.com/" xmlns:r="http://schemas.openxmlformats.org/officeDocument/2006/relationships" uri="GoogleDocsCustomDataVersion2">
+  <go:docsCustomData xmlns:go="http://customooxmlschemas.google.com/" roundtripDataSignature="AMtx7mi65SlRJfsAaB/f5FQ/QJjSa7JTRg==">CgMxLjAyCGguZ2pkZ3hzMgloLjMwajB6bGwyCWguMWZvYjl0ZTIJaC4zem55c2g3MgloLjJldDkycDAyCGgudHlqY3d0MgloLjNkeTZ2a20yCWguMXQzaDVzZjIJaC40ZDM0b2c4MgloLjJzOGV5bzEyCWguMTdkcDh2dTIJaC4zcmRjcmpuMgloLjI2aW4xcmcyCGgubG54Yno5MgloLjM1bmt1bjI4AHIhMVB3QlM0WUsxeVpEc0RYM1hkSnRydEtfT2RVVDZQNW5I</go:docsCustomData>
+</go:gDocsCustomXmlDataStorage>
 </file>
 
 <file path=customXml/item4.xml><?xml version="1.0" encoding="utf-8"?>
-<b:Sources xmlns:b="http://schemas.openxmlformats.org/officeDocument/2006/bibliography" xmlns="http://schemas.openxmlformats.org/officeDocument/2006/bibliography" SelectedStyle="\APASixthEditionOfficeOnline.xsl" StyleName="APA" Version="6"/>
-</file>
-
-<file path=customXml/item5.xml><?xml version="1.0" encoding="utf-8"?>
 <?mso-contentType ?>
 <FormTemplates xmlns="http://schemas.microsoft.com/sharepoint/v3/contenttype/forms">
   <Display>DocumentLibraryForm</Display>
@@ -51618,11 +51522,16 @@
 </FormTemplates>
 </file>
 
+<file path=customXml/item5.xml><?xml version="1.0" encoding="utf-8"?>
+<b:Sources xmlns:b="http://schemas.openxmlformats.org/officeDocument/2006/bibliography" xmlns="http://schemas.openxmlformats.org/officeDocument/2006/bibliography" SelectedStyle="\APASixthEditionOfficeOnline.xsl" StyleName="APA" Version="6"/>
+</file>
+
 <file path=customXml/itemProps1.xml><?xml version="1.0" encoding="utf-8"?>
-<ds:datastoreItem xmlns:ds="http://schemas.openxmlformats.org/officeDocument/2006/customXml" ds:itemID="{11111111-1234-1234-1234-123412341234}">
+<ds:datastoreItem xmlns:ds="http://schemas.openxmlformats.org/officeDocument/2006/customXml" ds:itemID="{D829E601-C5D7-4EB3-859E-E162E4261A98}">
   <ds:schemaRefs>
-    <ds:schemaRef ds:uri="http://customooxmlschemas.google.com/"/>
-    <ds:schemaRef ds:uri="http://schemas.openxmlformats.org/officeDocument/2006/relationships"/>
+    <ds:schemaRef ds:uri="http://schemas.microsoft.com/office/2006/metadata/properties"/>
+    <ds:schemaRef ds:uri="http://schemas.microsoft.com/office/infopath/2007/PartnerControls"/>
+    <ds:schemaRef ds:uri="1c364c2e-a9e5-4d0d-8b0c-60f96943b919"/>
   </ds:schemaRefs>
 </ds:datastoreItem>
 </file>
@@ -51647,27 +51556,26 @@
 </file>
 
 <file path=customXml/itemProps3.xml><?xml version="1.0" encoding="utf-8"?>
-<ds:datastoreItem xmlns:ds="http://schemas.openxmlformats.org/officeDocument/2006/customXml" ds:itemID="{D829E601-C5D7-4EB3-859E-E162E4261A98}">
+<ds:datastoreItem xmlns:ds="http://schemas.openxmlformats.org/officeDocument/2006/customXml" ds:itemID="{11111111-1234-1234-1234-123412341234}">
   <ds:schemaRefs>
-    <ds:schemaRef ds:uri="http://schemas.microsoft.com/office/2006/metadata/properties"/>
-    <ds:schemaRef ds:uri="http://schemas.microsoft.com/office/infopath/2007/PartnerControls"/>
-    <ds:schemaRef ds:uri="1c364c2e-a9e5-4d0d-8b0c-60f96943b919"/>
+    <ds:schemaRef ds:uri="http://customooxmlschemas.google.com/"/>
+    <ds:schemaRef ds:uri="http://schemas.openxmlformats.org/officeDocument/2006/relationships"/>
   </ds:schemaRefs>
 </ds:datastoreItem>
 </file>
 
 <file path=customXml/itemProps4.xml><?xml version="1.0" encoding="utf-8"?>
+<ds:datastoreItem xmlns:ds="http://schemas.openxmlformats.org/officeDocument/2006/customXml" ds:itemID="{DD1BD535-DABA-4752-B724-9FD5D9237B7F}">
+  <ds:schemaRefs>
+    <ds:schemaRef ds:uri="http://schemas.microsoft.com/sharepoint/v3/contenttype/forms"/>
+  </ds:schemaRefs>
+</ds:datastoreItem>
+</file>
+
+<file path=customXml/itemProps5.xml><?xml version="1.0" encoding="utf-8"?>
 <ds:datastoreItem xmlns:ds="http://schemas.openxmlformats.org/officeDocument/2006/customXml" ds:itemID="{02C867CF-6023-4BBE-9EB8-8D3F09F43338}">
   <ds:schemaRefs>
     <ds:schemaRef ds:uri="http://schemas.openxmlformats.org/officeDocument/2006/bibliography"/>
   </ds:schemaRefs>
 </ds:datastoreItem>
-</file>
-
-<file path=customXml/itemProps5.xml><?xml version="1.0" encoding="utf-8"?>
-<ds:datastoreItem xmlns:ds="http://schemas.openxmlformats.org/officeDocument/2006/customXml" ds:itemID="{DD1BD535-DABA-4752-B724-9FD5D9237B7F}">
-  <ds:schemaRefs>
-    <ds:schemaRef ds:uri="http://schemas.microsoft.com/sharepoint/v3/contenttype/forms"/>
-  </ds:schemaRefs>
-</ds:datastoreItem>
 </file>
</xml_diff>